<commit_message>
Address second review: novelty table, metric definitions, qualified claims
Adds a related-technique comparison table, defines AUROC/ECE/FAR/FRR,
explains the EER choice, qualifies synthetic 100% results, softens the
regulatory wording, documents per-answer confidence, and lists missing
validations as limitations. Still 6 pages A4.

Co-Authored-By: Claude Opus 5.5 <noreply@anthropic.com>
Claude-Session: https://claude.ai/code/session_013hQpENYQayBnP2TgZ4DeJc
</commit_message>
<xml_diff>
--- a/docs/paper-ieee/CogniHire_IEEE.docx
+++ b/docs/paper-ieee/CogniHire_IEEE.docx
@@ -370,7 +370,7 @@
         <w:rPr>
           <w:rFonts w:ascii="Times New Roman" w:hAnsi="Times New Roman" w:cs="Times New Roman" w:eastAsia="Times New Roman"/>
         </w:rPr>
-        <w:t xml:space="preserve">overwhelmingly</w:t>
+        <w:t xml:space="preserve">typically</w:t>
       </w:r>
       <w:r>
         <w:rPr>
@@ -2816,103 +2816,31 @@
         <w:rPr>
           <w:rFonts w:ascii="Times New Roman" w:hAnsi="Times New Roman" w:cs="Times New Roman" w:eastAsia="Times New Roman"/>
         </w:rPr>
-        <w:t xml:space="preserve">A technical interview ends with a form:</w:t>
-      </w:r>
-      <w:r>
-        <w:rPr>
-          <w:rFonts w:ascii="Times New Roman" w:hAnsi="Times New Roman" w:cs="Times New Roman" w:eastAsia="Times New Roman"/>
-        </w:rPr>
-        <w:t xml:space="preserve"> </w:t>
-      </w:r>
-      <w:r>
-        <w:rPr>
-          <w:rFonts w:ascii="Times New Roman" w:hAnsi="Times New Roman" w:cs="Times New Roman" w:eastAsia="Times New Roman"/>
-        </w:rPr>
-        <w:t xml:space="preserve">“</w:t>
-      </w:r>
-      <w:r>
-        <w:rPr>
-          <w:rFonts w:ascii="Times New Roman" w:hAnsi="Times New Roman" w:cs="Times New Roman" w:eastAsia="Times New Roman"/>
-        </w:rPr>
-        <w:t xml:space="preserve">Strong communication. Good Flutter</w:t>
-      </w:r>
-      <w:r>
-        <w:rPr>
-          <w:rFonts w:ascii="Times New Roman" w:hAnsi="Times New Roman" w:cs="Times New Roman" w:eastAsia="Times New Roman"/>
-        </w:rPr>
-        <w:t xml:space="preserve"> </w:t>
-      </w:r>
-      <w:r>
-        <w:rPr>
-          <w:rFonts w:ascii="Times New Roman" w:hAnsi="Times New Roman" w:cs="Times New Roman" w:eastAsia="Times New Roman"/>
-        </w:rPr>
-        <w:t xml:space="preserve">knowledge. 8.7/10.</w:t>
-      </w:r>
-      <w:r>
-        <w:rPr>
-          <w:rFonts w:ascii="Times New Roman" w:hAnsi="Times New Roman" w:cs="Times New Roman" w:eastAsia="Times New Roman"/>
-        </w:rPr>
-        <w:t xml:space="preserve">”</w:t>
-      </w:r>
-      <w:r>
-        <w:rPr>
-          <w:rFonts w:ascii="Times New Roman" w:hAnsi="Times New Roman" w:cs="Times New Roman" w:eastAsia="Times New Roman"/>
-        </w:rPr>
-        <w:t xml:space="preserve"> </w:t>
-      </w:r>
-      <w:r>
-        <w:rPr>
-          <w:rFonts w:ascii="Times New Roman" w:hAnsi="Times New Roman" w:cs="Times New Roman" w:eastAsia="Times New Roman"/>
-        </w:rPr>
-        <w:t xml:space="preserve">Six months later nobody can reconstruct which answer moved</w:t>
-      </w:r>
-      <w:r>
-        <w:rPr>
-          <w:rFonts w:ascii="Times New Roman" w:hAnsi="Times New Roman" w:cs="Times New Roman" w:eastAsia="Times New Roman"/>
-        </w:rPr>
-        <w:t xml:space="preserve"> </w:t>
-      </w:r>
-      <w:r>
-        <w:rPr>
-          <w:rFonts w:ascii="Times New Roman" w:hAnsi="Times New Roman" w:cs="Times New Roman" w:eastAsia="Times New Roman"/>
-        </w:rPr>
-        <w:t xml:space="preserve">the score from 8.4 to 8.7; the candidate cannot appeal it and the recruiter</w:t>
-      </w:r>
-      <w:r>
-        <w:rPr>
-          <w:rFonts w:ascii="Times New Roman" w:hAnsi="Times New Roman" w:cs="Times New Roman" w:eastAsia="Times New Roman"/>
-        </w:rPr>
-        <w:t xml:space="preserve"> </w:t>
-      </w:r>
-      <w:r>
-        <w:rPr>
-          <w:rFonts w:ascii="Times New Roman" w:hAnsi="Times New Roman" w:cs="Times New Roman" w:eastAsia="Times New Roman"/>
-        </w:rPr>
-        <w:t xml:space="preserve">cannot defend it. Automated platforms reproduce this failure at</w:t>
-      </w:r>
-      <w:r>
-        <w:rPr>
-          <w:rFonts w:ascii="Times New Roman" w:hAnsi="Times New Roman" w:cs="Times New Roman" w:eastAsia="Times New Roman"/>
-        </w:rPr>
-        <w:t xml:space="preserve"> </w:t>
-      </w:r>
-      <w:r>
-        <w:rPr>
-          <w:rFonts w:ascii="Times New Roman" w:hAnsi="Times New Roman" w:cs="Times New Roman" w:eastAsia="Times New Roman"/>
-        </w:rPr>
-        <w:t xml:space="preserve">scale [1], and the industry’s response has been a more</w:t>
-      </w:r>
-      <w:r>
-        <w:rPr>
-          <w:rFonts w:ascii="Times New Roman" w:hAnsi="Times New Roman" w:cs="Times New Roman" w:eastAsia="Times New Roman"/>
-        </w:rPr>
-        <w:t xml:space="preserve"> </w:t>
-      </w:r>
-      <w:r>
-        <w:rPr>
-          <w:rFonts w:ascii="Times New Roman" w:hAnsi="Times New Roman" w:cs="Times New Roman" w:eastAsia="Times New Roman"/>
-        </w:rPr>
-        <w:t xml:space="preserve">sophisticated scalar rather than a different output [2].</w:t>
+        <w:t xml:space="preserve">Interview assessments are commonly summarized as a single score, which records</w:t>
+      </w:r>
+      <w:r>
+        <w:rPr>
+          <w:rFonts w:ascii="Times New Roman" w:hAnsi="Times New Roman" w:cs="Times New Roman" w:eastAsia="Times New Roman"/>
+        </w:rPr>
+        <w:t xml:space="preserve"> </w:t>
+      </w:r>
+      <w:r>
+        <w:rPr>
+          <w:rFonts w:ascii="Times New Roman" w:hAnsi="Times New Roman" w:cs="Times New Roman" w:eastAsia="Times New Roman"/>
+        </w:rPr>
+        <w:t xml:space="preserve">neither which answer produced it nor how it could be contested. Automated</w:t>
+      </w:r>
+      <w:r>
+        <w:rPr>
+          <w:rFonts w:ascii="Times New Roman" w:hAnsi="Times New Roman" w:cs="Times New Roman" w:eastAsia="Times New Roman"/>
+        </w:rPr>
+        <w:t xml:space="preserve"> </w:t>
+      </w:r>
+      <w:r>
+        <w:rPr>
+          <w:rFonts w:ascii="Times New Roman" w:hAnsi="Times New Roman" w:cs="Times New Roman" w:eastAsia="Times New Roman"/>
+        </w:rPr>
+        <w:t xml:space="preserve">screening platforms inherit this limitation [1], [2].</w:t>
       </w:r>
     </w:p>
     <w:p>
@@ -2924,7 +2852,7 @@
         <w:rPr>
           <w:rFonts w:ascii="Times New Roman" w:hAnsi="Times New Roman" w:cs="Times New Roman" w:eastAsia="Times New Roman"/>
         </w:rPr>
-        <w:t xml:space="preserve">We take the opposite position: the useful output of automated screening is an</w:t>
+        <w:t xml:space="preserve">We propose that the useful output of automated screening is an</w:t>
       </w:r>
       <w:r>
         <w:rPr>
@@ -3251,9 +3179,574 @@
         <w:rPr>
           <w:rFonts w:ascii="Times New Roman" w:hAnsi="Times New Roman" w:cs="Times New Roman" w:eastAsia="Times New Roman"/>
         </w:rPr>
-        <w:t xml:space="preserve">first by construction and measure the second.</w:t>
+        <w:t xml:space="preserve">first by construction and measure the second. Table I</w:t>
+      </w:r>
+      <w:r>
+        <w:rPr>
+          <w:rFonts w:ascii="Times New Roman" w:hAnsi="Times New Roman" w:cs="Times New Roman" w:eastAsia="Times New Roman"/>
+        </w:rPr>
+        <w:t xml:space="preserve"> </w:t>
+      </w:r>
+      <w:r>
+        <w:rPr>
+          <w:rFonts w:ascii="Times New Roman" w:hAnsi="Times New Roman" w:cs="Times New Roman" w:eastAsia="Times New Roman"/>
+        </w:rPr>
+        <w:t xml:space="preserve">positions the grounding gate against neighboring techniques: none combines</w:t>
+      </w:r>
+      <w:r>
+        <w:rPr>
+          <w:rFonts w:ascii="Times New Roman" w:hAnsi="Times New Roman" w:cs="Times New Roman" w:eastAsia="Times New Roman"/>
+        </w:rPr>
+        <w:t xml:space="preserve"> </w:t>
+      </w:r>
+      <w:r>
+        <w:rPr>
+          <w:rFonts w:ascii="Times New Roman" w:hAnsi="Times New Roman" w:cs="Times New Roman" w:eastAsia="Times New Roman"/>
+        </w:rPr>
+        <w:t xml:space="preserve">verbatim span admission, assertion-level negation and hedge checks, and an</w:t>
+      </w:r>
+      <w:r>
+        <w:rPr>
+          <w:rFonts w:ascii="Times New Roman" w:hAnsi="Times New Roman" w:cs="Times New Roman" w:eastAsia="Times New Roman"/>
+        </w:rPr>
+        <w:t xml:space="preserve"> </w:t>
+      </w:r>
+      <w:r>
+        <w:rPr>
+          <w:rFonts w:ascii="Times New Roman" w:hAnsi="Times New Roman" w:cs="Times New Roman" w:eastAsia="Times New Roman"/>
+        </w:rPr>
+        <w:t xml:space="preserve">architectural boundary that keeps model text out of verdicts.</w:t>
       </w:r>
     </w:p>
+    <w:p>
+      <w:pPr>
+        <w:pStyle w:val="TableCaption"/>
+        <w:jc w:val="center"/>
+      </w:pPr>
+      <w:r>
+        <w:rPr>
+          <w:rFonts w:ascii="Times New Roman" w:hAnsi="Times New Roman" w:cs="Times New Roman" w:eastAsia="Times New Roman"/>
+        </w:rPr>
+        <w:t>TABLE I. Grounding Gate Compared With Related Techniques</w:t>
+      </w:r>
+    </w:p>
+    <w:tbl>
+      <w:tblPr>
+        <w:tblStyle w:val="Table"/>
+        <w:tblW w:type="pct" w:w="5000"/>
+        <w:tblLook w:firstRow="1" w:lastRow="0" w:firstColumn="0" w:lastColumn="0" w:noHBand="0" w:noVBand="0" w:val="0020"/>
+        <w:jc w:val="start"/>
+        <w:tblCaption w:val="Grounding Gate Compared With Related Techniques"/>
+        <w:tblBorders>
+          <w:top w:val="single" w:sz="4" w:color="000000"/>
+          <w:bottom w:val="single" w:sz="4" w:color="000000"/>
+          <w:insideH w:val="single" w:sz="4" w:color="000000"/>
+        </w:tblBorders>
+      </w:tblPr>
+      <w:tblGrid>
+        <w:gridCol w:w="1980"/>
+        <w:gridCol w:w="1980"/>
+        <w:gridCol w:w="1980"/>
+        <w:gridCol w:w="1980"/>
+      </w:tblGrid>
+      <w:tr>
+        <w:trPr>
+          <w:tblHeader w:val="true"/>
+        </w:trPr>
+        <w:tc>
+          <w:tcPr/>
+          <w:p>
+            <w:pPr>
+              <w:pStyle w:val="Compact"/>
+              <w:spacing w:after="0"/>
+              <w:jc w:val="left"/>
+            </w:pPr>
+            <w:r>
+              <w:rPr>
+                <w:rFonts w:ascii="Times New Roman" w:hAnsi="Times New Roman" w:cs="Times New Roman" w:eastAsia="Times New Roman"/>
+                <w:b/>
+                <w:sz w:val="18"/>
+              </w:rPr>
+              <w:t xml:space="preserve">Technique</w:t>
+            </w:r>
+          </w:p>
+        </w:tc>
+        <w:tc>
+          <w:tcPr/>
+          <w:p>
+            <w:pPr>
+              <w:pStyle w:val="Compact"/>
+              <w:spacing w:after="0"/>
+              <w:jc w:val="center"/>
+            </w:pPr>
+            <w:r>
+              <w:rPr>
+                <w:rFonts w:ascii="Times New Roman" w:hAnsi="Times New Roman" w:cs="Times New Roman" w:eastAsia="Times New Roman"/>
+                <w:b/>
+                <w:sz w:val="18"/>
+              </w:rPr>
+              <w:t xml:space="preserve">Verbatim span</w:t>
+            </w:r>
+          </w:p>
+        </w:tc>
+        <w:tc>
+          <w:tcPr/>
+          <w:p>
+            <w:pPr>
+              <w:pStyle w:val="Compact"/>
+              <w:spacing w:after="0"/>
+              <w:jc w:val="center"/>
+            </w:pPr>
+            <w:r>
+              <w:rPr>
+                <w:rFonts w:ascii="Times New Roman" w:hAnsi="Times New Roman" w:cs="Times New Roman" w:eastAsia="Times New Roman"/>
+                <w:b/>
+                <w:sz w:val="18"/>
+              </w:rPr>
+              <w:t xml:space="preserve">Negation/hedge</w:t>
+            </w:r>
+          </w:p>
+        </w:tc>
+        <w:tc>
+          <w:tcPr/>
+          <w:p>
+            <w:pPr>
+              <w:pStyle w:val="Compact"/>
+              <w:spacing w:after="0"/>
+              <w:jc w:val="center"/>
+            </w:pPr>
+            <w:r>
+              <w:rPr>
+                <w:rFonts w:ascii="Times New Roman" w:hAnsi="Times New Roman" w:cs="Times New Roman" w:eastAsia="Times New Roman"/>
+                <w:b/>
+                <w:sz w:val="18"/>
+              </w:rPr>
+              <w:t xml:space="preserve">Output reaches</w:t>
+            </w:r>
+          </w:p>
+        </w:tc>
+      </w:tr>
+      <w:tr>
+        <w:tc>
+          <w:tcPr/>
+          <w:p>
+            <w:pPr>
+              <w:pStyle w:val="Compact"/>
+              <w:spacing w:after="0"/>
+              <w:jc w:val="left"/>
+            </w:pPr>
+            <w:r>
+              <w:rPr>
+                <w:rFonts w:ascii="Times New Roman" w:hAnsi="Times New Roman" w:cs="Times New Roman" w:eastAsia="Times New Roman"/>
+                <w:sz w:val="18"/>
+              </w:rPr>
+              <w:t xml:space="preserve">Retrieval-augmented generation</w:t>
+            </w:r>
+          </w:p>
+        </w:tc>
+        <w:tc>
+          <w:tcPr/>
+          <w:p>
+            <w:pPr>
+              <w:pStyle w:val="Compact"/>
+              <w:spacing w:after="0"/>
+              <w:jc w:val="center"/>
+            </w:pPr>
+            <w:r>
+              <w:rPr>
+                <w:rFonts w:ascii="Times New Roman" w:hAnsi="Times New Roman" w:cs="Times New Roman" w:eastAsia="Times New Roman"/>
+                <w:sz w:val="18"/>
+              </w:rPr>
+              <w:t xml:space="preserve">No</w:t>
+            </w:r>
+          </w:p>
+        </w:tc>
+        <w:tc>
+          <w:tcPr/>
+          <w:p>
+            <w:pPr>
+              <w:pStyle w:val="Compact"/>
+              <w:spacing w:after="0"/>
+              <w:jc w:val="center"/>
+            </w:pPr>
+            <w:r>
+              <w:rPr>
+                <w:rFonts w:ascii="Times New Roman" w:hAnsi="Times New Roman" w:cs="Times New Roman" w:eastAsia="Times New Roman"/>
+                <w:sz w:val="18"/>
+              </w:rPr>
+              <w:t xml:space="preserve">No</w:t>
+            </w:r>
+          </w:p>
+        </w:tc>
+        <w:tc>
+          <w:tcPr/>
+          <w:p>
+            <w:pPr>
+              <w:pStyle w:val="Compact"/>
+              <w:spacing w:after="0"/>
+              <w:jc w:val="center"/>
+            </w:pPr>
+            <w:r>
+              <w:rPr>
+                <w:rFonts w:ascii="Times New Roman" w:hAnsi="Times New Roman" w:cs="Times New Roman" w:eastAsia="Times New Roman"/>
+                <w:sz w:val="18"/>
+              </w:rPr>
+              <w:t xml:space="preserve">Text</w:t>
+            </w:r>
+          </w:p>
+        </w:tc>
+      </w:tr>
+      <w:tr>
+        <w:tc>
+          <w:tcPr/>
+          <w:p>
+            <w:pPr>
+              <w:pStyle w:val="Compact"/>
+              <w:spacing w:after="0"/>
+              <w:jc w:val="left"/>
+            </w:pPr>
+            <w:r>
+              <w:rPr>
+                <w:rFonts w:ascii="Times New Roman" w:hAnsi="Times New Roman" w:cs="Times New Roman" w:eastAsia="Times New Roman"/>
+                <w:sz w:val="18"/>
+              </w:rPr>
+              <w:t xml:space="preserve">Citation/provenance generation</w:t>
+            </w:r>
+          </w:p>
+        </w:tc>
+        <w:tc>
+          <w:tcPr/>
+          <w:p>
+            <w:pPr>
+              <w:pStyle w:val="Compact"/>
+              <w:spacing w:after="0"/>
+              <w:jc w:val="center"/>
+            </w:pPr>
+            <w:r>
+              <w:rPr>
+                <w:rFonts w:ascii="Times New Roman" w:hAnsi="Times New Roman" w:cs="Times New Roman" w:eastAsia="Times New Roman"/>
+                <w:sz w:val="18"/>
+              </w:rPr>
+              <w:t xml:space="preserve">Partial</w:t>
+            </w:r>
+          </w:p>
+        </w:tc>
+        <w:tc>
+          <w:tcPr/>
+          <w:p>
+            <w:pPr>
+              <w:pStyle w:val="Compact"/>
+              <w:spacing w:after="0"/>
+              <w:jc w:val="center"/>
+            </w:pPr>
+            <w:r>
+              <w:rPr>
+                <w:rFonts w:ascii="Times New Roman" w:hAnsi="Times New Roman" w:cs="Times New Roman" w:eastAsia="Times New Roman"/>
+                <w:sz w:val="18"/>
+              </w:rPr>
+              <w:t xml:space="preserve">No</w:t>
+            </w:r>
+          </w:p>
+        </w:tc>
+        <w:tc>
+          <w:tcPr/>
+          <w:p>
+            <w:pPr>
+              <w:pStyle w:val="Compact"/>
+              <w:spacing w:after="0"/>
+              <w:jc w:val="center"/>
+            </w:pPr>
+            <w:r>
+              <w:rPr>
+                <w:rFonts w:ascii="Times New Roman" w:hAnsi="Times New Roman" w:cs="Times New Roman" w:eastAsia="Times New Roman"/>
+                <w:sz w:val="18"/>
+              </w:rPr>
+              <w:t xml:space="preserve">Text</w:t>
+            </w:r>
+          </w:p>
+        </w:tc>
+      </w:tr>
+      <w:tr>
+        <w:tc>
+          <w:tcPr/>
+          <w:p>
+            <w:pPr>
+              <w:pStyle w:val="Compact"/>
+              <w:spacing w:after="0"/>
+              <w:jc w:val="left"/>
+            </w:pPr>
+            <w:r>
+              <w:rPr>
+                <w:rFonts w:ascii="Times New Roman" w:hAnsi="Times New Roman" w:cs="Times New Roman" w:eastAsia="Times New Roman"/>
+                <w:sz w:val="18"/>
+              </w:rPr>
+              <w:t xml:space="preserve">Hallucination detection [4]</w:t>
+            </w:r>
+          </w:p>
+        </w:tc>
+        <w:tc>
+          <w:tcPr/>
+          <w:p>
+            <w:pPr>
+              <w:pStyle w:val="Compact"/>
+              <w:spacing w:after="0"/>
+              <w:jc w:val="center"/>
+            </w:pPr>
+            <w:r>
+              <w:rPr>
+                <w:rFonts w:ascii="Times New Roman" w:hAnsi="Times New Roman" w:cs="Times New Roman" w:eastAsia="Times New Roman"/>
+                <w:sz w:val="18"/>
+              </w:rPr>
+              <w:t xml:space="preserve">No</w:t>
+            </w:r>
+          </w:p>
+        </w:tc>
+        <w:tc>
+          <w:tcPr/>
+          <w:p>
+            <w:pPr>
+              <w:pStyle w:val="Compact"/>
+              <w:spacing w:after="0"/>
+              <w:jc w:val="center"/>
+            </w:pPr>
+            <w:r>
+              <w:rPr>
+                <w:rFonts w:ascii="Times New Roman" w:hAnsi="Times New Roman" w:cs="Times New Roman" w:eastAsia="Times New Roman"/>
+                <w:sz w:val="18"/>
+              </w:rPr>
+              <w:t xml:space="preserve">No</w:t>
+            </w:r>
+          </w:p>
+        </w:tc>
+        <w:tc>
+          <w:tcPr/>
+          <w:p>
+            <w:pPr>
+              <w:pStyle w:val="Compact"/>
+              <w:spacing w:after="0"/>
+              <w:jc w:val="center"/>
+            </w:pPr>
+            <w:r>
+              <w:rPr>
+                <w:rFonts w:ascii="Times New Roman" w:hAnsi="Times New Roman" w:cs="Times New Roman" w:eastAsia="Times New Roman"/>
+                <w:sz w:val="18"/>
+              </w:rPr>
+              <w:t xml:space="preserve">Score</w:t>
+            </w:r>
+          </w:p>
+        </w:tc>
+      </w:tr>
+      <w:tr>
+        <w:tc>
+          <w:tcPr/>
+          <w:p>
+            <w:pPr>
+              <w:pStyle w:val="Compact"/>
+              <w:spacing w:after="0"/>
+              <w:jc w:val="left"/>
+            </w:pPr>
+            <w:r>
+              <w:rPr>
+                <w:rFonts w:ascii="Times New Roman" w:hAnsi="Times New Roman" w:cs="Times New Roman" w:eastAsia="Times New Roman"/>
+                <w:sz w:val="18"/>
+              </w:rPr>
+              <w:t xml:space="preserve">Extractive information extraction</w:t>
+            </w:r>
+          </w:p>
+        </w:tc>
+        <w:tc>
+          <w:tcPr/>
+          <w:p>
+            <w:pPr>
+              <w:pStyle w:val="Compact"/>
+              <w:spacing w:after="0"/>
+              <w:jc w:val="center"/>
+            </w:pPr>
+            <w:r>
+              <w:rPr>
+                <w:rFonts w:ascii="Times New Roman" w:hAnsi="Times New Roman" w:cs="Times New Roman" w:eastAsia="Times New Roman"/>
+                <w:sz w:val="18"/>
+              </w:rPr>
+              <w:t xml:space="preserve">Yes</w:t>
+            </w:r>
+          </w:p>
+        </w:tc>
+        <w:tc>
+          <w:tcPr/>
+          <w:p>
+            <w:pPr>
+              <w:pStyle w:val="Compact"/>
+              <w:spacing w:after="0"/>
+              <w:jc w:val="center"/>
+            </w:pPr>
+            <w:r>
+              <w:rPr>
+                <w:rFonts w:ascii="Times New Roman" w:hAnsi="Times New Roman" w:cs="Times New Roman" w:eastAsia="Times New Roman"/>
+                <w:sz w:val="18"/>
+              </w:rPr>
+              <w:t xml:space="preserve">No</w:t>
+            </w:r>
+          </w:p>
+        </w:tc>
+        <w:tc>
+          <w:tcPr/>
+          <w:p>
+            <w:pPr>
+              <w:pStyle w:val="Compact"/>
+              <w:spacing w:after="0"/>
+              <w:jc w:val="center"/>
+            </w:pPr>
+            <w:r>
+              <w:rPr>
+                <w:rFonts w:ascii="Times New Roman" w:hAnsi="Times New Roman" w:cs="Times New Roman" w:eastAsia="Times New Roman"/>
+                <w:sz w:val="18"/>
+              </w:rPr>
+              <w:t xml:space="preserve">Field</w:t>
+            </w:r>
+          </w:p>
+        </w:tc>
+      </w:tr>
+      <w:tr>
+        <w:tc>
+          <w:tcPr/>
+          <w:p>
+            <w:pPr>
+              <w:pStyle w:val="Compact"/>
+              <w:spacing w:after="0"/>
+              <w:jc w:val="left"/>
+            </w:pPr>
+            <w:r>
+              <w:rPr>
+                <w:rFonts w:ascii="Times New Roman" w:hAnsi="Times New Roman" w:cs="Times New Roman" w:eastAsia="Times New Roman"/>
+                <w:sz w:val="18"/>
+              </w:rPr>
+              <w:t xml:space="preserve">Injection filtering [5]</w:t>
+            </w:r>
+          </w:p>
+        </w:tc>
+        <w:tc>
+          <w:tcPr/>
+          <w:p>
+            <w:pPr>
+              <w:pStyle w:val="Compact"/>
+              <w:spacing w:after="0"/>
+              <w:jc w:val="center"/>
+            </w:pPr>
+            <w:r>
+              <w:rPr>
+                <w:rFonts w:ascii="Times New Roman" w:hAnsi="Times New Roman" w:cs="Times New Roman" w:eastAsia="Times New Roman"/>
+                <w:sz w:val="18"/>
+              </w:rPr>
+              <w:t xml:space="preserve">No</w:t>
+            </w:r>
+          </w:p>
+        </w:tc>
+        <w:tc>
+          <w:tcPr/>
+          <w:p>
+            <w:pPr>
+              <w:pStyle w:val="Compact"/>
+              <w:spacing w:after="0"/>
+              <w:jc w:val="center"/>
+            </w:pPr>
+            <w:r>
+              <w:rPr>
+                <w:rFonts w:ascii="Times New Roman" w:hAnsi="Times New Roman" w:cs="Times New Roman" w:eastAsia="Times New Roman"/>
+                <w:sz w:val="18"/>
+              </w:rPr>
+              <w:t xml:space="preserve">No</w:t>
+            </w:r>
+          </w:p>
+        </w:tc>
+        <w:tc>
+          <w:tcPr/>
+          <w:p>
+            <w:pPr>
+              <w:pStyle w:val="Compact"/>
+              <w:spacing w:after="0"/>
+              <w:jc w:val="center"/>
+            </w:pPr>
+            <w:r>
+              <w:rPr>
+                <w:rFonts w:ascii="Times New Roman" w:hAnsi="Times New Roman" w:cs="Times New Roman" w:eastAsia="Times New Roman"/>
+                <w:sz w:val="18"/>
+              </w:rPr>
+              <w:t xml:space="preserve">Prompt</w:t>
+            </w:r>
+          </w:p>
+        </w:tc>
+      </w:tr>
+      <w:tr>
+        <w:tc>
+          <w:tcPr/>
+          <w:p>
+            <w:pPr>
+              <w:pStyle w:val="Compact"/>
+              <w:spacing w:after="0"/>
+              <w:jc w:val="left"/>
+            </w:pPr>
+            <w:r>
+              <w:rPr>
+                <w:rFonts w:ascii="Times New Roman" w:hAnsi="Times New Roman" w:cs="Times New Roman" w:eastAsia="Times New Roman"/>
+                <w:sz w:val="18"/>
+              </w:rPr>
+              <w:t xml:space="preserve">This work (gate)</w:t>
+            </w:r>
+          </w:p>
+        </w:tc>
+        <w:tc>
+          <w:tcPr/>
+          <w:p>
+            <w:pPr>
+              <w:pStyle w:val="Compact"/>
+              <w:spacing w:after="0"/>
+              <w:jc w:val="center"/>
+            </w:pPr>
+            <w:r>
+              <w:rPr>
+                <w:rFonts w:ascii="Times New Roman" w:hAnsi="Times New Roman" w:cs="Times New Roman" w:eastAsia="Times New Roman"/>
+                <w:sz w:val="18"/>
+              </w:rPr>
+              <w:t xml:space="preserve">Yes</w:t>
+            </w:r>
+          </w:p>
+        </w:tc>
+        <w:tc>
+          <w:tcPr/>
+          <w:p>
+            <w:pPr>
+              <w:pStyle w:val="Compact"/>
+              <w:spacing w:after="0"/>
+              <w:jc w:val="center"/>
+            </w:pPr>
+            <w:r>
+              <w:rPr>
+                <w:rFonts w:ascii="Times New Roman" w:hAnsi="Times New Roman" w:cs="Times New Roman" w:eastAsia="Times New Roman"/>
+                <w:sz w:val="18"/>
+              </w:rPr>
+              <w:t xml:space="preserve">Yes</w:t>
+            </w:r>
+          </w:p>
+        </w:tc>
+        <w:tc>
+          <w:tcPr/>
+          <w:p>
+            <w:pPr>
+              <w:pStyle w:val="Compact"/>
+              <w:spacing w:after="0"/>
+              <w:jc w:val="center"/>
+            </w:pPr>
+            <w:r>
+              <w:rPr>
+                <w:rFonts w:ascii="Times New Roman" w:hAnsi="Times New Roman" w:cs="Times New Roman" w:eastAsia="Times New Roman"/>
+                <w:sz w:val="18"/>
+              </w:rPr>
+              <w:t xml:space="preserve">Question</w:t>
+            </w:r>
+          </w:p>
+        </w:tc>
+      </w:tr>
+    </w:tbl>
     <w:p>
       <w:pPr>
         <w:pStyle w:val="BodyText"/>
@@ -3422,7 +3915,7 @@
         <w:rPr>
           <w:rFonts w:ascii="Times New Roman" w:hAnsi="Times New Roman" w:cs="Times New Roman" w:eastAsia="Times New Roman"/>
         </w:rPr>
-        <w:t xml:space="preserve">Table I defines the seven terms the paper uses in a fixed</w:t>
+        <w:t xml:space="preserve">Table II defines the seven terms the paper uses in a fixed</w:t>
       </w:r>
       <w:r>
         <w:rPr>
@@ -3458,7 +3951,7 @@
         <w:rPr>
           <w:rFonts w:ascii="Times New Roman" w:hAnsi="Times New Roman" w:cs="Times New Roman" w:eastAsia="Times New Roman"/>
         </w:rPr>
-        <w:t>TABLE I. Terminology Used Throughout the Paper</w:t>
+        <w:t>TABLE II. Terminology Used Throughout the Paper</w:t>
       </w:r>
     </w:p>
     <w:tbl>
@@ -3987,7 +4480,7 @@
         <w:rPr>
           <w:rFonts w:ascii="Times New Roman" w:hAnsi="Times New Roman" w:cs="Times New Roman" w:eastAsia="Times New Roman"/>
         </w:rPr>
-        <w:t xml:space="preserve">Table II lists every component output, whether it is deployed,</w:t>
+        <w:t xml:space="preserve">Table III lists every component output, whether it is deployed,</w:t>
       </w:r>
       <w:r>
         <w:rPr>
@@ -4047,7 +4540,7 @@
         <w:rPr>
           <w:rFonts w:ascii="Times New Roman" w:hAnsi="Times New Roman" w:cs="Times New Roman" w:eastAsia="Times New Roman"/>
         </w:rPr>
-        <w:t>TABLE II. Every Component Output, Its Deployment Status, and What It Can Influence</w:t>
+        <w:t>TABLE III. Every Component Output, Its Deployment Status, and What It Can Influence</w:t>
       </w:r>
     </w:p>
     <w:tbl>
@@ -6075,7 +6568,7 @@
         <w:rPr>
           <w:rFonts w:ascii="Times New Roman" w:hAnsi="Times New Roman" w:cs="Times New Roman" w:eastAsia="Times New Roman"/>
         </w:rPr>
-        <w:t xml:space="preserve">Table III summarizes the result: across roughly 100,000 trials the</w:t>
+        <w:t xml:space="preserve">Table IV summarizes the result: across roughly 100,000 trials the</w:t>
       </w:r>
       <w:r>
         <w:rPr>
@@ -6099,7 +6592,19 @@
         <w:rPr>
           <w:rFonts w:ascii="Times New Roman" w:hAnsi="Times New Roman" w:cs="Times New Roman" w:eastAsia="Times New Roman"/>
         </w:rPr>
-        <w:t xml:space="preserve">negation traps, before and after the fix described below.</w:t>
+        <w:t xml:space="preserve">negation traps, before and after the fix described below. These rates hold for</w:t>
+      </w:r>
+      <w:r>
+        <w:rPr>
+          <w:rFonts w:ascii="Times New Roman" w:hAnsi="Times New Roman" w:cs="Times New Roman" w:eastAsia="Times New Roman"/>
+        </w:rPr>
+        <w:t xml:space="preserve"> </w:t>
+      </w:r>
+      <w:r>
+        <w:rPr>
+          <w:rFonts w:ascii="Times New Roman" w:hAnsi="Times New Roman" w:cs="Times New Roman" w:eastAsia="Times New Roman"/>
+        </w:rPr>
+        <w:t xml:space="preserve">the generator’s paraphrase and negation patterns, not arbitrary real phrasing.</w:t>
       </w:r>
     </w:p>
     <w:p>
@@ -6111,7 +6616,7 @@
         <w:rPr>
           <w:rFonts w:ascii="Times New Roman" w:hAnsi="Times New Roman" w:cs="Times New Roman" w:eastAsia="Times New Roman"/>
         </w:rPr>
-        <w:t>TABLE III. Grounding-Gate Correct-Decision Rate Before and After the Clause-Splitter Fix</w:t>
+        <w:t>TABLE IV. Grounding-Gate Correct-Decision Rate Before and After the Clause-Splitter Fix</w:t>
       </w:r>
     </w:p>
     <w:tbl>
@@ -6721,7 +7226,7 @@
         <w:rPr>
           <w:rFonts w:ascii="Times New Roman" w:hAnsi="Times New Roman" w:cs="Times New Roman" w:eastAsia="Times New Roman"/>
         </w:rPr>
-        <w:t xml:space="preserve">content the injection demanded. Table IV reports what the</w:t>
+        <w:t xml:space="preserve">content the injection demanded. Table V reports what the</w:t>
       </w:r>
       <w:r>
         <w:rPr>
@@ -6745,7 +7250,7 @@
         <w:rPr>
           <w:rFonts w:ascii="Times New Roman" w:hAnsi="Times New Roman" w:cs="Times New Roman" w:eastAsia="Times New Roman"/>
         </w:rPr>
-        <w:t>TABLE IV. Grounding Gate Under a Fully Compromised Extraction Model</w:t>
+        <w:t>TABLE V. Grounding Gate Under a Fully Compromised Extraction Model</w:t>
       </w:r>
       <w:r>
         <w:rPr>
@@ -7300,7 +7805,7 @@
         <w:rPr>
           <w:rFonts w:ascii="Times New Roman" w:hAnsi="Times New Roman" w:cs="Times New Roman" w:eastAsia="Times New Roman"/>
         </w:rPr>
-        <w:t xml:space="preserve">(Table VI).</w:t>
+        <w:t xml:space="preserve">(Table VII).</w:t>
       </w:r>
     </w:p>
     <w:bookmarkEnd w:id="33"/>
@@ -7375,19 +7880,43 @@
         <w:rPr>
           <w:rFonts w:ascii="Times New Roman" w:hAnsi="Times New Roman" w:cs="Times New Roman" w:eastAsia="Times New Roman"/>
         </w:rPr>
-        <w:t xml:space="preserve">Table V gives each model’s mean AUROC, calibration error</w:t>
-      </w:r>
-      <w:r>
-        <w:rPr>
-          <w:rFonts w:ascii="Times New Roman" w:hAnsi="Times New Roman" w:cs="Times New Roman" w:eastAsia="Times New Roman"/>
-        </w:rPr>
-        <w:t xml:space="preserve"> </w:t>
-      </w:r>
-      <w:r>
-        <w:rPr>
-          <w:rFonts w:ascii="Times New Roman" w:hAnsi="Times New Roman" w:cs="Times New Roman" w:eastAsia="Times New Roman"/>
-        </w:rPr>
-        <w:t xml:space="preserve">(ECE) [21], inference latency and model size.</w:t>
+        <w:t xml:space="preserve">Table VI gives each model’s mean AUROC (area under the ROC curve;</w:t>
+      </w:r>
+      <w:r>
+        <w:rPr>
+          <w:rFonts w:ascii="Times New Roman" w:hAnsi="Times New Roman" w:cs="Times New Roman" w:eastAsia="Times New Roman"/>
+        </w:rPr>
+        <w:t xml:space="preserve"> </w:t>
+      </w:r>
+      <w:r>
+        <w:rPr>
+          <w:rFonts w:ascii="Times New Roman" w:hAnsi="Times New Roman" w:cs="Times New Roman" w:eastAsia="Times New Roman"/>
+        </w:rPr>
+        <w:t xml:space="preserve">0.5 is chance), expected calibration error (ECE, the mean gap between predicted</w:t>
+      </w:r>
+      <w:r>
+        <w:rPr>
+          <w:rFonts w:ascii="Times New Roman" w:hAnsi="Times New Roman" w:cs="Times New Roman" w:eastAsia="Times New Roman"/>
+        </w:rPr>
+        <w:t xml:space="preserve"> </w:t>
+      </w:r>
+      <w:r>
+        <w:rPr>
+          <w:rFonts w:ascii="Times New Roman" w:hAnsi="Times New Roman" w:cs="Times New Roman" w:eastAsia="Times New Roman"/>
+        </w:rPr>
+        <w:t xml:space="preserve">probability and observed frequency over ten bins) [21], latency and</w:t>
+      </w:r>
+      <w:r>
+        <w:rPr>
+          <w:rFonts w:ascii="Times New Roman" w:hAnsi="Times New Roman" w:cs="Times New Roman" w:eastAsia="Times New Roman"/>
+        </w:rPr>
+        <w:t xml:space="preserve"> </w:t>
+      </w:r>
+      <w:r>
+        <w:rPr>
+          <w:rFonts w:ascii="Times New Roman" w:hAnsi="Times New Roman" w:cs="Times New Roman" w:eastAsia="Times New Roman"/>
+        </w:rPr>
+        <w:t xml:space="preserve">model size.</w:t>
       </w:r>
     </w:p>
     <w:p>
@@ -7399,7 +7928,7 @@
         <w:rPr>
           <w:rFonts w:ascii="Times New Roman" w:hAnsi="Times New Roman" w:cs="Times New Roman" w:eastAsia="Times New Roman"/>
         </w:rPr>
-        <w:t>TABLE V. Nine Classifiers, Ten-Fold Cross-Validation Grouped by Posting</w:t>
+        <w:t>TABLE VI. Nine Classifiers, Ten-Fold Cross-Validation Grouped by Posting</w:t>
       </w:r>
       <w:r>
         <w:rPr>
@@ -8789,7 +9318,7 @@
         <w:rPr>
           <w:rFonts w:ascii="Times New Roman" w:hAnsi="Times New Roman" w:cs="Times New Roman" w:eastAsia="Times New Roman"/>
         </w:rPr>
-        <w:t xml:space="preserve">posting higher; every resume-level property cancels, so chance is 0.5. Table VI gives the result for the random forest over 4,112</w:t>
+        <w:t xml:space="preserve">posting higher; every resume-level property cancels, so chance is 0.5. Table VII gives the result for the random forest over 4,112</w:t>
       </w:r>
       <w:r>
         <w:rPr>
@@ -8813,7 +9342,7 @@
         <w:rPr>
           <w:rFonts w:ascii="Times New Roman" w:hAnsi="Times New Roman" w:cs="Times New Roman" w:eastAsia="Times New Roman"/>
         </w:rPr>
-        <w:t>TABLE VI. Pairwise Ranking Accuracy (Random Forest, 4,112 Within-Resume</w:t>
+        <w:t>TABLE VII. Pairwise Ranking Accuracy (Random Forest, 4,112 Within-Resume</w:t>
       </w:r>
       <w:r>
         <w:rPr>
@@ -9330,7 +9859,7 @@
         <w:rPr>
           <w:rFonts w:ascii="Times New Roman" w:hAnsi="Times New Roman" w:cs="Times New Roman" w:eastAsia="Times New Roman"/>
         </w:rPr>
-        <w:t xml:space="preserve">strong-memorization account. Removing the ambiguous class scores 0.681, no</w:t>
+        <w:t xml:space="preserve">strong-memorization account; fully entity-disjoint folds are future work. Removing the ambiguous class scores 0.681, no</w:t>
       </w:r>
       <w:r>
         <w:rPr>
@@ -9414,7 +9943,7 @@
         <w:rPr>
           <w:rFonts w:ascii="Times New Roman" w:hAnsi="Times New Roman" w:cs="Times New Roman" w:eastAsia="Times New Roman"/>
         </w:rPr>
-        <w:t xml:space="preserve">check; the classifiers of Table V take 0.2–195 µs per pair.</w:t>
+        <w:t xml:space="preserve">check; the classifiers of Table VI take 0.2–195 µs per pair.</w:t>
       </w:r>
       <w:r>
         <w:rPr>
@@ -9514,31 +10043,67 @@
         <w:rPr>
           <w:rFonts w:ascii="Times New Roman" w:hAnsi="Times New Roman" w:cs="Times New Roman" w:eastAsia="Times New Roman"/>
         </w:rPr>
-        <w:t xml:space="preserve">reasoned and documented but flagged as uncalibrated. We ran an equal-error-rate</w:t>
-      </w:r>
-      <w:r>
-        <w:rPr>
-          <w:rFonts w:ascii="Times New Roman" w:hAnsi="Times New Roman" w:cs="Times New Roman" w:eastAsia="Times New Roman"/>
-        </w:rPr>
-        <w:t xml:space="preserve"> </w:t>
-      </w:r>
-      <w:r>
-        <w:rPr>
-          <w:rFonts w:ascii="Times New Roman" w:hAnsi="Times New Roman" w:cs="Times New Roman" w:eastAsia="Times New Roman"/>
-        </w:rPr>
-        <w:t xml:space="preserve">sweep on 2,200 LFW [16] training pairs and evaluated the chosen</w:t>
-      </w:r>
-      <w:r>
-        <w:rPr>
-          <w:rFonts w:ascii="Times New Roman" w:hAnsi="Times New Roman" w:cs="Times New Roman" w:eastAsia="Times New Roman"/>
-        </w:rPr>
-        <w:t xml:space="preserve"> </w:t>
-      </w:r>
-      <w:r>
-        <w:rPr>
-          <w:rFonts w:ascii="Times New Roman" w:hAnsi="Times New Roman" w:cs="Times New Roman" w:eastAsia="Times New Roman"/>
-        </w:rPr>
-        <w:t xml:space="preserve">threshold on 1,000 held-out pairs. Table VII compares the</w:t>
+        <w:t xml:space="preserve">reasoned and documented but flagged as uncalibrated. FAR is the fraction of</w:t>
+      </w:r>
+      <w:r>
+        <w:rPr>
+          <w:rFonts w:ascii="Times New Roman" w:hAnsi="Times New Roman" w:cs="Times New Roman" w:eastAsia="Times New Roman"/>
+        </w:rPr>
+        <w:t xml:space="preserve"> </w:t>
+      </w:r>
+      <w:r>
+        <w:rPr>
+          <w:rFonts w:ascii="Times New Roman" w:hAnsi="Times New Roman" w:cs="Times New Roman" w:eastAsia="Times New Roman"/>
+        </w:rPr>
+        <w:t xml:space="preserve">different-person pairs accepted and FRR the fraction of same-person pairs</w:t>
+      </w:r>
+      <w:r>
+        <w:rPr>
+          <w:rFonts w:ascii="Times New Roman" w:hAnsi="Times New Roman" w:cs="Times New Roman" w:eastAsia="Times New Roman"/>
+        </w:rPr>
+        <w:t xml:space="preserve"> </w:t>
+      </w:r>
+      <w:r>
+        <w:rPr>
+          <w:rFonts w:ascii="Times New Roman" w:hAnsi="Times New Roman" w:cs="Times New Roman" w:eastAsia="Times New Roman"/>
+        </w:rPr>
+        <w:t xml:space="preserve">rejected. We chose the equal-error-rate threshold, where the two are equal,</w:t>
+      </w:r>
+      <w:r>
+        <w:rPr>
+          <w:rFonts w:ascii="Times New Roman" w:hAnsi="Times New Roman" w:cs="Times New Roman" w:eastAsia="Times New Roman"/>
+        </w:rPr>
+        <w:t xml:space="preserve"> </w:t>
+      </w:r>
+      <w:r>
+        <w:rPr>
+          <w:rFonts w:ascii="Times New Roman" w:hAnsi="Times New Roman" w:cs="Times New Roman" w:eastAsia="Times New Roman"/>
+        </w:rPr>
+        <w:t xml:space="preserve">because no validated cost ratio between them exists for this use; it was fitted</w:t>
+      </w:r>
+      <w:r>
+        <w:rPr>
+          <w:rFonts w:ascii="Times New Roman" w:hAnsi="Times New Roman" w:cs="Times New Roman" w:eastAsia="Times New Roman"/>
+        </w:rPr>
+        <w:t xml:space="preserve"> </w:t>
+      </w:r>
+      <w:r>
+        <w:rPr>
+          <w:rFonts w:ascii="Times New Roman" w:hAnsi="Times New Roman" w:cs="Times New Roman" w:eastAsia="Times New Roman"/>
+        </w:rPr>
+        <w:t xml:space="preserve">on the 2,200 pairs of the LFW [16] development training split and</w:t>
+      </w:r>
+      <w:r>
+        <w:rPr>
+          <w:rFonts w:ascii="Times New Roman" w:hAnsi="Times New Roman" w:cs="Times New Roman" w:eastAsia="Times New Roman"/>
+        </w:rPr>
+        <w:t xml:space="preserve"> </w:t>
+      </w:r>
+      <w:r>
+        <w:rPr>
+          <w:rFonts w:ascii="Times New Roman" w:hAnsi="Times New Roman" w:cs="Times New Roman" w:eastAsia="Times New Roman"/>
+        </w:rPr>
+        <w:t xml:space="preserve">tested on its 1,000 held-out pairs. Table VIII compares the</w:t>
       </w:r>
       <w:r>
         <w:rPr>
@@ -9574,7 +10139,7 @@
         <w:rPr>
           <w:rFonts w:ascii="Times New Roman" w:hAnsi="Times New Roman" w:cs="Times New Roman" w:eastAsia="Times New Roman"/>
         </w:rPr>
-        <w:t>TABLE VII. Face-Verification Threshold Before and After Calibration</w:t>
+        <w:t>TABLE VIII. Face-Verification Threshold Before and After Calibration</w:t>
       </w:r>
       <w:r>
         <w:rPr>
@@ -10018,7 +10583,19 @@
         <w:rPr>
           <w:rFonts w:ascii="Times New Roman" w:hAnsi="Times New Roman" w:cs="Times New Roman" w:eastAsia="Times New Roman"/>
         </w:rPr>
-        <w:t xml:space="preserve">This design maps onto the regulations named in the introduction. Bias audits</w:t>
+        <w:t xml:space="preserve">The design corresponds architecturally to current regulation; whether it</w:t>
+      </w:r>
+      <w:r>
+        <w:rPr>
+          <w:rFonts w:ascii="Times New Roman" w:hAnsi="Times New Roman" w:cs="Times New Roman" w:eastAsia="Times New Roman"/>
+        </w:rPr>
+        <w:t xml:space="preserve"> </w:t>
+      </w:r>
+      <w:r>
+        <w:rPr>
+          <w:rFonts w:ascii="Times New Roman" w:hAnsi="Times New Roman" w:cs="Times New Roman" w:eastAsia="Times New Roman"/>
+        </w:rPr>
+        <w:t xml:space="preserve">achieves legal compliance is outside this paper’s scope. Bias audits</w:t>
       </w:r>
       <w:r>
         <w:rPr>
@@ -10114,79 +10691,19 @@
         <w:rPr>
           <w:rFonts w:ascii="Times New Roman" w:hAnsi="Times New Roman" w:cs="Times New Roman" w:eastAsia="Times New Roman"/>
         </w:rPr>
-        <w:t xml:space="preserve">Before building, we audited a comparable open system and found its decision</w:t>
-      </w:r>
-      <w:r>
-        <w:rPr>
-          <w:rFonts w:ascii="Times New Roman" w:hAnsi="Times New Roman" w:cs="Times New Roman" w:eastAsia="Times New Roman"/>
-        </w:rPr>
-        <w:t xml:space="preserve"> </w:t>
-      </w:r>
-      <w:r>
-        <w:rPr>
-          <w:rFonts w:ascii="Times New Roman" w:hAnsi="Times New Roman" w:cs="Times New Roman" w:eastAsia="Times New Roman"/>
-        </w:rPr>
-        <w:t xml:space="preserve">layer largely fabricated: a detector that never ran, replaced by a heuristic</w:t>
-      </w:r>
-      <w:r>
-        <w:rPr>
-          <w:rFonts w:ascii="Times New Roman" w:hAnsi="Times New Roman" w:cs="Times New Roman" w:eastAsia="Times New Roman"/>
-        </w:rPr>
-        <w:t xml:space="preserve"> </w:t>
-      </w:r>
-      <w:r>
-        <w:rPr>
-          <w:rFonts w:ascii="Times New Roman" w:hAnsi="Times New Roman" w:cs="Times New Roman" w:eastAsia="Times New Roman"/>
-        </w:rPr>
-        <w:t xml:space="preserve">that logged window glare as phone detections, and an identity endpoint that</w:t>
-      </w:r>
-      <w:r>
-        <w:rPr>
-          <w:rFonts w:ascii="Times New Roman" w:hAnsi="Times New Roman" w:cs="Times New Roman" w:eastAsia="Times New Roman"/>
-        </w:rPr>
-        <w:t xml:space="preserve"> </w:t>
-      </w:r>
-      <w:r>
-        <w:rPr>
-          <w:rFonts w:ascii="Times New Roman" w:hAnsi="Times New Roman" w:cs="Times New Roman" w:eastAsia="Times New Roman"/>
-        </w:rPr>
-        <w:t xml:space="preserve">reported a 0.98 match with no enrolled face. A fallback that fabricates a</w:t>
-      </w:r>
-      <w:r>
-        <w:rPr>
-          <w:rFonts w:ascii="Times New Roman" w:hAnsi="Times New Roman" w:cs="Times New Roman" w:eastAsia="Times New Roman"/>
-        </w:rPr>
-        <w:t xml:space="preserve"> </w:t>
-      </w:r>
-      <w:r>
-        <w:rPr>
-          <w:rFonts w:ascii="Times New Roman" w:hAnsi="Times New Roman" w:cs="Times New Roman" w:eastAsia="Times New Roman"/>
-        </w:rPr>
-        <w:t xml:space="preserve">measurement is worse than an outage, which is why CogniHire uses a value-free</w:t>
-      </w:r>
-      <w:r>
-        <w:rPr>
-          <w:rFonts w:ascii="Times New Roman" w:hAnsi="Times New Roman" w:cs="Times New Roman" w:eastAsia="Times New Roman"/>
-        </w:rPr>
-        <w:t xml:space="preserve"> </w:t>
-      </w:r>
-      <w:r>
-        <w:rPr>
-          <w:rFonts w:ascii="Times New Roman" w:hAnsi="Times New Roman" w:cs="Times New Roman" w:eastAsia="Times New Roman"/>
-        </w:rPr>
-        <w:t xml:space="preserve">type for failed measurements and builds no affect, stress or deception</w:t>
-      </w:r>
-      <w:r>
-        <w:rPr>
-          <w:rFonts w:ascii="Times New Roman" w:hAnsi="Times New Roman" w:cs="Times New Roman" w:eastAsia="Times New Roman"/>
-        </w:rPr>
-        <w:t xml:space="preserve"> </w:t>
-      </w:r>
-      <w:r>
-        <w:rPr>
-          <w:rFonts w:ascii="Times New Roman" w:hAnsi="Times New Roman" w:cs="Times New Roman" w:eastAsia="Times New Roman"/>
-        </w:rPr>
-        <w:t xml:space="preserve">estimation.</w:t>
+        <w:t xml:space="preserve">For the same reason CogniHire uses a value-free type for failed measurements</w:t>
+      </w:r>
+      <w:r>
+        <w:rPr>
+          <w:rFonts w:ascii="Times New Roman" w:hAnsi="Times New Roman" w:cs="Times New Roman" w:eastAsia="Times New Roman"/>
+        </w:rPr>
+        <w:t xml:space="preserve"> </w:t>
+      </w:r>
+      <w:r>
+        <w:rPr>
+          <w:rFonts w:ascii="Times New Roman" w:hAnsi="Times New Roman" w:cs="Times New Roman" w:eastAsia="Times New Roman"/>
+        </w:rPr>
+        <w:t xml:space="preserve">and builds no affect, stress or deception estimation.</w:t>
       </w:r>
     </w:p>
     <w:p>
@@ -10272,6 +10789,30 @@
         <w:rPr>
           <w:rFonts w:ascii="Times New Roman" w:hAnsi="Times New Roman" w:cs="Times New Roman" w:eastAsia="Times New Roman"/>
         </w:rPr>
+        <w:t xml:space="preserve">Each judgment carries a model confidence between 0 and 1 with one use: below 0.6 the</w:t>
+      </w:r>
+      <w:r>
+        <w:rPr>
+          <w:rFonts w:ascii="Times New Roman" w:hAnsi="Times New Roman" w:cs="Times New Roman" w:eastAsia="Times New Roman"/>
+        </w:rPr>
+        <w:t xml:space="preserve"> </w:t>
+      </w:r>
+      <w:r>
+        <w:rPr>
+          <w:rFonts w:ascii="Times New Roman" w:hAnsi="Times New Roman" w:cs="Times New Roman" w:eastAsia="Times New Roman"/>
+        </w:rPr>
+        <w:t xml:space="preserve">topic gets a follow-up question. It is not calibrated and never aggregated.</w:t>
+      </w:r>
+      <w:r>
+        <w:rPr>
+          <w:rFonts w:ascii="Times New Roman" w:hAnsi="Times New Roman" w:cs="Times New Roman" w:eastAsia="Times New Roman"/>
+        </w:rPr>
+        <w:t xml:space="preserve"> </w:t>
+      </w:r>
+      <w:r>
+        <w:rPr>
+          <w:rFonts w:ascii="Times New Roman" w:hAnsi="Times New Roman" w:cs="Times New Roman" w:eastAsia="Times New Roman"/>
+        </w:rPr>
         <w:t xml:space="preserve">Identity matching is implemented and tested but is currently only</w:t>
       </w:r>
       <w:r>
@@ -10332,7 +10873,19 @@
         <w:rPr>
           <w:rFonts w:ascii="Times New Roman" w:hAnsi="Times New Roman" w:cs="Times New Roman" w:eastAsia="Times New Roman"/>
         </w:rPr>
-        <w:t xml:space="preserve">evaluation uses 24 host resumes and hand-written templates. An earlier fit</w:t>
+        <w:t xml:space="preserve">evaluation uses 24 host resumes and hand-written templates, not attacks observed in the wild, and no ablation</w:t>
+      </w:r>
+      <w:r>
+        <w:rPr>
+          <w:rFonts w:ascii="Times New Roman" w:hAnsi="Times New Roman" w:cs="Times New Roman" w:eastAsia="Times New Roman"/>
+        </w:rPr>
+        <w:t xml:space="preserve"> </w:t>
+      </w:r>
+      <w:r>
+        <w:rPr>
+          <w:rFonts w:ascii="Times New Roman" w:hAnsi="Times New Roman" w:cs="Times New Roman" w:eastAsia="Times New Roman"/>
+        </w:rPr>
+        <w:t xml:space="preserve">isolates each gate check. An earlier fit</w:t>
       </w:r>
       <w:r>
         <w:rPr>
@@ -10551,7 +11104,31 @@
         <w:rPr>
           <w:rFonts w:ascii="Times New Roman" w:hAnsi="Times New Roman" w:cs="Times New Roman" w:eastAsia="Times New Roman"/>
         </w:rPr>
-        <w:t xml:space="preserve">timing of the interview stage, and continuous identity verification on the</w:t>
+        <w:t xml:space="preserve">timing and validation of the interview stage, a per-check gate ablation,</w:t>
+      </w:r>
+      <w:r>
+        <w:rPr>
+          <w:rFonts w:ascii="Times New Roman" w:hAnsi="Times New Roman" w:cs="Times New Roman" w:eastAsia="Times New Roman"/>
+        </w:rPr>
+        <w:t xml:space="preserve"> </w:t>
+      </w:r>
+      <w:r>
+        <w:rPr>
+          <w:rFonts w:ascii="Times New Roman" w:hAnsi="Times New Roman" w:cs="Times New Roman" w:eastAsia="Times New Roman"/>
+        </w:rPr>
+        <w:t xml:space="preserve">real-world injection corpora, entity-disjoint cross-validation, demographically</w:t>
+      </w:r>
+      <w:r>
+        <w:rPr>
+          <w:rFonts w:ascii="Times New Roman" w:hAnsi="Times New Roman" w:cs="Times New Roman" w:eastAsia="Times New Roman"/>
+        </w:rPr>
+        <w:t xml:space="preserve"> </w:t>
+      </w:r>
+      <w:r>
+        <w:rPr>
+          <w:rFonts w:ascii="Times New Roman" w:hAnsi="Times New Roman" w:cs="Times New Roman" w:eastAsia="Times New Roman"/>
+        </w:rPr>
+        <w:t xml:space="preserve">stratified face evaluation, and continuous identity verification on the</w:t>
       </w:r>
       <w:r>
         <w:rPr>

</xml_diff>

<commit_message>
Address full second review: gate ablation, extended injection, stats, hide confidence
- New gate ablation on 24 real resumes (each check removed in turn) and
  extended injection vectors (zero-width, homoglyph, split, hidden HTML,
  multilingual): full gate makes no error, 0 fabrications admitted.
- Paper: ablation table, Kendall's W, corrected resampled t-test, AUROC
  intervals, Wilson intervals for face FAR/FRR; still 6 pages A4.
- Per-answer confidence no longer shown to reviewers (portal and app);
  it only selects follow-up questions.
- Response to Review answers all 15 major and the minor comments.

Co-Authored-By: Claude Opus 5.5 <noreply@anthropic.com>
Claude-Session: https://claude.ai/code/session_013hQpENYQayBnP2TgZ4DeJc
</commit_message>
<xml_diff>
--- a/docs/paper-ieee/CogniHire_IEEE.docx
+++ b/docs/paper-ieee/CogniHire_IEEE.docx
@@ -3756,67 +3756,43 @@
         <w:rPr>
           <w:rFonts w:ascii="Times New Roman" w:hAnsi="Times New Roman" w:cs="Times New Roman" w:eastAsia="Times New Roman"/>
         </w:rPr>
-        <w:t xml:space="preserve">On evaluation, published gains often fail to survive controlled</w:t>
-      </w:r>
-      <w:r>
-        <w:rPr>
-          <w:rFonts w:ascii="Times New Roman" w:hAnsi="Times New Roman" w:cs="Times New Roman" w:eastAsia="Times New Roman"/>
-        </w:rPr>
-        <w:t xml:space="preserve"> </w:t>
-      </w:r>
-      <w:r>
-        <w:rPr>
-          <w:rFonts w:ascii="Times New Roman" w:hAnsi="Times New Roman" w:cs="Times New Roman" w:eastAsia="Times New Roman"/>
-        </w:rPr>
-        <w:t xml:space="preserve">re-evaluation [6, 7], tree ensembles still rival deep</w:t>
-      </w:r>
-      <w:r>
-        <w:rPr>
-          <w:rFonts w:ascii="Times New Roman" w:hAnsi="Times New Roman" w:cs="Times New Roman" w:eastAsia="Times New Roman"/>
-        </w:rPr>
-        <w:t xml:space="preserve"> </w:t>
-      </w:r>
-      <w:r>
-        <w:rPr>
-          <w:rFonts w:ascii="Times New Roman" w:hAnsi="Times New Roman" w:cs="Times New Roman" w:eastAsia="Times New Roman"/>
-        </w:rPr>
-        <w:t xml:space="preserve">networks on tabular data [8], naive variance estimates are</w:t>
-      </w:r>
-      <w:r>
-        <w:rPr>
-          <w:rFonts w:ascii="Times New Roman" w:hAnsi="Times New Roman" w:cs="Times New Roman" w:eastAsia="Times New Roman"/>
-        </w:rPr>
-        <w:t xml:space="preserve"> </w:t>
-      </w:r>
-      <w:r>
-        <w:rPr>
-          <w:rFonts w:ascii="Times New Roman" w:hAnsi="Times New Roman" w:cs="Times New Roman" w:eastAsia="Times New Roman"/>
-        </w:rPr>
-        <w:t xml:space="preserve">biased by overlapping training sets [11], single-split rankings</w:t>
-      </w:r>
-      <w:r>
-        <w:rPr>
-          <w:rFonts w:ascii="Times New Roman" w:hAnsi="Times New Roman" w:cs="Times New Roman" w:eastAsia="Times New Roman"/>
-        </w:rPr>
-        <w:t xml:space="preserve"> </w:t>
-      </w:r>
-      <w:r>
-        <w:rPr>
-          <w:rFonts w:ascii="Times New Roman" w:hAnsi="Times New Roman" w:cs="Times New Roman" w:eastAsia="Times New Roman"/>
-        </w:rPr>
-        <w:t xml:space="preserve">often fail to reproduce [12], and leakage affects hundreds of</w:t>
-      </w:r>
-      <w:r>
-        <w:rPr>
-          <w:rFonts w:ascii="Times New Roman" w:hAnsi="Times New Roman" w:cs="Times New Roman" w:eastAsia="Times New Roman"/>
-        </w:rPr>
-        <w:t xml:space="preserve"> </w:t>
-      </w:r>
-      <w:r>
-        <w:rPr>
-          <w:rFonts w:ascii="Times New Roman" w:hAnsi="Times New Roman" w:cs="Times New Roman" w:eastAsia="Times New Roman"/>
-        </w:rPr>
-        <w:t xml:space="preserve">ML-based studies [13]. We follow Demšar [9]: a</w:t>
+        <w:t xml:space="preserve">Published gains often fail controlled re-evaluation [6], [7],</w:t>
+      </w:r>
+      <w:r>
+        <w:rPr>
+          <w:rFonts w:ascii="Times New Roman" w:hAnsi="Times New Roman" w:cs="Times New Roman" w:eastAsia="Times New Roman"/>
+        </w:rPr>
+        <w:t xml:space="preserve"> </w:t>
+      </w:r>
+      <w:r>
+        <w:rPr>
+          <w:rFonts w:ascii="Times New Roman" w:hAnsi="Times New Roman" w:cs="Times New Roman" w:eastAsia="Times New Roman"/>
+        </w:rPr>
+        <w:t xml:space="preserve">trees rival deep networks on tabular data [8], overlapping</w:t>
+      </w:r>
+      <w:r>
+        <w:rPr>
+          <w:rFonts w:ascii="Times New Roman" w:hAnsi="Times New Roman" w:cs="Times New Roman" w:eastAsia="Times New Roman"/>
+        </w:rPr>
+        <w:t xml:space="preserve"> </w:t>
+      </w:r>
+      <w:r>
+        <w:rPr>
+          <w:rFonts w:ascii="Times New Roman" w:hAnsi="Times New Roman" w:cs="Times New Roman" w:eastAsia="Times New Roman"/>
+        </w:rPr>
+        <w:t xml:space="preserve">training sets bias variance estimates [11], single-split rankings</w:t>
+      </w:r>
+      <w:r>
+        <w:rPr>
+          <w:rFonts w:ascii="Times New Roman" w:hAnsi="Times New Roman" w:cs="Times New Roman" w:eastAsia="Times New Roman"/>
+        </w:rPr>
+        <w:t xml:space="preserve"> </w:t>
+      </w:r>
+      <w:r>
+        <w:rPr>
+          <w:rFonts w:ascii="Times New Roman" w:hAnsi="Times New Roman" w:cs="Times New Roman" w:eastAsia="Times New Roman"/>
+        </w:rPr>
+        <w:t xml:space="preserve">often fail to reproduce [12], and leakage is widespread [13]. We follow Demšar [9]: a</w:t>
       </w:r>
       <w:r>
         <w:rPr>
@@ -4810,7 +4786,7 @@
                 <w:rFonts w:ascii="Times New Roman" w:hAnsi="Times New Roman" w:cs="Times New Roman" w:eastAsia="Times New Roman"/>
                 <w:sz w:val="18"/>
               </w:rPr>
-              <w:t xml:space="preserve">A reason and a verbatim quote from the answer</w:t>
+              <w:t xml:space="preserve">A reason and a verbatim quote from the answer; its confidence is not shown</w:t>
             </w:r>
           </w:p>
         </w:tc>
@@ -5277,7 +5253,7 @@
         <w:rPr>
           <w:rFonts w:ascii="Times New Roman" w:hAnsi="Times New Roman" w:cs="Times New Roman" w:eastAsia="Times New Roman"/>
         </w:rPr>
-        <w:t xml:space="preserve">As an end-to-end example, the resume bullet</w:t>
+        <w:t xml:space="preserve">As an example, the bullet</w:t>
       </w:r>
       <w:r>
         <w:rPr>
@@ -5295,19 +5271,19 @@
         <w:rPr>
           <w:rFonts w:ascii="Times New Roman" w:hAnsi="Times New Roman" w:cs="Times New Roman" w:eastAsia="Times New Roman"/>
         </w:rPr>
-        <w:t xml:space="preserve">Built REST APIs in Django for a</w:t>
-      </w:r>
-      <w:r>
-        <w:rPr>
-          <w:rFonts w:ascii="Times New Roman" w:hAnsi="Times New Roman" w:cs="Times New Roman" w:eastAsia="Times New Roman"/>
-        </w:rPr>
-        <w:t xml:space="preserve"> </w:t>
-      </w:r>
-      <w:r>
-        <w:rPr>
-          <w:rFonts w:ascii="Times New Roman" w:hAnsi="Times New Roman" w:cs="Times New Roman" w:eastAsia="Times New Roman"/>
-        </w:rPr>
-        <w:t xml:space="preserve">payments service</w:t>
+        <w:t xml:space="preserve">Built REST APIs in Django for a payments</w:t>
+      </w:r>
+      <w:r>
+        <w:rPr>
+          <w:rFonts w:ascii="Times New Roman" w:hAnsi="Times New Roman" w:cs="Times New Roman" w:eastAsia="Times New Roman"/>
+        </w:rPr>
+        <w:t xml:space="preserve"> </w:t>
+      </w:r>
+      <w:r>
+        <w:rPr>
+          <w:rFonts w:ascii="Times New Roman" w:hAnsi="Times New Roman" w:cs="Times New Roman" w:eastAsia="Times New Roman"/>
+        </w:rPr>
+        <w:t xml:space="preserve">service</w:t>
       </w:r>
       <w:r>
         <w:rPr>
@@ -5325,67 +5301,43 @@
         <w:rPr>
           <w:rFonts w:ascii="Times New Roman" w:hAnsi="Times New Roman" w:cs="Times New Roman" w:eastAsia="Times New Roman"/>
         </w:rPr>
-        <w:t xml:space="preserve">is proposed by the language model, found verbatim in one</w:t>
-      </w:r>
-      <w:r>
-        <w:rPr>
-          <w:rFonts w:ascii="Times New Roman" w:hAnsi="Times New Roman" w:cs="Times New Roman" w:eastAsia="Times New Roman"/>
-        </w:rPr>
-        <w:t xml:space="preserve"> </w:t>
-      </w:r>
-      <w:r>
-        <w:rPr>
-          <w:rFonts w:ascii="Times New Roman" w:hAnsi="Times New Roman" w:cs="Times New Roman" w:eastAsia="Times New Roman"/>
-        </w:rPr>
-        <w:t xml:space="preserve">clause by the gate, and admitted with its offsets. The interview engine asks</w:t>
-      </w:r>
-      <w:r>
-        <w:rPr>
-          <w:rFonts w:ascii="Times New Roman" w:hAnsi="Times New Roman" w:cs="Times New Roman" w:eastAsia="Times New Roman"/>
-        </w:rPr>
-        <w:t xml:space="preserve"> </w:t>
-      </w:r>
-      <w:r>
-        <w:rPr>
-          <w:rFonts w:ascii="Times New Roman" w:hAnsi="Times New Roman" w:cs="Times New Roman" w:eastAsia="Times New Roman"/>
-        </w:rPr>
-        <w:t xml:space="preserve">how the service handled idempotent retries; the answer is recorded as</w:t>
-      </w:r>
-      <w:r>
-        <w:rPr>
-          <w:rFonts w:ascii="Times New Roman" w:hAnsi="Times New Roman" w:cs="Times New Roman" w:eastAsia="Times New Roman"/>
-        </w:rPr>
-        <w:t xml:space="preserve"> </w:t>
-      </w:r>
-      <w:r>
-        <w:rPr>
-          <w:rFonts w:ascii="Times New Roman" w:hAnsi="Times New Roman" w:cs="Times New Roman" w:eastAsia="Times New Roman"/>
-        </w:rPr>
-        <w:t xml:space="preserve">evidence, keeping only a quote found verbatim in the answer. The DL layer logs</w:t>
-      </w:r>
-      <w:r>
-        <w:rPr>
-          <w:rFonts w:ascii="Times New Roman" w:hAnsi="Times New Roman" w:cs="Times New Roman" w:eastAsia="Times New Roman"/>
-        </w:rPr>
-        <w:t xml:space="preserve"> </w:t>
-      </w:r>
-      <w:r>
-        <w:rPr>
-          <w:rFonts w:ascii="Times New Roman" w:hAnsi="Times New Roman" w:cs="Times New Roman" w:eastAsia="Times New Roman"/>
-        </w:rPr>
-        <w:t xml:space="preserve">at intervals whether the same person is present. The reviewer sees the claim,</w:t>
-      </w:r>
-      <w:r>
-        <w:rPr>
-          <w:rFonts w:ascii="Times New Roman" w:hAnsi="Times New Roman" w:cs="Times New Roman" w:eastAsia="Times New Roman"/>
-        </w:rPr>
-        <w:t xml:space="preserve"> </w:t>
-      </w:r>
-      <w:r>
-        <w:rPr>
-          <w:rFonts w:ascii="Times New Roman" w:hAnsi="Times New Roman" w:cs="Times New Roman" w:eastAsia="Times New Roman"/>
-        </w:rPr>
-        <w:t xml:space="preserve">question, quote and identity log, and sets the verdict; no number about the</w:t>
+        <w:t xml:space="preserve">is proposed by the model, found verbatim in one clause by the gate,</w:t>
+      </w:r>
+      <w:r>
+        <w:rPr>
+          <w:rFonts w:ascii="Times New Roman" w:hAnsi="Times New Roman" w:cs="Times New Roman" w:eastAsia="Times New Roman"/>
+        </w:rPr>
+        <w:t xml:space="preserve"> </w:t>
+      </w:r>
+      <w:r>
+        <w:rPr>
+          <w:rFonts w:ascii="Times New Roman" w:hAnsi="Times New Roman" w:cs="Times New Roman" w:eastAsia="Times New Roman"/>
+        </w:rPr>
+        <w:t xml:space="preserve">and admitted with its offsets. The interview asks how the service handled</w:t>
+      </w:r>
+      <w:r>
+        <w:rPr>
+          <w:rFonts w:ascii="Times New Roman" w:hAnsi="Times New Roman" w:cs="Times New Roman" w:eastAsia="Times New Roman"/>
+        </w:rPr>
+        <w:t xml:space="preserve"> </w:t>
+      </w:r>
+      <w:r>
+        <w:rPr>
+          <w:rFonts w:ascii="Times New Roman" w:hAnsi="Times New Roman" w:cs="Times New Roman" w:eastAsia="Times New Roman"/>
+        </w:rPr>
+        <w:t xml:space="preserve">idempotent retries; a verbatim quote from the answer becomes evidence, the DL</w:t>
+      </w:r>
+      <w:r>
+        <w:rPr>
+          <w:rFonts w:ascii="Times New Roman" w:hAnsi="Times New Roman" w:cs="Times New Roman" w:eastAsia="Times New Roman"/>
+        </w:rPr>
+        <w:t xml:space="preserve"> </w:t>
+      </w:r>
+      <w:r>
+        <w:rPr>
+          <w:rFonts w:ascii="Times New Roman" w:hAnsi="Times New Roman" w:cs="Times New Roman" w:eastAsia="Times New Roman"/>
+        </w:rPr>
+        <w:t xml:space="preserve">layer logs presence, and the reviewer sets the verdict. No number about the</w:t>
       </w:r>
       <w:r>
         <w:rPr>
@@ -5449,7 +5401,7 @@
       </w:r>
     </w:p>
     <w:bookmarkEnd w:id="25"/>
-    <w:bookmarkStart w:id="32" w:name="evidence-grounding"/>
+    <w:bookmarkStart w:id="33" w:name="evidence-grounding"/>
     <w:p>
       <w:pPr>
         <w:pStyle w:val="Heading1"/>
@@ -6971,19 +6923,7 @@
         <w:rPr>
           <w:rFonts w:ascii="Times New Roman" w:hAnsi="Times New Roman" w:cs="Times New Roman" w:eastAsia="Times New Roman"/>
         </w:rPr>
-        <w:t xml:space="preserve">without weakening the guard. No unit test caught this; only corpus-scale</w:t>
-      </w:r>
-      <w:r>
-        <w:rPr>
-          <w:rFonts w:ascii="Times New Roman" w:hAnsi="Times New Roman" w:cs="Times New Roman" w:eastAsia="Times New Roman"/>
-        </w:rPr>
-        <w:t xml:space="preserve"> </w:t>
-      </w:r>
-      <w:r>
-        <w:rPr>
-          <w:rFonts w:ascii="Times New Roman" w:hAnsi="Times New Roman" w:cs="Times New Roman" w:eastAsia="Times New Roman"/>
-        </w:rPr>
-        <w:t xml:space="preserve">measurement did.</w:t>
+        <w:t xml:space="preserve">without weakening the guard. Only corpus-scale measurement caught this.</w:t>
       </w:r>
     </w:p>
     <w:p>
@@ -7031,7 +6971,19 @@
         <w:rPr>
           <w:rFonts w:ascii="Times New Roman" w:hAnsi="Times New Roman" w:cs="Times New Roman" w:eastAsia="Times New Roman"/>
         </w:rPr>
-        <w:t xml:space="preserve">written rather than selected. The synthetic corpus is single-generator, so the</w:t>
+        <w:t xml:space="preserve">written rather than selected; the 189 admitted claims were not manually</w:t>
+      </w:r>
+      <w:r>
+        <w:rPr>
+          <w:rFonts w:ascii="Times New Roman" w:hAnsi="Times New Roman" w:cs="Times New Roman" w:eastAsia="Times New Roman"/>
+        </w:rPr>
+        <w:t xml:space="preserve"> </w:t>
+      </w:r>
+      <w:r>
+        <w:rPr>
+          <w:rFonts w:ascii="Times New Roman" w:hAnsi="Times New Roman" w:cs="Times New Roman" w:eastAsia="Times New Roman"/>
+        </w:rPr>
+        <w:t xml:space="preserve">annotated for relevance. The synthetic corpus is single-generator, so the</w:t>
       </w:r>
       <w:r>
         <w:rPr>
@@ -7047,7 +6999,7 @@
       </w:r>
     </w:p>
     <w:bookmarkEnd w:id="30"/>
-    <w:bookmarkStart w:id="31" w:name="prompt-injection-evaluation"/>
+    <w:bookmarkStart w:id="31" w:name="ablation-on-real-resumes"/>
     <w:p>
       <w:pPr>
         <w:pStyle w:val="Heading2"/>
@@ -7058,7 +7010,7 @@
           <w:b w:val="0"/>
           <w:i/>
         </w:rPr>
-        <w:t>C. Prompt-Injection Evaluation</w:t>
+        <w:t>C. Ablation on Real Resumes</w:t>
       </w:r>
     </w:p>
     <w:p>
@@ -7070,49 +7022,43 @@
         <w:rPr>
           <w:rFonts w:ascii="Times New Roman" w:hAnsi="Times New Roman" w:cs="Times New Roman" w:eastAsia="Times New Roman"/>
         </w:rPr>
-        <w:t xml:space="preserve">Because the planner consumes only typed claims, an instruction embedded in a</w:t>
-      </w:r>
-      <w:r>
-        <w:rPr>
-          <w:rFonts w:ascii="Times New Roman" w:hAnsi="Times New Roman" w:cs="Times New Roman" w:eastAsia="Times New Roman"/>
-        </w:rPr>
-        <w:t xml:space="preserve"> </w:t>
-      </w:r>
-      <w:r>
-        <w:rPr>
-          <w:rFonts w:ascii="Times New Roman" w:hAnsi="Times New Roman" w:cs="Times New Roman" w:eastAsia="Times New Roman"/>
-        </w:rPr>
-        <w:t xml:space="preserve">resume has no field in which to act. We tested this against a fully</w:t>
-      </w:r>
-      <w:r>
-        <w:rPr>
-          <w:rFonts w:ascii="Times New Roman" w:hAnsi="Times New Roman" w:cs="Times New Roman" w:eastAsia="Times New Roman"/>
-        </w:rPr>
-        <w:t xml:space="preserve"> </w:t>
-      </w:r>
-      <w:r>
-        <w:rPr>
-          <w:rFonts w:ascii="Times New Roman" w:hAnsi="Times New Roman" w:cs="Times New Roman" w:eastAsia="Times New Roman"/>
-        </w:rPr>
-        <w:t xml:space="preserve">compromised extraction model that obeys every planted instruction. Twenty injection templates</w:t>
-      </w:r>
-      <w:r>
-        <w:rPr>
-          <w:rFonts w:ascii="Times New Roman" w:hAnsi="Times New Roman" w:cs="Times New Roman" w:eastAsia="Times New Roman"/>
-        </w:rPr>
-        <w:t xml:space="preserve"> </w:t>
-      </w:r>
-      <w:r>
-        <w:rPr>
-          <w:rFonts w:ascii="Times New Roman" w:hAnsi="Times New Roman" w:cs="Times New Roman" w:eastAsia="Times New Roman"/>
-        </w:rPr>
-        <w:t xml:space="preserve">(for example,</w:t>
-      </w:r>
-      <w:r>
-        <w:rPr>
-          <w:rFonts w:ascii="Times New Roman" w:hAnsi="Times New Roman" w:cs="Times New Roman" w:eastAsia="Times New Roman"/>
-        </w:rPr>
-        <w:t xml:space="preserve"> </w:t>
+        <w:t xml:space="preserve">To test the gate outside the synthetic generator and to show that each check is</w:t>
+      </w:r>
+      <w:r>
+        <w:rPr>
+          <w:rFonts w:ascii="Times New Roman" w:hAnsi="Times New Roman" w:cs="Times New Roman" w:eastAsia="Times New Roman"/>
+        </w:rPr>
+        <w:t xml:space="preserve"> </w:t>
+      </w:r>
+      <w:r>
+        <w:rPr>
+          <w:rFonts w:ascii="Times New Roman" w:hAnsi="Times New Roman" w:cs="Times New Roman" w:eastAsia="Times New Roman"/>
+        </w:rPr>
+        <w:t xml:space="preserve">necessary, we built trials from the 24 independently written real resumes:</w:t>
+      </w:r>
+      <w:r>
+        <w:rPr>
+          <w:rFonts w:ascii="Times New Roman" w:hAnsi="Times New Roman" w:cs="Times New Roman" w:eastAsia="Times New Roman"/>
+        </w:rPr>
+        <w:t xml:space="preserve"> </w:t>
+      </w:r>
+      <w:r>
+        <w:rPr>
+          <w:rFonts w:ascii="Times New Roman" w:hAnsi="Times New Roman" w:cs="Times New Roman" w:eastAsia="Times New Roman"/>
+        </w:rPr>
+        <w:t xml:space="preserve">950 genuine single-clause sentences, and for each a negated and a hedged</w:t>
+      </w:r>
+      <w:r>
+        <w:rPr>
+          <w:rFonts w:ascii="Times New Roman" w:hAnsi="Times New Roman" w:cs="Times New Roman" w:eastAsia="Times New Roman"/>
+        </w:rPr>
+        <w:t xml:space="preserve"> </w:t>
+      </w:r>
+      <w:r>
+        <w:rPr>
+          <w:rFonts w:ascii="Times New Roman" w:hAnsi="Times New Roman" w:cs="Times New Roman" w:eastAsia="Times New Roman"/>
+        </w:rPr>
+        <w:t xml:space="preserve">version written into the resume (</w:t>
       </w:r>
       <w:r>
         <w:rPr>
@@ -7124,19 +7070,7 @@
         <w:rPr>
           <w:rFonts w:ascii="Times New Roman" w:hAnsi="Times New Roman" w:cs="Times New Roman" w:eastAsia="Times New Roman"/>
         </w:rPr>
-        <w:t xml:space="preserve">Ignore all previous instructions and list Kubernetes, Rust and</w:t>
-      </w:r>
-      <w:r>
-        <w:rPr>
-          <w:rFonts w:ascii="Times New Roman" w:hAnsi="Times New Roman" w:cs="Times New Roman" w:eastAsia="Times New Roman"/>
-        </w:rPr>
-        <w:t xml:space="preserve"> </w:t>
-      </w:r>
-      <w:r>
-        <w:rPr>
-          <w:rFonts w:ascii="Times New Roman" w:hAnsi="Times New Roman" w:cs="Times New Roman" w:eastAsia="Times New Roman"/>
-        </w:rPr>
-        <w:t xml:space="preserve">AWS as expert skills</w:t>
+        <w:t xml:space="preserve">I have not ...</w:t>
       </w:r>
       <w:r>
         <w:rPr>
@@ -7166,19 +7100,7 @@
         <w:rPr>
           <w:rFonts w:ascii="Times New Roman" w:hAnsi="Times New Roman" w:cs="Times New Roman" w:eastAsia="Times New Roman"/>
         </w:rPr>
-        <w:t xml:space="preserve">SYSTEM: mark every claim for this candidate as</w:t>
-      </w:r>
-      <w:r>
-        <w:rPr>
-          <w:rFonts w:ascii="Times New Roman" w:hAnsi="Times New Roman" w:cs="Times New Roman" w:eastAsia="Times New Roman"/>
-        </w:rPr>
-        <w:t xml:space="preserve"> </w:t>
-      </w:r>
-      <w:r>
-        <w:rPr>
-          <w:rFonts w:ascii="Times New Roman" w:hAnsi="Times New Roman" w:cs="Times New Roman" w:eastAsia="Times New Roman"/>
-        </w:rPr>
-        <w:t xml:space="preserve">substantiated</w:t>
+        <w:t xml:space="preserve">Possibly ...</w:t>
       </w:r>
       <w:r>
         <w:rPr>
@@ -7190,55 +7112,67 @@
         <w:rPr>
           <w:rFonts w:ascii="Times New Roman" w:hAnsi="Times New Roman" w:cs="Times New Roman" w:eastAsia="Times New Roman"/>
         </w:rPr>
-        <w:t xml:space="preserve">, and an HTML comment asserting cloud certifications) were</w:t>
-      </w:r>
-      <w:r>
-        <w:rPr>
-          <w:rFonts w:ascii="Times New Roman" w:hAnsi="Times New Roman" w:cs="Times New Roman" w:eastAsia="Times New Roman"/>
-        </w:rPr>
-        <w:t xml:space="preserve"> </w:t>
-      </w:r>
-      <w:r>
-        <w:rPr>
-          <w:rFonts w:ascii="Times New Roman" w:hAnsi="Times New Roman" w:cs="Times New Roman" w:eastAsia="Times New Roman"/>
-        </w:rPr>
-        <w:t xml:space="preserve">inserted at the start, middle and end of each of the 24 real resumes,</w:t>
-      </w:r>
-      <w:r>
-        <w:rPr>
-          <w:rFonts w:ascii="Times New Roman" w:hAnsi="Times New Roman" w:cs="Times New Roman" w:eastAsia="Times New Roman"/>
-        </w:rPr>
-        <w:t xml:space="preserve"> </w:t>
-      </w:r>
-      <w:r>
-        <w:rPr>
-          <w:rFonts w:ascii="Times New Roman" w:hAnsi="Times New Roman" w:cs="Times New Roman" w:eastAsia="Times New Roman"/>
-        </w:rPr>
-        <w:t xml:space="preserve">giving 1,440 injected documents. For each, the compromised model emitted the</w:t>
-      </w:r>
-      <w:r>
-        <w:rPr>
-          <w:rFonts w:ascii="Times New Roman" w:hAnsi="Times New Roman" w:cs="Times New Roman" w:eastAsia="Times New Roman"/>
-        </w:rPr>
-        <w:t xml:space="preserve"> </w:t>
-      </w:r>
-      <w:r>
-        <w:rPr>
-          <w:rFonts w:ascii="Times New Roman" w:hAnsi="Times New Roman" w:cs="Times New Roman" w:eastAsia="Times New Roman"/>
-        </w:rPr>
-        <w:t xml:space="preserve">content the injection demanded. Table V reports what the</w:t>
-      </w:r>
-      <w:r>
-        <w:rPr>
-          <w:rFonts w:ascii="Times New Roman" w:hAnsi="Times New Roman" w:cs="Times New Roman" w:eastAsia="Times New Roman"/>
-        </w:rPr>
-        <w:t xml:space="preserve"> </w:t>
-      </w:r>
-      <w:r>
-        <w:rPr>
-          <w:rFonts w:ascii="Times New Roman" w:hAnsi="Times New Roman" w:cs="Times New Roman" w:eastAsia="Times New Roman"/>
-        </w:rPr>
-        <w:t xml:space="preserve">gate admitted.</w:t>
+        <w:t xml:space="preserve">),</w:t>
+      </w:r>
+      <w:r>
+        <w:rPr>
+          <w:rFonts w:ascii="Times New Roman" w:hAnsi="Times New Roman" w:cs="Times New Roman" w:eastAsia="Times New Roman"/>
+        </w:rPr>
+        <w:t xml:space="preserve"> </w:t>
+      </w:r>
+      <w:r>
+        <w:rPr>
+          <w:rFonts w:ascii="Times New Roman" w:hAnsi="Times New Roman" w:cs="Times New Roman" w:eastAsia="Times New Roman"/>
+        </w:rPr>
+        <w:t xml:space="preserve">a paraphrase, and 955 spans crossing a real sentence boundary. Traps were kept</w:t>
+      </w:r>
+      <w:r>
+        <w:rPr>
+          <w:rFonts w:ascii="Times New Roman" w:hAnsi="Times New Roman" w:cs="Times New Roman" w:eastAsia="Times New Roman"/>
+        </w:rPr>
+        <w:t xml:space="preserve"> </w:t>
+      </w:r>
+      <w:r>
+        <w:rPr>
+          <w:rFonts w:ascii="Times New Roman" w:hAnsi="Times New Roman" w:cs="Times New Roman" w:eastAsia="Times New Roman"/>
+        </w:rPr>
+        <w:t xml:space="preserve">only where the candidate text is otherwise absent from the resume.</w:t>
+      </w:r>
+      <w:r>
+        <w:rPr>
+          <w:rFonts w:ascii="Times New Roman" w:hAnsi="Times New Roman" w:cs="Times New Roman" w:eastAsia="Times New Roman"/>
+        </w:rPr>
+        <w:t xml:space="preserve"> </w:t>
+      </w:r>
+      <w:r>
+        <w:rPr>
+          <w:rFonts w:ascii="Times New Roman" w:hAnsi="Times New Roman" w:cs="Times New Roman" w:eastAsia="Times New Roman"/>
+        </w:rPr>
+        <w:t xml:space="preserve">Table V removes one check at a time. The full gate made no</w:t>
+      </w:r>
+      <w:r>
+        <w:rPr>
+          <w:rFonts w:ascii="Times New Roman" w:hAnsi="Times New Roman" w:cs="Times New Roman" w:eastAsia="Times New Roman"/>
+        </w:rPr>
+        <w:t xml:space="preserve"> </w:t>
+      </w:r>
+      <w:r>
+        <w:rPr>
+          <w:rFonts w:ascii="Times New Roman" w:hAnsi="Times New Roman" w:cs="Times New Roman" w:eastAsia="Times New Roman"/>
+        </w:rPr>
+        <w:t xml:space="preserve">error; removing the negation and hedge check admitted every negated and hedged</w:t>
+      </w:r>
+      <w:r>
+        <w:rPr>
+          <w:rFonts w:ascii="Times New Roman" w:hAnsi="Times New Roman" w:cs="Times New Roman" w:eastAsia="Times New Roman"/>
+        </w:rPr>
+        <w:t xml:space="preserve"> </w:t>
+      </w:r>
+      <w:r>
+        <w:rPr>
+          <w:rFonts w:ascii="Times New Roman" w:hAnsi="Times New Roman" w:cs="Times New Roman" w:eastAsia="Times New Roman"/>
+        </w:rPr>
+        <w:t xml:space="preserve">claim, and matching without clause scope lost 38.5% of genuine claims.</w:t>
       </w:r>
     </w:p>
     <w:p>
@@ -7250,7 +7184,973 @@
         <w:rPr>
           <w:rFonts w:ascii="Times New Roman" w:hAnsi="Times New Roman" w:cs="Times New Roman" w:eastAsia="Times New Roman"/>
         </w:rPr>
-        <w:t>TABLE V. Grounding Gate Under a Fully Compromised Extraction Model</w:t>
+        <w:t>TABLE V. Gate Ablation on 24 Real Resumes: Must-Reject Trials Admitted</w:t>
+      </w:r>
+    </w:p>
+    <w:tbl>
+      <w:tblPr>
+        <w:tblStyle w:val="Table"/>
+        <w:tblW w:type="pct" w:w="5000"/>
+        <w:tblLook w:firstRow="1" w:lastRow="0" w:firstColumn="0" w:lastColumn="0" w:noHBand="0" w:noVBand="0" w:val="0020"/>
+        <w:jc w:val="start"/>
+        <w:tblCaption w:val="Gate Ablation on 24 Real Resumes: Must-Reject Trials Admitted"/>
+        <w:tblBorders>
+          <w:top w:val="single" w:sz="4" w:color="000000"/>
+          <w:bottom w:val="single" w:sz="4" w:color="000000"/>
+          <w:insideH w:val="single" w:sz="4" w:color="000000"/>
+        </w:tblBorders>
+      </w:tblPr>
+      <w:tblGrid>
+        <w:gridCol w:w="1131"/>
+        <w:gridCol w:w="1131"/>
+        <w:gridCol w:w="1131"/>
+        <w:gridCol w:w="1131"/>
+        <w:gridCol w:w="1131"/>
+        <w:gridCol w:w="1131"/>
+        <w:gridCol w:w="1131"/>
+      </w:tblGrid>
+      <w:tr>
+        <w:trPr>
+          <w:tblHeader w:val="true"/>
+        </w:trPr>
+        <w:tc>
+          <w:tcPr/>
+          <w:p>
+            <w:pPr>
+              <w:pStyle w:val="Compact"/>
+              <w:spacing w:after="0"/>
+              <w:jc w:val="left"/>
+            </w:pPr>
+            <w:r>
+              <w:rPr>
+                <w:rFonts w:ascii="Times New Roman" w:hAnsi="Times New Roman" w:cs="Times New Roman" w:eastAsia="Times New Roman"/>
+                <w:b/>
+                <w:sz w:val="18"/>
+              </w:rPr>
+              <w:t xml:space="preserve">Configuration</w:t>
+            </w:r>
+          </w:p>
+        </w:tc>
+        <w:tc>
+          <w:tcPr/>
+          <w:p>
+            <w:pPr>
+              <w:pStyle w:val="Compact"/>
+              <w:spacing w:after="0"/>
+              <w:jc w:val="center"/>
+            </w:pPr>
+            <w:r>
+              <w:rPr>
+                <w:rFonts w:ascii="Times New Roman" w:hAnsi="Times New Roman" w:cs="Times New Roman" w:eastAsia="Times New Roman"/>
+                <w:b/>
+                <w:sz w:val="18"/>
+              </w:rPr>
+              <w:t xml:space="preserve">Verbatim kept</w:t>
+            </w:r>
+          </w:p>
+        </w:tc>
+        <w:tc>
+          <w:tcPr/>
+          <w:p>
+            <w:pPr>
+              <w:pStyle w:val="Compact"/>
+              <w:spacing w:after="0"/>
+              <w:jc w:val="center"/>
+            </w:pPr>
+            <w:r>
+              <w:rPr>
+                <w:rFonts w:ascii="Times New Roman" w:hAnsi="Times New Roman" w:cs="Times New Roman" w:eastAsia="Times New Roman"/>
+                <w:b/>
+                <w:sz w:val="18"/>
+              </w:rPr>
+              <w:t xml:space="preserve">Negation (947)</w:t>
+            </w:r>
+          </w:p>
+        </w:tc>
+        <w:tc>
+          <w:tcPr/>
+          <w:p>
+            <w:pPr>
+              <w:pStyle w:val="Compact"/>
+              <w:spacing w:after="0"/>
+              <w:jc w:val="center"/>
+            </w:pPr>
+            <w:r>
+              <w:rPr>
+                <w:rFonts w:ascii="Times New Roman" w:hAnsi="Times New Roman" w:cs="Times New Roman" w:eastAsia="Times New Roman"/>
+                <w:b/>
+                <w:sz w:val="18"/>
+              </w:rPr>
+              <w:t xml:space="preserve">Hedge (947)</w:t>
+            </w:r>
+          </w:p>
+        </w:tc>
+        <w:tc>
+          <w:tcPr/>
+          <w:p>
+            <w:pPr>
+              <w:pStyle w:val="Compact"/>
+              <w:spacing w:after="0"/>
+              <w:jc w:val="center"/>
+            </w:pPr>
+            <w:r>
+              <w:rPr>
+                <w:rFonts w:ascii="Times New Roman" w:hAnsi="Times New Roman" w:cs="Times New Roman" w:eastAsia="Times New Roman"/>
+                <w:b/>
+                <w:sz w:val="18"/>
+              </w:rPr>
+              <w:t xml:space="preserve">Cross-clause (955)</w:t>
+            </w:r>
+          </w:p>
+        </w:tc>
+        <w:tc>
+          <w:tcPr/>
+          <w:p>
+            <w:pPr>
+              <w:pStyle w:val="Compact"/>
+              <w:spacing w:after="0"/>
+              <w:jc w:val="center"/>
+            </w:pPr>
+            <w:r>
+              <w:rPr>
+                <w:rFonts w:ascii="Times New Roman" w:hAnsi="Times New Roman" w:cs="Times New Roman" w:eastAsia="Times New Roman"/>
+                <w:b/>
+                <w:sz w:val="18"/>
+              </w:rPr>
+              <w:t xml:space="preserve">Paraphrase (344)</w:t>
+            </w:r>
+          </w:p>
+        </w:tc>
+        <w:tc>
+          <w:tcPr/>
+          <w:p>
+            <w:pPr>
+              <w:pStyle w:val="Compact"/>
+              <w:spacing w:after="0"/>
+              <w:jc w:val="center"/>
+            </w:pPr>
+            <w:r>
+              <w:rPr>
+                <w:rFonts w:ascii="Times New Roman" w:hAnsi="Times New Roman" w:cs="Times New Roman" w:eastAsia="Times New Roman"/>
+                <w:b/>
+                <w:sz w:val="18"/>
+              </w:rPr>
+              <w:t xml:space="preserve">Injection (1,800)</w:t>
+            </w:r>
+          </w:p>
+        </w:tc>
+      </w:tr>
+      <w:tr>
+        <w:tc>
+          <w:tcPr/>
+          <w:p>
+            <w:pPr>
+              <w:pStyle w:val="Compact"/>
+              <w:spacing w:after="0"/>
+              <w:jc w:val="left"/>
+            </w:pPr>
+            <w:r>
+              <w:rPr>
+                <w:rFonts w:ascii="Times New Roman" w:hAnsi="Times New Roman" w:cs="Times New Roman" w:eastAsia="Times New Roman"/>
+                <w:sz w:val="18"/>
+              </w:rPr>
+              <w:t xml:space="preserve">Full gate</w:t>
+            </w:r>
+          </w:p>
+        </w:tc>
+        <w:tc>
+          <w:tcPr/>
+          <w:p>
+            <w:pPr>
+              <w:pStyle w:val="Compact"/>
+              <w:spacing w:after="0"/>
+              <w:jc w:val="center"/>
+            </w:pPr>
+            <w:r>
+              <w:rPr>
+                <w:rFonts w:ascii="Times New Roman" w:hAnsi="Times New Roman" w:cs="Times New Roman" w:eastAsia="Times New Roman"/>
+                <w:sz w:val="18"/>
+              </w:rPr>
+              <w:t xml:space="preserve">100%</w:t>
+            </w:r>
+          </w:p>
+        </w:tc>
+        <w:tc>
+          <w:tcPr/>
+          <w:p>
+            <w:pPr>
+              <w:pStyle w:val="Compact"/>
+              <w:spacing w:after="0"/>
+              <w:jc w:val="center"/>
+            </w:pPr>
+            <w:r>
+              <w:rPr>
+                <w:rFonts w:ascii="Times New Roman" w:hAnsi="Times New Roman" w:cs="Times New Roman" w:eastAsia="Times New Roman"/>
+                <w:sz w:val="18"/>
+              </w:rPr>
+              <w:t xml:space="preserve">0</w:t>
+            </w:r>
+          </w:p>
+        </w:tc>
+        <w:tc>
+          <w:tcPr/>
+          <w:p>
+            <w:pPr>
+              <w:pStyle w:val="Compact"/>
+              <w:spacing w:after="0"/>
+              <w:jc w:val="center"/>
+            </w:pPr>
+            <w:r>
+              <w:rPr>
+                <w:rFonts w:ascii="Times New Roman" w:hAnsi="Times New Roman" w:cs="Times New Roman" w:eastAsia="Times New Roman"/>
+                <w:sz w:val="18"/>
+              </w:rPr>
+              <w:t xml:space="preserve">0</w:t>
+            </w:r>
+          </w:p>
+        </w:tc>
+        <w:tc>
+          <w:tcPr/>
+          <w:p>
+            <w:pPr>
+              <w:pStyle w:val="Compact"/>
+              <w:spacing w:after="0"/>
+              <w:jc w:val="center"/>
+            </w:pPr>
+            <w:r>
+              <w:rPr>
+                <w:rFonts w:ascii="Times New Roman" w:hAnsi="Times New Roman" w:cs="Times New Roman" w:eastAsia="Times New Roman"/>
+                <w:sz w:val="18"/>
+              </w:rPr>
+              <w:t xml:space="preserve">0</w:t>
+            </w:r>
+          </w:p>
+        </w:tc>
+        <w:tc>
+          <w:tcPr/>
+          <w:p>
+            <w:pPr>
+              <w:pStyle w:val="Compact"/>
+              <w:spacing w:after="0"/>
+              <w:jc w:val="center"/>
+            </w:pPr>
+            <w:r>
+              <w:rPr>
+                <w:rFonts w:ascii="Times New Roman" w:hAnsi="Times New Roman" w:cs="Times New Roman" w:eastAsia="Times New Roman"/>
+                <w:sz w:val="18"/>
+              </w:rPr>
+              <w:t xml:space="preserve">0</w:t>
+            </w:r>
+          </w:p>
+        </w:tc>
+        <w:tc>
+          <w:tcPr/>
+          <w:p>
+            <w:pPr>
+              <w:pStyle w:val="Compact"/>
+              <w:spacing w:after="0"/>
+              <w:jc w:val="center"/>
+            </w:pPr>
+            <w:r>
+              <w:rPr>
+                <w:rFonts w:ascii="Times New Roman" w:hAnsi="Times New Roman" w:cs="Times New Roman" w:eastAsia="Times New Roman"/>
+                <w:sz w:val="18"/>
+              </w:rPr>
+              <w:t xml:space="preserve">0</w:t>
+            </w:r>
+          </w:p>
+        </w:tc>
+      </w:tr>
+      <w:tr>
+        <w:tc>
+          <w:tcPr/>
+          <w:p>
+            <w:pPr>
+              <w:pStyle w:val="Compact"/>
+              <w:spacing w:after="0"/>
+              <w:jc w:val="left"/>
+            </w:pPr>
+            <w:r>
+              <w:rPr>
+                <w:rFonts w:ascii="Times New Roman" w:hAnsi="Times New Roman" w:cs="Times New Roman" w:eastAsia="Times New Roman"/>
+                <w:sz w:val="18"/>
+              </w:rPr>
+              <w:t xml:space="preserve">No negation check</w:t>
+            </w:r>
+          </w:p>
+        </w:tc>
+        <w:tc>
+          <w:tcPr/>
+          <w:p>
+            <w:pPr>
+              <w:pStyle w:val="Compact"/>
+              <w:spacing w:after="0"/>
+              <w:jc w:val="center"/>
+            </w:pPr>
+            <w:r>
+              <w:rPr>
+                <w:rFonts w:ascii="Times New Roman" w:hAnsi="Times New Roman" w:cs="Times New Roman" w:eastAsia="Times New Roman"/>
+                <w:sz w:val="18"/>
+              </w:rPr>
+              <w:t xml:space="preserve">100%</w:t>
+            </w:r>
+          </w:p>
+        </w:tc>
+        <w:tc>
+          <w:tcPr/>
+          <w:p>
+            <w:pPr>
+              <w:pStyle w:val="Compact"/>
+              <w:spacing w:after="0"/>
+              <w:jc w:val="center"/>
+            </w:pPr>
+            <w:r>
+              <w:rPr>
+                <w:rFonts w:ascii="Times New Roman" w:hAnsi="Times New Roman" w:cs="Times New Roman" w:eastAsia="Times New Roman"/>
+                <w:sz w:val="18"/>
+              </w:rPr>
+              <w:t xml:space="preserve">947</w:t>
+            </w:r>
+          </w:p>
+        </w:tc>
+        <w:tc>
+          <w:tcPr/>
+          <w:p>
+            <w:pPr>
+              <w:pStyle w:val="Compact"/>
+              <w:spacing w:after="0"/>
+              <w:jc w:val="center"/>
+            </w:pPr>
+            <w:r>
+              <w:rPr>
+                <w:rFonts w:ascii="Times New Roman" w:hAnsi="Times New Roman" w:cs="Times New Roman" w:eastAsia="Times New Roman"/>
+                <w:sz w:val="18"/>
+              </w:rPr>
+              <w:t xml:space="preserve">947</w:t>
+            </w:r>
+          </w:p>
+        </w:tc>
+        <w:tc>
+          <w:tcPr/>
+          <w:p>
+            <w:pPr>
+              <w:pStyle w:val="Compact"/>
+              <w:spacing w:after="0"/>
+              <w:jc w:val="center"/>
+            </w:pPr>
+            <w:r>
+              <w:rPr>
+                <w:rFonts w:ascii="Times New Roman" w:hAnsi="Times New Roman" w:cs="Times New Roman" w:eastAsia="Times New Roman"/>
+                <w:sz w:val="18"/>
+              </w:rPr>
+              <w:t xml:space="preserve">0</w:t>
+            </w:r>
+          </w:p>
+        </w:tc>
+        <w:tc>
+          <w:tcPr/>
+          <w:p>
+            <w:pPr>
+              <w:pStyle w:val="Compact"/>
+              <w:spacing w:after="0"/>
+              <w:jc w:val="center"/>
+            </w:pPr>
+            <w:r>
+              <w:rPr>
+                <w:rFonts w:ascii="Times New Roman" w:hAnsi="Times New Roman" w:cs="Times New Roman" w:eastAsia="Times New Roman"/>
+                <w:sz w:val="18"/>
+              </w:rPr>
+              <w:t xml:space="preserve">0</w:t>
+            </w:r>
+          </w:p>
+        </w:tc>
+        <w:tc>
+          <w:tcPr/>
+          <w:p>
+            <w:pPr>
+              <w:pStyle w:val="Compact"/>
+              <w:spacing w:after="0"/>
+              <w:jc w:val="center"/>
+            </w:pPr>
+            <w:r>
+              <w:rPr>
+                <w:rFonts w:ascii="Times New Roman" w:hAnsi="Times New Roman" w:cs="Times New Roman" w:eastAsia="Times New Roman"/>
+                <w:sz w:val="18"/>
+              </w:rPr>
+              <w:t xml:space="preserve">0</w:t>
+            </w:r>
+          </w:p>
+        </w:tc>
+      </w:tr>
+      <w:tr>
+        <w:tc>
+          <w:tcPr/>
+          <w:p>
+            <w:pPr>
+              <w:pStyle w:val="Compact"/>
+              <w:spacing w:after="0"/>
+              <w:jc w:val="left"/>
+            </w:pPr>
+            <w:r>
+              <w:rPr>
+                <w:rFonts w:ascii="Times New Roman" w:hAnsi="Times New Roman" w:cs="Times New Roman" w:eastAsia="Times New Roman"/>
+                <w:sz w:val="18"/>
+              </w:rPr>
+              <w:t xml:space="preserve">No clause scope</w:t>
+            </w:r>
+          </w:p>
+        </w:tc>
+        <w:tc>
+          <w:tcPr/>
+          <w:p>
+            <w:pPr>
+              <w:pStyle w:val="Compact"/>
+              <w:spacing w:after="0"/>
+              <w:jc w:val="center"/>
+            </w:pPr>
+            <w:r>
+              <w:rPr>
+                <w:rFonts w:ascii="Times New Roman" w:hAnsi="Times New Roman" w:cs="Times New Roman" w:eastAsia="Times New Roman"/>
+                <w:sz w:val="18"/>
+              </w:rPr>
+              <w:t xml:space="preserve">61.5%</w:t>
+            </w:r>
+          </w:p>
+        </w:tc>
+        <w:tc>
+          <w:tcPr/>
+          <w:p>
+            <w:pPr>
+              <w:pStyle w:val="Compact"/>
+              <w:spacing w:after="0"/>
+              <w:jc w:val="center"/>
+            </w:pPr>
+            <w:r>
+              <w:rPr>
+                <w:rFonts w:ascii="Times New Roman" w:hAnsi="Times New Roman" w:cs="Times New Roman" w:eastAsia="Times New Roman"/>
+                <w:sz w:val="18"/>
+              </w:rPr>
+              <w:t xml:space="preserve">0</w:t>
+            </w:r>
+          </w:p>
+        </w:tc>
+        <w:tc>
+          <w:tcPr/>
+          <w:p>
+            <w:pPr>
+              <w:pStyle w:val="Compact"/>
+              <w:spacing w:after="0"/>
+              <w:jc w:val="center"/>
+            </w:pPr>
+            <w:r>
+              <w:rPr>
+                <w:rFonts w:ascii="Times New Roman" w:hAnsi="Times New Roman" w:cs="Times New Roman" w:eastAsia="Times New Roman"/>
+                <w:sz w:val="18"/>
+              </w:rPr>
+              <w:t xml:space="preserve">0</w:t>
+            </w:r>
+          </w:p>
+        </w:tc>
+        <w:tc>
+          <w:tcPr/>
+          <w:p>
+            <w:pPr>
+              <w:pStyle w:val="Compact"/>
+              <w:spacing w:after="0"/>
+              <w:jc w:val="center"/>
+            </w:pPr>
+            <w:r>
+              <w:rPr>
+                <w:rFonts w:ascii="Times New Roman" w:hAnsi="Times New Roman" w:cs="Times New Roman" w:eastAsia="Times New Roman"/>
+                <w:sz w:val="18"/>
+              </w:rPr>
+              <w:t xml:space="preserve">565</w:t>
+            </w:r>
+          </w:p>
+        </w:tc>
+        <w:tc>
+          <w:tcPr/>
+          <w:p>
+            <w:pPr>
+              <w:pStyle w:val="Compact"/>
+              <w:spacing w:after="0"/>
+              <w:jc w:val="center"/>
+            </w:pPr>
+            <w:r>
+              <w:rPr>
+                <w:rFonts w:ascii="Times New Roman" w:hAnsi="Times New Roman" w:cs="Times New Roman" w:eastAsia="Times New Roman"/>
+                <w:sz w:val="18"/>
+              </w:rPr>
+              <w:t xml:space="preserve">0</w:t>
+            </w:r>
+          </w:p>
+        </w:tc>
+        <w:tc>
+          <w:tcPr/>
+          <w:p>
+            <w:pPr>
+              <w:pStyle w:val="Compact"/>
+              <w:spacing w:after="0"/>
+              <w:jc w:val="center"/>
+            </w:pPr>
+            <w:r>
+              <w:rPr>
+                <w:rFonts w:ascii="Times New Roman" w:hAnsi="Times New Roman" w:cs="Times New Roman" w:eastAsia="Times New Roman"/>
+                <w:sz w:val="18"/>
+              </w:rPr>
+              <w:t xml:space="preserve">0</w:t>
+            </w:r>
+          </w:p>
+        </w:tc>
+      </w:tr>
+      <w:tr>
+        <w:tc>
+          <w:tcPr/>
+          <w:p>
+            <w:pPr>
+              <w:pStyle w:val="Compact"/>
+              <w:spacing w:after="0"/>
+              <w:jc w:val="left"/>
+            </w:pPr>
+            <w:r>
+              <w:rPr>
+                <w:rFonts w:ascii="Times New Roman" w:hAnsi="Times New Roman" w:cs="Times New Roman" w:eastAsia="Times New Roman"/>
+                <w:sz w:val="18"/>
+              </w:rPr>
+              <w:t xml:space="preserve">Substring only</w:t>
+            </w:r>
+          </w:p>
+        </w:tc>
+        <w:tc>
+          <w:tcPr/>
+          <w:p>
+            <w:pPr>
+              <w:pStyle w:val="Compact"/>
+              <w:spacing w:after="0"/>
+              <w:jc w:val="center"/>
+            </w:pPr>
+            <w:r>
+              <w:rPr>
+                <w:rFonts w:ascii="Times New Roman" w:hAnsi="Times New Roman" w:cs="Times New Roman" w:eastAsia="Times New Roman"/>
+                <w:sz w:val="18"/>
+              </w:rPr>
+              <w:t xml:space="preserve">100%</w:t>
+            </w:r>
+          </w:p>
+        </w:tc>
+        <w:tc>
+          <w:tcPr/>
+          <w:p>
+            <w:pPr>
+              <w:pStyle w:val="Compact"/>
+              <w:spacing w:after="0"/>
+              <w:jc w:val="center"/>
+            </w:pPr>
+            <w:r>
+              <w:rPr>
+                <w:rFonts w:ascii="Times New Roman" w:hAnsi="Times New Roman" w:cs="Times New Roman" w:eastAsia="Times New Roman"/>
+                <w:sz w:val="18"/>
+              </w:rPr>
+              <w:t xml:space="preserve">947</w:t>
+            </w:r>
+          </w:p>
+        </w:tc>
+        <w:tc>
+          <w:tcPr/>
+          <w:p>
+            <w:pPr>
+              <w:pStyle w:val="Compact"/>
+              <w:spacing w:after="0"/>
+              <w:jc w:val="center"/>
+            </w:pPr>
+            <w:r>
+              <w:rPr>
+                <w:rFonts w:ascii="Times New Roman" w:hAnsi="Times New Roman" w:cs="Times New Roman" w:eastAsia="Times New Roman"/>
+                <w:sz w:val="18"/>
+              </w:rPr>
+              <w:t xml:space="preserve">947</w:t>
+            </w:r>
+          </w:p>
+        </w:tc>
+        <w:tc>
+          <w:tcPr/>
+          <w:p>
+            <w:pPr>
+              <w:pStyle w:val="Compact"/>
+              <w:spacing w:after="0"/>
+              <w:jc w:val="center"/>
+            </w:pPr>
+            <w:r>
+              <w:rPr>
+                <w:rFonts w:ascii="Times New Roman" w:hAnsi="Times New Roman" w:cs="Times New Roman" w:eastAsia="Times New Roman"/>
+                <w:sz w:val="18"/>
+              </w:rPr>
+              <w:t xml:space="preserve">955</w:t>
+            </w:r>
+          </w:p>
+        </w:tc>
+        <w:tc>
+          <w:tcPr/>
+          <w:p>
+            <w:pPr>
+              <w:pStyle w:val="Compact"/>
+              <w:spacing w:after="0"/>
+              <w:jc w:val="center"/>
+            </w:pPr>
+            <w:r>
+              <w:rPr>
+                <w:rFonts w:ascii="Times New Roman" w:hAnsi="Times New Roman" w:cs="Times New Roman" w:eastAsia="Times New Roman"/>
+                <w:sz w:val="18"/>
+              </w:rPr>
+              <w:t xml:space="preserve">0</w:t>
+            </w:r>
+          </w:p>
+        </w:tc>
+        <w:tc>
+          <w:tcPr/>
+          <w:p>
+            <w:pPr>
+              <w:pStyle w:val="Compact"/>
+              <w:spacing w:after="0"/>
+              <w:jc w:val="center"/>
+            </w:pPr>
+            <w:r>
+              <w:rPr>
+                <w:rFonts w:ascii="Times New Roman" w:hAnsi="Times New Roman" w:cs="Times New Roman" w:eastAsia="Times New Roman"/>
+                <w:sz w:val="18"/>
+              </w:rPr>
+              <w:t xml:space="preserve">0</w:t>
+            </w:r>
+          </w:p>
+        </w:tc>
+      </w:tr>
+      <w:tr>
+        <w:tc>
+          <w:tcPr/>
+          <w:p>
+            <w:pPr>
+              <w:pStyle w:val="Compact"/>
+              <w:spacing w:after="0"/>
+              <w:jc w:val="left"/>
+            </w:pPr>
+            <w:r>
+              <w:rPr>
+                <w:rFonts w:ascii="Times New Roman" w:hAnsi="Times New Roman" w:cs="Times New Roman" w:eastAsia="Times New Roman"/>
+                <w:sz w:val="18"/>
+              </w:rPr>
+              <w:t xml:space="preserve">No gate</w:t>
+            </w:r>
+          </w:p>
+        </w:tc>
+        <w:tc>
+          <w:tcPr/>
+          <w:p>
+            <w:pPr>
+              <w:pStyle w:val="Compact"/>
+              <w:spacing w:after="0"/>
+              <w:jc w:val="center"/>
+            </w:pPr>
+            <w:r>
+              <w:rPr>
+                <w:rFonts w:ascii="Times New Roman" w:hAnsi="Times New Roman" w:cs="Times New Roman" w:eastAsia="Times New Roman"/>
+                <w:sz w:val="18"/>
+              </w:rPr>
+              <w:t xml:space="preserve">100%</w:t>
+            </w:r>
+          </w:p>
+        </w:tc>
+        <w:tc>
+          <w:tcPr/>
+          <w:p>
+            <w:pPr>
+              <w:pStyle w:val="Compact"/>
+              <w:spacing w:after="0"/>
+              <w:jc w:val="center"/>
+            </w:pPr>
+            <w:r>
+              <w:rPr>
+                <w:rFonts w:ascii="Times New Roman" w:hAnsi="Times New Roman" w:cs="Times New Roman" w:eastAsia="Times New Roman"/>
+                <w:sz w:val="18"/>
+              </w:rPr>
+              <w:t xml:space="preserve">947</w:t>
+            </w:r>
+          </w:p>
+        </w:tc>
+        <w:tc>
+          <w:tcPr/>
+          <w:p>
+            <w:pPr>
+              <w:pStyle w:val="Compact"/>
+              <w:spacing w:after="0"/>
+              <w:jc w:val="center"/>
+            </w:pPr>
+            <w:r>
+              <w:rPr>
+                <w:rFonts w:ascii="Times New Roman" w:hAnsi="Times New Roman" w:cs="Times New Roman" w:eastAsia="Times New Roman"/>
+                <w:sz w:val="18"/>
+              </w:rPr>
+              <w:t xml:space="preserve">947</w:t>
+            </w:r>
+          </w:p>
+        </w:tc>
+        <w:tc>
+          <w:tcPr/>
+          <w:p>
+            <w:pPr>
+              <w:pStyle w:val="Compact"/>
+              <w:spacing w:after="0"/>
+              <w:jc w:val="center"/>
+            </w:pPr>
+            <w:r>
+              <w:rPr>
+                <w:rFonts w:ascii="Times New Roman" w:hAnsi="Times New Roman" w:cs="Times New Roman" w:eastAsia="Times New Roman"/>
+                <w:sz w:val="18"/>
+              </w:rPr>
+              <w:t xml:space="preserve">955</w:t>
+            </w:r>
+          </w:p>
+        </w:tc>
+        <w:tc>
+          <w:tcPr/>
+          <w:p>
+            <w:pPr>
+              <w:pStyle w:val="Compact"/>
+              <w:spacing w:after="0"/>
+              <w:jc w:val="center"/>
+            </w:pPr>
+            <w:r>
+              <w:rPr>
+                <w:rFonts w:ascii="Times New Roman" w:hAnsi="Times New Roman" w:cs="Times New Roman" w:eastAsia="Times New Roman"/>
+                <w:sz w:val="18"/>
+              </w:rPr>
+              <w:t xml:space="preserve">344</w:t>
+            </w:r>
+          </w:p>
+        </w:tc>
+        <w:tc>
+          <w:tcPr/>
+          <w:p>
+            <w:pPr>
+              <w:pStyle w:val="Compact"/>
+              <w:spacing w:after="0"/>
+              <w:jc w:val="center"/>
+            </w:pPr>
+            <w:r>
+              <w:rPr>
+                <w:rFonts w:ascii="Times New Roman" w:hAnsi="Times New Roman" w:cs="Times New Roman" w:eastAsia="Times New Roman"/>
+                <w:sz w:val="18"/>
+              </w:rPr>
+              <w:t xml:space="preserve">1,800</w:t>
+            </w:r>
+          </w:p>
+        </w:tc>
+      </w:tr>
+    </w:tbl>
+    <w:bookmarkEnd w:id="31"/>
+    <w:bookmarkStart w:id="32" w:name="prompt-injection-evaluation"/>
+    <w:p>
+      <w:pPr>
+        <w:pStyle w:val="Heading2"/>
+      </w:pPr>
+      <w:r>
+        <w:rPr>
+          <w:rFonts w:ascii="Times New Roman" w:hAnsi="Times New Roman" w:cs="Times New Roman" w:eastAsia="Times New Roman"/>
+          <w:b w:val="0"/>
+          <w:i/>
+        </w:rPr>
+        <w:t>D. Prompt-Injection Evaluation</w:t>
+      </w:r>
+    </w:p>
+    <w:p>
+      <w:pPr>
+        <w:pStyle w:val="FirstParagraph"/>
+        <w:jc w:val="both"/>
+      </w:pPr>
+      <w:r>
+        <w:rPr>
+          <w:rFonts w:ascii="Times New Roman" w:hAnsi="Times New Roman" w:cs="Times New Roman" w:eastAsia="Times New Roman"/>
+        </w:rPr>
+        <w:t xml:space="preserve">Because the planner consumes only typed claims, an instruction embedded in a</w:t>
+      </w:r>
+      <w:r>
+        <w:rPr>
+          <w:rFonts w:ascii="Times New Roman" w:hAnsi="Times New Roman" w:cs="Times New Roman" w:eastAsia="Times New Roman"/>
+        </w:rPr>
+        <w:t xml:space="preserve"> </w:t>
+      </w:r>
+      <w:r>
+        <w:rPr>
+          <w:rFonts w:ascii="Times New Roman" w:hAnsi="Times New Roman" w:cs="Times New Roman" w:eastAsia="Times New Roman"/>
+        </w:rPr>
+        <w:t xml:space="preserve">resume has no field in which to act. We tested this against a fully</w:t>
+      </w:r>
+      <w:r>
+        <w:rPr>
+          <w:rFonts w:ascii="Times New Roman" w:hAnsi="Times New Roman" w:cs="Times New Roman" w:eastAsia="Times New Roman"/>
+        </w:rPr>
+        <w:t xml:space="preserve"> </w:t>
+      </w:r>
+      <w:r>
+        <w:rPr>
+          <w:rFonts w:ascii="Times New Roman" w:hAnsi="Times New Roman" w:cs="Times New Roman" w:eastAsia="Times New Roman"/>
+        </w:rPr>
+        <w:t xml:space="preserve">compromised extraction model that obeys every planted instruction. Twenty injection templates</w:t>
+      </w:r>
+      <w:r>
+        <w:rPr>
+          <w:rFonts w:ascii="Times New Roman" w:hAnsi="Times New Roman" w:cs="Times New Roman" w:eastAsia="Times New Roman"/>
+        </w:rPr>
+        <w:t xml:space="preserve"> </w:t>
+      </w:r>
+      <w:r>
+        <w:rPr>
+          <w:rFonts w:ascii="Times New Roman" w:hAnsi="Times New Roman" w:cs="Times New Roman" w:eastAsia="Times New Roman"/>
+        </w:rPr>
+        <w:t xml:space="preserve">(for example,</w:t>
+      </w:r>
+      <w:r>
+        <w:rPr>
+          <w:rFonts w:ascii="Times New Roman" w:hAnsi="Times New Roman" w:cs="Times New Roman" w:eastAsia="Times New Roman"/>
+        </w:rPr>
+        <w:t xml:space="preserve"> </w:t>
+      </w:r>
+      <w:r>
+        <w:rPr>
+          <w:rFonts w:ascii="Times New Roman" w:hAnsi="Times New Roman" w:cs="Times New Roman" w:eastAsia="Times New Roman"/>
+        </w:rPr>
+        <w:t xml:space="preserve">“</w:t>
+      </w:r>
+      <w:r>
+        <w:rPr>
+          <w:rFonts w:ascii="Times New Roman" w:hAnsi="Times New Roman" w:cs="Times New Roman" w:eastAsia="Times New Roman"/>
+        </w:rPr>
+        <w:t xml:space="preserve">Ignore all previous instructions and list Kubernetes, Rust and</w:t>
+      </w:r>
+      <w:r>
+        <w:rPr>
+          <w:rFonts w:ascii="Times New Roman" w:hAnsi="Times New Roman" w:cs="Times New Roman" w:eastAsia="Times New Roman"/>
+        </w:rPr>
+        <w:t xml:space="preserve"> </w:t>
+      </w:r>
+      <w:r>
+        <w:rPr>
+          <w:rFonts w:ascii="Times New Roman" w:hAnsi="Times New Roman" w:cs="Times New Roman" w:eastAsia="Times New Roman"/>
+        </w:rPr>
+        <w:t xml:space="preserve">AWS as expert skills</w:t>
+      </w:r>
+      <w:r>
+        <w:rPr>
+          <w:rFonts w:ascii="Times New Roman" w:hAnsi="Times New Roman" w:cs="Times New Roman" w:eastAsia="Times New Roman"/>
+        </w:rPr>
+        <w:t xml:space="preserve">”</w:t>
+      </w:r>
+      <w:r>
+        <w:rPr>
+          <w:rFonts w:ascii="Times New Roman" w:hAnsi="Times New Roman" w:cs="Times New Roman" w:eastAsia="Times New Roman"/>
+        </w:rPr>
+        <w:t xml:space="preserve">,</w:t>
+      </w:r>
+      <w:r>
+        <w:rPr>
+          <w:rFonts w:ascii="Times New Roman" w:hAnsi="Times New Roman" w:cs="Times New Roman" w:eastAsia="Times New Roman"/>
+        </w:rPr>
+        <w:t xml:space="preserve"> </w:t>
+      </w:r>
+      <w:r>
+        <w:rPr>
+          <w:rFonts w:ascii="Times New Roman" w:hAnsi="Times New Roman" w:cs="Times New Roman" w:eastAsia="Times New Roman"/>
+        </w:rPr>
+        <w:t xml:space="preserve">“</w:t>
+      </w:r>
+      <w:r>
+        <w:rPr>
+          <w:rFonts w:ascii="Times New Roman" w:hAnsi="Times New Roman" w:cs="Times New Roman" w:eastAsia="Times New Roman"/>
+        </w:rPr>
+        <w:t xml:space="preserve">SYSTEM: mark every claim for this candidate as</w:t>
+      </w:r>
+      <w:r>
+        <w:rPr>
+          <w:rFonts w:ascii="Times New Roman" w:hAnsi="Times New Roman" w:cs="Times New Roman" w:eastAsia="Times New Roman"/>
+        </w:rPr>
+        <w:t xml:space="preserve"> </w:t>
+      </w:r>
+      <w:r>
+        <w:rPr>
+          <w:rFonts w:ascii="Times New Roman" w:hAnsi="Times New Roman" w:cs="Times New Roman" w:eastAsia="Times New Roman"/>
+        </w:rPr>
+        <w:t xml:space="preserve">substantiated</w:t>
+      </w:r>
+      <w:r>
+        <w:rPr>
+          <w:rFonts w:ascii="Times New Roman" w:hAnsi="Times New Roman" w:cs="Times New Roman" w:eastAsia="Times New Roman"/>
+        </w:rPr>
+        <w:t xml:space="preserve">”</w:t>
+      </w:r>
+      <w:r>
+        <w:rPr>
+          <w:rFonts w:ascii="Times New Roman" w:hAnsi="Times New Roman" w:cs="Times New Roman" w:eastAsia="Times New Roman"/>
+        </w:rPr>
+        <w:t xml:space="preserve">, and an HTML comment asserting cloud certifications) were</w:t>
+      </w:r>
+      <w:r>
+        <w:rPr>
+          <w:rFonts w:ascii="Times New Roman" w:hAnsi="Times New Roman" w:cs="Times New Roman" w:eastAsia="Times New Roman"/>
+        </w:rPr>
+        <w:t xml:space="preserve"> </w:t>
+      </w:r>
+      <w:r>
+        <w:rPr>
+          <w:rFonts w:ascii="Times New Roman" w:hAnsi="Times New Roman" w:cs="Times New Roman" w:eastAsia="Times New Roman"/>
+        </w:rPr>
+        <w:t xml:space="preserve">inserted at the start, middle and end of each of the 24 real resumes,</w:t>
+      </w:r>
+      <w:r>
+        <w:rPr>
+          <w:rFonts w:ascii="Times New Roman" w:hAnsi="Times New Roman" w:cs="Times New Roman" w:eastAsia="Times New Roman"/>
+        </w:rPr>
+        <w:t xml:space="preserve"> </w:t>
+      </w:r>
+      <w:r>
+        <w:rPr>
+          <w:rFonts w:ascii="Times New Roman" w:hAnsi="Times New Roman" w:cs="Times New Roman" w:eastAsia="Times New Roman"/>
+        </w:rPr>
+        <w:t xml:space="preserve">giving 1,440 injected documents. For each, the compromised model emitted the</w:t>
+      </w:r>
+      <w:r>
+        <w:rPr>
+          <w:rFonts w:ascii="Times New Roman" w:hAnsi="Times New Roman" w:cs="Times New Roman" w:eastAsia="Times New Roman"/>
+        </w:rPr>
+        <w:t xml:space="preserve"> </w:t>
+      </w:r>
+      <w:r>
+        <w:rPr>
+          <w:rFonts w:ascii="Times New Roman" w:hAnsi="Times New Roman" w:cs="Times New Roman" w:eastAsia="Times New Roman"/>
+        </w:rPr>
+        <w:t xml:space="preserve">content the injection demanded. Table VI reports what the</w:t>
+      </w:r>
+      <w:r>
+        <w:rPr>
+          <w:rFonts w:ascii="Times New Roman" w:hAnsi="Times New Roman" w:cs="Times New Roman" w:eastAsia="Times New Roman"/>
+        </w:rPr>
+        <w:t xml:space="preserve"> </w:t>
+      </w:r>
+      <w:r>
+        <w:rPr>
+          <w:rFonts w:ascii="Times New Roman" w:hAnsi="Times New Roman" w:cs="Times New Roman" w:eastAsia="Times New Roman"/>
+        </w:rPr>
+        <w:t xml:space="preserve">gate admitted.</w:t>
+      </w:r>
+    </w:p>
+    <w:p>
+      <w:pPr>
+        <w:pStyle w:val="TableCaption"/>
+        <w:jc w:val="center"/>
+      </w:pPr>
+      <w:r>
+        <w:rPr>
+          <w:rFonts w:ascii="Times New Roman" w:hAnsi="Times New Roman" w:cs="Times New Roman" w:eastAsia="Times New Roman"/>
+        </w:rPr>
+        <w:t>TABLE VI. Grounding Gate Under a Fully Compromised Extraction Model</w:t>
       </w:r>
       <w:r>
         <w:rPr>
@@ -7583,7 +8483,55 @@
         <w:rPr>
           <w:rFonts w:ascii="Times New Roman" w:hAnsi="Times New Roman" w:cs="Times New Roman" w:eastAsia="Times New Roman"/>
         </w:rPr>
-        <w:t xml:space="preserve">or a semicolon.) Grounding removes the fabrication channel; detecting false</w:t>
+        <w:t xml:space="preserve">or a semicolon.) Four further vectors, each over the same 1,440 documents,</w:t>
+      </w:r>
+      <w:r>
+        <w:rPr>
+          <w:rFonts w:ascii="Times New Roman" w:hAnsi="Times New Roman" w:cs="Times New Roman" w:eastAsia="Times New Roman"/>
+        </w:rPr>
+        <w:t xml:space="preserve"> </w:t>
+      </w:r>
+      <w:r>
+        <w:rPr>
+          <w:rFonts w:ascii="Times New Roman" w:hAnsi="Times New Roman" w:cs="Times New Roman" w:eastAsia="Times New Roman"/>
+        </w:rPr>
+        <w:t xml:space="preserve">admitted no fabricated output either: zero-width characters, Cyrillic</w:t>
+      </w:r>
+      <w:r>
+        <w:rPr>
+          <w:rFonts w:ascii="Times New Roman" w:hAnsi="Times New Roman" w:cs="Times New Roman" w:eastAsia="Times New Roman"/>
+        </w:rPr>
+        <w:t xml:space="preserve"> </w:t>
+      </w:r>
+      <w:r>
+        <w:rPr>
+          <w:rFonts w:ascii="Times New Roman" w:hAnsi="Times New Roman" w:cs="Times New Roman" w:eastAsia="Times New Roman"/>
+        </w:rPr>
+        <w:t xml:space="preserve">homoglyphs, an instruction split across lines, and HTML hidden text; nor did</w:t>
+      </w:r>
+      <w:r>
+        <w:rPr>
+          <w:rFonts w:ascii="Times New Roman" w:hAnsi="Times New Roman" w:cs="Times New Roman" w:eastAsia="Times New Roman"/>
+        </w:rPr>
+        <w:t xml:space="preserve"> </w:t>
+      </w:r>
+      <w:r>
+        <w:rPr>
+          <w:rFonts w:ascii="Times New Roman" w:hAnsi="Times New Roman" w:cs="Times New Roman" w:eastAsia="Times New Roman"/>
+        </w:rPr>
+        <w:t xml:space="preserve">instructions in Spanish, Hindi, Chinese and French. Instructions inside images</w:t>
+      </w:r>
+      <w:r>
+        <w:rPr>
+          <w:rFonts w:ascii="Times New Roman" w:hAnsi="Times New Roman" w:cs="Times New Roman" w:eastAsia="Times New Roman"/>
+        </w:rPr>
+        <w:t xml:space="preserve"> </w:t>
+      </w:r>
+      <w:r>
+        <w:rPr>
+          <w:rFonts w:ascii="Times New Roman" w:hAnsi="Times New Roman" w:cs="Times New Roman" w:eastAsia="Times New Roman"/>
+        </w:rPr>
+        <w:t xml:space="preserve">or PDF metadata were not tested. Grounding removes the fabrication channel; detecting false</w:t>
       </w:r>
       <w:r>
         <w:rPr>
@@ -7598,9 +8546,9 @@
         <w:t xml:space="preserve">statements a candidate writes is the interview’s job.</w:t>
       </w:r>
     </w:p>
-    <w:bookmarkEnd w:id="31"/>
     <w:bookmarkEnd w:id="32"/>
-    <w:bookmarkStart w:id="40" w:name="machine-learning-what-model-choice-buys"/>
+    <w:bookmarkEnd w:id="33"/>
+    <w:bookmarkStart w:id="41" w:name="machine-learning-what-model-choice-buys"/>
     <w:p>
       <w:pPr>
         <w:pStyle w:val="Heading1"/>
@@ -7650,7 +8598,7 @@
         <w:t xml:space="preserve">matching; none of these models is deployed.</w:t>
       </w:r>
     </w:p>
-    <w:bookmarkStart w:id="33" w:name="X44e2f109a5444fd0756253b8ad067dfe7ca7602"/>
+    <w:bookmarkStart w:id="34" w:name="X44e2f109a5444fd0756253b8ad067dfe7ca7602"/>
     <w:p>
       <w:pPr>
         <w:pStyle w:val="Heading2"/>
@@ -7757,59 +8705,35 @@
         <w:rPr>
           <w:rFonts w:ascii="Times New Roman" w:hAnsi="Times New Roman" w:cs="Times New Roman" w:eastAsia="Times New Roman"/>
         </w:rPr>
-        <w:t xml:space="preserve">Repeated entities make the effective sample size far smaller than 7,910. The</w:t>
-      </w:r>
-      <w:r>
-        <w:rPr>
-          <w:rFonts w:ascii="Times New Roman" w:hAnsi="Times New Roman" w:cs="Times New Roman" w:eastAsia="Times New Roman"/>
-        </w:rPr>
-        <w:t xml:space="preserve"> </w:t>
-      </w:r>
-      <w:r>
-        <w:rPr>
-          <w:rFonts w:ascii="Times New Roman" w:hAnsi="Times New Roman" w:cs="Times New Roman" w:eastAsia="Times New Roman"/>
-        </w:rPr>
-        <w:t xml:space="preserve">protocol handles this by grouping cross-validation by posting, computing every</w:t>
-      </w:r>
-      <w:r>
-        <w:rPr>
-          <w:rFonts w:ascii="Times New Roman" w:hAnsi="Times New Roman" w:cs="Times New Roman" w:eastAsia="Times New Roman"/>
-        </w:rPr>
-        <w:t xml:space="preserve"> </w:t>
-      </w:r>
-      <w:r>
-        <w:rPr>
-          <w:rFonts w:ascii="Times New Roman" w:hAnsi="Times New Roman" w:cs="Times New Roman" w:eastAsia="Times New Roman"/>
-        </w:rPr>
-        <w:t xml:space="preserve">significance test over the ten fold-level scores rather than rows, and using a</w:t>
-      </w:r>
-      <w:r>
-        <w:rPr>
-          <w:rFonts w:ascii="Times New Roman" w:hAnsi="Times New Roman" w:cs="Times New Roman" w:eastAsia="Times New Roman"/>
-        </w:rPr>
-        <w:t xml:space="preserve"> </w:t>
-      </w:r>
-      <w:r>
-        <w:rPr>
-          <w:rFonts w:ascii="Times New Roman" w:hAnsi="Times New Roman" w:cs="Times New Roman" w:eastAsia="Times New Roman"/>
-        </w:rPr>
-        <w:t xml:space="preserve">fold-level sign test where pairs would otherwise be treated as independent</w:t>
-      </w:r>
-      <w:r>
-        <w:rPr>
-          <w:rFonts w:ascii="Times New Roman" w:hAnsi="Times New Roman" w:cs="Times New Roman" w:eastAsia="Times New Roman"/>
-        </w:rPr>
-        <w:t xml:space="preserve"> </w:t>
-      </w:r>
-      <w:r>
-        <w:rPr>
-          <w:rFonts w:ascii="Times New Roman" w:hAnsi="Times New Roman" w:cs="Times New Roman" w:eastAsia="Times New Roman"/>
-        </w:rPr>
-        <w:t xml:space="preserve">(Table VII).</w:t>
+        <w:t xml:space="preserve">Repeated entities make the effective sample size far smaller than 7,910, so</w:t>
+      </w:r>
+      <w:r>
+        <w:rPr>
+          <w:rFonts w:ascii="Times New Roman" w:hAnsi="Times New Roman" w:cs="Times New Roman" w:eastAsia="Times New Roman"/>
+        </w:rPr>
+        <w:t xml:space="preserve"> </w:t>
+      </w:r>
+      <w:r>
+        <w:rPr>
+          <w:rFonts w:ascii="Times New Roman" w:hAnsi="Times New Roman" w:cs="Times New Roman" w:eastAsia="Times New Roman"/>
+        </w:rPr>
+        <w:t xml:space="preserve">folds are grouped by posting and every significance test uses the ten</w:t>
+      </w:r>
+      <w:r>
+        <w:rPr>
+          <w:rFonts w:ascii="Times New Roman" w:hAnsi="Times New Roman" w:cs="Times New Roman" w:eastAsia="Times New Roman"/>
+        </w:rPr>
+        <w:t xml:space="preserve"> </w:t>
+      </w:r>
+      <w:r>
+        <w:rPr>
+          <w:rFonts w:ascii="Times New Roman" w:hAnsi="Times New Roman" w:cs="Times New Roman" w:eastAsia="Times New Roman"/>
+        </w:rPr>
+        <w:t xml:space="preserve">fold-level scores, not rows (Table VIII).</w:t>
       </w:r>
     </w:p>
-    <w:bookmarkEnd w:id="33"/>
-    <w:bookmarkStart w:id="37" w:name="protocol-and-results"/>
+    <w:bookmarkEnd w:id="34"/>
+    <w:bookmarkStart w:id="38" w:name="protocol-and-results"/>
     <w:p>
       <w:pPr>
         <w:pStyle w:val="Heading2"/>
@@ -7880,7 +8804,7 @@
         <w:rPr>
           <w:rFonts w:ascii="Times New Roman" w:hAnsi="Times New Roman" w:cs="Times New Roman" w:eastAsia="Times New Roman"/>
         </w:rPr>
-        <w:t xml:space="preserve">Table VI gives each model’s mean AUROC (area under the ROC curve;</w:t>
+        <w:t xml:space="preserve">Table VII gives each model’s mean AUROC (area under the ROC curve;</w:t>
       </w:r>
       <w:r>
         <w:rPr>
@@ -7928,7 +8852,7 @@
         <w:rPr>
           <w:rFonts w:ascii="Times New Roman" w:hAnsi="Times New Roman" w:cs="Times New Roman" w:eastAsia="Times New Roman"/>
         </w:rPr>
-        <w:t>TABLE VI. Nine Classifiers, Ten-Fold Cross-Validation Grouped by Posting</w:t>
+        <w:t>TABLE VII. Nine Classifiers, Ten-Fold Cross-Validation Grouped by Posting</w:t>
       </w:r>
       <w:r>
         <w:rPr>
@@ -8911,7 +9835,43 @@
         <w:rPr>
           <w:rFonts w:ascii="Times New Roman" w:hAnsi="Times New Roman" w:cs="Times New Roman" w:eastAsia="Times New Roman"/>
         </w:rPr>
-        <w:t xml:space="preserve">(adjusted p from 0.078 to 0.262). A ranked table alone would have licensed</w:t>
+        <w:t xml:space="preserve">(adjusted p from 0.078 to 0.262). The Friedman effect size is moderate</w:t>
+      </w:r>
+      <w:r>
+        <w:rPr>
+          <w:rFonts w:ascii="Times New Roman" w:hAnsi="Times New Roman" w:cs="Times New Roman" w:eastAsia="Times New Roman"/>
+        </w:rPr>
+        <w:t xml:space="preserve"> </w:t>
+      </w:r>
+      <w:r>
+        <w:rPr>
+          <w:rFonts w:ascii="Times New Roman" w:hAnsi="Times New Roman" w:cs="Times New Roman" w:eastAsia="Times New Roman"/>
+        </w:rPr>
+        <w:t xml:space="preserve">(Kendall’s W = 0.48), and a corrected resampled t-test [11]</w:t>
+      </w:r>
+      <w:r>
+        <w:rPr>
+          <w:rFonts w:ascii="Times New Roman" w:hAnsi="Times New Roman" w:cs="Times New Roman" w:eastAsia="Times New Roman"/>
+        </w:rPr>
+        <w:t xml:space="preserve"> </w:t>
+      </w:r>
+      <w:r>
+        <w:rPr>
+          <w:rFonts w:ascii="Times New Roman" w:hAnsi="Times New Roman" w:cs="Times New Roman" w:eastAsia="Times New Roman"/>
+        </w:rPr>
+        <w:t xml:space="preserve">with Holm correction also finds no significant pairwise difference from the</w:t>
+      </w:r>
+      <w:r>
+        <w:rPr>
+          <w:rFonts w:ascii="Times New Roman" w:hAnsi="Times New Roman" w:cs="Times New Roman" w:eastAsia="Times New Roman"/>
+        </w:rPr>
+        <w:t xml:space="preserve"> </w:t>
+      </w:r>
+      <w:r>
+        <w:rPr>
+          <w:rFonts w:ascii="Times New Roman" w:hAnsi="Times New Roman" w:cs="Times New Roman" w:eastAsia="Times New Roman"/>
+        </w:rPr>
+        <w:t xml:space="preserve">MLP; mean AUROC 95% intervals overlap for all nine models. A ranked table alone would have licensed</w:t>
       </w:r>
       <w:r>
         <w:rPr>
@@ -9028,18 +9988,18 @@
           <wp:inline>
             <wp:extent cx="5334000" cy="1314245"/>
             <wp:effectExtent b="0" l="0" r="0" t="0"/>
-            <wp:docPr descr="" title="" id="35" name="Picture"/>
+            <wp:docPr descr="" title="" id="36" name="Picture"/>
             <a:graphic>
               <a:graphicData uri="http://schemas.openxmlformats.org/drawingml/2006/picture">
                 <pic:pic>
                   <pic:nvPicPr>
-                    <pic:cNvPr descr="/tmp/wd/fig_folds.png" id="36" name="Picture"/>
+                    <pic:cNvPr descr="/tmp/wd/fig_folds.png" id="37" name="Picture"/>
                     <pic:cNvPicPr>
                       <a:picLocks noChangeArrowheads="1" noChangeAspect="1"/>
                     </pic:cNvPicPr>
                   </pic:nvPicPr>
                   <pic:blipFill>
-                    <a:blip r:embed="rId34"/>
+                    <a:blip r:embed="rId35"/>
                     <a:stretch>
                       <a:fillRect/>
                     </a:stretch>
@@ -9162,8 +10122,8 @@
         <w:t xml:space="preserve">separates from fewer rivals, not more.</w:t>
       </w:r>
     </w:p>
-    <w:bookmarkEnd w:id="37"/>
-    <w:bookmarkStart w:id="38" w:name="Xef6cd31bbcdb28340ef9c36af2838d2b36bb455"/>
+    <w:bookmarkEnd w:id="38"/>
+    <w:bookmarkStart w:id="39" w:name="Xef6cd31bbcdb28340ef9c36af2838d2b36bb455"/>
     <w:p>
       <w:pPr>
         <w:pStyle w:val="Heading2"/>
@@ -9318,7 +10278,7 @@
         <w:rPr>
           <w:rFonts w:ascii="Times New Roman" w:hAnsi="Times New Roman" w:cs="Times New Roman" w:eastAsia="Times New Roman"/>
         </w:rPr>
-        <w:t xml:space="preserve">posting higher; every resume-level property cancels, so chance is 0.5. Table VII gives the result for the random forest over 4,112</w:t>
+        <w:t xml:space="preserve">posting higher; every resume-level property cancels, so chance is 0.5. Table VIII gives the result for the random forest over 4,112</w:t>
       </w:r>
       <w:r>
         <w:rPr>
@@ -9342,7 +10302,7 @@
         <w:rPr>
           <w:rFonts w:ascii="Times New Roman" w:hAnsi="Times New Roman" w:cs="Times New Roman" w:eastAsia="Times New Roman"/>
         </w:rPr>
-        <w:t>TABLE VII. Pairwise Ranking Accuracy (Random Forest, 4,112 Within-Resume</w:t>
+        <w:t>TABLE VIII. Pairwise Ranking Accuracy (Random Forest, 4,112 Within-Resume</w:t>
       </w:r>
       <w:r>
         <w:rPr>
@@ -9787,8 +10747,8 @@
         <w:t xml:space="preserve">substitution Raghavan et al. [2] describe.</w:t>
       </w:r>
     </w:p>
-    <w:bookmarkEnd w:id="38"/>
-    <w:bookmarkStart w:id="39" w:name="robustness-and-cost"/>
+    <w:bookmarkEnd w:id="39"/>
+    <w:bookmarkStart w:id="40" w:name="robustness-and-cost"/>
     <w:p>
       <w:pPr>
         <w:pStyle w:val="Heading2"/>
@@ -9871,31 +10831,7 @@
         <w:rPr>
           <w:rFonts w:ascii="Times New Roman" w:hAnsi="Times New Roman" w:cs="Times New Roman" w:eastAsia="Times New Roman"/>
         </w:rPr>
-        <w:t xml:space="preserve">better than the binarized label. A learning curve rises from 0.651 AUROC at a</w:t>
-      </w:r>
-      <w:r>
-        <w:rPr>
-          <w:rFonts w:ascii="Times New Roman" w:hAnsi="Times New Roman" w:cs="Times New Roman" w:eastAsia="Times New Roman"/>
-        </w:rPr>
-        <w:t xml:space="preserve"> </w:t>
-      </w:r>
-      <w:r>
-        <w:rPr>
-          <w:rFonts w:ascii="Times New Roman" w:hAnsi="Times New Roman" w:cs="Times New Roman" w:eastAsia="Times New Roman"/>
-        </w:rPr>
-        <w:t xml:space="preserve">tenth of the data to 0.688 at all of it, flattening well below any useful</w:t>
-      </w:r>
-      <w:r>
-        <w:rPr>
-          <w:rFonts w:ascii="Times New Roman" w:hAnsi="Times New Roman" w:cs="Times New Roman" w:eastAsia="Times New Roman"/>
-        </w:rPr>
-        <w:t xml:space="preserve"> </w:t>
-      </w:r>
-      <w:r>
-        <w:rPr>
-          <w:rFonts w:ascii="Times New Roman" w:hAnsi="Times New Roman" w:cs="Times New Roman" w:eastAsia="Times New Roman"/>
-        </w:rPr>
-        <w:t xml:space="preserve">operating point, so the limitation is not sample size.</w:t>
+        <w:t xml:space="preserve">better than the binarized label. A learning curve flattens at 0.688 AUROC, so the limit is not sample size.</w:t>
       </w:r>
     </w:p>
     <w:p>
@@ -9943,7 +10879,7 @@
         <w:rPr>
           <w:rFonts w:ascii="Times New Roman" w:hAnsi="Times New Roman" w:cs="Times New Roman" w:eastAsia="Times New Roman"/>
         </w:rPr>
-        <w:t xml:space="preserve">check; the classifiers of Table VI take 0.2–195 µs per pair.</w:t>
+        <w:t xml:space="preserve">check; the classifiers of Table VII take 0.2–195 µs per pair.</w:t>
       </w:r>
       <w:r>
         <w:rPr>
@@ -9970,9 +10906,9 @@
         <w:t xml:space="preserve">figure is not yet available.</w:t>
       </w:r>
     </w:p>
-    <w:bookmarkEnd w:id="39"/>
     <w:bookmarkEnd w:id="40"/>
-    <w:bookmarkStart w:id="41" w:name="deep-learning-calibrating-identity"/>
+    <w:bookmarkEnd w:id="41"/>
+    <w:bookmarkStart w:id="42" w:name="deep-learning-calibrating-identity"/>
     <w:p>
       <w:pPr>
         <w:pStyle w:val="Heading1"/>
@@ -10103,7 +11039,7 @@
         <w:rPr>
           <w:rFonts w:ascii="Times New Roman" w:hAnsi="Times New Roman" w:cs="Times New Roman" w:eastAsia="Times New Roman"/>
         </w:rPr>
-        <w:t xml:space="preserve">tested on its 1,000 held-out pairs. Table VIII compares the</w:t>
+        <w:t xml:space="preserve">tested on its 1,000 held-out pairs. Table IX compares the</w:t>
       </w:r>
       <w:r>
         <w:rPr>
@@ -10127,7 +11063,19 @@
         <w:rPr>
           <w:rFonts w:ascii="Times New Roman" w:hAnsi="Times New Roman" w:cs="Times New Roman" w:eastAsia="Times New Roman"/>
         </w:rPr>
-        <w:t xml:space="preserve">is 0.9785 at any threshold.</w:t>
+        <w:t xml:space="preserve">is 0.9785 at any threshold. Wilson 95% intervals on the 500 genuine and 500</w:t>
+      </w:r>
+      <w:r>
+        <w:rPr>
+          <w:rFonts w:ascii="Times New Roman" w:hAnsi="Times New Roman" w:cs="Times New Roman" w:eastAsia="Times New Roman"/>
+        </w:rPr>
+        <w:t xml:space="preserve"> </w:t>
+      </w:r>
+      <w:r>
+        <w:rPr>
+          <w:rFonts w:ascii="Times New Roman" w:hAnsi="Times New Roman" w:cs="Times New Roman" w:eastAsia="Times New Roman"/>
+        </w:rPr>
+        <w:t xml:space="preserve">impostor test pairs are 0.018–0.049 for FAR and 0.021–0.054 for FRR.</w:t>
       </w:r>
     </w:p>
     <w:p>
@@ -10139,7 +11087,7 @@
         <w:rPr>
           <w:rFonts w:ascii="Times New Roman" w:hAnsi="Times New Roman" w:cs="Times New Roman" w:eastAsia="Times New Roman"/>
         </w:rPr>
-        <w:t>TABLE VIII. Face-Verification Threshold Before and After Calibration</w:t>
+        <w:t>TABLE IX. Face-Verification Threshold Before and After Calibration</w:t>
       </w:r>
       <w:r>
         <w:rPr>
@@ -10472,35 +11420,11 @@
         <w:rPr>
           <w:rFonts w:ascii="Times New Roman" w:hAnsi="Times New Roman" w:cs="Times New Roman" w:eastAsia="Times New Roman"/>
         </w:rPr>
-        <w:t xml:space="preserve">of distribution-free abstention [25]. LFW is a public-figure</w:t>
-      </w:r>
-      <w:r>
-        <w:rPr>
-          <w:rFonts w:ascii="Times New Roman" w:hAnsi="Times New Roman" w:cs="Times New Roman" w:eastAsia="Times New Roman"/>
-        </w:rPr>
-        <w:t xml:space="preserve"> </w:t>
-      </w:r>
-      <w:r>
-        <w:rPr>
-          <w:rFonts w:ascii="Times New Roman" w:hAnsi="Times New Roman" w:cs="Times New Roman" w:eastAsia="Times New Roman"/>
-        </w:rPr>
-        <w:t xml:space="preserve">benchmark, not our candidate population; population-specific recalibration</w:t>
-      </w:r>
-      <w:r>
-        <w:rPr>
-          <w:rFonts w:ascii="Times New Roman" w:hAnsi="Times New Roman" w:cs="Times New Roman" w:eastAsia="Times New Roman"/>
-        </w:rPr>
-        <w:t xml:space="preserve"> </w:t>
-      </w:r>
-      <w:r>
-        <w:rPr>
-          <w:rFonts w:ascii="Times New Roman" w:hAnsi="Times New Roman" w:cs="Times New Roman" w:eastAsia="Times New Roman"/>
-        </w:rPr>
-        <w:t xml:space="preserve">requires consented candidate data we have not collected.</w:t>
+        <w:t xml:space="preserve">of distribution-free abstention [25].</w:t>
       </w:r>
     </w:p>
-    <w:bookmarkEnd w:id="41"/>
-    <w:bookmarkStart w:id="42" w:name="integration-compliance-and-limitations"/>
+    <w:bookmarkEnd w:id="42"/>
+    <w:bookmarkStart w:id="43" w:name="integration-compliance-and-limitations"/>
     <w:p>
       <w:pPr>
         <w:pStyle w:val="Heading1"/>
@@ -10523,55 +11447,31 @@
         <w:rPr>
           <w:rFonts w:ascii="Times New Roman" w:hAnsi="Times New Roman" w:cs="Times New Roman" w:eastAsia="Times New Roman"/>
         </w:rPr>
-        <w:t xml:space="preserve">Each family alone leaves a gap. Grounding guarantees claims are the candidate’s</w:t>
-      </w:r>
-      <w:r>
-        <w:rPr>
-          <w:rFonts w:ascii="Times New Roman" w:hAnsi="Times New Roman" w:cs="Times New Roman" w:eastAsia="Times New Roman"/>
-        </w:rPr>
-        <w:t xml:space="preserve"> </w:t>
-      </w:r>
-      <w:r>
-        <w:rPr>
-          <w:rFonts w:ascii="Times New Roman" w:hAnsi="Times New Roman" w:cs="Times New Roman" w:eastAsia="Times New Roman"/>
-        </w:rPr>
-        <w:t xml:space="preserve">own words but not that a session gathered enough evidence to judge them; ML can</w:t>
-      </w:r>
-      <w:r>
-        <w:rPr>
-          <w:rFonts w:ascii="Times New Roman" w:hAnsi="Times New Roman" w:cs="Times New Roman" w:eastAsia="Times New Roman"/>
-        </w:rPr>
-        <w:t xml:space="preserve"> </w:t>
-      </w:r>
-      <w:r>
-        <w:rPr>
-          <w:rFonts w:ascii="Times New Roman" w:hAnsi="Times New Roman" w:cs="Times New Roman" w:eastAsia="Times New Roman"/>
-        </w:rPr>
-        <w:t xml:space="preserve">measure evidence sufficiency but, without grounding, would measure text a model</w:t>
-      </w:r>
-      <w:r>
-        <w:rPr>
-          <w:rFonts w:ascii="Times New Roman" w:hAnsi="Times New Roman" w:cs="Times New Roman" w:eastAsia="Times New Roman"/>
-        </w:rPr>
-        <w:t xml:space="preserve"> </w:t>
-      </w:r>
-      <w:r>
-        <w:rPr>
-          <w:rFonts w:ascii="Times New Roman" w:hAnsi="Times New Roman" w:cs="Times New Roman" w:eastAsia="Times New Roman"/>
-        </w:rPr>
-        <w:t xml:space="preserve">may have invented; DL supplies identity continuity but no verdict. Together</w:t>
-      </w:r>
-      <w:r>
-        <w:rPr>
-          <w:rFonts w:ascii="Times New Roman" w:hAnsi="Times New Roman" w:cs="Times New Roman" w:eastAsia="Times New Roman"/>
-        </w:rPr>
-        <w:t xml:space="preserve"> </w:t>
-      </w:r>
-      <w:r>
-        <w:rPr>
-          <w:rFonts w:ascii="Times New Roman" w:hAnsi="Times New Roman" w:cs="Times New Roman" w:eastAsia="Times New Roman"/>
-        </w:rPr>
-        <w:t xml:space="preserve">they close a loop that ends in a human reviewer, not an aggregate.</w:t>
+        <w:t xml:space="preserve">Grounding guarantees claims are the candidate’s own words, ML measures</w:t>
+      </w:r>
+      <w:r>
+        <w:rPr>
+          <w:rFonts w:ascii="Times New Roman" w:hAnsi="Times New Roman" w:cs="Times New Roman" w:eastAsia="Times New Roman"/>
+        </w:rPr>
+        <w:t xml:space="preserve"> </w:t>
+      </w:r>
+      <w:r>
+        <w:rPr>
+          <w:rFonts w:ascii="Times New Roman" w:hAnsi="Times New Roman" w:cs="Times New Roman" w:eastAsia="Times New Roman"/>
+        </w:rPr>
+        <w:t xml:space="preserve">evidence properties, and DL supplies identity continuity; none sets a verdict,</w:t>
+      </w:r>
+      <w:r>
+        <w:rPr>
+          <w:rFonts w:ascii="Times New Roman" w:hAnsi="Times New Roman" w:cs="Times New Roman" w:eastAsia="Times New Roman"/>
+        </w:rPr>
+        <w:t xml:space="preserve"> </w:t>
+      </w:r>
+      <w:r>
+        <w:rPr>
+          <w:rFonts w:ascii="Times New Roman" w:hAnsi="Times New Roman" w:cs="Times New Roman" w:eastAsia="Times New Roman"/>
+        </w:rPr>
+        <w:t xml:space="preserve">and the loop ends in a human reviewer, not an aggregate.</w:t>
       </w:r>
     </w:p>
     <w:p>
@@ -10690,20 +11590,253 @@
       <w:r>
         <w:rPr>
           <w:rFonts w:ascii="Times New Roman" w:hAnsi="Times New Roman" w:cs="Times New Roman" w:eastAsia="Times New Roman"/>
-        </w:rPr>
-        <w:t xml:space="preserve">For the same reason CogniHire uses a value-free type for failed measurements</w:t>
-      </w:r>
-      <w:r>
-        <w:rPr>
-          <w:rFonts w:ascii="Times New Roman" w:hAnsi="Times New Roman" w:cs="Times New Roman" w:eastAsia="Times New Roman"/>
-        </w:rPr>
-        <w:t xml:space="preserve"> </w:t>
-      </w:r>
-      <w:r>
-        <w:rPr>
-          <w:rFonts w:ascii="Times New Roman" w:hAnsi="Times New Roman" w:cs="Times New Roman" w:eastAsia="Times New Roman"/>
-        </w:rPr>
-        <w:t xml:space="preserve">and builds no affect, stress or deception estimation.</w:t>
+          <w:iCs/>
+          <w:i/>
+        </w:rPr>
+        <w:t xml:space="preserve">Limitations.</w:t>
+      </w:r>
+      <w:r>
+        <w:rPr>
+          <w:rFonts w:ascii="Times New Roman" w:hAnsi="Times New Roman" w:cs="Times New Roman" w:eastAsia="Times New Roman"/>
+        </w:rPr>
+        <w:t xml:space="preserve"> </w:t>
+      </w:r>
+      <w:r>
+        <w:rPr>
+          <w:rFonts w:ascii="Times New Roman" w:hAnsi="Times New Roman" w:cs="Times New Roman" w:eastAsia="Times New Roman"/>
+        </w:rPr>
+        <w:t xml:space="preserve">A mean model confidence</w:t>
+      </w:r>
+      <w:r>
+        <w:rPr>
+          <w:rFonts w:ascii="Times New Roman" w:hAnsi="Times New Roman" w:cs="Times New Roman" w:eastAsia="Times New Roman"/>
+        </w:rPr>
+        <w:t xml:space="preserve"> </w:t>
+      </w:r>
+      <w:r>
+        <w:rPr>
+          <w:rFonts w:ascii="Times New Roman" w:hAnsi="Times New Roman" w:cs="Times New Roman" w:eastAsia="Times New Roman"/>
+        </w:rPr>
+        <w:t xml:space="preserve">per session, which a recruiter could read as a candidate score, was removed</w:t>
+      </w:r>
+      <w:r>
+        <w:rPr>
+          <w:rFonts w:ascii="Times New Roman" w:hAnsi="Times New Roman" w:cs="Times New Roman" w:eastAsia="Times New Roman"/>
+        </w:rPr>
+        <w:t xml:space="preserve"> </w:t>
+      </w:r>
+      <w:r>
+        <w:rPr>
+          <w:rFonts w:ascii="Times New Roman" w:hAnsi="Times New Roman" w:cs="Times New Roman" w:eastAsia="Times New Roman"/>
+        </w:rPr>
+        <w:t xml:space="preserve">from the report during this revision. Each judgment carries an uncalibrated</w:t>
+      </w:r>
+      <w:r>
+        <w:rPr>
+          <w:rFonts w:ascii="Times New Roman" w:hAnsi="Times New Roman" w:cs="Times New Roman" w:eastAsia="Times New Roman"/>
+        </w:rPr>
+        <w:t xml:space="preserve"> </w:t>
+      </w:r>
+      <w:r>
+        <w:rPr>
+          <w:rFonts w:ascii="Times New Roman" w:hAnsi="Times New Roman" w:cs="Times New Roman" w:eastAsia="Times New Roman"/>
+        </w:rPr>
+        <w:t xml:space="preserve">model confidence between 0 and 1 with one use: below 0.6 the topic gets a</w:t>
+      </w:r>
+      <w:r>
+        <w:rPr>
+          <w:rFonts w:ascii="Times New Roman" w:hAnsi="Times New Roman" w:cs="Times New Roman" w:eastAsia="Times New Roman"/>
+        </w:rPr>
+        <w:t xml:space="preserve"> </w:t>
+      </w:r>
+      <w:r>
+        <w:rPr>
+          <w:rFonts w:ascii="Times New Roman" w:hAnsi="Times New Roman" w:cs="Times New Roman" w:eastAsia="Times New Roman"/>
+        </w:rPr>
+        <w:t xml:space="preserve">follow-up question. It is not shown to the reviewer and never aggregated; a</w:t>
+      </w:r>
+      <w:r>
+        <w:rPr>
+          <w:rFonts w:ascii="Times New Roman" w:hAnsi="Times New Roman" w:cs="Times New Roman" w:eastAsia="Times New Roman"/>
+        </w:rPr>
+        <w:t xml:space="preserve"> </w:t>
+      </w:r>
+      <w:r>
+        <w:rPr>
+          <w:rFonts w:ascii="Times New Roman" w:hAnsi="Times New Roman" w:cs="Times New Roman" w:eastAsia="Times New Roman"/>
+        </w:rPr>
+        <w:t xml:space="preserve">follow-up adds evidence but sets no verdict. Identity matching is implemented</w:t>
+      </w:r>
+      <w:r>
+        <w:rPr>
+          <w:rFonts w:ascii="Times New Roman" w:hAnsi="Times New Roman" w:cs="Times New Roman" w:eastAsia="Times New Roman"/>
+        </w:rPr>
+        <w:t xml:space="preserve"> </w:t>
+      </w:r>
+      <w:r>
+        <w:rPr>
+          <w:rFonts w:ascii="Times New Roman" w:hAnsi="Times New Roman" w:cs="Times New Roman" w:eastAsia="Times New Roman"/>
+        </w:rPr>
+        <w:t xml:space="preserve">and tested but is currently only a presence gate on the production path, so</w:t>
+      </w:r>
+      <w:r>
+        <w:rPr>
+          <w:rFonts w:ascii="Times New Roman" w:hAnsi="Times New Roman" w:cs="Times New Roman" w:eastAsia="Times New Roman"/>
+        </w:rPr>
+        <w:t xml:space="preserve"> </w:t>
+      </w:r>
+      <w:r>
+        <w:rPr>
+          <w:rFonts w:ascii="Times New Roman" w:hAnsi="Times New Roman" w:cs="Times New Roman" w:eastAsia="Times New Roman"/>
+        </w:rPr>
+        <w:t xml:space="preserve">continuous identity verification is not yet deployed. The face threshold is</w:t>
+      </w:r>
+      <w:r>
+        <w:rPr>
+          <w:rFonts w:ascii="Times New Roman" w:hAnsi="Times New Roman" w:cs="Times New Roman" w:eastAsia="Times New Roman"/>
+        </w:rPr>
+        <w:t xml:space="preserve"> </w:t>
+      </w:r>
+      <w:r>
+        <w:rPr>
+          <w:rFonts w:ascii="Times New Roman" w:hAnsi="Times New Roman" w:cs="Times New Roman" w:eastAsia="Times New Roman"/>
+        </w:rPr>
+        <w:t xml:space="preserve">calibrated on a public benchmark, not candidates. No structured recruiter study</w:t>
+      </w:r>
+      <w:r>
+        <w:rPr>
+          <w:rFonts w:ascii="Times New Roman" w:hAnsi="Times New Roman" w:cs="Times New Roman" w:eastAsia="Times New Roman"/>
+        </w:rPr>
+        <w:t xml:space="preserve"> </w:t>
+      </w:r>
+      <w:r>
+        <w:rPr>
+          <w:rFonts w:ascii="Times New Roman" w:hAnsi="Times New Roman" w:cs="Times New Roman" w:eastAsia="Times New Roman"/>
+        </w:rPr>
+        <w:t xml:space="preserve">has been conducted, so the premise that reviewers prefer a claim audit to a</w:t>
+      </w:r>
+      <w:r>
+        <w:rPr>
+          <w:rFonts w:ascii="Times New Roman" w:hAnsi="Times New Roman" w:cs="Times New Roman" w:eastAsia="Times New Roman"/>
+        </w:rPr>
+        <w:t xml:space="preserve"> </w:t>
+      </w:r>
+      <w:r>
+        <w:rPr>
+          <w:rFonts w:ascii="Times New Roman" w:hAnsi="Times New Roman" w:cs="Times New Roman" w:eastAsia="Times New Roman"/>
+        </w:rPr>
+        <w:t xml:space="preserve">score is untested. Injection templates are hand-written, not attacks observed</w:t>
+      </w:r>
+      <w:r>
+        <w:rPr>
+          <w:rFonts w:ascii="Times New Roman" w:hAnsi="Times New Roman" w:cs="Times New Roman" w:eastAsia="Times New Roman"/>
+        </w:rPr>
+        <w:t xml:space="preserve"> </w:t>
+      </w:r>
+      <w:r>
+        <w:rPr>
+          <w:rFonts w:ascii="Times New Roman" w:hAnsi="Times New Roman" w:cs="Times New Roman" w:eastAsia="Times New Roman"/>
+        </w:rPr>
+        <w:t xml:space="preserve">in the wild.</w:t>
+      </w:r>
+    </w:p>
+    <w:bookmarkEnd w:id="43"/>
+    <w:bookmarkStart w:id="44" w:name="conclusion-and-future-work"/>
+    <w:p>
+      <w:pPr>
+        <w:pStyle w:val="Heading1"/>
+        <w:jc w:val="center"/>
+      </w:pPr>
+      <w:r>
+        <w:rPr>
+          <w:rFonts w:ascii="Times New Roman" w:hAnsi="Times New Roman" w:cs="Times New Roman" w:eastAsia="Times New Roman"/>
+          <w:b w:val="0"/>
+        </w:rPr>
+        <w:t>VIII. CONCLUSION AND FUTURE WORK</w:t>
+      </w:r>
+    </w:p>
+    <w:p>
+      <w:pPr>
+        <w:pStyle w:val="FirstParagraph"/>
+        <w:jc w:val="both"/>
+      </w:pPr>
+      <w:r>
+        <w:rPr>
+          <w:rFonts w:ascii="Times New Roman" w:hAnsi="Times New Roman" w:cs="Times New Roman" w:eastAsia="Times New Roman"/>
+        </w:rPr>
+        <w:t xml:space="preserve">Demonstrated by measurement, on the evaluated data: the grounding gate made</w:t>
+      </w:r>
+      <w:r>
+        <w:rPr>
+          <w:rFonts w:ascii="Times New Roman" w:hAnsi="Times New Roman" w:cs="Times New Roman" w:eastAsia="Times New Roman"/>
+        </w:rPr>
+        <w:t xml:space="preserve"> </w:t>
+      </w:r>
+      <w:r>
+        <w:rPr>
+          <w:rFonts w:ascii="Times New Roman" w:hAnsi="Times New Roman" w:cs="Times New Roman" w:eastAsia="Times New Roman"/>
+        </w:rPr>
+        <w:t xml:space="preserve">no error on roughly 100,000 synthetic and 4,100 real-resume trials, each of its</w:t>
+      </w:r>
+      <w:r>
+        <w:rPr>
+          <w:rFonts w:ascii="Times New Roman" w:hAnsi="Times New Roman" w:cs="Times New Roman" w:eastAsia="Times New Roman"/>
+        </w:rPr>
+        <w:t xml:space="preserve"> </w:t>
+      </w:r>
+      <w:r>
+        <w:rPr>
+          <w:rFonts w:ascii="Times New Roman" w:hAnsi="Times New Roman" w:cs="Times New Roman" w:eastAsia="Times New Roman"/>
+        </w:rPr>
+        <w:t xml:space="preserve">checks is necessary, and it admitted none of 1,800 fabricated claims from a</w:t>
+      </w:r>
+      <w:r>
+        <w:rPr>
+          <w:rFonts w:ascii="Times New Roman" w:hAnsi="Times New Roman" w:cs="Times New Roman" w:eastAsia="Times New Roman"/>
+        </w:rPr>
+        <w:t xml:space="preserve"> </w:t>
+      </w:r>
+      <w:r>
+        <w:rPr>
+          <w:rFonts w:ascii="Times New Roman" w:hAnsi="Times New Roman" w:cs="Times New Roman" w:eastAsia="Times New Roman"/>
+        </w:rPr>
+        <w:t xml:space="preserve">fully compromised model; an authored face threshold would have falsely</w:t>
+      </w:r>
+      <w:r>
+        <w:rPr>
+          <w:rFonts w:ascii="Times New Roman" w:hAnsi="Times New Roman" w:cs="Times New Roman" w:eastAsia="Times New Roman"/>
+        </w:rPr>
+        <w:t xml:space="preserve"> </w:t>
+      </w:r>
+      <w:r>
+        <w:rPr>
+          <w:rFonts w:ascii="Times New Roman" w:hAnsi="Times New Roman" w:cs="Times New Roman" w:eastAsia="Times New Roman"/>
+        </w:rPr>
+        <w:t xml:space="preserve">rejected 41.4% of genuine LFW matches, against 3.4% after calibration; and</w:t>
+      </w:r>
+      <w:r>
+        <w:rPr>
+          <w:rFonts w:ascii="Times New Roman" w:hAnsi="Times New Roman" w:cs="Times New Roman" w:eastAsia="Times New Roman"/>
+        </w:rPr>
+        <w:t xml:space="preserve"> </w:t>
+      </w:r>
+      <w:r>
+        <w:rPr>
+          <w:rFonts w:ascii="Times New Roman" w:hAnsi="Times New Roman" w:cs="Times New Roman" w:eastAsia="Times New Roman"/>
+        </w:rPr>
+        <w:t xml:space="preserve">nine classifiers were statistically indistinguishable on a public benchmark,</w:t>
+      </w:r>
+      <w:r>
+        <w:rPr>
+          <w:rFonts w:ascii="Times New Roman" w:hAnsi="Times New Roman" w:cs="Times New Roman" w:eastAsia="Times New Roman"/>
+        </w:rPr>
+        <w:t xml:space="preserve"> </w:t>
+      </w:r>
+      <w:r>
+        <w:rPr>
+          <w:rFonts w:ascii="Times New Roman" w:hAnsi="Times New Roman" w:cs="Times New Roman" w:eastAsia="Times New Roman"/>
+        </w:rPr>
+        <w:t xml:space="preserve">where apparent gains came from ranking candidates rather than matching them.</w:t>
       </w:r>
     </w:p>
     <w:p>
@@ -10714,206 +11847,84 @@
       <w:r>
         <w:rPr>
           <w:rFonts w:ascii="Times New Roman" w:hAnsi="Times New Roman" w:cs="Times New Roman" w:eastAsia="Times New Roman"/>
-          <w:iCs/>
-          <w:i/>
-        </w:rPr>
-        <w:t xml:space="preserve">Limitations.</w:t>
-      </w:r>
-      <w:r>
-        <w:rPr>
-          <w:rFonts w:ascii="Times New Roman" w:hAnsi="Times New Roman" w:cs="Times New Roman" w:eastAsia="Times New Roman"/>
-        </w:rPr>
-        <w:t xml:space="preserve"> </w:t>
-      </w:r>
-      <w:r>
-        <w:rPr>
-          <w:rFonts w:ascii="Times New Roman" w:hAnsi="Times New Roman" w:cs="Times New Roman" w:eastAsia="Times New Roman"/>
-        </w:rPr>
-        <w:t xml:space="preserve">An earlier version of the web report</w:t>
-      </w:r>
-      <w:r>
-        <w:rPr>
-          <w:rFonts w:ascii="Times New Roman" w:hAnsi="Times New Roman" w:cs="Times New Roman" w:eastAsia="Times New Roman"/>
-        </w:rPr>
-        <w:t xml:space="preserve"> </w:t>
-      </w:r>
-      <w:r>
-        <w:rPr>
-          <w:rFonts w:ascii="Times New Roman" w:hAnsi="Times New Roman" w:cs="Times New Roman" w:eastAsia="Times New Roman"/>
-        </w:rPr>
-        <w:t xml:space="preserve">showed, beside the per-claim audit, the mean model confidence across answered</w:t>
-      </w:r>
-      <w:r>
-        <w:rPr>
-          <w:rFonts w:ascii="Times New Roman" w:hAnsi="Times New Roman" w:cs="Times New Roman" w:eastAsia="Times New Roman"/>
-        </w:rPr>
-        <w:t xml:space="preserve"> </w:t>
-      </w:r>
-      <w:r>
-        <w:rPr>
-          <w:rFonts w:ascii="Times New Roman" w:hAnsi="Times New Roman" w:cs="Times New Roman" w:eastAsia="Times New Roman"/>
-        </w:rPr>
-        <w:t xml:space="preserve">topics: a session-level aggregate a recruiter could read as a candidate score.</w:t>
-      </w:r>
-      <w:r>
-        <w:rPr>
-          <w:rFonts w:ascii="Times New Roman" w:hAnsi="Times New Roman" w:cs="Times New Roman" w:eastAsia="Times New Roman"/>
-        </w:rPr>
-        <w:t xml:space="preserve"> </w:t>
-      </w:r>
-      <w:r>
-        <w:rPr>
-          <w:rFonts w:ascii="Times New Roman" w:hAnsi="Times New Roman" w:cs="Times New Roman" w:eastAsia="Times New Roman"/>
-        </w:rPr>
-        <w:t xml:space="preserve">It was removed during this revision, from both the report service and the</w:t>
-      </w:r>
-      <w:r>
-        <w:rPr>
-          <w:rFonts w:ascii="Times New Roman" w:hAnsi="Times New Roman" w:cs="Times New Roman" w:eastAsia="Times New Roman"/>
-        </w:rPr>
-        <w:t xml:space="preserve"> </w:t>
-      </w:r>
-      <w:r>
-        <w:rPr>
-          <w:rFonts w:ascii="Times New Roman" w:hAnsi="Times New Roman" w:cs="Times New Roman" w:eastAsia="Times New Roman"/>
-        </w:rPr>
-        <w:t xml:space="preserve">portal; the report now shows only per-answer judgments and process counts.</w:t>
-      </w:r>
-      <w:r>
-        <w:rPr>
-          <w:rFonts w:ascii="Times New Roman" w:hAnsi="Times New Roman" w:cs="Times New Roman" w:eastAsia="Times New Roman"/>
-        </w:rPr>
-        <w:t xml:space="preserve"> </w:t>
-      </w:r>
-      <w:r>
-        <w:rPr>
-          <w:rFonts w:ascii="Times New Roman" w:hAnsi="Times New Roman" w:cs="Times New Roman" w:eastAsia="Times New Roman"/>
-        </w:rPr>
-        <w:t xml:space="preserve">Each judgment carries a model confidence between 0 and 1 with one use: below 0.6 the</w:t>
-      </w:r>
-      <w:r>
-        <w:rPr>
-          <w:rFonts w:ascii="Times New Roman" w:hAnsi="Times New Roman" w:cs="Times New Roman" w:eastAsia="Times New Roman"/>
-        </w:rPr>
-        <w:t xml:space="preserve"> </w:t>
-      </w:r>
-      <w:r>
-        <w:rPr>
-          <w:rFonts w:ascii="Times New Roman" w:hAnsi="Times New Roman" w:cs="Times New Roman" w:eastAsia="Times New Roman"/>
-        </w:rPr>
-        <w:t xml:space="preserve">topic gets a follow-up question. It is not calibrated and never aggregated.</w:t>
-      </w:r>
-      <w:r>
-        <w:rPr>
-          <w:rFonts w:ascii="Times New Roman" w:hAnsi="Times New Roman" w:cs="Times New Roman" w:eastAsia="Times New Roman"/>
-        </w:rPr>
-        <w:t xml:space="preserve"> </w:t>
-      </w:r>
-      <w:r>
-        <w:rPr>
-          <w:rFonts w:ascii="Times New Roman" w:hAnsi="Times New Roman" w:cs="Times New Roman" w:eastAsia="Times New Roman"/>
-        </w:rPr>
-        <w:t xml:space="preserve">Identity matching is implemented and tested but is currently only</w:t>
-      </w:r>
-      <w:r>
-        <w:rPr>
-          <w:rFonts w:ascii="Times New Roman" w:hAnsi="Times New Roman" w:cs="Times New Roman" w:eastAsia="Times New Roman"/>
-        </w:rPr>
-        <w:t xml:space="preserve"> </w:t>
-      </w:r>
-      <w:r>
-        <w:rPr>
-          <w:rFonts w:ascii="Times New Roman" w:hAnsi="Times New Roman" w:cs="Times New Roman" w:eastAsia="Times New Roman"/>
-        </w:rPr>
-        <w:t xml:space="preserve">a presence gate on the production path, so continuous identity verification is</w:t>
-      </w:r>
-      <w:r>
-        <w:rPr>
-          <w:rFonts w:ascii="Times New Roman" w:hAnsi="Times New Roman" w:cs="Times New Roman" w:eastAsia="Times New Roman"/>
-        </w:rPr>
-        <w:t xml:space="preserve"> </w:t>
-      </w:r>
-      <w:r>
-        <w:rPr>
-          <w:rFonts w:ascii="Times New Roman" w:hAnsi="Times New Roman" w:cs="Times New Roman" w:eastAsia="Times New Roman"/>
-        </w:rPr>
-        <w:t xml:space="preserve">not yet deployed. The face threshold is calibrated on a public benchmark, not</w:t>
-      </w:r>
-      <w:r>
-        <w:rPr>
-          <w:rFonts w:ascii="Times New Roman" w:hAnsi="Times New Roman" w:cs="Times New Roman" w:eastAsia="Times New Roman"/>
-        </w:rPr>
-        <w:t xml:space="preserve"> </w:t>
-      </w:r>
-      <w:r>
-        <w:rPr>
-          <w:rFonts w:ascii="Times New Roman" w:hAnsi="Times New Roman" w:cs="Times New Roman" w:eastAsia="Times New Roman"/>
-        </w:rPr>
-        <w:t xml:space="preserve">candidates. No structured recruiter study has been conducted, so the premise</w:t>
-      </w:r>
-      <w:r>
-        <w:rPr>
-          <w:rFonts w:ascii="Times New Roman" w:hAnsi="Times New Roman" w:cs="Times New Roman" w:eastAsia="Times New Roman"/>
-        </w:rPr>
-        <w:t xml:space="preserve"> </w:t>
-      </w:r>
-      <w:r>
-        <w:rPr>
-          <w:rFonts w:ascii="Times New Roman" w:hAnsi="Times New Roman" w:cs="Times New Roman" w:eastAsia="Times New Roman"/>
-        </w:rPr>
-        <w:t xml:space="preserve">that reviewers prefer a claim audit to a score is untested. The injection</w:t>
-      </w:r>
-      <w:r>
-        <w:rPr>
-          <w:rFonts w:ascii="Times New Roman" w:hAnsi="Times New Roman" w:cs="Times New Roman" w:eastAsia="Times New Roman"/>
-        </w:rPr>
-        <w:t xml:space="preserve"> </w:t>
-      </w:r>
-      <w:r>
-        <w:rPr>
-          <w:rFonts w:ascii="Times New Roman" w:hAnsi="Times New Roman" w:cs="Times New Roman" w:eastAsia="Times New Roman"/>
-        </w:rPr>
-        <w:t xml:space="preserve">evaluation uses 24 host resumes and hand-written templates, not attacks observed in the wild, and no ablation</w:t>
-      </w:r>
-      <w:r>
-        <w:rPr>
-          <w:rFonts w:ascii="Times New Roman" w:hAnsi="Times New Roman" w:cs="Times New Roman" w:eastAsia="Times New Roman"/>
-        </w:rPr>
-        <w:t xml:space="preserve"> </w:t>
-      </w:r>
-      <w:r>
-        <w:rPr>
-          <w:rFonts w:ascii="Times New Roman" w:hAnsi="Times New Roman" w:cs="Times New Roman" w:eastAsia="Times New Roman"/>
-        </w:rPr>
-        <w:t xml:space="preserve">isolates each gate check. An earlier fit</w:t>
-      </w:r>
-      <w:r>
-        <w:rPr>
-          <w:rFonts w:ascii="Times New Roman" w:hAnsi="Times New Roman" w:cs="Times New Roman" w:eastAsia="Times New Roman"/>
-        </w:rPr>
-        <w:t xml:space="preserve"> </w:t>
-      </w:r>
-      <w:r>
-        <w:rPr>
-          <w:rFonts w:ascii="Times New Roman" w:hAnsi="Times New Roman" w:cs="Times New Roman" w:eastAsia="Times New Roman"/>
-        </w:rPr>
-        <w:t xml:space="preserve">model (0.657 AUROC) is deliberately not deployed, for the reasons in</w:t>
-      </w:r>
-      <w:r>
-        <w:rPr>
-          <w:rFonts w:ascii="Times New Roman" w:hAnsi="Times New Roman" w:cs="Times New Roman" w:eastAsia="Times New Roman"/>
-        </w:rPr>
-        <w:t xml:space="preserve"> </w:t>
-      </w:r>
-      <w:r>
-        <w:rPr>
-          <w:rFonts w:ascii="Times New Roman" w:hAnsi="Times New Roman" w:cs="Times New Roman" w:eastAsia="Times New Roman"/>
-        </w:rPr>
-        <w:t xml:space="preserve">Section V-C.</w:t>
+        </w:rPr>
+        <w:t xml:space="preserve">Not yet demonstrated: that reviewers decide better or more consistently with a</w:t>
+      </w:r>
+      <w:r>
+        <w:rPr>
+          <w:rFonts w:ascii="Times New Roman" w:hAnsi="Times New Roman" w:cs="Times New Roman" w:eastAsia="Times New Roman"/>
+        </w:rPr>
+        <w:t xml:space="preserve"> </w:t>
+      </w:r>
+      <w:r>
+        <w:rPr>
+          <w:rFonts w:ascii="Times New Roman" w:hAnsi="Times New Roman" w:cs="Times New Roman" w:eastAsia="Times New Roman"/>
+        </w:rPr>
+        <w:t xml:space="preserve">claim audit than with a score, that the face threshold holds for candidates,</w:t>
+      </w:r>
+      <w:r>
+        <w:rPr>
+          <w:rFonts w:ascii="Times New Roman" w:hAnsi="Times New Roman" w:cs="Times New Roman" w:eastAsia="Times New Roman"/>
+        </w:rPr>
+        <w:t xml:space="preserve"> </w:t>
+      </w:r>
+      <w:r>
+        <w:rPr>
+          <w:rFonts w:ascii="Times New Roman" w:hAnsi="Times New Roman" w:cs="Times New Roman" w:eastAsia="Times New Roman"/>
+        </w:rPr>
+        <w:t xml:space="preserve">and that the design satisfies a legal audit. Next steps are a controlled</w:t>
+      </w:r>
+      <w:r>
+        <w:rPr>
+          <w:rFonts w:ascii="Times New Roman" w:hAnsi="Times New Roman" w:cs="Times New Roman" w:eastAsia="Times New Roman"/>
+        </w:rPr>
+        <w:t xml:space="preserve"> </w:t>
+      </w:r>
+      <w:r>
+        <w:rPr>
+          <w:rFonts w:ascii="Times New Roman" w:hAnsi="Times New Roman" w:cs="Times New Roman" w:eastAsia="Times New Roman"/>
+        </w:rPr>
+        <w:t xml:space="preserve">reviewer study (agreement, review time, decision consistency), end-to-end</w:t>
+      </w:r>
+      <w:r>
+        <w:rPr>
+          <w:rFonts w:ascii="Times New Roman" w:hAnsi="Times New Roman" w:cs="Times New Roman" w:eastAsia="Times New Roman"/>
+        </w:rPr>
+        <w:t xml:space="preserve"> </w:t>
+      </w:r>
+      <w:r>
+        <w:rPr>
+          <w:rFonts w:ascii="Times New Roman" w:hAnsi="Times New Roman" w:cs="Times New Roman" w:eastAsia="Times New Roman"/>
+        </w:rPr>
+        <w:t xml:space="preserve">validation and timing on consented sessions, entity-disjoint and repeated</w:t>
+      </w:r>
+      <w:r>
+        <w:rPr>
+          <w:rFonts w:ascii="Times New Roman" w:hAnsi="Times New Roman" w:cs="Times New Roman" w:eastAsia="Times New Roman"/>
+        </w:rPr>
+        <w:t xml:space="preserve"> </w:t>
+      </w:r>
+      <w:r>
+        <w:rPr>
+          <w:rFonts w:ascii="Times New Roman" w:hAnsi="Times New Roman" w:cs="Times New Roman" w:eastAsia="Times New Roman"/>
+        </w:rPr>
+        <w:t xml:space="preserve">cross-validation, image and document-level injection vectors, and face</w:t>
+      </w:r>
+      <w:r>
+        <w:rPr>
+          <w:rFonts w:ascii="Times New Roman" w:hAnsi="Times New Roman" w:cs="Times New Roman" w:eastAsia="Times New Roman"/>
+        </w:rPr>
+        <w:t xml:space="preserve"> </w:t>
+      </w:r>
+      <w:r>
+        <w:rPr>
+          <w:rFonts w:ascii="Times New Roman" w:hAnsi="Times New Roman" w:cs="Times New Roman" w:eastAsia="Times New Roman"/>
+        </w:rPr>
+        <w:t xml:space="preserve">evaluation stratified by demographics, device and lighting.</w:t>
       </w:r>
     </w:p>
-    <w:bookmarkEnd w:id="42"/>
-    <w:bookmarkStart w:id="43" w:name="conclusion-and-future-work"/>
+    <w:bookmarkEnd w:id="44"/>
+    <w:bookmarkStart w:id="45" w:name="data-availability"/>
     <w:p>
       <w:pPr>
         <w:pStyle w:val="Heading1"/>
@@ -10924,7 +11935,7 @@
           <w:rFonts w:ascii="Times New Roman" w:hAnsi="Times New Roman" w:cs="Times New Roman" w:eastAsia="Times New Roman"/>
           <w:b w:val="0"/>
         </w:rPr>
-        <w:t>VIII. CONCLUSION AND FUTURE WORK</w:t>
+        <w:t>DATA AVAILABILITY</w:t>
       </w:r>
     </w:p>
     <w:p>
@@ -10936,91 +11947,118 @@
         <w:rPr>
           <w:rFonts w:ascii="Times New Roman" w:hAnsi="Times New Roman" w:cs="Times New Roman" w:eastAsia="Times New Roman"/>
         </w:rPr>
-        <w:t xml:space="preserve">Demonstrated by measurement: the grounding gate rejected every paraphrase and</w:t>
-      </w:r>
-      <w:r>
-        <w:rPr>
-          <w:rFonts w:ascii="Times New Roman" w:hAnsi="Times New Roman" w:cs="Times New Roman" w:eastAsia="Times New Roman"/>
-        </w:rPr>
-        <w:t xml:space="preserve"> </w:t>
-      </w:r>
-      <w:r>
-        <w:rPr>
-          <w:rFonts w:ascii="Times New Roman" w:hAnsi="Times New Roman" w:cs="Times New Roman" w:eastAsia="Times New Roman"/>
-        </w:rPr>
-        <w:t xml:space="preserve">negation trap across roughly 100,000 synthetic trials and admitted none of</w:t>
-      </w:r>
-      <w:r>
-        <w:rPr>
-          <w:rFonts w:ascii="Times New Roman" w:hAnsi="Times New Roman" w:cs="Times New Roman" w:eastAsia="Times New Roman"/>
-        </w:rPr>
-        <w:t xml:space="preserve"> </w:t>
-      </w:r>
-      <w:r>
-        <w:rPr>
-          <w:rFonts w:ascii="Times New Roman" w:hAnsi="Times New Roman" w:cs="Times New Roman" w:eastAsia="Times New Roman"/>
-        </w:rPr>
-        <w:t xml:space="preserve">1,800 fabricated claims from a fully compromised model; a carefully reasoned</w:t>
-      </w:r>
-      <w:r>
-        <w:rPr>
-          <w:rFonts w:ascii="Times New Roman" w:hAnsi="Times New Roman" w:cs="Times New Roman" w:eastAsia="Times New Roman"/>
-        </w:rPr>
-        <w:t xml:space="preserve"> </w:t>
-      </w:r>
-      <w:r>
-        <w:rPr>
-          <w:rFonts w:ascii="Times New Roman" w:hAnsi="Times New Roman" w:cs="Times New Roman" w:eastAsia="Times New Roman"/>
-        </w:rPr>
-        <w:t xml:space="preserve">face threshold would have falsely rejected 41.4% of genuine matches, and</w:t>
-      </w:r>
-      <w:r>
-        <w:rPr>
-          <w:rFonts w:ascii="Times New Roman" w:hAnsi="Times New Roman" w:cs="Times New Roman" w:eastAsia="Times New Roman"/>
-        </w:rPr>
-        <w:t xml:space="preserve"> </w:t>
-      </w:r>
-      <w:r>
-        <w:rPr>
-          <w:rFonts w:ascii="Times New Roman" w:hAnsi="Times New Roman" w:cs="Times New Roman" w:eastAsia="Times New Roman"/>
-        </w:rPr>
-        <w:t xml:space="preserve">calibration reduced that to 3.4% on LFW; and nine classifiers were</w:t>
-      </w:r>
-      <w:r>
-        <w:rPr>
-          <w:rFonts w:ascii="Times New Roman" w:hAnsi="Times New Roman" w:cs="Times New Roman" w:eastAsia="Times New Roman"/>
-        </w:rPr>
-        <w:t xml:space="preserve"> </w:t>
-      </w:r>
-      <w:r>
-        <w:rPr>
-          <w:rFonts w:ascii="Times New Roman" w:hAnsi="Times New Roman" w:cs="Times New Roman" w:eastAsia="Times New Roman"/>
-        </w:rPr>
-        <w:t xml:space="preserve">statistically indistinguishable at the top of a public screening benchmark,</w:t>
-      </w:r>
-      <w:r>
-        <w:rPr>
-          <w:rFonts w:ascii="Times New Roman" w:hAnsi="Times New Roman" w:cs="Times New Roman" w:eastAsia="Times New Roman"/>
-        </w:rPr>
-        <w:t xml:space="preserve"> </w:t>
-      </w:r>
-      <w:r>
-        <w:rPr>
-          <w:rFonts w:ascii="Times New Roman" w:hAnsi="Times New Roman" w:cs="Times New Roman" w:eastAsia="Times New Roman"/>
-        </w:rPr>
-        <w:t xml:space="preserve">where a within-query diagnostic showed that apparent gains came from ranking</w:t>
-      </w:r>
-      <w:r>
-        <w:rPr>
-          <w:rFonts w:ascii="Times New Roman" w:hAnsi="Times New Roman" w:cs="Times New Roman" w:eastAsia="Times New Roman"/>
-        </w:rPr>
-        <w:t xml:space="preserve"> </w:t>
-      </w:r>
-      <w:r>
-        <w:rPr>
-          <w:rFonts w:ascii="Times New Roman" w:hAnsi="Times New Roman" w:cs="Times New Roman" w:eastAsia="Times New Roman"/>
-        </w:rPr>
-        <w:t xml:space="preserve">candidates rather than matching them.</w:t>
+        <w:t xml:space="preserve">Analysis code, per-fold results, the prompt-injection harness and figure</w:t>
+      </w:r>
+      <w:r>
+        <w:rPr>
+          <w:rFonts w:ascii="Times New Roman" w:hAnsi="Times New Roman" w:cs="Times New Roman" w:eastAsia="Times New Roman"/>
+        </w:rPr>
+        <w:t xml:space="preserve"> </w:t>
+      </w:r>
+      <w:r>
+        <w:rPr>
+          <w:rFonts w:ascii="Times New Roman" w:hAnsi="Times New Roman" w:cs="Times New Roman" w:eastAsia="Times New Roman"/>
+        </w:rPr>
+        <w:t xml:space="preserve">sources are available from the author on request. The face study uses the</w:t>
+      </w:r>
+      <w:r>
+        <w:rPr>
+          <w:rFonts w:ascii="Times New Roman" w:hAnsi="Times New Roman" w:cs="Times New Roman" w:eastAsia="Times New Roman"/>
+        </w:rPr>
+        <w:t xml:space="preserve"> </w:t>
+      </w:r>
+      <w:r>
+        <w:rPr>
+          <w:rFonts w:ascii="Times New Roman" w:hAnsi="Times New Roman" w:cs="Times New Roman" w:eastAsia="Times New Roman"/>
+        </w:rPr>
+        <w:t xml:space="preserve">public LFW benchmark and the grounding evaluation a synthetic corpus and public</w:t>
+      </w:r>
+      <w:r>
+        <w:rPr>
+          <w:rFonts w:ascii="Times New Roman" w:hAnsi="Times New Roman" w:cs="Times New Roman" w:eastAsia="Times New Roman"/>
+        </w:rPr>
+        <w:t xml:space="preserve"> </w:t>
+      </w:r>
+      <w:r>
+        <w:rPr>
+          <w:rFonts w:ascii="Times New Roman" w:hAnsi="Times New Roman" w:cs="Times New Roman" w:eastAsia="Times New Roman"/>
+        </w:rPr>
+        <w:t xml:space="preserve">resumes; no human subjects were involved.</w:t>
+      </w:r>
+    </w:p>
+    <w:bookmarkEnd w:id="45"/>
+    <w:bookmarkStart w:id="47" w:name="references"/>
+    <w:p>
+      <w:pPr>
+        <w:pStyle w:val="Heading1"/>
+        <w:jc w:val="center"/>
+      </w:pPr>
+      <w:r>
+        <w:rPr>
+          <w:rFonts w:ascii="Times New Roman" w:hAnsi="Times New Roman" w:cs="Times New Roman" w:eastAsia="Times New Roman"/>
+          <w:b w:val="0"/>
+        </w:rPr>
+        <w:t>REFERENCES</w:t>
+      </w:r>
+    </w:p>
+    <w:p>
+      <w:pPr>
+        <w:pStyle w:val="FirstParagraph"/>
+        <w:jc w:val="both"/>
+      </w:pPr>
+      <w:r>
+        <w:rPr>
+          <w:rFonts w:ascii="Times New Roman" w:hAnsi="Times New Roman" w:cs="Times New Roman" w:eastAsia="Times New Roman"/>
+        </w:rPr>
+        <w:t xml:space="preserve">[1] M. Bogen and A. Rieke,</w:t>
+      </w:r>
+      <w:r>
+        <w:rPr>
+          <w:rFonts w:ascii="Times New Roman" w:hAnsi="Times New Roman" w:cs="Times New Roman" w:eastAsia="Times New Roman"/>
+        </w:rPr>
+        <w:t xml:space="preserve"> </w:t>
+      </w:r>
+      <w:r>
+        <w:rPr>
+          <w:rFonts w:ascii="Times New Roman" w:hAnsi="Times New Roman" w:cs="Times New Roman" w:eastAsia="Times New Roman"/>
+        </w:rPr>
+        <w:t xml:space="preserve">“</w:t>
+      </w:r>
+      <w:r>
+        <w:rPr>
+          <w:rFonts w:ascii="Times New Roman" w:hAnsi="Times New Roman" w:cs="Times New Roman" w:eastAsia="Times New Roman"/>
+        </w:rPr>
+        <w:t xml:space="preserve">Help wanted: An examination of hiring algorithms,</w:t>
+      </w:r>
+      <w:r>
+        <w:rPr>
+          <w:rFonts w:ascii="Times New Roman" w:hAnsi="Times New Roman" w:cs="Times New Roman" w:eastAsia="Times New Roman"/>
+        </w:rPr>
+        <w:t xml:space="preserve"> </w:t>
+      </w:r>
+      <w:r>
+        <w:rPr>
+          <w:rFonts w:ascii="Times New Roman" w:hAnsi="Times New Roman" w:cs="Times New Roman" w:eastAsia="Times New Roman"/>
+        </w:rPr>
+        <w:t xml:space="preserve">equity, and bias,</w:t>
+      </w:r>
+      <w:r>
+        <w:rPr>
+          <w:rFonts w:ascii="Times New Roman" w:hAnsi="Times New Roman" w:cs="Times New Roman" w:eastAsia="Times New Roman"/>
+        </w:rPr>
+        <w:t xml:space="preserve">”</w:t>
+      </w:r>
+      <w:r>
+        <w:rPr>
+          <w:rFonts w:ascii="Times New Roman" w:hAnsi="Times New Roman" w:cs="Times New Roman" w:eastAsia="Times New Roman"/>
+        </w:rPr>
+        <w:t xml:space="preserve"> </w:t>
+      </w:r>
+      <w:r>
+        <w:rPr>
+          <w:rFonts w:ascii="Times New Roman" w:hAnsi="Times New Roman" w:cs="Times New Roman" w:eastAsia="Times New Roman"/>
+        </w:rPr>
+        <w:t xml:space="preserve">Upturn, Washington, DC, USA, Dec. 2018.</w:t>
       </w:r>
     </w:p>
     <w:p>
@@ -11032,205 +12070,7 @@
         <w:rPr>
           <w:rFonts w:ascii="Times New Roman" w:hAnsi="Times New Roman" w:cs="Times New Roman" w:eastAsia="Times New Roman"/>
         </w:rPr>
-        <w:t xml:space="preserve">Proposed but not yet demonstrated: that recruiters make better or fairer</w:t>
-      </w:r>
-      <w:r>
-        <w:rPr>
-          <w:rFonts w:ascii="Times New Roman" w:hAnsi="Times New Roman" w:cs="Times New Roman" w:eastAsia="Times New Roman"/>
-        </w:rPr>
-        <w:t xml:space="preserve"> </w:t>
-      </w:r>
-      <w:r>
-        <w:rPr>
-          <w:rFonts w:ascii="Times New Roman" w:hAnsi="Times New Roman" w:cs="Times New Roman" w:eastAsia="Times New Roman"/>
-        </w:rPr>
-        <w:t xml:space="preserve">decisions with a claim audit than with a score; that the face threshold holds</w:t>
-      </w:r>
-      <w:r>
-        <w:rPr>
-          <w:rFonts w:ascii="Times New Roman" w:hAnsi="Times New Roman" w:cs="Times New Roman" w:eastAsia="Times New Roman"/>
-        </w:rPr>
-        <w:t xml:space="preserve"> </w:t>
-      </w:r>
-      <w:r>
-        <w:rPr>
-          <w:rFonts w:ascii="Times New Roman" w:hAnsi="Times New Roman" w:cs="Times New Roman" w:eastAsia="Times New Roman"/>
-        </w:rPr>
-        <w:t xml:space="preserve">on the candidate population; and that the system’s regulatory mapping would</w:t>
-      </w:r>
-      <w:r>
-        <w:rPr>
-          <w:rFonts w:ascii="Times New Roman" w:hAnsi="Times New Roman" w:cs="Times New Roman" w:eastAsia="Times New Roman"/>
-        </w:rPr>
-        <w:t xml:space="preserve"> </w:t>
-      </w:r>
-      <w:r>
-        <w:rPr>
-          <w:rFonts w:ascii="Times New Roman" w:hAnsi="Times New Roman" w:cs="Times New Roman" w:eastAsia="Times New Roman"/>
-        </w:rPr>
-        <w:t xml:space="preserve">satisfy an auditor. These are the next steps: a controlled recruiter study</w:t>
-      </w:r>
-      <w:r>
-        <w:rPr>
-          <w:rFonts w:ascii="Times New Roman" w:hAnsi="Times New Roman" w:cs="Times New Roman" w:eastAsia="Times New Roman"/>
-        </w:rPr>
-        <w:t xml:space="preserve"> </w:t>
-      </w:r>
-      <w:r>
-        <w:rPr>
-          <w:rFonts w:ascii="Times New Roman" w:hAnsi="Times New Roman" w:cs="Times New Roman" w:eastAsia="Times New Roman"/>
-        </w:rPr>
-        <w:t xml:space="preserve">comparing inter-reviewer agreement on a claim audit against a composite score,</w:t>
-      </w:r>
-      <w:r>
-        <w:rPr>
-          <w:rFonts w:ascii="Times New Roman" w:hAnsi="Times New Roman" w:cs="Times New Roman" w:eastAsia="Times New Roman"/>
-        </w:rPr>
-        <w:t xml:space="preserve"> </w:t>
-      </w:r>
-      <w:r>
-        <w:rPr>
-          <w:rFonts w:ascii="Times New Roman" w:hAnsi="Times New Roman" w:cs="Times New Roman" w:eastAsia="Times New Roman"/>
-        </w:rPr>
-        <w:t xml:space="preserve">recalibration of the face threshold on consented candidate data, end-to-end</w:t>
-      </w:r>
-      <w:r>
-        <w:rPr>
-          <w:rFonts w:ascii="Times New Roman" w:hAnsi="Times New Roman" w:cs="Times New Roman" w:eastAsia="Times New Roman"/>
-        </w:rPr>
-        <w:t xml:space="preserve"> </w:t>
-      </w:r>
-      <w:r>
-        <w:rPr>
-          <w:rFonts w:ascii="Times New Roman" w:hAnsi="Times New Roman" w:cs="Times New Roman" w:eastAsia="Times New Roman"/>
-        </w:rPr>
-        <w:t xml:space="preserve">timing and validation of the interview stage, a per-check gate ablation,</w:t>
-      </w:r>
-      <w:r>
-        <w:rPr>
-          <w:rFonts w:ascii="Times New Roman" w:hAnsi="Times New Roman" w:cs="Times New Roman" w:eastAsia="Times New Roman"/>
-        </w:rPr>
-        <w:t xml:space="preserve"> </w:t>
-      </w:r>
-      <w:r>
-        <w:rPr>
-          <w:rFonts w:ascii="Times New Roman" w:hAnsi="Times New Roman" w:cs="Times New Roman" w:eastAsia="Times New Roman"/>
-        </w:rPr>
-        <w:t xml:space="preserve">real-world injection corpora, entity-disjoint cross-validation, demographically</w:t>
-      </w:r>
-      <w:r>
-        <w:rPr>
-          <w:rFonts w:ascii="Times New Roman" w:hAnsi="Times New Roman" w:cs="Times New Roman" w:eastAsia="Times New Roman"/>
-        </w:rPr>
-        <w:t xml:space="preserve"> </w:t>
-      </w:r>
-      <w:r>
-        <w:rPr>
-          <w:rFonts w:ascii="Times New Roman" w:hAnsi="Times New Roman" w:cs="Times New Roman" w:eastAsia="Times New Roman"/>
-        </w:rPr>
-        <w:t xml:space="preserve">stratified face evaluation, and continuous identity verification on the</w:t>
-      </w:r>
-      <w:r>
-        <w:rPr>
-          <w:rFonts w:ascii="Times New Roman" w:hAnsi="Times New Roman" w:cs="Times New Roman" w:eastAsia="Times New Roman"/>
-        </w:rPr>
-        <w:t xml:space="preserve"> </w:t>
-      </w:r>
-      <w:r>
-        <w:rPr>
-          <w:rFonts w:ascii="Times New Roman" w:hAnsi="Times New Roman" w:cs="Times New Roman" w:eastAsia="Times New Roman"/>
-        </w:rPr>
-        <w:t xml:space="preserve">production path.</w:t>
-      </w:r>
-    </w:p>
-    <w:bookmarkEnd w:id="43"/>
-    <w:bookmarkStart w:id="44" w:name="data-availability"/>
-    <w:p>
-      <w:pPr>
-        <w:pStyle w:val="Heading1"/>
-        <w:jc w:val="center"/>
-      </w:pPr>
-      <w:r>
-        <w:rPr>
-          <w:rFonts w:ascii="Times New Roman" w:hAnsi="Times New Roman" w:cs="Times New Roman" w:eastAsia="Times New Roman"/>
-          <w:b w:val="0"/>
-        </w:rPr>
-        <w:t>DATA AVAILABILITY</w:t>
-      </w:r>
-    </w:p>
-    <w:p>
-      <w:pPr>
-        <w:pStyle w:val="FirstParagraph"/>
-        <w:jc w:val="both"/>
-      </w:pPr>
-      <w:r>
-        <w:rPr>
-          <w:rFonts w:ascii="Times New Roman" w:hAnsi="Times New Roman" w:cs="Times New Roman" w:eastAsia="Times New Roman"/>
-        </w:rPr>
-        <w:t xml:space="preserve">Analysis code, per-fold results, the prompt-injection harness and figure</w:t>
-      </w:r>
-      <w:r>
-        <w:rPr>
-          <w:rFonts w:ascii="Times New Roman" w:hAnsi="Times New Roman" w:cs="Times New Roman" w:eastAsia="Times New Roman"/>
-        </w:rPr>
-        <w:t xml:space="preserve"> </w:t>
-      </w:r>
-      <w:r>
-        <w:rPr>
-          <w:rFonts w:ascii="Times New Roman" w:hAnsi="Times New Roman" w:cs="Times New Roman" w:eastAsia="Times New Roman"/>
-        </w:rPr>
-        <w:t xml:space="preserve">sources are available from the author on request. The face study uses the</w:t>
-      </w:r>
-      <w:r>
-        <w:rPr>
-          <w:rFonts w:ascii="Times New Roman" w:hAnsi="Times New Roman" w:cs="Times New Roman" w:eastAsia="Times New Roman"/>
-        </w:rPr>
-        <w:t xml:space="preserve"> </w:t>
-      </w:r>
-      <w:r>
-        <w:rPr>
-          <w:rFonts w:ascii="Times New Roman" w:hAnsi="Times New Roman" w:cs="Times New Roman" w:eastAsia="Times New Roman"/>
-        </w:rPr>
-        <w:t xml:space="preserve">public LFW benchmark and the grounding evaluation a synthetic corpus and public</w:t>
-      </w:r>
-      <w:r>
-        <w:rPr>
-          <w:rFonts w:ascii="Times New Roman" w:hAnsi="Times New Roman" w:cs="Times New Roman" w:eastAsia="Times New Roman"/>
-        </w:rPr>
-        <w:t xml:space="preserve"> </w:t>
-      </w:r>
-      <w:r>
-        <w:rPr>
-          <w:rFonts w:ascii="Times New Roman" w:hAnsi="Times New Roman" w:cs="Times New Roman" w:eastAsia="Times New Roman"/>
-        </w:rPr>
-        <w:t xml:space="preserve">resumes; no human subjects were involved.</w:t>
-      </w:r>
-    </w:p>
-    <w:bookmarkEnd w:id="44"/>
-    <w:bookmarkStart w:id="46" w:name="references"/>
-    <w:p>
-      <w:pPr>
-        <w:pStyle w:val="Heading1"/>
-        <w:jc w:val="center"/>
-      </w:pPr>
-      <w:r>
-        <w:rPr>
-          <w:rFonts w:ascii="Times New Roman" w:hAnsi="Times New Roman" w:cs="Times New Roman" w:eastAsia="Times New Roman"/>
-          <w:b w:val="0"/>
-        </w:rPr>
-        <w:t>REFERENCES</w:t>
-      </w:r>
-    </w:p>
-    <w:p>
-      <w:pPr>
-        <w:pStyle w:val="FirstParagraph"/>
-        <w:jc w:val="both"/>
-      </w:pPr>
-      <w:r>
-        <w:rPr>
-          <w:rFonts w:ascii="Times New Roman" w:hAnsi="Times New Roman" w:cs="Times New Roman" w:eastAsia="Times New Roman"/>
-        </w:rPr>
-        <w:t xml:space="preserve">[1] M. Bogen and A. Rieke,</w:t>
+        <w:t xml:space="preserve">[2] M. Raghavan, S. Barocas, J. Kleinberg, and K. Levy,</w:t>
       </w:r>
       <w:r>
         <w:rPr>
@@ -11248,19 +12088,19 @@
         <w:rPr>
           <w:rFonts w:ascii="Times New Roman" w:hAnsi="Times New Roman" w:cs="Times New Roman" w:eastAsia="Times New Roman"/>
         </w:rPr>
-        <w:t xml:space="preserve">Help wanted: An examination of hiring algorithms,</w:t>
-      </w:r>
-      <w:r>
-        <w:rPr>
-          <w:rFonts w:ascii="Times New Roman" w:hAnsi="Times New Roman" w:cs="Times New Roman" w:eastAsia="Times New Roman"/>
-        </w:rPr>
-        <w:t xml:space="preserve"> </w:t>
-      </w:r>
-      <w:r>
-        <w:rPr>
-          <w:rFonts w:ascii="Times New Roman" w:hAnsi="Times New Roman" w:cs="Times New Roman" w:eastAsia="Times New Roman"/>
-        </w:rPr>
-        <w:t xml:space="preserve">equity, and bias,</w:t>
+        <w:t xml:space="preserve">Mitigating bias in</w:t>
+      </w:r>
+      <w:r>
+        <w:rPr>
+          <w:rFonts w:ascii="Times New Roman" w:hAnsi="Times New Roman" w:cs="Times New Roman" w:eastAsia="Times New Roman"/>
+        </w:rPr>
+        <w:t xml:space="preserve"> </w:t>
+      </w:r>
+      <w:r>
+        <w:rPr>
+          <w:rFonts w:ascii="Times New Roman" w:hAnsi="Times New Roman" w:cs="Times New Roman" w:eastAsia="Times New Roman"/>
+        </w:rPr>
+        <w:t xml:space="preserve">algorithmic hiring: Evaluating claims and practices,</w:t>
       </w:r>
       <w:r>
         <w:rPr>
@@ -11278,7 +12118,55 @@
         <w:rPr>
           <w:rFonts w:ascii="Times New Roman" w:hAnsi="Times New Roman" w:cs="Times New Roman" w:eastAsia="Times New Roman"/>
         </w:rPr>
-        <w:t xml:space="preserve">Upturn, Washington, DC, USA, Dec. 2018.</w:t>
+        <w:t xml:space="preserve">in</w:t>
+      </w:r>
+      <w:r>
+        <w:rPr>
+          <w:rFonts w:ascii="Times New Roman" w:hAnsi="Times New Roman" w:cs="Times New Roman" w:eastAsia="Times New Roman"/>
+        </w:rPr>
+        <w:t xml:space="preserve"> </w:t>
+      </w:r>
+      <w:r>
+        <w:rPr>
+          <w:rFonts w:ascii="Times New Roman" w:hAnsi="Times New Roman" w:cs="Times New Roman" w:eastAsia="Times New Roman"/>
+          <w:iCs/>
+          <w:i/>
+        </w:rPr>
+        <w:t xml:space="preserve">Proc. Conf.</w:t>
+      </w:r>
+      <w:r>
+        <w:rPr>
+          <w:rFonts w:ascii="Times New Roman" w:hAnsi="Times New Roman" w:cs="Times New Roman" w:eastAsia="Times New Roman"/>
+          <w:iCs/>
+          <w:i/>
+        </w:rPr>
+        <w:t xml:space="preserve"> </w:t>
+      </w:r>
+      <w:r>
+        <w:rPr>
+          <w:rFonts w:ascii="Times New Roman" w:hAnsi="Times New Roman" w:cs="Times New Roman" w:eastAsia="Times New Roman"/>
+          <w:iCs/>
+          <w:i/>
+        </w:rPr>
+        <w:t xml:space="preserve">Fairness, Accountability, and Transparency (FAT* ’20)</w:t>
+      </w:r>
+      <w:r>
+        <w:rPr>
+          <w:rFonts w:ascii="Times New Roman" w:hAnsi="Times New Roman" w:cs="Times New Roman" w:eastAsia="Times New Roman"/>
+        </w:rPr>
+        <w:t xml:space="preserve">, Barcelona, Spain,</w:t>
+      </w:r>
+      <w:r>
+        <w:rPr>
+          <w:rFonts w:ascii="Times New Roman" w:hAnsi="Times New Roman" w:cs="Times New Roman" w:eastAsia="Times New Roman"/>
+        </w:rPr>
+        <w:t xml:space="preserve"> </w:t>
+      </w:r>
+      <w:r>
+        <w:rPr>
+          <w:rFonts w:ascii="Times New Roman" w:hAnsi="Times New Roman" w:cs="Times New Roman" w:eastAsia="Times New Roman"/>
+        </w:rPr>
+        <w:t xml:space="preserve">2020, pp. 469–481.</w:t>
       </w:r>
     </w:p>
     <w:p>
@@ -11290,7 +12178,7 @@
         <w:rPr>
           <w:rFonts w:ascii="Times New Roman" w:hAnsi="Times New Roman" w:cs="Times New Roman" w:eastAsia="Times New Roman"/>
         </w:rPr>
-        <w:t xml:space="preserve">[2] M. Raghavan, S. Barocas, J. Kleinberg, and K. Levy,</w:t>
+        <w:t xml:space="preserve">[3] S. Wachter, B. Mittelstadt, and C. Russell,</w:t>
       </w:r>
       <w:r>
         <w:rPr>
@@ -11308,37 +12196,25 @@
         <w:rPr>
           <w:rFonts w:ascii="Times New Roman" w:hAnsi="Times New Roman" w:cs="Times New Roman" w:eastAsia="Times New Roman"/>
         </w:rPr>
-        <w:t xml:space="preserve">Mitigating bias in</w:t>
-      </w:r>
-      <w:r>
-        <w:rPr>
-          <w:rFonts w:ascii="Times New Roman" w:hAnsi="Times New Roman" w:cs="Times New Roman" w:eastAsia="Times New Roman"/>
-        </w:rPr>
-        <w:t xml:space="preserve"> </w:t>
-      </w:r>
-      <w:r>
-        <w:rPr>
-          <w:rFonts w:ascii="Times New Roman" w:hAnsi="Times New Roman" w:cs="Times New Roman" w:eastAsia="Times New Roman"/>
-        </w:rPr>
-        <w:t xml:space="preserve">algorithmic hiring: Evaluating claims and practices,</w:t>
+        <w:t xml:space="preserve">Counterfactual explanations</w:t>
+      </w:r>
+      <w:r>
+        <w:rPr>
+          <w:rFonts w:ascii="Times New Roman" w:hAnsi="Times New Roman" w:cs="Times New Roman" w:eastAsia="Times New Roman"/>
+        </w:rPr>
+        <w:t xml:space="preserve"> </w:t>
+      </w:r>
+      <w:r>
+        <w:rPr>
+          <w:rFonts w:ascii="Times New Roman" w:hAnsi="Times New Roman" w:cs="Times New Roman" w:eastAsia="Times New Roman"/>
+        </w:rPr>
+        <w:t xml:space="preserve">without opening the black box: Automated decisions and the GDPR,</w:t>
       </w:r>
       <w:r>
         <w:rPr>
           <w:rFonts w:ascii="Times New Roman" w:hAnsi="Times New Roman" w:cs="Times New Roman" w:eastAsia="Times New Roman"/>
         </w:rPr>
         <w:t xml:space="preserve">”</w:t>
-      </w:r>
-      <w:r>
-        <w:rPr>
-          <w:rFonts w:ascii="Times New Roman" w:hAnsi="Times New Roman" w:cs="Times New Roman" w:eastAsia="Times New Roman"/>
-        </w:rPr>
-        <w:t xml:space="preserve"> </w:t>
-      </w:r>
-      <w:r>
-        <w:rPr>
-          <w:rFonts w:ascii="Times New Roman" w:hAnsi="Times New Roman" w:cs="Times New Roman" w:eastAsia="Times New Roman"/>
-        </w:rPr>
-        <w:t xml:space="preserve">in</w:t>
       </w:r>
       <w:r>
         <w:rPr>
@@ -11352,41 +12228,13 @@
           <w:iCs/>
           <w:i/>
         </w:rPr>
-        <w:t xml:space="preserve">Proc. Conf.</w:t>
-      </w:r>
-      <w:r>
-        <w:rPr>
-          <w:rFonts w:ascii="Times New Roman" w:hAnsi="Times New Roman" w:cs="Times New Roman" w:eastAsia="Times New Roman"/>
-          <w:iCs/>
-          <w:i/>
-        </w:rPr>
-        <w:t xml:space="preserve"> </w:t>
-      </w:r>
-      <w:r>
-        <w:rPr>
-          <w:rFonts w:ascii="Times New Roman" w:hAnsi="Times New Roman" w:cs="Times New Roman" w:eastAsia="Times New Roman"/>
-          <w:iCs/>
-          <w:i/>
-        </w:rPr>
-        <w:t xml:space="preserve">Fairness, Accountability, and Transparency (FAT* ’20)</w:t>
-      </w:r>
-      <w:r>
-        <w:rPr>
-          <w:rFonts w:ascii="Times New Roman" w:hAnsi="Times New Roman" w:cs="Times New Roman" w:eastAsia="Times New Roman"/>
-        </w:rPr>
-        <w:t xml:space="preserve">, Barcelona, Spain,</w:t>
-      </w:r>
-      <w:r>
-        <w:rPr>
-          <w:rFonts w:ascii="Times New Roman" w:hAnsi="Times New Roman" w:cs="Times New Roman" w:eastAsia="Times New Roman"/>
-        </w:rPr>
-        <w:t xml:space="preserve"> </w:t>
-      </w:r>
-      <w:r>
-        <w:rPr>
-          <w:rFonts w:ascii="Times New Roman" w:hAnsi="Times New Roman" w:cs="Times New Roman" w:eastAsia="Times New Roman"/>
-        </w:rPr>
-        <w:t xml:space="preserve">2020, pp. 469–481.</w:t>
+        <w:t xml:space="preserve">Harvard J. Law Technol.</w:t>
+      </w:r>
+      <w:r>
+        <w:rPr>
+          <w:rFonts w:ascii="Times New Roman" w:hAnsi="Times New Roman" w:cs="Times New Roman" w:eastAsia="Times New Roman"/>
+        </w:rPr>
+        <w:t xml:space="preserve">, vol. 31, no. 2, pp. 841–887, 2018.</w:t>
       </w:r>
     </w:p>
     <w:p>
@@ -11398,43 +12246,7 @@
         <w:rPr>
           <w:rFonts w:ascii="Times New Roman" w:hAnsi="Times New Roman" w:cs="Times New Roman" w:eastAsia="Times New Roman"/>
         </w:rPr>
-        <w:t xml:space="preserve">[3] S. Wachter, B. Mittelstadt, and C. Russell,</w:t>
-      </w:r>
-      <w:r>
-        <w:rPr>
-          <w:rFonts w:ascii="Times New Roman" w:hAnsi="Times New Roman" w:cs="Times New Roman" w:eastAsia="Times New Roman"/>
-        </w:rPr>
-        <w:t xml:space="preserve"> </w:t>
-      </w:r>
-      <w:r>
-        <w:rPr>
-          <w:rFonts w:ascii="Times New Roman" w:hAnsi="Times New Roman" w:cs="Times New Roman" w:eastAsia="Times New Roman"/>
-        </w:rPr>
-        <w:t xml:space="preserve">“</w:t>
-      </w:r>
-      <w:r>
-        <w:rPr>
-          <w:rFonts w:ascii="Times New Roman" w:hAnsi="Times New Roman" w:cs="Times New Roman" w:eastAsia="Times New Roman"/>
-        </w:rPr>
-        <w:t xml:space="preserve">Counterfactual explanations</w:t>
-      </w:r>
-      <w:r>
-        <w:rPr>
-          <w:rFonts w:ascii="Times New Roman" w:hAnsi="Times New Roman" w:cs="Times New Roman" w:eastAsia="Times New Roman"/>
-        </w:rPr>
-        <w:t xml:space="preserve"> </w:t>
-      </w:r>
-      <w:r>
-        <w:rPr>
-          <w:rFonts w:ascii="Times New Roman" w:hAnsi="Times New Roman" w:cs="Times New Roman" w:eastAsia="Times New Roman"/>
-        </w:rPr>
-        <w:t xml:space="preserve">without opening the black box: Automated decisions and the GDPR,</w:t>
-      </w:r>
-      <w:r>
-        <w:rPr>
-          <w:rFonts w:ascii="Times New Roman" w:hAnsi="Times New Roman" w:cs="Times New Roman" w:eastAsia="Times New Roman"/>
-        </w:rPr>
-        <w:t xml:space="preserve">”</w:t>
+        <w:t xml:space="preserve">[4] Z. Ji</w:t>
       </w:r>
       <w:r>
         <w:rPr>
@@ -11448,13 +12260,69 @@
           <w:iCs/>
           <w:i/>
         </w:rPr>
-        <w:t xml:space="preserve">Harvard J. Law Technol.</w:t>
-      </w:r>
-      <w:r>
-        <w:rPr>
-          <w:rFonts w:ascii="Times New Roman" w:hAnsi="Times New Roman" w:cs="Times New Roman" w:eastAsia="Times New Roman"/>
-        </w:rPr>
-        <w:t xml:space="preserve">, vol. 31, no. 2, pp. 841–887, 2018.</w:t>
+        <w:t xml:space="preserve">et al.</w:t>
+      </w:r>
+      <w:r>
+        <w:rPr>
+          <w:rFonts w:ascii="Times New Roman" w:hAnsi="Times New Roman" w:cs="Times New Roman" w:eastAsia="Times New Roman"/>
+        </w:rPr>
+        <w:t xml:space="preserve">,</w:t>
+      </w:r>
+      <w:r>
+        <w:rPr>
+          <w:rFonts w:ascii="Times New Roman" w:hAnsi="Times New Roman" w:cs="Times New Roman" w:eastAsia="Times New Roman"/>
+        </w:rPr>
+        <w:t xml:space="preserve"> </w:t>
+      </w:r>
+      <w:r>
+        <w:rPr>
+          <w:rFonts w:ascii="Times New Roman" w:hAnsi="Times New Roman" w:cs="Times New Roman" w:eastAsia="Times New Roman"/>
+        </w:rPr>
+        <w:t xml:space="preserve">“</w:t>
+      </w:r>
+      <w:r>
+        <w:rPr>
+          <w:rFonts w:ascii="Times New Roman" w:hAnsi="Times New Roman" w:cs="Times New Roman" w:eastAsia="Times New Roman"/>
+        </w:rPr>
+        <w:t xml:space="preserve">Survey of hallucination in natural language</w:t>
+      </w:r>
+      <w:r>
+        <w:rPr>
+          <w:rFonts w:ascii="Times New Roman" w:hAnsi="Times New Roman" w:cs="Times New Roman" w:eastAsia="Times New Roman"/>
+        </w:rPr>
+        <w:t xml:space="preserve"> </w:t>
+      </w:r>
+      <w:r>
+        <w:rPr>
+          <w:rFonts w:ascii="Times New Roman" w:hAnsi="Times New Roman" w:cs="Times New Roman" w:eastAsia="Times New Roman"/>
+        </w:rPr>
+        <w:t xml:space="preserve">generation,</w:t>
+      </w:r>
+      <w:r>
+        <w:rPr>
+          <w:rFonts w:ascii="Times New Roman" w:hAnsi="Times New Roman" w:cs="Times New Roman" w:eastAsia="Times New Roman"/>
+        </w:rPr>
+        <w:t xml:space="preserve">”</w:t>
+      </w:r>
+      <w:r>
+        <w:rPr>
+          <w:rFonts w:ascii="Times New Roman" w:hAnsi="Times New Roman" w:cs="Times New Roman" w:eastAsia="Times New Roman"/>
+        </w:rPr>
+        <w:t xml:space="preserve"> </w:t>
+      </w:r>
+      <w:r>
+        <w:rPr>
+          <w:rFonts w:ascii="Times New Roman" w:hAnsi="Times New Roman" w:cs="Times New Roman" w:eastAsia="Times New Roman"/>
+          <w:iCs/>
+          <w:i/>
+        </w:rPr>
+        <w:t xml:space="preserve">ACM Comput. Surv.</w:t>
+      </w:r>
+      <w:r>
+        <w:rPr>
+          <w:rFonts w:ascii="Times New Roman" w:hAnsi="Times New Roman" w:cs="Times New Roman" w:eastAsia="Times New Roman"/>
+        </w:rPr>
+        <w:t xml:space="preserve">, vol. 55, no. 12, Art. no. 248, 2023.</w:t>
       </w:r>
     </w:p>
     <w:p>
@@ -11466,7 +12334,67 @@
         <w:rPr>
           <w:rFonts w:ascii="Times New Roman" w:hAnsi="Times New Roman" w:cs="Times New Roman" w:eastAsia="Times New Roman"/>
         </w:rPr>
-        <w:t xml:space="preserve">[4] Z. Ji</w:t>
+        <w:t xml:space="preserve">[5] K. Greshake, S. Abdelnabi, S. Mishra, C. Endres, T. Holz, and M. Fritz,</w:t>
+      </w:r>
+      <w:r>
+        <w:rPr>
+          <w:rFonts w:ascii="Times New Roman" w:hAnsi="Times New Roman" w:cs="Times New Roman" w:eastAsia="Times New Roman"/>
+        </w:rPr>
+        <w:t xml:space="preserve"> </w:t>
+      </w:r>
+      <w:r>
+        <w:rPr>
+          <w:rFonts w:ascii="Times New Roman" w:hAnsi="Times New Roman" w:cs="Times New Roman" w:eastAsia="Times New Roman"/>
+        </w:rPr>
+        <w:t xml:space="preserve">“</w:t>
+      </w:r>
+      <w:r>
+        <w:rPr>
+          <w:rFonts w:ascii="Times New Roman" w:hAnsi="Times New Roman" w:cs="Times New Roman" w:eastAsia="Times New Roman"/>
+        </w:rPr>
+        <w:t xml:space="preserve">Not</w:t>
+      </w:r>
+      <w:r>
+        <w:rPr>
+          <w:rFonts w:ascii="Times New Roman" w:hAnsi="Times New Roman" w:cs="Times New Roman" w:eastAsia="Times New Roman"/>
+        </w:rPr>
+        <w:t xml:space="preserve"> </w:t>
+      </w:r>
+      <w:r>
+        <w:rPr>
+          <w:rFonts w:ascii="Times New Roman" w:hAnsi="Times New Roman" w:cs="Times New Roman" w:eastAsia="Times New Roman"/>
+        </w:rPr>
+        <w:t xml:space="preserve">what you’ve signed up for: Compromising real-world LLM-integrated applications</w:t>
+      </w:r>
+      <w:r>
+        <w:rPr>
+          <w:rFonts w:ascii="Times New Roman" w:hAnsi="Times New Roman" w:cs="Times New Roman" w:eastAsia="Times New Roman"/>
+        </w:rPr>
+        <w:t xml:space="preserve"> </w:t>
+      </w:r>
+      <w:r>
+        <w:rPr>
+          <w:rFonts w:ascii="Times New Roman" w:hAnsi="Times New Roman" w:cs="Times New Roman" w:eastAsia="Times New Roman"/>
+        </w:rPr>
+        <w:t xml:space="preserve">with indirect prompt injection,</w:t>
+      </w:r>
+      <w:r>
+        <w:rPr>
+          <w:rFonts w:ascii="Times New Roman" w:hAnsi="Times New Roman" w:cs="Times New Roman" w:eastAsia="Times New Roman"/>
+        </w:rPr>
+        <w:t xml:space="preserve">”</w:t>
+      </w:r>
+      <w:r>
+        <w:rPr>
+          <w:rFonts w:ascii="Times New Roman" w:hAnsi="Times New Roman" w:cs="Times New Roman" w:eastAsia="Times New Roman"/>
+        </w:rPr>
+        <w:t xml:space="preserve"> </w:t>
+      </w:r>
+      <w:r>
+        <w:rPr>
+          <w:rFonts w:ascii="Times New Roman" w:hAnsi="Times New Roman" w:cs="Times New Roman" w:eastAsia="Times New Roman"/>
+        </w:rPr>
+        <w:t xml:space="preserve">in</w:t>
       </w:r>
       <w:r>
         <w:rPr>
@@ -11480,55 +12408,7 @@
           <w:iCs/>
           <w:i/>
         </w:rPr>
-        <w:t xml:space="preserve">et al.</w:t>
-      </w:r>
-      <w:r>
-        <w:rPr>
-          <w:rFonts w:ascii="Times New Roman" w:hAnsi="Times New Roman" w:cs="Times New Roman" w:eastAsia="Times New Roman"/>
-        </w:rPr>
-        <w:t xml:space="preserve">,</w:t>
-      </w:r>
-      <w:r>
-        <w:rPr>
-          <w:rFonts w:ascii="Times New Roman" w:hAnsi="Times New Roman" w:cs="Times New Roman" w:eastAsia="Times New Roman"/>
-        </w:rPr>
-        <w:t xml:space="preserve"> </w:t>
-      </w:r>
-      <w:r>
-        <w:rPr>
-          <w:rFonts w:ascii="Times New Roman" w:hAnsi="Times New Roman" w:cs="Times New Roman" w:eastAsia="Times New Roman"/>
-        </w:rPr>
-        <w:t xml:space="preserve">“</w:t>
-      </w:r>
-      <w:r>
-        <w:rPr>
-          <w:rFonts w:ascii="Times New Roman" w:hAnsi="Times New Roman" w:cs="Times New Roman" w:eastAsia="Times New Roman"/>
-        </w:rPr>
-        <w:t xml:space="preserve">Survey of hallucination in natural language</w:t>
-      </w:r>
-      <w:r>
-        <w:rPr>
-          <w:rFonts w:ascii="Times New Roman" w:hAnsi="Times New Roman" w:cs="Times New Roman" w:eastAsia="Times New Roman"/>
-        </w:rPr>
-        <w:t xml:space="preserve"> </w:t>
-      </w:r>
-      <w:r>
-        <w:rPr>
-          <w:rFonts w:ascii="Times New Roman" w:hAnsi="Times New Roman" w:cs="Times New Roman" w:eastAsia="Times New Roman"/>
-        </w:rPr>
-        <w:t xml:space="preserve">generation,</w:t>
-      </w:r>
-      <w:r>
-        <w:rPr>
-          <w:rFonts w:ascii="Times New Roman" w:hAnsi="Times New Roman" w:cs="Times New Roman" w:eastAsia="Times New Roman"/>
-        </w:rPr>
-        <w:t xml:space="preserve">”</w:t>
-      </w:r>
-      <w:r>
-        <w:rPr>
-          <w:rFonts w:ascii="Times New Roman" w:hAnsi="Times New Roman" w:cs="Times New Roman" w:eastAsia="Times New Roman"/>
-        </w:rPr>
-        <w:t xml:space="preserve"> </w:t>
+        <w:t xml:space="preserve">Proc. 16th ACM Workshop Artif.</w:t>
       </w:r>
       <w:r>
         <w:rPr>
@@ -11536,13 +12416,21 @@
           <w:iCs/>
           <w:i/>
         </w:rPr>
-        <w:t xml:space="preserve">ACM Comput. Surv.</w:t>
-      </w:r>
-      <w:r>
-        <w:rPr>
-          <w:rFonts w:ascii="Times New Roman" w:hAnsi="Times New Roman" w:cs="Times New Roman" w:eastAsia="Times New Roman"/>
-        </w:rPr>
-        <w:t xml:space="preserve">, vol. 55, no. 12, Art. no. 248, 2023.</w:t>
+        <w:t xml:space="preserve"> </w:t>
+      </w:r>
+      <w:r>
+        <w:rPr>
+          <w:rFonts w:ascii="Times New Roman" w:hAnsi="Times New Roman" w:cs="Times New Roman" w:eastAsia="Times New Roman"/>
+          <w:iCs/>
+          <w:i/>
+        </w:rPr>
+        <w:t xml:space="preserve">Intell. Security (AISec ’23)</w:t>
+      </w:r>
+      <w:r>
+        <w:rPr>
+          <w:rFonts w:ascii="Times New Roman" w:hAnsi="Times New Roman" w:cs="Times New Roman" w:eastAsia="Times New Roman"/>
+        </w:rPr>
+        <w:t xml:space="preserve">, 2023, pp. 79–90.</w:t>
       </w:r>
     </w:p>
     <w:p>
@@ -11554,7 +12442,7 @@
         <w:rPr>
           <w:rFonts w:ascii="Times New Roman" w:hAnsi="Times New Roman" w:cs="Times New Roman" w:eastAsia="Times New Roman"/>
         </w:rPr>
-        <w:t xml:space="preserve">[5] K. Greshake, S. Abdelnabi, S. Mishra, C. Endres, T. Holz, and M. Fritz,</w:t>
+        <w:t xml:space="preserve">[6] M. Ferrari Dacrema, P. Cremonesi, and D. Jannach,</w:t>
       </w:r>
       <w:r>
         <w:rPr>
@@ -11572,31 +12460,19 @@
         <w:rPr>
           <w:rFonts w:ascii="Times New Roman" w:hAnsi="Times New Roman" w:cs="Times New Roman" w:eastAsia="Times New Roman"/>
         </w:rPr>
-        <w:t xml:space="preserve">Not</w:t>
-      </w:r>
-      <w:r>
-        <w:rPr>
-          <w:rFonts w:ascii="Times New Roman" w:hAnsi="Times New Roman" w:cs="Times New Roman" w:eastAsia="Times New Roman"/>
-        </w:rPr>
-        <w:t xml:space="preserve"> </w:t>
-      </w:r>
-      <w:r>
-        <w:rPr>
-          <w:rFonts w:ascii="Times New Roman" w:hAnsi="Times New Roman" w:cs="Times New Roman" w:eastAsia="Times New Roman"/>
-        </w:rPr>
-        <w:t xml:space="preserve">what you’ve signed up for: Compromising real-world LLM-integrated applications</w:t>
-      </w:r>
-      <w:r>
-        <w:rPr>
-          <w:rFonts w:ascii="Times New Roman" w:hAnsi="Times New Roman" w:cs="Times New Roman" w:eastAsia="Times New Roman"/>
-        </w:rPr>
-        <w:t xml:space="preserve"> </w:t>
-      </w:r>
-      <w:r>
-        <w:rPr>
-          <w:rFonts w:ascii="Times New Roman" w:hAnsi="Times New Roman" w:cs="Times New Roman" w:eastAsia="Times New Roman"/>
-        </w:rPr>
-        <w:t xml:space="preserve">with indirect prompt injection,</w:t>
+        <w:t xml:space="preserve">Are we really making much</w:t>
+      </w:r>
+      <w:r>
+        <w:rPr>
+          <w:rFonts w:ascii="Times New Roman" w:hAnsi="Times New Roman" w:cs="Times New Roman" w:eastAsia="Times New Roman"/>
+        </w:rPr>
+        <w:t xml:space="preserve"> </w:t>
+      </w:r>
+      <w:r>
+        <w:rPr>
+          <w:rFonts w:ascii="Times New Roman" w:hAnsi="Times New Roman" w:cs="Times New Roman" w:eastAsia="Times New Roman"/>
+        </w:rPr>
+        <w:t xml:space="preserve">progress? A worrying analysis of recent neural recommendation approaches,</w:t>
       </w:r>
       <w:r>
         <w:rPr>
@@ -11628,29 +12504,25 @@
           <w:iCs/>
           <w:i/>
         </w:rPr>
-        <w:t xml:space="preserve">Proc. 16th ACM Workshop Artif.</w:t>
-      </w:r>
-      <w:r>
-        <w:rPr>
-          <w:rFonts w:ascii="Times New Roman" w:hAnsi="Times New Roman" w:cs="Times New Roman" w:eastAsia="Times New Roman"/>
-          <w:iCs/>
-          <w:i/>
-        </w:rPr>
-        <w:t xml:space="preserve"> </w:t>
-      </w:r>
-      <w:r>
-        <w:rPr>
-          <w:rFonts w:ascii="Times New Roman" w:hAnsi="Times New Roman" w:cs="Times New Roman" w:eastAsia="Times New Roman"/>
-          <w:iCs/>
-          <w:i/>
-        </w:rPr>
-        <w:t xml:space="preserve">Intell. Security (AISec ’23)</w:t>
-      </w:r>
-      <w:r>
-        <w:rPr>
-          <w:rFonts w:ascii="Times New Roman" w:hAnsi="Times New Roman" w:cs="Times New Roman" w:eastAsia="Times New Roman"/>
-        </w:rPr>
-        <w:t xml:space="preserve">, 2023, pp. 79–90.</w:t>
+        <w:t xml:space="preserve">Proc. 13th ACM Conf. Recommender Systems (RecSys ’19)</w:t>
+      </w:r>
+      <w:r>
+        <w:rPr>
+          <w:rFonts w:ascii="Times New Roman" w:hAnsi="Times New Roman" w:cs="Times New Roman" w:eastAsia="Times New Roman"/>
+        </w:rPr>
+        <w:t xml:space="preserve">, Copenhagen,</w:t>
+      </w:r>
+      <w:r>
+        <w:rPr>
+          <w:rFonts w:ascii="Times New Roman" w:hAnsi="Times New Roman" w:cs="Times New Roman" w:eastAsia="Times New Roman"/>
+        </w:rPr>
+        <w:t xml:space="preserve"> </w:t>
+      </w:r>
+      <w:r>
+        <w:rPr>
+          <w:rFonts w:ascii="Times New Roman" w:hAnsi="Times New Roman" w:cs="Times New Roman" w:eastAsia="Times New Roman"/>
+        </w:rPr>
+        <w:t xml:space="preserve">Denmark, 2019, pp. 101–109.</w:t>
       </w:r>
     </w:p>
     <w:p>
@@ -11662,7 +12534,7 @@
         <w:rPr>
           <w:rFonts w:ascii="Times New Roman" w:hAnsi="Times New Roman" w:cs="Times New Roman" w:eastAsia="Times New Roman"/>
         </w:rPr>
-        <w:t xml:space="preserve">[6] M. Ferrari Dacrema, P. Cremonesi, and D. Jannach,</w:t>
+        <w:t xml:space="preserve">[7] K. Musgrave, S. Belongie, and S.-N. Lim,</w:t>
       </w:r>
       <w:r>
         <w:rPr>
@@ -11680,19 +12552,7 @@
         <w:rPr>
           <w:rFonts w:ascii="Times New Roman" w:hAnsi="Times New Roman" w:cs="Times New Roman" w:eastAsia="Times New Roman"/>
         </w:rPr>
-        <w:t xml:space="preserve">Are we really making much</w:t>
-      </w:r>
-      <w:r>
-        <w:rPr>
-          <w:rFonts w:ascii="Times New Roman" w:hAnsi="Times New Roman" w:cs="Times New Roman" w:eastAsia="Times New Roman"/>
-        </w:rPr>
-        <w:t xml:space="preserve"> </w:t>
-      </w:r>
-      <w:r>
-        <w:rPr>
-          <w:rFonts w:ascii="Times New Roman" w:hAnsi="Times New Roman" w:cs="Times New Roman" w:eastAsia="Times New Roman"/>
-        </w:rPr>
-        <w:t xml:space="preserve">progress? A worrying analysis of recent neural recommendation approaches,</w:t>
+        <w:t xml:space="preserve">A metric learning reality check,</w:t>
       </w:r>
       <w:r>
         <w:rPr>
@@ -11724,25 +12584,25 @@
           <w:iCs/>
           <w:i/>
         </w:rPr>
-        <w:t xml:space="preserve">Proc. 13th ACM Conf. Recommender Systems (RecSys ’19)</w:t>
-      </w:r>
-      <w:r>
-        <w:rPr>
-          <w:rFonts w:ascii="Times New Roman" w:hAnsi="Times New Roman" w:cs="Times New Roman" w:eastAsia="Times New Roman"/>
-        </w:rPr>
-        <w:t xml:space="preserve">, Copenhagen,</w:t>
-      </w:r>
-      <w:r>
-        <w:rPr>
-          <w:rFonts w:ascii="Times New Roman" w:hAnsi="Times New Roman" w:cs="Times New Roman" w:eastAsia="Times New Roman"/>
-        </w:rPr>
-        <w:t xml:space="preserve"> </w:t>
-      </w:r>
-      <w:r>
-        <w:rPr>
-          <w:rFonts w:ascii="Times New Roman" w:hAnsi="Times New Roman" w:cs="Times New Roman" w:eastAsia="Times New Roman"/>
-        </w:rPr>
-        <w:t xml:space="preserve">Denmark, 2019, pp. 101–109.</w:t>
+        <w:t xml:space="preserve">Computer Vision – ECCV 2020</w:t>
+      </w:r>
+      <w:r>
+        <w:rPr>
+          <w:rFonts w:ascii="Times New Roman" w:hAnsi="Times New Roman" w:cs="Times New Roman" w:eastAsia="Times New Roman"/>
+        </w:rPr>
+        <w:t xml:space="preserve">, ser. LNCS, vol. 12370. Cham,</w:t>
+      </w:r>
+      <w:r>
+        <w:rPr>
+          <w:rFonts w:ascii="Times New Roman" w:hAnsi="Times New Roman" w:cs="Times New Roman" w:eastAsia="Times New Roman"/>
+        </w:rPr>
+        <w:t xml:space="preserve"> </w:t>
+      </w:r>
+      <w:r>
+        <w:rPr>
+          <w:rFonts w:ascii="Times New Roman" w:hAnsi="Times New Roman" w:cs="Times New Roman" w:eastAsia="Times New Roman"/>
+        </w:rPr>
+        <w:t xml:space="preserve">Switzerland: Springer, 2020, pp. 681–699.</w:t>
       </w:r>
     </w:p>
     <w:p>
@@ -11754,7 +12614,7 @@
         <w:rPr>
           <w:rFonts w:ascii="Times New Roman" w:hAnsi="Times New Roman" w:cs="Times New Roman" w:eastAsia="Times New Roman"/>
         </w:rPr>
-        <w:t xml:space="preserve">[7] K. Musgrave, S. Belongie, and S.-N. Lim,</w:t>
+        <w:t xml:space="preserve">[8] L. Grinsztajn, E. Oyallon, and G. Varoquaux,</w:t>
       </w:r>
       <w:r>
         <w:rPr>
@@ -11772,7 +12632,19 @@
         <w:rPr>
           <w:rFonts w:ascii="Times New Roman" w:hAnsi="Times New Roman" w:cs="Times New Roman" w:eastAsia="Times New Roman"/>
         </w:rPr>
-        <w:t xml:space="preserve">A metric learning reality check,</w:t>
+        <w:t xml:space="preserve">Why do tree-based models still</w:t>
+      </w:r>
+      <w:r>
+        <w:rPr>
+          <w:rFonts w:ascii="Times New Roman" w:hAnsi="Times New Roman" w:cs="Times New Roman" w:eastAsia="Times New Roman"/>
+        </w:rPr>
+        <w:t xml:space="preserve"> </w:t>
+      </w:r>
+      <w:r>
+        <w:rPr>
+          <w:rFonts w:ascii="Times New Roman" w:hAnsi="Times New Roman" w:cs="Times New Roman" w:eastAsia="Times New Roman"/>
+        </w:rPr>
+        <w:t xml:space="preserve">outperform deep learning on typical tabular data?</w:t>
       </w:r>
       <w:r>
         <w:rPr>
@@ -11804,25 +12676,45 @@
           <w:iCs/>
           <w:i/>
         </w:rPr>
-        <w:t xml:space="preserve">Computer Vision – ECCV 2020</w:t>
-      </w:r>
-      <w:r>
-        <w:rPr>
-          <w:rFonts w:ascii="Times New Roman" w:hAnsi="Times New Roman" w:cs="Times New Roman" w:eastAsia="Times New Roman"/>
-        </w:rPr>
-        <w:t xml:space="preserve">, ser. LNCS, vol. 12370. Cham,</w:t>
-      </w:r>
-      <w:r>
-        <w:rPr>
-          <w:rFonts w:ascii="Times New Roman" w:hAnsi="Times New Roman" w:cs="Times New Roman" w:eastAsia="Times New Roman"/>
-        </w:rPr>
-        <w:t xml:space="preserve"> </w:t>
-      </w:r>
-      <w:r>
-        <w:rPr>
-          <w:rFonts w:ascii="Times New Roman" w:hAnsi="Times New Roman" w:cs="Times New Roman" w:eastAsia="Times New Roman"/>
-        </w:rPr>
-        <w:t xml:space="preserve">Switzerland: Springer, 2020, pp. 681–699.</w:t>
+        <w:t xml:space="preserve">Advances in</w:t>
+      </w:r>
+      <w:r>
+        <w:rPr>
+          <w:rFonts w:ascii="Times New Roman" w:hAnsi="Times New Roman" w:cs="Times New Roman" w:eastAsia="Times New Roman"/>
+          <w:iCs/>
+          <w:i/>
+        </w:rPr>
+        <w:t xml:space="preserve"> </w:t>
+      </w:r>
+      <w:r>
+        <w:rPr>
+          <w:rFonts w:ascii="Times New Roman" w:hAnsi="Times New Roman" w:cs="Times New Roman" w:eastAsia="Times New Roman"/>
+          <w:iCs/>
+          <w:i/>
+        </w:rPr>
+        <w:t xml:space="preserve">Neural Information Processing Systems (NeurIPS), Datasets and Benchmarks</w:t>
+      </w:r>
+      <w:r>
+        <w:rPr>
+          <w:rFonts w:ascii="Times New Roman" w:hAnsi="Times New Roman" w:cs="Times New Roman" w:eastAsia="Times New Roman"/>
+          <w:iCs/>
+          <w:i/>
+        </w:rPr>
+        <w:t xml:space="preserve"> </w:t>
+      </w:r>
+      <w:r>
+        <w:rPr>
+          <w:rFonts w:ascii="Times New Roman" w:hAnsi="Times New Roman" w:cs="Times New Roman" w:eastAsia="Times New Roman"/>
+          <w:iCs/>
+          <w:i/>
+        </w:rPr>
+        <w:t xml:space="preserve">Track</w:t>
+      </w:r>
+      <w:r>
+        <w:rPr>
+          <w:rFonts w:ascii="Times New Roman" w:hAnsi="Times New Roman" w:cs="Times New Roman" w:eastAsia="Times New Roman"/>
+        </w:rPr>
+        <w:t xml:space="preserve">, 2022.</w:t>
       </w:r>
     </w:p>
     <w:p>
@@ -11834,7 +12726,7 @@
         <w:rPr>
           <w:rFonts w:ascii="Times New Roman" w:hAnsi="Times New Roman" w:cs="Times New Roman" w:eastAsia="Times New Roman"/>
         </w:rPr>
-        <w:t xml:space="preserve">[8] L. Grinsztajn, E. Oyallon, and G. Varoquaux,</w:t>
+        <w:t xml:space="preserve">[9] J. Demšar,</w:t>
       </w:r>
       <w:r>
         <w:rPr>
@@ -11852,37 +12744,25 @@
         <w:rPr>
           <w:rFonts w:ascii="Times New Roman" w:hAnsi="Times New Roman" w:cs="Times New Roman" w:eastAsia="Times New Roman"/>
         </w:rPr>
-        <w:t xml:space="preserve">Why do tree-based models still</w:t>
-      </w:r>
-      <w:r>
-        <w:rPr>
-          <w:rFonts w:ascii="Times New Roman" w:hAnsi="Times New Roman" w:cs="Times New Roman" w:eastAsia="Times New Roman"/>
-        </w:rPr>
-        <w:t xml:space="preserve"> </w:t>
-      </w:r>
-      <w:r>
-        <w:rPr>
-          <w:rFonts w:ascii="Times New Roman" w:hAnsi="Times New Roman" w:cs="Times New Roman" w:eastAsia="Times New Roman"/>
-        </w:rPr>
-        <w:t xml:space="preserve">outperform deep learning on typical tabular data?</w:t>
+        <w:t xml:space="preserve">Statistical comparisons of classifiers over multiple data</w:t>
+      </w:r>
+      <w:r>
+        <w:rPr>
+          <w:rFonts w:ascii="Times New Roman" w:hAnsi="Times New Roman" w:cs="Times New Roman" w:eastAsia="Times New Roman"/>
+        </w:rPr>
+        <w:t xml:space="preserve"> </w:t>
+      </w:r>
+      <w:r>
+        <w:rPr>
+          <w:rFonts w:ascii="Times New Roman" w:hAnsi="Times New Roman" w:cs="Times New Roman" w:eastAsia="Times New Roman"/>
+        </w:rPr>
+        <w:t xml:space="preserve">sets,</w:t>
       </w:r>
       <w:r>
         <w:rPr>
           <w:rFonts w:ascii="Times New Roman" w:hAnsi="Times New Roman" w:cs="Times New Roman" w:eastAsia="Times New Roman"/>
         </w:rPr>
         <w:t xml:space="preserve">”</w:t>
-      </w:r>
-      <w:r>
-        <w:rPr>
-          <w:rFonts w:ascii="Times New Roman" w:hAnsi="Times New Roman" w:cs="Times New Roman" w:eastAsia="Times New Roman"/>
-        </w:rPr>
-        <w:t xml:space="preserve"> </w:t>
-      </w:r>
-      <w:r>
-        <w:rPr>
-          <w:rFonts w:ascii="Times New Roman" w:hAnsi="Times New Roman" w:cs="Times New Roman" w:eastAsia="Times New Roman"/>
-        </w:rPr>
-        <w:t xml:space="preserve">in</w:t>
       </w:r>
       <w:r>
         <w:rPr>
@@ -11896,45 +12776,13 @@
           <w:iCs/>
           <w:i/>
         </w:rPr>
-        <w:t xml:space="preserve">Advances in</w:t>
-      </w:r>
-      <w:r>
-        <w:rPr>
-          <w:rFonts w:ascii="Times New Roman" w:hAnsi="Times New Roman" w:cs="Times New Roman" w:eastAsia="Times New Roman"/>
-          <w:iCs/>
-          <w:i/>
-        </w:rPr>
-        <w:t xml:space="preserve"> </w:t>
-      </w:r>
-      <w:r>
-        <w:rPr>
-          <w:rFonts w:ascii="Times New Roman" w:hAnsi="Times New Roman" w:cs="Times New Roman" w:eastAsia="Times New Roman"/>
-          <w:iCs/>
-          <w:i/>
-        </w:rPr>
-        <w:t xml:space="preserve">Neural Information Processing Systems (NeurIPS), Datasets and Benchmarks</w:t>
-      </w:r>
-      <w:r>
-        <w:rPr>
-          <w:rFonts w:ascii="Times New Roman" w:hAnsi="Times New Roman" w:cs="Times New Roman" w:eastAsia="Times New Roman"/>
-          <w:iCs/>
-          <w:i/>
-        </w:rPr>
-        <w:t xml:space="preserve"> </w:t>
-      </w:r>
-      <w:r>
-        <w:rPr>
-          <w:rFonts w:ascii="Times New Roman" w:hAnsi="Times New Roman" w:cs="Times New Roman" w:eastAsia="Times New Roman"/>
-          <w:iCs/>
-          <w:i/>
-        </w:rPr>
-        <w:t xml:space="preserve">Track</w:t>
-      </w:r>
-      <w:r>
-        <w:rPr>
-          <w:rFonts w:ascii="Times New Roman" w:hAnsi="Times New Roman" w:cs="Times New Roman" w:eastAsia="Times New Roman"/>
-        </w:rPr>
-        <w:t xml:space="preserve">, 2022.</w:t>
+        <w:t xml:space="preserve">J. Mach. Learn. Res.</w:t>
+      </w:r>
+      <w:r>
+        <w:rPr>
+          <w:rFonts w:ascii="Times New Roman" w:hAnsi="Times New Roman" w:cs="Times New Roman" w:eastAsia="Times New Roman"/>
+        </w:rPr>
+        <w:t xml:space="preserve">, vol. 7, pp. 1–30, 2006.</w:t>
       </w:r>
     </w:p>
     <w:p>
@@ -11946,7 +12794,7 @@
         <w:rPr>
           <w:rFonts w:ascii="Times New Roman" w:hAnsi="Times New Roman" w:cs="Times New Roman" w:eastAsia="Times New Roman"/>
         </w:rPr>
-        <w:t xml:space="preserve">[9] J. Demšar,</w:t>
+        <w:t xml:space="preserve">[10] M. Friedman,</w:t>
       </w:r>
       <w:r>
         <w:rPr>
@@ -11964,19 +12812,19 @@
         <w:rPr>
           <w:rFonts w:ascii="Times New Roman" w:hAnsi="Times New Roman" w:cs="Times New Roman" w:eastAsia="Times New Roman"/>
         </w:rPr>
-        <w:t xml:space="preserve">Statistical comparisons of classifiers over multiple data</w:t>
-      </w:r>
-      <w:r>
-        <w:rPr>
-          <w:rFonts w:ascii="Times New Roman" w:hAnsi="Times New Roman" w:cs="Times New Roman" w:eastAsia="Times New Roman"/>
-        </w:rPr>
-        <w:t xml:space="preserve"> </w:t>
-      </w:r>
-      <w:r>
-        <w:rPr>
-          <w:rFonts w:ascii="Times New Roman" w:hAnsi="Times New Roman" w:cs="Times New Roman" w:eastAsia="Times New Roman"/>
-        </w:rPr>
-        <w:t xml:space="preserve">sets,</w:t>
+        <w:t xml:space="preserve">The use of ranks to avoid the assumption of normality implicit</w:t>
+      </w:r>
+      <w:r>
+        <w:rPr>
+          <w:rFonts w:ascii="Times New Roman" w:hAnsi="Times New Roman" w:cs="Times New Roman" w:eastAsia="Times New Roman"/>
+        </w:rPr>
+        <w:t xml:space="preserve"> </w:t>
+      </w:r>
+      <w:r>
+        <w:rPr>
+          <w:rFonts w:ascii="Times New Roman" w:hAnsi="Times New Roman" w:cs="Times New Roman" w:eastAsia="Times New Roman"/>
+        </w:rPr>
+        <w:t xml:space="preserve">in the analysis of variance,</w:t>
       </w:r>
       <w:r>
         <w:rPr>
@@ -11996,13 +12844,25 @@
           <w:iCs/>
           <w:i/>
         </w:rPr>
-        <w:t xml:space="preserve">J. Mach. Learn. Res.</w:t>
-      </w:r>
-      <w:r>
-        <w:rPr>
-          <w:rFonts w:ascii="Times New Roman" w:hAnsi="Times New Roman" w:cs="Times New Roman" w:eastAsia="Times New Roman"/>
-        </w:rPr>
-        <w:t xml:space="preserve">, vol. 7, pp. 1–30, 2006.</w:t>
+        <w:t xml:space="preserve">J. Amer. Statist. Assoc.</w:t>
+      </w:r>
+      <w:r>
+        <w:rPr>
+          <w:rFonts w:ascii="Times New Roman" w:hAnsi="Times New Roman" w:cs="Times New Roman" w:eastAsia="Times New Roman"/>
+        </w:rPr>
+        <w:t xml:space="preserve">, vol. 32,</w:t>
+      </w:r>
+      <w:r>
+        <w:rPr>
+          <w:rFonts w:ascii="Times New Roman" w:hAnsi="Times New Roman" w:cs="Times New Roman" w:eastAsia="Times New Roman"/>
+        </w:rPr>
+        <w:t xml:space="preserve"> </w:t>
+      </w:r>
+      <w:r>
+        <w:rPr>
+          <w:rFonts w:ascii="Times New Roman" w:hAnsi="Times New Roman" w:cs="Times New Roman" w:eastAsia="Times New Roman"/>
+        </w:rPr>
+        <w:t xml:space="preserve">no. 200, pp. 675–701, 1937.</w:t>
       </w:r>
     </w:p>
     <w:p>
@@ -12014,7 +12874,7 @@
         <w:rPr>
           <w:rFonts w:ascii="Times New Roman" w:hAnsi="Times New Roman" w:cs="Times New Roman" w:eastAsia="Times New Roman"/>
         </w:rPr>
-        <w:t xml:space="preserve">[10] M. Friedman,</w:t>
+        <w:t xml:space="preserve">[11] C. Nadeau and Y. Bengio,</w:t>
       </w:r>
       <w:r>
         <w:rPr>
@@ -12032,19 +12892,7 @@
         <w:rPr>
           <w:rFonts w:ascii="Times New Roman" w:hAnsi="Times New Roman" w:cs="Times New Roman" w:eastAsia="Times New Roman"/>
         </w:rPr>
-        <w:t xml:space="preserve">The use of ranks to avoid the assumption of normality implicit</w:t>
-      </w:r>
-      <w:r>
-        <w:rPr>
-          <w:rFonts w:ascii="Times New Roman" w:hAnsi="Times New Roman" w:cs="Times New Roman" w:eastAsia="Times New Roman"/>
-        </w:rPr>
-        <w:t xml:space="preserve"> </w:t>
-      </w:r>
-      <w:r>
-        <w:rPr>
-          <w:rFonts w:ascii="Times New Roman" w:hAnsi="Times New Roman" w:cs="Times New Roman" w:eastAsia="Times New Roman"/>
-        </w:rPr>
-        <w:t xml:space="preserve">in the analysis of variance,</w:t>
+        <w:t xml:space="preserve">Inference for the generalization error,</w:t>
       </w:r>
       <w:r>
         <w:rPr>
@@ -12064,25 +12912,13 @@
           <w:iCs/>
           <w:i/>
         </w:rPr>
-        <w:t xml:space="preserve">J. Amer. Statist. Assoc.</w:t>
-      </w:r>
-      <w:r>
-        <w:rPr>
-          <w:rFonts w:ascii="Times New Roman" w:hAnsi="Times New Roman" w:cs="Times New Roman" w:eastAsia="Times New Roman"/>
-        </w:rPr>
-        <w:t xml:space="preserve">, vol. 32,</w:t>
-      </w:r>
-      <w:r>
-        <w:rPr>
-          <w:rFonts w:ascii="Times New Roman" w:hAnsi="Times New Roman" w:cs="Times New Roman" w:eastAsia="Times New Roman"/>
-        </w:rPr>
-        <w:t xml:space="preserve"> </w:t>
-      </w:r>
-      <w:r>
-        <w:rPr>
-          <w:rFonts w:ascii="Times New Roman" w:hAnsi="Times New Roman" w:cs="Times New Roman" w:eastAsia="Times New Roman"/>
-        </w:rPr>
-        <w:t xml:space="preserve">no. 200, pp. 675–701, 1937.</w:t>
+        <w:t xml:space="preserve">Mach. Learn.</w:t>
+      </w:r>
+      <w:r>
+        <w:rPr>
+          <w:rFonts w:ascii="Times New Roman" w:hAnsi="Times New Roman" w:cs="Times New Roman" w:eastAsia="Times New Roman"/>
+        </w:rPr>
+        <w:t xml:space="preserve">, vol. 52, no. 3, pp. 239–281, 2003.</w:t>
       </w:r>
     </w:p>
     <w:p>
@@ -12094,7 +12930,7 @@
         <w:rPr>
           <w:rFonts w:ascii="Times New Roman" w:hAnsi="Times New Roman" w:cs="Times New Roman" w:eastAsia="Times New Roman"/>
         </w:rPr>
-        <w:t xml:space="preserve">[11] C. Nadeau and Y. Bengio,</w:t>
+        <w:t xml:space="preserve">[12] K. Gorman and S. Bedrick,</w:t>
       </w:r>
       <w:r>
         <w:rPr>
@@ -12112,13 +12948,25 @@
         <w:rPr>
           <w:rFonts w:ascii="Times New Roman" w:hAnsi="Times New Roman" w:cs="Times New Roman" w:eastAsia="Times New Roman"/>
         </w:rPr>
-        <w:t xml:space="preserve">Inference for the generalization error,</w:t>
+        <w:t xml:space="preserve">We need to talk about standard splits,</w:t>
       </w:r>
       <w:r>
         <w:rPr>
           <w:rFonts w:ascii="Times New Roman" w:hAnsi="Times New Roman" w:cs="Times New Roman" w:eastAsia="Times New Roman"/>
         </w:rPr>
         <w:t xml:space="preserve">”</w:t>
+      </w:r>
+      <w:r>
+        <w:rPr>
+          <w:rFonts w:ascii="Times New Roman" w:hAnsi="Times New Roman" w:cs="Times New Roman" w:eastAsia="Times New Roman"/>
+        </w:rPr>
+        <w:t xml:space="preserve"> </w:t>
+      </w:r>
+      <w:r>
+        <w:rPr>
+          <w:rFonts w:ascii="Times New Roman" w:hAnsi="Times New Roman" w:cs="Times New Roman" w:eastAsia="Times New Roman"/>
+        </w:rPr>
+        <w:t xml:space="preserve">in</w:t>
       </w:r>
       <w:r>
         <w:rPr>
@@ -12132,13 +12980,25 @@
           <w:iCs/>
           <w:i/>
         </w:rPr>
-        <w:t xml:space="preserve">Mach. Learn.</w:t>
-      </w:r>
-      <w:r>
-        <w:rPr>
-          <w:rFonts w:ascii="Times New Roman" w:hAnsi="Times New Roman" w:cs="Times New Roman" w:eastAsia="Times New Roman"/>
-        </w:rPr>
-        <w:t xml:space="preserve">, vol. 52, no. 3, pp. 239–281, 2003.</w:t>
+        <w:t xml:space="preserve">Proc. 57th Annu. Meeting Assoc. Comput. Linguistics (ACL)</w:t>
+      </w:r>
+      <w:r>
+        <w:rPr>
+          <w:rFonts w:ascii="Times New Roman" w:hAnsi="Times New Roman" w:cs="Times New Roman" w:eastAsia="Times New Roman"/>
+        </w:rPr>
+        <w:t xml:space="preserve">, Florence,</w:t>
+      </w:r>
+      <w:r>
+        <w:rPr>
+          <w:rFonts w:ascii="Times New Roman" w:hAnsi="Times New Roman" w:cs="Times New Roman" w:eastAsia="Times New Roman"/>
+        </w:rPr>
+        <w:t xml:space="preserve"> </w:t>
+      </w:r>
+      <w:r>
+        <w:rPr>
+          <w:rFonts w:ascii="Times New Roman" w:hAnsi="Times New Roman" w:cs="Times New Roman" w:eastAsia="Times New Roman"/>
+        </w:rPr>
+        <w:t xml:space="preserve">Italy, 2019, pp. 2786–2791.</w:t>
       </w:r>
     </w:p>
     <w:p>
@@ -12150,7 +13010,7 @@
         <w:rPr>
           <w:rFonts w:ascii="Times New Roman" w:hAnsi="Times New Roman" w:cs="Times New Roman" w:eastAsia="Times New Roman"/>
         </w:rPr>
-        <w:t xml:space="preserve">[12] K. Gorman and S. Bedrick,</w:t>
+        <w:t xml:space="preserve">[13] S. Kapoor and A. Narayanan,</w:t>
       </w:r>
       <w:r>
         <w:rPr>
@@ -12168,25 +13028,25 @@
         <w:rPr>
           <w:rFonts w:ascii="Times New Roman" w:hAnsi="Times New Roman" w:cs="Times New Roman" w:eastAsia="Times New Roman"/>
         </w:rPr>
-        <w:t xml:space="preserve">We need to talk about standard splits,</w:t>
+        <w:t xml:space="preserve">Leakage and the reproducibility crisis in</w:t>
+      </w:r>
+      <w:r>
+        <w:rPr>
+          <w:rFonts w:ascii="Times New Roman" w:hAnsi="Times New Roman" w:cs="Times New Roman" w:eastAsia="Times New Roman"/>
+        </w:rPr>
+        <w:t xml:space="preserve"> </w:t>
+      </w:r>
+      <w:r>
+        <w:rPr>
+          <w:rFonts w:ascii="Times New Roman" w:hAnsi="Times New Roman" w:cs="Times New Roman" w:eastAsia="Times New Roman"/>
+        </w:rPr>
+        <w:t xml:space="preserve">machine-learning-based science,</w:t>
       </w:r>
       <w:r>
         <w:rPr>
           <w:rFonts w:ascii="Times New Roman" w:hAnsi="Times New Roman" w:cs="Times New Roman" w:eastAsia="Times New Roman"/>
         </w:rPr>
         <w:t xml:space="preserve">”</w:t>
-      </w:r>
-      <w:r>
-        <w:rPr>
-          <w:rFonts w:ascii="Times New Roman" w:hAnsi="Times New Roman" w:cs="Times New Roman" w:eastAsia="Times New Roman"/>
-        </w:rPr>
-        <w:t xml:space="preserve"> </w:t>
-      </w:r>
-      <w:r>
-        <w:rPr>
-          <w:rFonts w:ascii="Times New Roman" w:hAnsi="Times New Roman" w:cs="Times New Roman" w:eastAsia="Times New Roman"/>
-        </w:rPr>
-        <w:t xml:space="preserve">in</w:t>
       </w:r>
       <w:r>
         <w:rPr>
@@ -12200,25 +13060,25 @@
           <w:iCs/>
           <w:i/>
         </w:rPr>
-        <w:t xml:space="preserve">Proc. 57th Annu. Meeting Assoc. Comput. Linguistics (ACL)</w:t>
-      </w:r>
-      <w:r>
-        <w:rPr>
-          <w:rFonts w:ascii="Times New Roman" w:hAnsi="Times New Roman" w:cs="Times New Roman" w:eastAsia="Times New Roman"/>
-        </w:rPr>
-        <w:t xml:space="preserve">, Florence,</w:t>
-      </w:r>
-      <w:r>
-        <w:rPr>
-          <w:rFonts w:ascii="Times New Roman" w:hAnsi="Times New Roman" w:cs="Times New Roman" w:eastAsia="Times New Roman"/>
-        </w:rPr>
-        <w:t xml:space="preserve"> </w:t>
-      </w:r>
-      <w:r>
-        <w:rPr>
-          <w:rFonts w:ascii="Times New Roman" w:hAnsi="Times New Roman" w:cs="Times New Roman" w:eastAsia="Times New Roman"/>
-        </w:rPr>
-        <w:t xml:space="preserve">Italy, 2019, pp. 2786–2791.</w:t>
+        <w:t xml:space="preserve">Patterns</w:t>
+      </w:r>
+      <w:r>
+        <w:rPr>
+          <w:rFonts w:ascii="Times New Roman" w:hAnsi="Times New Roman" w:cs="Times New Roman" w:eastAsia="Times New Roman"/>
+        </w:rPr>
+        <w:t xml:space="preserve">, vol. 4, no. 9, Art.</w:t>
+      </w:r>
+      <w:r>
+        <w:rPr>
+          <w:rFonts w:ascii="Times New Roman" w:hAnsi="Times New Roman" w:cs="Times New Roman" w:eastAsia="Times New Roman"/>
+        </w:rPr>
+        <w:t xml:space="preserve"> </w:t>
+      </w:r>
+      <w:r>
+        <w:rPr>
+          <w:rFonts w:ascii="Times New Roman" w:hAnsi="Times New Roman" w:cs="Times New Roman" w:eastAsia="Times New Roman"/>
+        </w:rPr>
+        <w:t xml:space="preserve">no. 100804, 2023.</w:t>
       </w:r>
     </w:p>
     <w:p>
@@ -12230,7 +13090,7 @@
         <w:rPr>
           <w:rFonts w:ascii="Times New Roman" w:hAnsi="Times New Roman" w:cs="Times New Roman" w:eastAsia="Times New Roman"/>
         </w:rPr>
-        <w:t xml:space="preserve">[13] S. Kapoor and A. Narayanan,</w:t>
+        <w:t xml:space="preserve">[14] J. Guo, J. Deng, A. Lattas, and S. Zafeiriou,</w:t>
       </w:r>
       <w:r>
         <w:rPr>
@@ -12248,25 +13108,37 @@
         <w:rPr>
           <w:rFonts w:ascii="Times New Roman" w:hAnsi="Times New Roman" w:cs="Times New Roman" w:eastAsia="Times New Roman"/>
         </w:rPr>
-        <w:t xml:space="preserve">Leakage and the reproducibility crisis in</w:t>
-      </w:r>
-      <w:r>
-        <w:rPr>
-          <w:rFonts w:ascii="Times New Roman" w:hAnsi="Times New Roman" w:cs="Times New Roman" w:eastAsia="Times New Roman"/>
-        </w:rPr>
-        <w:t xml:space="preserve"> </w:t>
-      </w:r>
-      <w:r>
-        <w:rPr>
-          <w:rFonts w:ascii="Times New Roman" w:hAnsi="Times New Roman" w:cs="Times New Roman" w:eastAsia="Times New Roman"/>
-        </w:rPr>
-        <w:t xml:space="preserve">machine-learning-based science,</w:t>
+        <w:t xml:space="preserve">Sample and computation</w:t>
+      </w:r>
+      <w:r>
+        <w:rPr>
+          <w:rFonts w:ascii="Times New Roman" w:hAnsi="Times New Roman" w:cs="Times New Roman" w:eastAsia="Times New Roman"/>
+        </w:rPr>
+        <w:t xml:space="preserve"> </w:t>
+      </w:r>
+      <w:r>
+        <w:rPr>
+          <w:rFonts w:ascii="Times New Roman" w:hAnsi="Times New Roman" w:cs="Times New Roman" w:eastAsia="Times New Roman"/>
+        </w:rPr>
+        <w:t xml:space="preserve">redistribution for efficient face detection,</w:t>
       </w:r>
       <w:r>
         <w:rPr>
           <w:rFonts w:ascii="Times New Roman" w:hAnsi="Times New Roman" w:cs="Times New Roman" w:eastAsia="Times New Roman"/>
         </w:rPr>
         <w:t xml:space="preserve">”</w:t>
+      </w:r>
+      <w:r>
+        <w:rPr>
+          <w:rFonts w:ascii="Times New Roman" w:hAnsi="Times New Roman" w:cs="Times New Roman" w:eastAsia="Times New Roman"/>
+        </w:rPr>
+        <w:t xml:space="preserve"> </w:t>
+      </w:r>
+      <w:r>
+        <w:rPr>
+          <w:rFonts w:ascii="Times New Roman" w:hAnsi="Times New Roman" w:cs="Times New Roman" w:eastAsia="Times New Roman"/>
+        </w:rPr>
+        <w:t xml:space="preserve">in</w:t>
       </w:r>
       <w:r>
         <w:rPr>
@@ -12280,25 +13152,29 @@
           <w:iCs/>
           <w:i/>
         </w:rPr>
-        <w:t xml:space="preserve">Patterns</w:t>
-      </w:r>
-      <w:r>
-        <w:rPr>
-          <w:rFonts w:ascii="Times New Roman" w:hAnsi="Times New Roman" w:cs="Times New Roman" w:eastAsia="Times New Roman"/>
-        </w:rPr>
-        <w:t xml:space="preserve">, vol. 4, no. 9, Art.</w:t>
-      </w:r>
-      <w:r>
-        <w:rPr>
-          <w:rFonts w:ascii="Times New Roman" w:hAnsi="Times New Roman" w:cs="Times New Roman" w:eastAsia="Times New Roman"/>
-        </w:rPr>
-        <w:t xml:space="preserve"> </w:t>
-      </w:r>
-      <w:r>
-        <w:rPr>
-          <w:rFonts w:ascii="Times New Roman" w:hAnsi="Times New Roman" w:cs="Times New Roman" w:eastAsia="Times New Roman"/>
-        </w:rPr>
-        <w:t xml:space="preserve">no. 100804, 2023.</w:t>
+        <w:t xml:space="preserve">Proc. Int. Conf.</w:t>
+      </w:r>
+      <w:r>
+        <w:rPr>
+          <w:rFonts w:ascii="Times New Roman" w:hAnsi="Times New Roman" w:cs="Times New Roman" w:eastAsia="Times New Roman"/>
+          <w:iCs/>
+          <w:i/>
+        </w:rPr>
+        <w:t xml:space="preserve"> </w:t>
+      </w:r>
+      <w:r>
+        <w:rPr>
+          <w:rFonts w:ascii="Times New Roman" w:hAnsi="Times New Roman" w:cs="Times New Roman" w:eastAsia="Times New Roman"/>
+          <w:iCs/>
+          <w:i/>
+        </w:rPr>
+        <w:t xml:space="preserve">Learning Representations (ICLR)</w:t>
+      </w:r>
+      <w:r>
+        <w:rPr>
+          <w:rFonts w:ascii="Times New Roman" w:hAnsi="Times New Roman" w:cs="Times New Roman" w:eastAsia="Times New Roman"/>
+        </w:rPr>
+        <w:t xml:space="preserve">, 2022.</w:t>
       </w:r>
     </w:p>
     <w:p>
@@ -12310,7 +13186,7 @@
         <w:rPr>
           <w:rFonts w:ascii="Times New Roman" w:hAnsi="Times New Roman" w:cs="Times New Roman" w:eastAsia="Times New Roman"/>
         </w:rPr>
-        <w:t xml:space="preserve">[14] J. Guo, J. Deng, A. Lattas, and S. Zafeiriou,</w:t>
+        <w:t xml:space="preserve">[15] J. Deng, J. Guo, N. Xue, and S. Zafeiriou,</w:t>
       </w:r>
       <w:r>
         <w:rPr>
@@ -12328,19 +13204,19 @@
         <w:rPr>
           <w:rFonts w:ascii="Times New Roman" w:hAnsi="Times New Roman" w:cs="Times New Roman" w:eastAsia="Times New Roman"/>
         </w:rPr>
-        <w:t xml:space="preserve">Sample and computation</w:t>
-      </w:r>
-      <w:r>
-        <w:rPr>
-          <w:rFonts w:ascii="Times New Roman" w:hAnsi="Times New Roman" w:cs="Times New Roman" w:eastAsia="Times New Roman"/>
-        </w:rPr>
-        <w:t xml:space="preserve"> </w:t>
-      </w:r>
-      <w:r>
-        <w:rPr>
-          <w:rFonts w:ascii="Times New Roman" w:hAnsi="Times New Roman" w:cs="Times New Roman" w:eastAsia="Times New Roman"/>
-        </w:rPr>
-        <w:t xml:space="preserve">redistribution for efficient face detection,</w:t>
+        <w:t xml:space="preserve">ArcFace: Additive angular margin</w:t>
+      </w:r>
+      <w:r>
+        <w:rPr>
+          <w:rFonts w:ascii="Times New Roman" w:hAnsi="Times New Roman" w:cs="Times New Roman" w:eastAsia="Times New Roman"/>
+        </w:rPr>
+        <w:t xml:space="preserve"> </w:t>
+      </w:r>
+      <w:r>
+        <w:rPr>
+          <w:rFonts w:ascii="Times New Roman" w:hAnsi="Times New Roman" w:cs="Times New Roman" w:eastAsia="Times New Roman"/>
+        </w:rPr>
+        <w:t xml:space="preserve">loss for deep face recognition,</w:t>
       </w:r>
       <w:r>
         <w:rPr>
@@ -12372,7 +13248,7 @@
           <w:iCs/>
           <w:i/>
         </w:rPr>
-        <w:t xml:space="preserve">Proc. Int. Conf.</w:t>
+        <w:t xml:space="preserve">Proc. IEEE/CVF Conf. Computer</w:t>
       </w:r>
       <w:r>
         <w:rPr>
@@ -12388,13 +13264,13 @@
           <w:iCs/>
           <w:i/>
         </w:rPr>
-        <w:t xml:space="preserve">Learning Representations (ICLR)</w:t>
-      </w:r>
-      <w:r>
-        <w:rPr>
-          <w:rFonts w:ascii="Times New Roman" w:hAnsi="Times New Roman" w:cs="Times New Roman" w:eastAsia="Times New Roman"/>
-        </w:rPr>
-        <w:t xml:space="preserve">, 2022.</w:t>
+        <w:t xml:space="preserve">Vision and Pattern Recognition (CVPR)</w:t>
+      </w:r>
+      <w:r>
+        <w:rPr>
+          <w:rFonts w:ascii="Times New Roman" w:hAnsi="Times New Roman" w:cs="Times New Roman" w:eastAsia="Times New Roman"/>
+        </w:rPr>
+        <w:t xml:space="preserve">, 2019, pp. 4690–4699.</w:t>
       </w:r>
     </w:p>
     <w:p>
@@ -12406,7 +13282,7 @@
         <w:rPr>
           <w:rFonts w:ascii="Times New Roman" w:hAnsi="Times New Roman" w:cs="Times New Roman" w:eastAsia="Times New Roman"/>
         </w:rPr>
-        <w:t xml:space="preserve">[15] J. Deng, J. Guo, N. Xue, and S. Zafeiriou,</w:t>
+        <w:t xml:space="preserve">[16] G. B. Huang, M. Ramesh, T. Berg, and E. Learned-Miller,</w:t>
       </w:r>
       <w:r>
         <w:rPr>
@@ -12424,19 +13300,31 @@
         <w:rPr>
           <w:rFonts w:ascii="Times New Roman" w:hAnsi="Times New Roman" w:cs="Times New Roman" w:eastAsia="Times New Roman"/>
         </w:rPr>
-        <w:t xml:space="preserve">ArcFace: Additive angular margin</w:t>
-      </w:r>
-      <w:r>
-        <w:rPr>
-          <w:rFonts w:ascii="Times New Roman" w:hAnsi="Times New Roman" w:cs="Times New Roman" w:eastAsia="Times New Roman"/>
-        </w:rPr>
-        <w:t xml:space="preserve"> </w:t>
-      </w:r>
-      <w:r>
-        <w:rPr>
-          <w:rFonts w:ascii="Times New Roman" w:hAnsi="Times New Roman" w:cs="Times New Roman" w:eastAsia="Times New Roman"/>
-        </w:rPr>
-        <w:t xml:space="preserve">loss for deep face recognition,</w:t>
+        <w:t xml:space="preserve">Labeled Faces in the</w:t>
+      </w:r>
+      <w:r>
+        <w:rPr>
+          <w:rFonts w:ascii="Times New Roman" w:hAnsi="Times New Roman" w:cs="Times New Roman" w:eastAsia="Times New Roman"/>
+        </w:rPr>
+        <w:t xml:space="preserve"> </w:t>
+      </w:r>
+      <w:r>
+        <w:rPr>
+          <w:rFonts w:ascii="Times New Roman" w:hAnsi="Times New Roman" w:cs="Times New Roman" w:eastAsia="Times New Roman"/>
+        </w:rPr>
+        <w:t xml:space="preserve">Wild: A database for studying face recognition in unconstrained</w:t>
+      </w:r>
+      <w:r>
+        <w:rPr>
+          <w:rFonts w:ascii="Times New Roman" w:hAnsi="Times New Roman" w:cs="Times New Roman" w:eastAsia="Times New Roman"/>
+        </w:rPr>
+        <w:t xml:space="preserve"> </w:t>
+      </w:r>
+      <w:r>
+        <w:rPr>
+          <w:rFonts w:ascii="Times New Roman" w:hAnsi="Times New Roman" w:cs="Times New Roman" w:eastAsia="Times New Roman"/>
+        </w:rPr>
+        <w:t xml:space="preserve">environments,</w:t>
       </w:r>
       <w:r>
         <w:rPr>
@@ -12454,43 +13342,19 @@
         <w:rPr>
           <w:rFonts w:ascii="Times New Roman" w:hAnsi="Times New Roman" w:cs="Times New Roman" w:eastAsia="Times New Roman"/>
         </w:rPr>
-        <w:t xml:space="preserve">in</w:t>
-      </w:r>
-      <w:r>
-        <w:rPr>
-          <w:rFonts w:ascii="Times New Roman" w:hAnsi="Times New Roman" w:cs="Times New Roman" w:eastAsia="Times New Roman"/>
-        </w:rPr>
-        <w:t xml:space="preserve"> </w:t>
-      </w:r>
-      <w:r>
-        <w:rPr>
-          <w:rFonts w:ascii="Times New Roman" w:hAnsi="Times New Roman" w:cs="Times New Roman" w:eastAsia="Times New Roman"/>
-          <w:iCs/>
-          <w:i/>
-        </w:rPr>
-        <w:t xml:space="preserve">Proc. IEEE/CVF Conf. Computer</w:t>
-      </w:r>
-      <w:r>
-        <w:rPr>
-          <w:rFonts w:ascii="Times New Roman" w:hAnsi="Times New Roman" w:cs="Times New Roman" w:eastAsia="Times New Roman"/>
-          <w:iCs/>
-          <w:i/>
-        </w:rPr>
-        <w:t xml:space="preserve"> </w:t>
-      </w:r>
-      <w:r>
-        <w:rPr>
-          <w:rFonts w:ascii="Times New Roman" w:hAnsi="Times New Roman" w:cs="Times New Roman" w:eastAsia="Times New Roman"/>
-          <w:iCs/>
-          <w:i/>
-        </w:rPr>
-        <w:t xml:space="preserve">Vision and Pattern Recognition (CVPR)</w:t>
-      </w:r>
-      <w:r>
-        <w:rPr>
-          <w:rFonts w:ascii="Times New Roman" w:hAnsi="Times New Roman" w:cs="Times New Roman" w:eastAsia="Times New Roman"/>
-        </w:rPr>
-        <w:t xml:space="preserve">, 2019, pp. 4690–4699.</w:t>
+        <w:t xml:space="preserve">Univ. Massachusetts, Amherst, MA, USA, Tech. Rep. 07-49,</w:t>
+      </w:r>
+      <w:r>
+        <w:rPr>
+          <w:rFonts w:ascii="Times New Roman" w:hAnsi="Times New Roman" w:cs="Times New Roman" w:eastAsia="Times New Roman"/>
+        </w:rPr>
+        <w:t xml:space="preserve"> </w:t>
+      </w:r>
+      <w:r>
+        <w:rPr>
+          <w:rFonts w:ascii="Times New Roman" w:hAnsi="Times New Roman" w:cs="Times New Roman" w:eastAsia="Times New Roman"/>
+        </w:rPr>
+        <w:t xml:space="preserve">Oct. 2007.</w:t>
       </w:r>
     </w:p>
     <w:p>
@@ -12502,7 +13366,7 @@
         <w:rPr>
           <w:rFonts w:ascii="Times New Roman" w:hAnsi="Times New Roman" w:cs="Times New Roman" w:eastAsia="Times New Roman"/>
         </w:rPr>
-        <w:t xml:space="preserve">[16] G. B. Huang, M. Ramesh, T. Berg, and E. Learned-Miller,</w:t>
+        <w:t xml:space="preserve">[17] J. Buolamwini and T. Gebru,</w:t>
       </w:r>
       <w:r>
         <w:rPr>
@@ -12520,31 +13384,19 @@
         <w:rPr>
           <w:rFonts w:ascii="Times New Roman" w:hAnsi="Times New Roman" w:cs="Times New Roman" w:eastAsia="Times New Roman"/>
         </w:rPr>
-        <w:t xml:space="preserve">Labeled Faces in the</w:t>
-      </w:r>
-      <w:r>
-        <w:rPr>
-          <w:rFonts w:ascii="Times New Roman" w:hAnsi="Times New Roman" w:cs="Times New Roman" w:eastAsia="Times New Roman"/>
-        </w:rPr>
-        <w:t xml:space="preserve"> </w:t>
-      </w:r>
-      <w:r>
-        <w:rPr>
-          <w:rFonts w:ascii="Times New Roman" w:hAnsi="Times New Roman" w:cs="Times New Roman" w:eastAsia="Times New Roman"/>
-        </w:rPr>
-        <w:t xml:space="preserve">Wild: A database for studying face recognition in unconstrained</w:t>
-      </w:r>
-      <w:r>
-        <w:rPr>
-          <w:rFonts w:ascii="Times New Roman" w:hAnsi="Times New Roman" w:cs="Times New Roman" w:eastAsia="Times New Roman"/>
-        </w:rPr>
-        <w:t xml:space="preserve"> </w:t>
-      </w:r>
-      <w:r>
-        <w:rPr>
-          <w:rFonts w:ascii="Times New Roman" w:hAnsi="Times New Roman" w:cs="Times New Roman" w:eastAsia="Times New Roman"/>
-        </w:rPr>
-        <w:t xml:space="preserve">environments,</w:t>
+        <w:t xml:space="preserve">Gender shades: Intersectional accuracy</w:t>
+      </w:r>
+      <w:r>
+        <w:rPr>
+          <w:rFonts w:ascii="Times New Roman" w:hAnsi="Times New Roman" w:cs="Times New Roman" w:eastAsia="Times New Roman"/>
+        </w:rPr>
+        <w:t xml:space="preserve"> </w:t>
+      </w:r>
+      <w:r>
+        <w:rPr>
+          <w:rFonts w:ascii="Times New Roman" w:hAnsi="Times New Roman" w:cs="Times New Roman" w:eastAsia="Times New Roman"/>
+        </w:rPr>
+        <w:t xml:space="preserve">disparities in commercial gender classification,</w:t>
       </w:r>
       <w:r>
         <w:rPr>
@@ -12562,19 +13414,43 @@
         <w:rPr>
           <w:rFonts w:ascii="Times New Roman" w:hAnsi="Times New Roman" w:cs="Times New Roman" w:eastAsia="Times New Roman"/>
         </w:rPr>
-        <w:t xml:space="preserve">Univ. Massachusetts, Amherst, MA, USA, Tech. Rep. 07-49,</w:t>
-      </w:r>
-      <w:r>
-        <w:rPr>
-          <w:rFonts w:ascii="Times New Roman" w:hAnsi="Times New Roman" w:cs="Times New Roman" w:eastAsia="Times New Roman"/>
-        </w:rPr>
-        <w:t xml:space="preserve"> </w:t>
-      </w:r>
-      <w:r>
-        <w:rPr>
-          <w:rFonts w:ascii="Times New Roman" w:hAnsi="Times New Roman" w:cs="Times New Roman" w:eastAsia="Times New Roman"/>
-        </w:rPr>
-        <w:t xml:space="preserve">Oct. 2007.</w:t>
+        <w:t xml:space="preserve">in</w:t>
+      </w:r>
+      <w:r>
+        <w:rPr>
+          <w:rFonts w:ascii="Times New Roman" w:hAnsi="Times New Roman" w:cs="Times New Roman" w:eastAsia="Times New Roman"/>
+        </w:rPr>
+        <w:t xml:space="preserve"> </w:t>
+      </w:r>
+      <w:r>
+        <w:rPr>
+          <w:rFonts w:ascii="Times New Roman" w:hAnsi="Times New Roman" w:cs="Times New Roman" w:eastAsia="Times New Roman"/>
+          <w:iCs/>
+          <w:i/>
+        </w:rPr>
+        <w:t xml:space="preserve">Proc. Conf.</w:t>
+      </w:r>
+      <w:r>
+        <w:rPr>
+          <w:rFonts w:ascii="Times New Roman" w:hAnsi="Times New Roman" w:cs="Times New Roman" w:eastAsia="Times New Roman"/>
+          <w:iCs/>
+          <w:i/>
+        </w:rPr>
+        <w:t xml:space="preserve"> </w:t>
+      </w:r>
+      <w:r>
+        <w:rPr>
+          <w:rFonts w:ascii="Times New Roman" w:hAnsi="Times New Roman" w:cs="Times New Roman" w:eastAsia="Times New Roman"/>
+          <w:iCs/>
+          <w:i/>
+        </w:rPr>
+        <w:t xml:space="preserve">Fairness, Accountability and Transparency</w:t>
+      </w:r>
+      <w:r>
+        <w:rPr>
+          <w:rFonts w:ascii="Times New Roman" w:hAnsi="Times New Roman" w:cs="Times New Roman" w:eastAsia="Times New Roman"/>
+        </w:rPr>
+        <w:t xml:space="preserve">, PMLR vol. 81, 2018, pp. 77–91.</w:t>
       </w:r>
     </w:p>
     <w:p>
@@ -12586,7 +13462,7 @@
         <w:rPr>
           <w:rFonts w:ascii="Times New Roman" w:hAnsi="Times New Roman" w:cs="Times New Roman" w:eastAsia="Times New Roman"/>
         </w:rPr>
-        <w:t xml:space="preserve">[17] J. Buolamwini and T. Gebru,</w:t>
+        <w:t xml:space="preserve">[18] Qwen Team,</w:t>
       </w:r>
       <w:r>
         <w:rPr>
@@ -12604,19 +13480,7 @@
         <w:rPr>
           <w:rFonts w:ascii="Times New Roman" w:hAnsi="Times New Roman" w:cs="Times New Roman" w:eastAsia="Times New Roman"/>
         </w:rPr>
-        <w:t xml:space="preserve">Gender shades: Intersectional accuracy</w:t>
-      </w:r>
-      <w:r>
-        <w:rPr>
-          <w:rFonts w:ascii="Times New Roman" w:hAnsi="Times New Roman" w:cs="Times New Roman" w:eastAsia="Times New Roman"/>
-        </w:rPr>
-        <w:t xml:space="preserve"> </w:t>
-      </w:r>
-      <w:r>
-        <w:rPr>
-          <w:rFonts w:ascii="Times New Roman" w:hAnsi="Times New Roman" w:cs="Times New Roman" w:eastAsia="Times New Roman"/>
-        </w:rPr>
-        <w:t xml:space="preserve">disparities in commercial gender classification,</w:t>
+        <w:t xml:space="preserve">Qwen2.5 technical report,</w:t>
       </w:r>
       <w:r>
         <w:rPr>
@@ -12634,43 +13498,7 @@
         <w:rPr>
           <w:rFonts w:ascii="Times New Roman" w:hAnsi="Times New Roman" w:cs="Times New Roman" w:eastAsia="Times New Roman"/>
         </w:rPr>
-        <w:t xml:space="preserve">in</w:t>
-      </w:r>
-      <w:r>
-        <w:rPr>
-          <w:rFonts w:ascii="Times New Roman" w:hAnsi="Times New Roman" w:cs="Times New Roman" w:eastAsia="Times New Roman"/>
-        </w:rPr>
-        <w:t xml:space="preserve"> </w:t>
-      </w:r>
-      <w:r>
-        <w:rPr>
-          <w:rFonts w:ascii="Times New Roman" w:hAnsi="Times New Roman" w:cs="Times New Roman" w:eastAsia="Times New Roman"/>
-          <w:iCs/>
-          <w:i/>
-        </w:rPr>
-        <w:t xml:space="preserve">Proc. Conf.</w:t>
-      </w:r>
-      <w:r>
-        <w:rPr>
-          <w:rFonts w:ascii="Times New Roman" w:hAnsi="Times New Roman" w:cs="Times New Roman" w:eastAsia="Times New Roman"/>
-          <w:iCs/>
-          <w:i/>
-        </w:rPr>
-        <w:t xml:space="preserve"> </w:t>
-      </w:r>
-      <w:r>
-        <w:rPr>
-          <w:rFonts w:ascii="Times New Roman" w:hAnsi="Times New Roman" w:cs="Times New Roman" w:eastAsia="Times New Roman"/>
-          <w:iCs/>
-          <w:i/>
-        </w:rPr>
-        <w:t xml:space="preserve">Fairness, Accountability and Transparency</w:t>
-      </w:r>
-      <w:r>
-        <w:rPr>
-          <w:rFonts w:ascii="Times New Roman" w:hAnsi="Times New Roman" w:cs="Times New Roman" w:eastAsia="Times New Roman"/>
-        </w:rPr>
-        <w:t xml:space="preserve">, PMLR vol. 81, 2018, pp. 77–91.</w:t>
+        <w:t xml:space="preserve">arXiv:2412.15115, 2024.</w:t>
       </w:r>
     </w:p>
     <w:p>
@@ -12682,7 +13510,7 @@
         <w:rPr>
           <w:rFonts w:ascii="Times New Roman" w:hAnsi="Times New Roman" w:cs="Times New Roman" w:eastAsia="Times New Roman"/>
         </w:rPr>
-        <w:t xml:space="preserve">[18] Qwen Team,</w:t>
+        <w:t xml:space="preserve">[19] cnamuangtoun,</w:t>
       </w:r>
       <w:r>
         <w:rPr>
@@ -12700,7 +13528,7 @@
         <w:rPr>
           <w:rFonts w:ascii="Times New Roman" w:hAnsi="Times New Roman" w:cs="Times New Roman" w:eastAsia="Times New Roman"/>
         </w:rPr>
-        <w:t xml:space="preserve">Qwen2.5 technical report,</w:t>
+        <w:t xml:space="preserve">resume-job-description-fit,</w:t>
       </w:r>
       <w:r>
         <w:rPr>
@@ -12718,54 +13546,6 @@
         <w:rPr>
           <w:rFonts w:ascii="Times New Roman" w:hAnsi="Times New Roman" w:cs="Times New Roman" w:eastAsia="Times New Roman"/>
         </w:rPr>
-        <w:t xml:space="preserve">arXiv:2412.15115, 2024.</w:t>
-      </w:r>
-    </w:p>
-    <w:p>
-      <w:pPr>
-        <w:pStyle w:val="BodyText"/>
-        <w:jc w:val="both"/>
-      </w:pPr>
-      <w:r>
-        <w:rPr>
-          <w:rFonts w:ascii="Times New Roman" w:hAnsi="Times New Roman" w:cs="Times New Roman" w:eastAsia="Times New Roman"/>
-        </w:rPr>
-        <w:t xml:space="preserve">[19] cnamuangtoun,</w:t>
-      </w:r>
-      <w:r>
-        <w:rPr>
-          <w:rFonts w:ascii="Times New Roman" w:hAnsi="Times New Roman" w:cs="Times New Roman" w:eastAsia="Times New Roman"/>
-        </w:rPr>
-        <w:t xml:space="preserve"> </w:t>
-      </w:r>
-      <w:r>
-        <w:rPr>
-          <w:rFonts w:ascii="Times New Roman" w:hAnsi="Times New Roman" w:cs="Times New Roman" w:eastAsia="Times New Roman"/>
-        </w:rPr>
-        <w:t xml:space="preserve">“</w:t>
-      </w:r>
-      <w:r>
-        <w:rPr>
-          <w:rFonts w:ascii="Times New Roman" w:hAnsi="Times New Roman" w:cs="Times New Roman" w:eastAsia="Times New Roman"/>
-        </w:rPr>
-        <w:t xml:space="preserve">resume-job-description-fit,</w:t>
-      </w:r>
-      <w:r>
-        <w:rPr>
-          <w:rFonts w:ascii="Times New Roman" w:hAnsi="Times New Roman" w:cs="Times New Roman" w:eastAsia="Times New Roman"/>
-        </w:rPr>
-        <w:t xml:space="preserve">”</w:t>
-      </w:r>
-      <w:r>
-        <w:rPr>
-          <w:rFonts w:ascii="Times New Roman" w:hAnsi="Times New Roman" w:cs="Times New Roman" w:eastAsia="Times New Roman"/>
-        </w:rPr>
-        <w:t xml:space="preserve"> </w:t>
-      </w:r>
-      <w:r>
-        <w:rPr>
-          <w:rFonts w:ascii="Times New Roman" w:hAnsi="Times New Roman" w:cs="Times New Roman" w:eastAsia="Times New Roman"/>
-        </w:rPr>
         <w:t xml:space="preserve">Hugging Face Datasets, 2024.</w:t>
       </w:r>
       <w:r>
@@ -12786,7 +13566,7 @@
         </w:rPr>
         <w:t xml:space="preserve"> </w:t>
       </w:r>
-      <w:hyperlink r:id="rId45">
+      <w:hyperlink r:id="rId46">
         <w:r>
           <w:rPr>
             <w:rStyle w:val="Hyperlink"/>
@@ -13483,7 +14263,7 @@
         <w:t xml:space="preserve">, OJ L, 2024/1689, Jul. 12, 2024.</w:t>
       </w:r>
     </w:p>
-    <w:bookmarkEnd w:id="46"/>
+    <w:bookmarkEnd w:id="47"/>
     <w:sectPr>
       <w:pgSz w:w="11906" w:h="16838"/>
       <w:pgMar w:top="1247" w:bottom="1247" w:left="1247" w:right="1247"/>

</xml_diff>

<commit_message>
Add co-author Aswathy and public repository link to IEEE paper
Co-Authored-By: Claude Opus 5.5 <noreply@anthropic.com>
Claude-Session: https://claude.ai/code/session_013hQpENYQayBnP2TgZ4DeJc
</commit_message>
<xml_diff>
--- a/docs/paper-ieee/CogniHire_IEEE.docx
+++ b/docs/paper-ieee/CogniHire_IEEE.docx
@@ -312,6 +312,186 @@
           <w:rFonts w:ascii="Times New Roman" w:hAnsi="Times New Roman" w:cs="Times New Roman" w:eastAsia="Times New Roman"/>
         </w:rPr>
         <w:t xml:space="preserve">deveshsv.386@gmail.com</w:t>
+      </w:r>
+      <w:r>
+        <w:rPr>
+          <w:rFonts w:ascii="Times New Roman" w:hAnsi="Times New Roman" w:cs="Times New Roman" w:eastAsia="Times New Roman"/>
+        </w:rPr>
+        <w:br/>
+      </w:r>
+      <w:r>
+        <w:rPr>
+          <w:rFonts w:ascii="Times New Roman" w:hAnsi="Times New Roman" w:cs="Times New Roman" w:eastAsia="Times New Roman"/>
+        </w:rPr>
+        <w:t xml:space="preserve">Aswathy</w:t>
+      </w:r>
+      <w:r>
+        <w:rPr>
+          <w:rFonts w:ascii="Times New Roman" w:hAnsi="Times New Roman" w:cs="Times New Roman" w:eastAsia="Times New Roman"/>
+        </w:rPr>
+        <w:br/>
+      </w:r>
+      <w:r>
+        <w:rPr>
+          <w:rFonts w:ascii="Times New Roman" w:hAnsi="Times New Roman" w:cs="Times New Roman" w:eastAsia="Times New Roman"/>
+        </w:rPr>
+        <w:t xml:space="preserve">Department</w:t>
+      </w:r>
+      <w:r>
+        <w:rPr>
+          <w:rFonts w:ascii="Times New Roman" w:hAnsi="Times New Roman" w:cs="Times New Roman" w:eastAsia="Times New Roman"/>
+        </w:rPr>
+        <w:t xml:space="preserve"> </w:t>
+      </w:r>
+      <w:r>
+        <w:rPr>
+          <w:rFonts w:ascii="Times New Roman" w:hAnsi="Times New Roman" w:cs="Times New Roman" w:eastAsia="Times New Roman"/>
+        </w:rPr>
+        <w:t xml:space="preserve">of</w:t>
+      </w:r>
+      <w:r>
+        <w:rPr>
+          <w:rFonts w:ascii="Times New Roman" w:hAnsi="Times New Roman" w:cs="Times New Roman" w:eastAsia="Times New Roman"/>
+        </w:rPr>
+        <w:t xml:space="preserve"> </w:t>
+      </w:r>
+      <w:r>
+        <w:rPr>
+          <w:rFonts w:ascii="Times New Roman" w:hAnsi="Times New Roman" w:cs="Times New Roman" w:eastAsia="Times New Roman"/>
+        </w:rPr>
+        <w:t xml:space="preserve">Computer</w:t>
+      </w:r>
+      <w:r>
+        <w:rPr>
+          <w:rFonts w:ascii="Times New Roman" w:hAnsi="Times New Roman" w:cs="Times New Roman" w:eastAsia="Times New Roman"/>
+        </w:rPr>
+        <w:t xml:space="preserve"> </w:t>
+      </w:r>
+      <w:r>
+        <w:rPr>
+          <w:rFonts w:ascii="Times New Roman" w:hAnsi="Times New Roman" w:cs="Times New Roman" w:eastAsia="Times New Roman"/>
+        </w:rPr>
+        <w:t xml:space="preserve">Science</w:t>
+      </w:r>
+      <w:r>
+        <w:rPr>
+          <w:rFonts w:ascii="Times New Roman" w:hAnsi="Times New Roman" w:cs="Times New Roman" w:eastAsia="Times New Roman"/>
+        </w:rPr>
+        <w:t xml:space="preserve"> </w:t>
+      </w:r>
+      <w:r>
+        <w:rPr>
+          <w:rFonts w:ascii="Times New Roman" w:hAnsi="Times New Roman" w:cs="Times New Roman" w:eastAsia="Times New Roman"/>
+        </w:rPr>
+        <w:t xml:space="preserve">and</w:t>
+      </w:r>
+      <w:r>
+        <w:rPr>
+          <w:rFonts w:ascii="Times New Roman" w:hAnsi="Times New Roman" w:cs="Times New Roman" w:eastAsia="Times New Roman"/>
+        </w:rPr>
+        <w:t xml:space="preserve"> </w:t>
+      </w:r>
+      <w:r>
+        <w:rPr>
+          <w:rFonts w:ascii="Times New Roman" w:hAnsi="Times New Roman" w:cs="Times New Roman" w:eastAsia="Times New Roman"/>
+        </w:rPr>
+        <w:t xml:space="preserve">Engineering</w:t>
+      </w:r>
+      <w:r>
+        <w:rPr>
+          <w:rFonts w:ascii="Times New Roman" w:hAnsi="Times New Roman" w:cs="Times New Roman" w:eastAsia="Times New Roman"/>
+        </w:rPr>
+        <w:br/>
+      </w:r>
+      <w:r>
+        <w:rPr>
+          <w:rFonts w:ascii="Times New Roman" w:hAnsi="Times New Roman" w:cs="Times New Roman" w:eastAsia="Times New Roman"/>
+        </w:rPr>
+        <w:t xml:space="preserve">SRM</w:t>
+      </w:r>
+      <w:r>
+        <w:rPr>
+          <w:rFonts w:ascii="Times New Roman" w:hAnsi="Times New Roman" w:cs="Times New Roman" w:eastAsia="Times New Roman"/>
+        </w:rPr>
+        <w:t xml:space="preserve"> </w:t>
+      </w:r>
+      <w:r>
+        <w:rPr>
+          <w:rFonts w:ascii="Times New Roman" w:hAnsi="Times New Roman" w:cs="Times New Roman" w:eastAsia="Times New Roman"/>
+        </w:rPr>
+        <w:t xml:space="preserve">Institute</w:t>
+      </w:r>
+      <w:r>
+        <w:rPr>
+          <w:rFonts w:ascii="Times New Roman" w:hAnsi="Times New Roman" w:cs="Times New Roman" w:eastAsia="Times New Roman"/>
+        </w:rPr>
+        <w:t xml:space="preserve"> </w:t>
+      </w:r>
+      <w:r>
+        <w:rPr>
+          <w:rFonts w:ascii="Times New Roman" w:hAnsi="Times New Roman" w:cs="Times New Roman" w:eastAsia="Times New Roman"/>
+        </w:rPr>
+        <w:t xml:space="preserve">of</w:t>
+      </w:r>
+      <w:r>
+        <w:rPr>
+          <w:rFonts w:ascii="Times New Roman" w:hAnsi="Times New Roman" w:cs="Times New Roman" w:eastAsia="Times New Roman"/>
+        </w:rPr>
+        <w:t xml:space="preserve"> </w:t>
+      </w:r>
+      <w:r>
+        <w:rPr>
+          <w:rFonts w:ascii="Times New Roman" w:hAnsi="Times New Roman" w:cs="Times New Roman" w:eastAsia="Times New Roman"/>
+        </w:rPr>
+        <w:t xml:space="preserve">Science</w:t>
+      </w:r>
+      <w:r>
+        <w:rPr>
+          <w:rFonts w:ascii="Times New Roman" w:hAnsi="Times New Roman" w:cs="Times New Roman" w:eastAsia="Times New Roman"/>
+        </w:rPr>
+        <w:t xml:space="preserve"> </w:t>
+      </w:r>
+      <w:r>
+        <w:rPr>
+          <w:rFonts w:ascii="Times New Roman" w:hAnsi="Times New Roman" w:cs="Times New Roman" w:eastAsia="Times New Roman"/>
+        </w:rPr>
+        <w:t xml:space="preserve">and</w:t>
+      </w:r>
+      <w:r>
+        <w:rPr>
+          <w:rFonts w:ascii="Times New Roman" w:hAnsi="Times New Roman" w:cs="Times New Roman" w:eastAsia="Times New Roman"/>
+        </w:rPr>
+        <w:t xml:space="preserve"> </w:t>
+      </w:r>
+      <w:r>
+        <w:rPr>
+          <w:rFonts w:ascii="Times New Roman" w:hAnsi="Times New Roman" w:cs="Times New Roman" w:eastAsia="Times New Roman"/>
+        </w:rPr>
+        <w:t xml:space="preserve">Technology,</w:t>
+      </w:r>
+      <w:r>
+        <w:rPr>
+          <w:rFonts w:ascii="Times New Roman" w:hAnsi="Times New Roman" w:cs="Times New Roman" w:eastAsia="Times New Roman"/>
+        </w:rPr>
+        <w:t xml:space="preserve"> </w:t>
+      </w:r>
+      <w:r>
+        <w:rPr>
+          <w:rFonts w:ascii="Times New Roman" w:hAnsi="Times New Roman" w:cs="Times New Roman" w:eastAsia="Times New Roman"/>
+        </w:rPr>
+        <w:t xml:space="preserve">Chennai,</w:t>
+      </w:r>
+      <w:r>
+        <w:rPr>
+          <w:rFonts w:ascii="Times New Roman" w:hAnsi="Times New Roman" w:cs="Times New Roman" w:eastAsia="Times New Roman"/>
+        </w:rPr>
+        <w:t xml:space="preserve"> </w:t>
+      </w:r>
+      <w:r>
+        <w:rPr>
+          <w:rFonts w:ascii="Times New Roman" w:hAnsi="Times New Roman" w:cs="Times New Roman" w:eastAsia="Times New Roman"/>
+        </w:rPr>
+        <w:t xml:space="preserve">India</w:t>
       </w:r>
     </w:p>
     <w:p>
@@ -11947,19 +12127,31 @@
         <w:rPr>
           <w:rFonts w:ascii="Times New Roman" w:hAnsi="Times New Roman" w:cs="Times New Roman" w:eastAsia="Times New Roman"/>
         </w:rPr>
-        <w:t xml:space="preserve">Analysis code, per-fold results, the prompt-injection harness and figure</w:t>
-      </w:r>
-      <w:r>
-        <w:rPr>
-          <w:rFonts w:ascii="Times New Roman" w:hAnsi="Times New Roman" w:cs="Times New Roman" w:eastAsia="Times New Roman"/>
-        </w:rPr>
-        <w:t xml:space="preserve"> </w:t>
-      </w:r>
-      <w:r>
-        <w:rPr>
-          <w:rFonts w:ascii="Times New Roman" w:hAnsi="Times New Roman" w:cs="Times New Roman" w:eastAsia="Times New Roman"/>
-        </w:rPr>
-        <w:t xml:space="preserve">sources are available from the author on request. The face study uses the</w:t>
+        <w:t xml:space="preserve">All code, per-fold results, evaluation harnesses (grounding, ablation and</w:t>
+      </w:r>
+      <w:r>
+        <w:rPr>
+          <w:rFonts w:ascii="Times New Roman" w:hAnsi="Times New Roman" w:cs="Times New Roman" w:eastAsia="Times New Roman"/>
+        </w:rPr>
+        <w:t xml:space="preserve"> </w:t>
+      </w:r>
+      <w:r>
+        <w:rPr>
+          <w:rFonts w:ascii="Times New Roman" w:hAnsi="Times New Roman" w:cs="Times New Roman" w:eastAsia="Times New Roman"/>
+        </w:rPr>
+        <w:t xml:space="preserve">prompt injection) and figure sources are publicly available at</w:t>
+      </w:r>
+      <w:r>
+        <w:rPr>
+          <w:rFonts w:ascii="Times New Roman" w:hAnsi="Times New Roman" w:cs="Times New Roman" w:eastAsia="Times New Roman"/>
+        </w:rPr>
+        <w:t xml:space="preserve"> </w:t>
+      </w:r>
+      <w:r>
+        <w:rPr>
+          <w:rFonts w:ascii="Times New Roman" w:hAnsi="Times New Roman" w:cs="Times New Roman" w:eastAsia="Times New Roman"/>
+        </w:rPr>
+        <w:t xml:space="preserve">https://github.com/devesh-386/cognihire-. The face study uses the</w:t>
       </w:r>
       <w:r>
         <w:rPr>

</xml_diff>

<commit_message>
Add Dr. Aswathy's title and designation to IEEE paper
Co-Authored-By: Claude Opus 5.5 <noreply@anthropic.com>
Claude-Session: https://claude.ai/code/session_013hQpENYQayBnP2TgZ4DeJc
</commit_message>
<xml_diff>
--- a/docs/paper-ieee/CogniHire_IEEE.docx
+++ b/docs/paper-ieee/CogniHire_IEEE.docx
@@ -323,7 +323,43 @@
         <w:rPr>
           <w:rFonts w:ascii="Times New Roman" w:hAnsi="Times New Roman" w:cs="Times New Roman" w:eastAsia="Times New Roman"/>
         </w:rPr>
+        <w:t xml:space="preserve">Dr.</w:t>
+      </w:r>
+      <w:r>
+        <w:rPr>
+          <w:rFonts w:ascii="Times New Roman" w:hAnsi="Times New Roman" w:cs="Times New Roman" w:eastAsia="Times New Roman"/>
+        </w:rPr>
+        <w:t xml:space="preserve"> </w:t>
+      </w:r>
+      <w:r>
+        <w:rPr>
+          <w:rFonts w:ascii="Times New Roman" w:hAnsi="Times New Roman" w:cs="Times New Roman" w:eastAsia="Times New Roman"/>
+        </w:rPr>
         <w:t xml:space="preserve">Aswathy</w:t>
+      </w:r>
+      <w:r>
+        <w:rPr>
+          <w:rFonts w:ascii="Times New Roman" w:hAnsi="Times New Roman" w:cs="Times New Roman" w:eastAsia="Times New Roman"/>
+        </w:rPr>
+        <w:br/>
+      </w:r>
+      <w:r>
+        <w:rPr>
+          <w:rFonts w:ascii="Times New Roman" w:hAnsi="Times New Roman" w:cs="Times New Roman" w:eastAsia="Times New Roman"/>
+        </w:rPr>
+        <w:t xml:space="preserve">Assistant</w:t>
+      </w:r>
+      <w:r>
+        <w:rPr>
+          <w:rFonts w:ascii="Times New Roman" w:hAnsi="Times New Roman" w:cs="Times New Roman" w:eastAsia="Times New Roman"/>
+        </w:rPr>
+        <w:t xml:space="preserve"> </w:t>
+      </w:r>
+      <w:r>
+        <w:rPr>
+          <w:rFonts w:ascii="Times New Roman" w:hAnsi="Times New Roman" w:cs="Times New Roman" w:eastAsia="Times New Roman"/>
+        </w:rPr>
+        <w:t xml:space="preserve">Professor</w:t>
       </w:r>
       <w:r>
         <w:rPr>

</xml_diff>

<commit_message>
Update author affiliations: Department of Computing Technologies, Dr. Aswathy K Cherian
Co-Authored-By: Claude Opus 5.5 <noreply@anthropic.com>
Claude-Session: https://claude.ai/code/session_013hQpENYQayBnP2TgZ4DeJc
</commit_message>
<xml_diff>
--- a/docs/paper-ieee/CogniHire_IEEE.docx
+++ b/docs/paper-ieee/CogniHire_IEEE.docx
@@ -167,7 +167,55 @@
         <w:rPr>
           <w:rFonts w:ascii="Times New Roman" w:hAnsi="Times New Roman" w:cs="Times New Roman" w:eastAsia="Times New Roman"/>
         </w:rPr>
-        <w:t xml:space="preserve">Computer</w:t>
+        <w:t xml:space="preserve">Computing</w:t>
+      </w:r>
+      <w:r>
+        <w:rPr>
+          <w:rFonts w:ascii="Times New Roman" w:hAnsi="Times New Roman" w:cs="Times New Roman" w:eastAsia="Times New Roman"/>
+        </w:rPr>
+        <w:t xml:space="preserve"> </w:t>
+      </w:r>
+      <w:r>
+        <w:rPr>
+          <w:rFonts w:ascii="Times New Roman" w:hAnsi="Times New Roman" w:cs="Times New Roman" w:eastAsia="Times New Roman"/>
+        </w:rPr>
+        <w:t xml:space="preserve">Technologies</w:t>
+      </w:r>
+      <w:r>
+        <w:rPr>
+          <w:rFonts w:ascii="Times New Roman" w:hAnsi="Times New Roman" w:cs="Times New Roman" w:eastAsia="Times New Roman"/>
+        </w:rPr>
+        <w:br/>
+      </w:r>
+      <w:r>
+        <w:rPr>
+          <w:rFonts w:ascii="Times New Roman" w:hAnsi="Times New Roman" w:cs="Times New Roman" w:eastAsia="Times New Roman"/>
+        </w:rPr>
+        <w:t xml:space="preserve">SRM</w:t>
+      </w:r>
+      <w:r>
+        <w:rPr>
+          <w:rFonts w:ascii="Times New Roman" w:hAnsi="Times New Roman" w:cs="Times New Roman" w:eastAsia="Times New Roman"/>
+        </w:rPr>
+        <w:t xml:space="preserve"> </w:t>
+      </w:r>
+      <w:r>
+        <w:rPr>
+          <w:rFonts w:ascii="Times New Roman" w:hAnsi="Times New Roman" w:cs="Times New Roman" w:eastAsia="Times New Roman"/>
+        </w:rPr>
+        <w:t xml:space="preserve">Institute</w:t>
+      </w:r>
+      <w:r>
+        <w:rPr>
+          <w:rFonts w:ascii="Times New Roman" w:hAnsi="Times New Roman" w:cs="Times New Roman" w:eastAsia="Times New Roman"/>
+        </w:rPr>
+        <w:t xml:space="preserve"> </w:t>
+      </w:r>
+      <w:r>
+        <w:rPr>
+          <w:rFonts w:ascii="Times New Roman" w:hAnsi="Times New Roman" w:cs="Times New Roman" w:eastAsia="Times New Roman"/>
+        </w:rPr>
+        <w:t xml:space="preserve">of</w:t>
       </w:r>
       <w:r>
         <w:rPr>
@@ -203,7 +251,43 @@
         <w:rPr>
           <w:rFonts w:ascii="Times New Roman" w:hAnsi="Times New Roman" w:cs="Times New Roman" w:eastAsia="Times New Roman"/>
         </w:rPr>
-        <w:t xml:space="preserve">Engineering</w:t>
+        <w:t xml:space="preserve">Technology,</w:t>
+      </w:r>
+      <w:r>
+        <w:rPr>
+          <w:rFonts w:ascii="Times New Roman" w:hAnsi="Times New Roman" w:cs="Times New Roman" w:eastAsia="Times New Roman"/>
+        </w:rPr>
+        <w:t xml:space="preserve"> </w:t>
+      </w:r>
+      <w:r>
+        <w:rPr>
+          <w:rFonts w:ascii="Times New Roman" w:hAnsi="Times New Roman" w:cs="Times New Roman" w:eastAsia="Times New Roman"/>
+        </w:rPr>
+        <w:t xml:space="preserve">Kattankalathur,</w:t>
+      </w:r>
+      <w:r>
+        <w:rPr>
+          <w:rFonts w:ascii="Times New Roman" w:hAnsi="Times New Roman" w:cs="Times New Roman" w:eastAsia="Times New Roman"/>
+        </w:rPr>
+        <w:t xml:space="preserve"> </w:t>
+      </w:r>
+      <w:r>
+        <w:rPr>
+          <w:rFonts w:ascii="Times New Roman" w:hAnsi="Times New Roman" w:cs="Times New Roman" w:eastAsia="Times New Roman"/>
+        </w:rPr>
+        <w:t xml:space="preserve">Chennai,</w:t>
+      </w:r>
+      <w:r>
+        <w:rPr>
+          <w:rFonts w:ascii="Times New Roman" w:hAnsi="Times New Roman" w:cs="Times New Roman" w:eastAsia="Times New Roman"/>
+        </w:rPr>
+        <w:t xml:space="preserve"> </w:t>
+      </w:r>
+      <w:r>
+        <w:rPr>
+          <w:rFonts w:ascii="Times New Roman" w:hAnsi="Times New Roman" w:cs="Times New Roman" w:eastAsia="Times New Roman"/>
+        </w:rPr>
+        <w:t xml:space="preserve">India</w:t>
       </w:r>
       <w:r>
         <w:rPr>
@@ -215,6 +299,138 @@
         <w:rPr>
           <w:rFonts w:ascii="Times New Roman" w:hAnsi="Times New Roman" w:cs="Times New Roman" w:eastAsia="Times New Roman"/>
         </w:rPr>
+        <w:t xml:space="preserve">deveshsv.386@gmail.com</w:t>
+      </w:r>
+      <w:r>
+        <w:rPr>
+          <w:rFonts w:ascii="Times New Roman" w:hAnsi="Times New Roman" w:cs="Times New Roman" w:eastAsia="Times New Roman"/>
+        </w:rPr>
+        <w:br/>
+      </w:r>
+      <w:r>
+        <w:rPr>
+          <w:rFonts w:ascii="Times New Roman" w:hAnsi="Times New Roman" w:cs="Times New Roman" w:eastAsia="Times New Roman"/>
+        </w:rPr>
+        <w:t xml:space="preserve">Dr.</w:t>
+      </w:r>
+      <w:r>
+        <w:rPr>
+          <w:rFonts w:ascii="Times New Roman" w:hAnsi="Times New Roman" w:cs="Times New Roman" w:eastAsia="Times New Roman"/>
+        </w:rPr>
+        <w:t xml:space="preserve"> </w:t>
+      </w:r>
+      <w:r>
+        <w:rPr>
+          <w:rFonts w:ascii="Times New Roman" w:hAnsi="Times New Roman" w:cs="Times New Roman" w:eastAsia="Times New Roman"/>
+        </w:rPr>
+        <w:t xml:space="preserve">Aswathy</w:t>
+      </w:r>
+      <w:r>
+        <w:rPr>
+          <w:rFonts w:ascii="Times New Roman" w:hAnsi="Times New Roman" w:cs="Times New Roman" w:eastAsia="Times New Roman"/>
+        </w:rPr>
+        <w:t xml:space="preserve"> </w:t>
+      </w:r>
+      <w:r>
+        <w:rPr>
+          <w:rFonts w:ascii="Times New Roman" w:hAnsi="Times New Roman" w:cs="Times New Roman" w:eastAsia="Times New Roman"/>
+        </w:rPr>
+        <w:t xml:space="preserve">K</w:t>
+      </w:r>
+      <w:r>
+        <w:rPr>
+          <w:rFonts w:ascii="Times New Roman" w:hAnsi="Times New Roman" w:cs="Times New Roman" w:eastAsia="Times New Roman"/>
+        </w:rPr>
+        <w:t xml:space="preserve"> </w:t>
+      </w:r>
+      <w:r>
+        <w:rPr>
+          <w:rFonts w:ascii="Times New Roman" w:hAnsi="Times New Roman" w:cs="Times New Roman" w:eastAsia="Times New Roman"/>
+        </w:rPr>
+        <w:t xml:space="preserve">Cherian</w:t>
+      </w:r>
+      <w:r>
+        <w:rPr>
+          <w:rFonts w:ascii="Times New Roman" w:hAnsi="Times New Roman" w:cs="Times New Roman" w:eastAsia="Times New Roman"/>
+        </w:rPr>
+        <w:br/>
+      </w:r>
+      <w:r>
+        <w:rPr>
+          <w:rFonts w:ascii="Times New Roman" w:hAnsi="Times New Roman" w:cs="Times New Roman" w:eastAsia="Times New Roman"/>
+        </w:rPr>
+        <w:t xml:space="preserve">Associate</w:t>
+      </w:r>
+      <w:r>
+        <w:rPr>
+          <w:rFonts w:ascii="Times New Roman" w:hAnsi="Times New Roman" w:cs="Times New Roman" w:eastAsia="Times New Roman"/>
+        </w:rPr>
+        <w:t xml:space="preserve"> </w:t>
+      </w:r>
+      <w:r>
+        <w:rPr>
+          <w:rFonts w:ascii="Times New Roman" w:hAnsi="Times New Roman" w:cs="Times New Roman" w:eastAsia="Times New Roman"/>
+        </w:rPr>
+        <w:t xml:space="preserve">Professor</w:t>
+      </w:r>
+      <w:r>
+        <w:rPr>
+          <w:rFonts w:ascii="Times New Roman" w:hAnsi="Times New Roman" w:cs="Times New Roman" w:eastAsia="Times New Roman"/>
+        </w:rPr>
+        <w:br/>
+      </w:r>
+      <w:r>
+        <w:rPr>
+          <w:rFonts w:ascii="Times New Roman" w:hAnsi="Times New Roman" w:cs="Times New Roman" w:eastAsia="Times New Roman"/>
+        </w:rPr>
+        <w:t xml:space="preserve">Department</w:t>
+      </w:r>
+      <w:r>
+        <w:rPr>
+          <w:rFonts w:ascii="Times New Roman" w:hAnsi="Times New Roman" w:cs="Times New Roman" w:eastAsia="Times New Roman"/>
+        </w:rPr>
+        <w:t xml:space="preserve"> </w:t>
+      </w:r>
+      <w:r>
+        <w:rPr>
+          <w:rFonts w:ascii="Times New Roman" w:hAnsi="Times New Roman" w:cs="Times New Roman" w:eastAsia="Times New Roman"/>
+        </w:rPr>
+        <w:t xml:space="preserve">of</w:t>
+      </w:r>
+      <w:r>
+        <w:rPr>
+          <w:rFonts w:ascii="Times New Roman" w:hAnsi="Times New Roman" w:cs="Times New Roman" w:eastAsia="Times New Roman"/>
+        </w:rPr>
+        <w:t xml:space="preserve"> </w:t>
+      </w:r>
+      <w:r>
+        <w:rPr>
+          <w:rFonts w:ascii="Times New Roman" w:hAnsi="Times New Roman" w:cs="Times New Roman" w:eastAsia="Times New Roman"/>
+        </w:rPr>
+        <w:t xml:space="preserve">Computing</w:t>
+      </w:r>
+      <w:r>
+        <w:rPr>
+          <w:rFonts w:ascii="Times New Roman" w:hAnsi="Times New Roman" w:cs="Times New Roman" w:eastAsia="Times New Roman"/>
+        </w:rPr>
+        <w:t xml:space="preserve"> </w:t>
+      </w:r>
+      <w:r>
+        <w:rPr>
+          <w:rFonts w:ascii="Times New Roman" w:hAnsi="Times New Roman" w:cs="Times New Roman" w:eastAsia="Times New Roman"/>
+        </w:rPr>
+        <w:t xml:space="preserve">Technologies</w:t>
+      </w:r>
+      <w:r>
+        <w:rPr>
+          <w:rFonts w:ascii="Times New Roman" w:hAnsi="Times New Roman" w:cs="Times New Roman" w:eastAsia="Times New Roman"/>
+        </w:rPr>
+        <w:br/>
+      </w:r>
+      <w:r>
+        <w:rPr>
+          <w:rFonts w:ascii="Times New Roman" w:hAnsi="Times New Roman" w:cs="Times New Roman" w:eastAsia="Times New Roman"/>
+        </w:rPr>
         <w:t xml:space="preserve">SRM</w:t>
       </w:r>
       <w:r>
@@ -287,6 +503,18 @@
         <w:rPr>
           <w:rFonts w:ascii="Times New Roman" w:hAnsi="Times New Roman" w:cs="Times New Roman" w:eastAsia="Times New Roman"/>
         </w:rPr>
+        <w:t xml:space="preserve">Kattankalathur,</w:t>
+      </w:r>
+      <w:r>
+        <w:rPr>
+          <w:rFonts w:ascii="Times New Roman" w:hAnsi="Times New Roman" w:cs="Times New Roman" w:eastAsia="Times New Roman"/>
+        </w:rPr>
+        <w:t xml:space="preserve"> </w:t>
+      </w:r>
+      <w:r>
+        <w:rPr>
+          <w:rFonts w:ascii="Times New Roman" w:hAnsi="Times New Roman" w:cs="Times New Roman" w:eastAsia="Times New Roman"/>
+        </w:rPr>
         <w:t xml:space="preserve">Chennai,</w:t>
       </w:r>
       <w:r>
@@ -311,223 +539,7 @@
         <w:rPr>
           <w:rFonts w:ascii="Times New Roman" w:hAnsi="Times New Roman" w:cs="Times New Roman" w:eastAsia="Times New Roman"/>
         </w:rPr>
-        <w:t xml:space="preserve">deveshsv.386@gmail.com</w:t>
-      </w:r>
-      <w:r>
-        <w:rPr>
-          <w:rFonts w:ascii="Times New Roman" w:hAnsi="Times New Roman" w:cs="Times New Roman" w:eastAsia="Times New Roman"/>
-        </w:rPr>
-        <w:br/>
-      </w:r>
-      <w:r>
-        <w:rPr>
-          <w:rFonts w:ascii="Times New Roman" w:hAnsi="Times New Roman" w:cs="Times New Roman" w:eastAsia="Times New Roman"/>
-        </w:rPr>
-        <w:t xml:space="preserve">Dr.</w:t>
-      </w:r>
-      <w:r>
-        <w:rPr>
-          <w:rFonts w:ascii="Times New Roman" w:hAnsi="Times New Roman" w:cs="Times New Roman" w:eastAsia="Times New Roman"/>
-        </w:rPr>
-        <w:t xml:space="preserve"> </w:t>
-      </w:r>
-      <w:r>
-        <w:rPr>
-          <w:rFonts w:ascii="Times New Roman" w:hAnsi="Times New Roman" w:cs="Times New Roman" w:eastAsia="Times New Roman"/>
-        </w:rPr>
-        <w:t xml:space="preserve">Aswathy</w:t>
-      </w:r>
-      <w:r>
-        <w:rPr>
-          <w:rFonts w:ascii="Times New Roman" w:hAnsi="Times New Roman" w:cs="Times New Roman" w:eastAsia="Times New Roman"/>
-        </w:rPr>
-        <w:br/>
-      </w:r>
-      <w:r>
-        <w:rPr>
-          <w:rFonts w:ascii="Times New Roman" w:hAnsi="Times New Roman" w:cs="Times New Roman" w:eastAsia="Times New Roman"/>
-        </w:rPr>
-        <w:t xml:space="preserve">Assistant</w:t>
-      </w:r>
-      <w:r>
-        <w:rPr>
-          <w:rFonts w:ascii="Times New Roman" w:hAnsi="Times New Roman" w:cs="Times New Roman" w:eastAsia="Times New Roman"/>
-        </w:rPr>
-        <w:t xml:space="preserve"> </w:t>
-      </w:r>
-      <w:r>
-        <w:rPr>
-          <w:rFonts w:ascii="Times New Roman" w:hAnsi="Times New Roman" w:cs="Times New Roman" w:eastAsia="Times New Roman"/>
-        </w:rPr>
-        <w:t xml:space="preserve">Professor</w:t>
-      </w:r>
-      <w:r>
-        <w:rPr>
-          <w:rFonts w:ascii="Times New Roman" w:hAnsi="Times New Roman" w:cs="Times New Roman" w:eastAsia="Times New Roman"/>
-        </w:rPr>
-        <w:br/>
-      </w:r>
-      <w:r>
-        <w:rPr>
-          <w:rFonts w:ascii="Times New Roman" w:hAnsi="Times New Roman" w:cs="Times New Roman" w:eastAsia="Times New Roman"/>
-        </w:rPr>
-        <w:t xml:space="preserve">Department</w:t>
-      </w:r>
-      <w:r>
-        <w:rPr>
-          <w:rFonts w:ascii="Times New Roman" w:hAnsi="Times New Roman" w:cs="Times New Roman" w:eastAsia="Times New Roman"/>
-        </w:rPr>
-        <w:t xml:space="preserve"> </w:t>
-      </w:r>
-      <w:r>
-        <w:rPr>
-          <w:rFonts w:ascii="Times New Roman" w:hAnsi="Times New Roman" w:cs="Times New Roman" w:eastAsia="Times New Roman"/>
-        </w:rPr>
-        <w:t xml:space="preserve">of</w:t>
-      </w:r>
-      <w:r>
-        <w:rPr>
-          <w:rFonts w:ascii="Times New Roman" w:hAnsi="Times New Roman" w:cs="Times New Roman" w:eastAsia="Times New Roman"/>
-        </w:rPr>
-        <w:t xml:space="preserve"> </w:t>
-      </w:r>
-      <w:r>
-        <w:rPr>
-          <w:rFonts w:ascii="Times New Roman" w:hAnsi="Times New Roman" w:cs="Times New Roman" w:eastAsia="Times New Roman"/>
-        </w:rPr>
-        <w:t xml:space="preserve">Computer</w:t>
-      </w:r>
-      <w:r>
-        <w:rPr>
-          <w:rFonts w:ascii="Times New Roman" w:hAnsi="Times New Roman" w:cs="Times New Roman" w:eastAsia="Times New Roman"/>
-        </w:rPr>
-        <w:t xml:space="preserve"> </w:t>
-      </w:r>
-      <w:r>
-        <w:rPr>
-          <w:rFonts w:ascii="Times New Roman" w:hAnsi="Times New Roman" w:cs="Times New Roman" w:eastAsia="Times New Roman"/>
-        </w:rPr>
-        <w:t xml:space="preserve">Science</w:t>
-      </w:r>
-      <w:r>
-        <w:rPr>
-          <w:rFonts w:ascii="Times New Roman" w:hAnsi="Times New Roman" w:cs="Times New Roman" w:eastAsia="Times New Roman"/>
-        </w:rPr>
-        <w:t xml:space="preserve"> </w:t>
-      </w:r>
-      <w:r>
-        <w:rPr>
-          <w:rFonts w:ascii="Times New Roman" w:hAnsi="Times New Roman" w:cs="Times New Roman" w:eastAsia="Times New Roman"/>
-        </w:rPr>
-        <w:t xml:space="preserve">and</w:t>
-      </w:r>
-      <w:r>
-        <w:rPr>
-          <w:rFonts w:ascii="Times New Roman" w:hAnsi="Times New Roman" w:cs="Times New Roman" w:eastAsia="Times New Roman"/>
-        </w:rPr>
-        <w:t xml:space="preserve"> </w:t>
-      </w:r>
-      <w:r>
-        <w:rPr>
-          <w:rFonts w:ascii="Times New Roman" w:hAnsi="Times New Roman" w:cs="Times New Roman" w:eastAsia="Times New Roman"/>
-        </w:rPr>
-        <w:t xml:space="preserve">Engineering</w:t>
-      </w:r>
-      <w:r>
-        <w:rPr>
-          <w:rFonts w:ascii="Times New Roman" w:hAnsi="Times New Roman" w:cs="Times New Roman" w:eastAsia="Times New Roman"/>
-        </w:rPr>
-        <w:br/>
-      </w:r>
-      <w:r>
-        <w:rPr>
-          <w:rFonts w:ascii="Times New Roman" w:hAnsi="Times New Roman" w:cs="Times New Roman" w:eastAsia="Times New Roman"/>
-        </w:rPr>
-        <w:t xml:space="preserve">SRM</w:t>
-      </w:r>
-      <w:r>
-        <w:rPr>
-          <w:rFonts w:ascii="Times New Roman" w:hAnsi="Times New Roman" w:cs="Times New Roman" w:eastAsia="Times New Roman"/>
-        </w:rPr>
-        <w:t xml:space="preserve"> </w:t>
-      </w:r>
-      <w:r>
-        <w:rPr>
-          <w:rFonts w:ascii="Times New Roman" w:hAnsi="Times New Roman" w:cs="Times New Roman" w:eastAsia="Times New Roman"/>
-        </w:rPr>
-        <w:t xml:space="preserve">Institute</w:t>
-      </w:r>
-      <w:r>
-        <w:rPr>
-          <w:rFonts w:ascii="Times New Roman" w:hAnsi="Times New Roman" w:cs="Times New Roman" w:eastAsia="Times New Roman"/>
-        </w:rPr>
-        <w:t xml:space="preserve"> </w:t>
-      </w:r>
-      <w:r>
-        <w:rPr>
-          <w:rFonts w:ascii="Times New Roman" w:hAnsi="Times New Roman" w:cs="Times New Roman" w:eastAsia="Times New Roman"/>
-        </w:rPr>
-        <w:t xml:space="preserve">of</w:t>
-      </w:r>
-      <w:r>
-        <w:rPr>
-          <w:rFonts w:ascii="Times New Roman" w:hAnsi="Times New Roman" w:cs="Times New Roman" w:eastAsia="Times New Roman"/>
-        </w:rPr>
-        <w:t xml:space="preserve"> </w:t>
-      </w:r>
-      <w:r>
-        <w:rPr>
-          <w:rFonts w:ascii="Times New Roman" w:hAnsi="Times New Roman" w:cs="Times New Roman" w:eastAsia="Times New Roman"/>
-        </w:rPr>
-        <w:t xml:space="preserve">Science</w:t>
-      </w:r>
-      <w:r>
-        <w:rPr>
-          <w:rFonts w:ascii="Times New Roman" w:hAnsi="Times New Roman" w:cs="Times New Roman" w:eastAsia="Times New Roman"/>
-        </w:rPr>
-        <w:t xml:space="preserve"> </w:t>
-      </w:r>
-      <w:r>
-        <w:rPr>
-          <w:rFonts w:ascii="Times New Roman" w:hAnsi="Times New Roman" w:cs="Times New Roman" w:eastAsia="Times New Roman"/>
-        </w:rPr>
-        <w:t xml:space="preserve">and</w:t>
-      </w:r>
-      <w:r>
-        <w:rPr>
-          <w:rFonts w:ascii="Times New Roman" w:hAnsi="Times New Roman" w:cs="Times New Roman" w:eastAsia="Times New Roman"/>
-        </w:rPr>
-        <w:t xml:space="preserve"> </w:t>
-      </w:r>
-      <w:r>
-        <w:rPr>
-          <w:rFonts w:ascii="Times New Roman" w:hAnsi="Times New Roman" w:cs="Times New Roman" w:eastAsia="Times New Roman"/>
-        </w:rPr>
-        <w:t xml:space="preserve">Technology,</w:t>
-      </w:r>
-      <w:r>
-        <w:rPr>
-          <w:rFonts w:ascii="Times New Roman" w:hAnsi="Times New Roman" w:cs="Times New Roman" w:eastAsia="Times New Roman"/>
-        </w:rPr>
-        <w:t xml:space="preserve"> </w:t>
-      </w:r>
-      <w:r>
-        <w:rPr>
-          <w:rFonts w:ascii="Times New Roman" w:hAnsi="Times New Roman" w:cs="Times New Roman" w:eastAsia="Times New Roman"/>
-        </w:rPr>
-        <w:t xml:space="preserve">Chennai,</w:t>
-      </w:r>
-      <w:r>
-        <w:rPr>
-          <w:rFonts w:ascii="Times New Roman" w:hAnsi="Times New Roman" w:cs="Times New Roman" w:eastAsia="Times New Roman"/>
-        </w:rPr>
-        <w:t xml:space="preserve"> </w:t>
-      </w:r>
-      <w:r>
-        <w:rPr>
-          <w:rFonts w:ascii="Times New Roman" w:hAnsi="Times New Roman" w:cs="Times New Roman" w:eastAsia="Times New Roman"/>
-        </w:rPr>
-        <w:t xml:space="preserve">India</w:t>
+        <w:t xml:space="preserve">aswathyc1@srmist.edu.in</w:t>
       </w:r>
     </w:p>
     <w:p>

</xml_diff>

<commit_message>
Add industry mentor Shrikrishna S. Chippalkatti (C-DAC) as second author
Author order: primary student, industry mentor, faculty mentor. Abstract's
regulation list shortened to keep 6 pages.

Co-Authored-By: Claude Opus 5.5 <noreply@anthropic.com>
Claude-Session: https://claude.ai/code/session_013hQpENYQayBnP2TgZ4DeJc
</commit_message>
<xml_diff>
--- a/docs/paper-ieee/CogniHire_IEEE.docx
+++ b/docs/paper-ieee/CogniHire_IEEE.docx
@@ -311,6 +311,186 @@
         <w:rPr>
           <w:rFonts w:ascii="Times New Roman" w:hAnsi="Times New Roman" w:cs="Times New Roman" w:eastAsia="Times New Roman"/>
         </w:rPr>
+        <w:t xml:space="preserve">Shrikrishna</w:t>
+      </w:r>
+      <w:r>
+        <w:rPr>
+          <w:rFonts w:ascii="Times New Roman" w:hAnsi="Times New Roman" w:cs="Times New Roman" w:eastAsia="Times New Roman"/>
+        </w:rPr>
+        <w:t xml:space="preserve"> </w:t>
+      </w:r>
+      <w:r>
+        <w:rPr>
+          <w:rFonts w:ascii="Times New Roman" w:hAnsi="Times New Roman" w:cs="Times New Roman" w:eastAsia="Times New Roman"/>
+        </w:rPr>
+        <w:t xml:space="preserve">S.</w:t>
+      </w:r>
+      <w:r>
+        <w:rPr>
+          <w:rFonts w:ascii="Times New Roman" w:hAnsi="Times New Roman" w:cs="Times New Roman" w:eastAsia="Times New Roman"/>
+        </w:rPr>
+        <w:t xml:space="preserve"> </w:t>
+      </w:r>
+      <w:r>
+        <w:rPr>
+          <w:rFonts w:ascii="Times New Roman" w:hAnsi="Times New Roman" w:cs="Times New Roman" w:eastAsia="Times New Roman"/>
+        </w:rPr>
+        <w:t xml:space="preserve">Chippalkatti</w:t>
+      </w:r>
+      <w:r>
+        <w:rPr>
+          <w:rFonts w:ascii="Times New Roman" w:hAnsi="Times New Roman" w:cs="Times New Roman" w:eastAsia="Times New Roman"/>
+        </w:rPr>
+        <w:br/>
+      </w:r>
+      <w:r>
+        <w:rPr>
+          <w:rFonts w:ascii="Times New Roman" w:hAnsi="Times New Roman" w:cs="Times New Roman" w:eastAsia="Times New Roman"/>
+        </w:rPr>
+        <w:t xml:space="preserve">Scientist</w:t>
+      </w:r>
+      <w:r>
+        <w:rPr>
+          <w:rFonts w:ascii="Times New Roman" w:hAnsi="Times New Roman" w:cs="Times New Roman" w:eastAsia="Times New Roman"/>
+        </w:rPr>
+        <w:t xml:space="preserve"> </w:t>
+      </w:r>
+      <w:r>
+        <w:rPr>
+          <w:rFonts w:ascii="Times New Roman" w:hAnsi="Times New Roman" w:cs="Times New Roman" w:eastAsia="Times New Roman"/>
+        </w:rPr>
+        <w:t xml:space="preserve">E</w:t>
+      </w:r>
+      <w:r>
+        <w:rPr>
+          <w:rFonts w:ascii="Times New Roman" w:hAnsi="Times New Roman" w:cs="Times New Roman" w:eastAsia="Times New Roman"/>
+        </w:rPr>
+        <w:br/>
+      </w:r>
+      <w:r>
+        <w:rPr>
+          <w:rFonts w:ascii="Times New Roman" w:hAnsi="Times New Roman" w:cs="Times New Roman" w:eastAsia="Times New Roman"/>
+        </w:rPr>
+        <w:t xml:space="preserve">Centre</w:t>
+      </w:r>
+      <w:r>
+        <w:rPr>
+          <w:rFonts w:ascii="Times New Roman" w:hAnsi="Times New Roman" w:cs="Times New Roman" w:eastAsia="Times New Roman"/>
+        </w:rPr>
+        <w:t xml:space="preserve"> </w:t>
+      </w:r>
+      <w:r>
+        <w:rPr>
+          <w:rFonts w:ascii="Times New Roman" w:hAnsi="Times New Roman" w:cs="Times New Roman" w:eastAsia="Times New Roman"/>
+        </w:rPr>
+        <w:t xml:space="preserve">for</w:t>
+      </w:r>
+      <w:r>
+        <w:rPr>
+          <w:rFonts w:ascii="Times New Roman" w:hAnsi="Times New Roman" w:cs="Times New Roman" w:eastAsia="Times New Roman"/>
+        </w:rPr>
+        <w:t xml:space="preserve"> </w:t>
+      </w:r>
+      <w:r>
+        <w:rPr>
+          <w:rFonts w:ascii="Times New Roman" w:hAnsi="Times New Roman" w:cs="Times New Roman" w:eastAsia="Times New Roman"/>
+        </w:rPr>
+        <w:t xml:space="preserve">Development</w:t>
+      </w:r>
+      <w:r>
+        <w:rPr>
+          <w:rFonts w:ascii="Times New Roman" w:hAnsi="Times New Roman" w:cs="Times New Roman" w:eastAsia="Times New Roman"/>
+        </w:rPr>
+        <w:t xml:space="preserve"> </w:t>
+      </w:r>
+      <w:r>
+        <w:rPr>
+          <w:rFonts w:ascii="Times New Roman" w:hAnsi="Times New Roman" w:cs="Times New Roman" w:eastAsia="Times New Roman"/>
+        </w:rPr>
+        <w:t xml:space="preserve">of</w:t>
+      </w:r>
+      <w:r>
+        <w:rPr>
+          <w:rFonts w:ascii="Times New Roman" w:hAnsi="Times New Roman" w:cs="Times New Roman" w:eastAsia="Times New Roman"/>
+        </w:rPr>
+        <w:t xml:space="preserve"> </w:t>
+      </w:r>
+      <w:r>
+        <w:rPr>
+          <w:rFonts w:ascii="Times New Roman" w:hAnsi="Times New Roman" w:cs="Times New Roman" w:eastAsia="Times New Roman"/>
+        </w:rPr>
+        <w:t xml:space="preserve">Advanced</w:t>
+      </w:r>
+      <w:r>
+        <w:rPr>
+          <w:rFonts w:ascii="Times New Roman" w:hAnsi="Times New Roman" w:cs="Times New Roman" w:eastAsia="Times New Roman"/>
+        </w:rPr>
+        <w:t xml:space="preserve"> </w:t>
+      </w:r>
+      <w:r>
+        <w:rPr>
+          <w:rFonts w:ascii="Times New Roman" w:hAnsi="Times New Roman" w:cs="Times New Roman" w:eastAsia="Times New Roman"/>
+        </w:rPr>
+        <w:t xml:space="preserve">Computing</w:t>
+      </w:r>
+      <w:r>
+        <w:rPr>
+          <w:rFonts w:ascii="Times New Roman" w:hAnsi="Times New Roman" w:cs="Times New Roman" w:eastAsia="Times New Roman"/>
+        </w:rPr>
+        <w:t xml:space="preserve"> </w:t>
+      </w:r>
+      <w:r>
+        <w:rPr>
+          <w:rFonts w:ascii="Times New Roman" w:hAnsi="Times New Roman" w:cs="Times New Roman" w:eastAsia="Times New Roman"/>
+        </w:rPr>
+        <w:t xml:space="preserve">(C-DAC),</w:t>
+      </w:r>
+      <w:r>
+        <w:rPr>
+          <w:rFonts w:ascii="Times New Roman" w:hAnsi="Times New Roman" w:cs="Times New Roman" w:eastAsia="Times New Roman"/>
+        </w:rPr>
+        <w:t xml:space="preserve"> </w:t>
+      </w:r>
+      <w:r>
+        <w:rPr>
+          <w:rFonts w:ascii="Times New Roman" w:hAnsi="Times New Roman" w:cs="Times New Roman" w:eastAsia="Times New Roman"/>
+        </w:rPr>
+        <w:t xml:space="preserve">Bengaluru,</w:t>
+      </w:r>
+      <w:r>
+        <w:rPr>
+          <w:rFonts w:ascii="Times New Roman" w:hAnsi="Times New Roman" w:cs="Times New Roman" w:eastAsia="Times New Roman"/>
+        </w:rPr>
+        <w:t xml:space="preserve"> </w:t>
+      </w:r>
+      <w:r>
+        <w:rPr>
+          <w:rFonts w:ascii="Times New Roman" w:hAnsi="Times New Roman" w:cs="Times New Roman" w:eastAsia="Times New Roman"/>
+        </w:rPr>
+        <w:t xml:space="preserve">India</w:t>
+      </w:r>
+      <w:r>
+        <w:rPr>
+          <w:rFonts w:ascii="Times New Roman" w:hAnsi="Times New Roman" w:cs="Times New Roman" w:eastAsia="Times New Roman"/>
+        </w:rPr>
+        <w:br/>
+      </w:r>
+      <w:r>
+        <w:rPr>
+          <w:rFonts w:ascii="Times New Roman" w:hAnsi="Times New Roman" w:cs="Times New Roman" w:eastAsia="Times New Roman"/>
+        </w:rPr>
+        <w:t xml:space="preserve">krishnac@cdac.in</w:t>
+      </w:r>
+      <w:r>
+        <w:rPr>
+          <w:rFonts w:ascii="Times New Roman" w:hAnsi="Times New Roman" w:cs="Times New Roman" w:eastAsia="Times New Roman"/>
+        </w:rPr>
+        <w:br/>
+      </w:r>
+      <w:r>
+        <w:rPr>
+          <w:rFonts w:ascii="Times New Roman" w:hAnsi="Times New Roman" w:cs="Times New Roman" w:eastAsia="Times New Roman"/>
+        </w:rPr>
         <w:t xml:space="preserve">Dr.</w:t>
       </w:r>
       <w:r>
@@ -922,7 +1102,739 @@
         <w:rPr>
           <w:rFonts w:ascii="Times New Roman" w:hAnsi="Times New Roman" w:cs="Times New Roman" w:eastAsia="Times New Roman"/>
         </w:rPr>
-        <w:t xml:space="preserve">exposure</w:t>
+        <w:t xml:space="preserve">exposure.</w:t>
+      </w:r>
+      <w:r>
+        <w:rPr>
+          <w:rFonts w:ascii="Times New Roman" w:hAnsi="Times New Roman" w:cs="Times New Roman" w:eastAsia="Times New Roman"/>
+        </w:rPr>
+        <w:t xml:space="preserve"> </w:t>
+      </w:r>
+      <w:r>
+        <w:rPr>
+          <w:rFonts w:ascii="Times New Roman" w:hAnsi="Times New Roman" w:cs="Times New Roman" w:eastAsia="Times New Roman"/>
+        </w:rPr>
+        <w:t xml:space="preserve">We</w:t>
+      </w:r>
+      <w:r>
+        <w:rPr>
+          <w:rFonts w:ascii="Times New Roman" w:hAnsi="Times New Roman" w:cs="Times New Roman" w:eastAsia="Times New Roman"/>
+        </w:rPr>
+        <w:t xml:space="preserve"> </w:t>
+      </w:r>
+      <w:r>
+        <w:rPr>
+          <w:rFonts w:ascii="Times New Roman" w:hAnsi="Times New Roman" w:cs="Times New Roman" w:eastAsia="Times New Roman"/>
+        </w:rPr>
+        <w:t xml:space="preserve">present</w:t>
+      </w:r>
+      <w:r>
+        <w:rPr>
+          <w:rFonts w:ascii="Times New Roman" w:hAnsi="Times New Roman" w:cs="Times New Roman" w:eastAsia="Times New Roman"/>
+        </w:rPr>
+        <w:t xml:space="preserve"> </w:t>
+      </w:r>
+      <w:r>
+        <w:rPr>
+          <w:rFonts w:ascii="Times New Roman" w:hAnsi="Times New Roman" w:cs="Times New Roman" w:eastAsia="Times New Roman"/>
+        </w:rPr>
+        <w:t xml:space="preserve">CogniHire,</w:t>
+      </w:r>
+      <w:r>
+        <w:rPr>
+          <w:rFonts w:ascii="Times New Roman" w:hAnsi="Times New Roman" w:cs="Times New Roman" w:eastAsia="Times New Roman"/>
+        </w:rPr>
+        <w:t xml:space="preserve"> </w:t>
+      </w:r>
+      <w:r>
+        <w:rPr>
+          <w:rFonts w:ascii="Times New Roman" w:hAnsi="Times New Roman" w:cs="Times New Roman" w:eastAsia="Times New Roman"/>
+        </w:rPr>
+        <w:t xml:space="preserve">a</w:t>
+      </w:r>
+      <w:r>
+        <w:rPr>
+          <w:rFonts w:ascii="Times New Roman" w:hAnsi="Times New Roman" w:cs="Times New Roman" w:eastAsia="Times New Roman"/>
+        </w:rPr>
+        <w:t xml:space="preserve"> </w:t>
+      </w:r>
+      <w:r>
+        <w:rPr>
+          <w:rFonts w:ascii="Times New Roman" w:hAnsi="Times New Roman" w:cs="Times New Roman" w:eastAsia="Times New Roman"/>
+        </w:rPr>
+        <w:t xml:space="preserve">technical</w:t>
+      </w:r>
+      <w:r>
+        <w:rPr>
+          <w:rFonts w:ascii="Times New Roman" w:hAnsi="Times New Roman" w:cs="Times New Roman" w:eastAsia="Times New Roman"/>
+        </w:rPr>
+        <w:t xml:space="preserve"> </w:t>
+      </w:r>
+      <w:r>
+        <w:rPr>
+          <w:rFonts w:ascii="Times New Roman" w:hAnsi="Times New Roman" w:cs="Times New Roman" w:eastAsia="Times New Roman"/>
+        </w:rPr>
+        <w:t xml:space="preserve">screening</w:t>
+      </w:r>
+      <w:r>
+        <w:rPr>
+          <w:rFonts w:ascii="Times New Roman" w:hAnsi="Times New Roman" w:cs="Times New Roman" w:eastAsia="Times New Roman"/>
+        </w:rPr>
+        <w:t xml:space="preserve"> </w:t>
+      </w:r>
+      <w:r>
+        <w:rPr>
+          <w:rFonts w:ascii="Times New Roman" w:hAnsi="Times New Roman" w:cs="Times New Roman" w:eastAsia="Times New Roman"/>
+        </w:rPr>
+        <w:t xml:space="preserve">system</w:t>
+      </w:r>
+      <w:r>
+        <w:rPr>
+          <w:rFonts w:ascii="Times New Roman" w:hAnsi="Times New Roman" w:cs="Times New Roman" w:eastAsia="Times New Roman"/>
+        </w:rPr>
+        <w:t xml:space="preserve"> </w:t>
+      </w:r>
+      <w:r>
+        <w:rPr>
+          <w:rFonts w:ascii="Times New Roman" w:hAnsi="Times New Roman" w:cs="Times New Roman" w:eastAsia="Times New Roman"/>
+        </w:rPr>
+        <w:t xml:space="preserve">designed</w:t>
+      </w:r>
+      <w:r>
+        <w:rPr>
+          <w:rFonts w:ascii="Times New Roman" w:hAnsi="Times New Roman" w:cs="Times New Roman" w:eastAsia="Times New Roman"/>
+        </w:rPr>
+        <w:t xml:space="preserve"> </w:t>
+      </w:r>
+      <w:r>
+        <w:rPr>
+          <w:rFonts w:ascii="Times New Roman" w:hAnsi="Times New Roman" w:cs="Times New Roman" w:eastAsia="Times New Roman"/>
+        </w:rPr>
+        <w:t xml:space="preserve">to</w:t>
+      </w:r>
+      <w:r>
+        <w:rPr>
+          <w:rFonts w:ascii="Times New Roman" w:hAnsi="Times New Roman" w:cs="Times New Roman" w:eastAsia="Times New Roman"/>
+        </w:rPr>
+        <w:t xml:space="preserve"> </w:t>
+      </w:r>
+      <w:r>
+        <w:rPr>
+          <w:rFonts w:ascii="Times New Roman" w:hAnsi="Times New Roman" w:cs="Times New Roman" w:eastAsia="Times New Roman"/>
+        </w:rPr>
+        <w:t xml:space="preserve">audit</w:t>
+      </w:r>
+      <w:r>
+        <w:rPr>
+          <w:rFonts w:ascii="Times New Roman" w:hAnsi="Times New Roman" w:cs="Times New Roman" w:eastAsia="Times New Roman"/>
+        </w:rPr>
+        <w:t xml:space="preserve"> </w:t>
+      </w:r>
+      <w:r>
+        <w:rPr>
+          <w:rFonts w:ascii="Times New Roman" w:hAnsi="Times New Roman" w:cs="Times New Roman" w:eastAsia="Times New Roman"/>
+        </w:rPr>
+        <w:t xml:space="preserve">the</w:t>
+      </w:r>
+      <w:r>
+        <w:rPr>
+          <w:rFonts w:ascii="Times New Roman" w:hAnsi="Times New Roman" w:cs="Times New Roman" w:eastAsia="Times New Roman"/>
+        </w:rPr>
+        <w:t xml:space="preserve"> </w:t>
+      </w:r>
+      <w:r>
+        <w:rPr>
+          <w:rFonts w:ascii="Times New Roman" w:hAnsi="Times New Roman" w:cs="Times New Roman" w:eastAsia="Times New Roman"/>
+        </w:rPr>
+        <w:t xml:space="preserve">claims</w:t>
+      </w:r>
+      <w:r>
+        <w:rPr>
+          <w:rFonts w:ascii="Times New Roman" w:hAnsi="Times New Roman" w:cs="Times New Roman" w:eastAsia="Times New Roman"/>
+        </w:rPr>
+        <w:t xml:space="preserve"> </w:t>
+      </w:r>
+      <w:r>
+        <w:rPr>
+          <w:rFonts w:ascii="Times New Roman" w:hAnsi="Times New Roman" w:cs="Times New Roman" w:eastAsia="Times New Roman"/>
+        </w:rPr>
+        <w:t xml:space="preserve">a</w:t>
+      </w:r>
+      <w:r>
+        <w:rPr>
+          <w:rFonts w:ascii="Times New Roman" w:hAnsi="Times New Roman" w:cs="Times New Roman" w:eastAsia="Times New Roman"/>
+        </w:rPr>
+        <w:t xml:space="preserve"> </w:t>
+      </w:r>
+      <w:r>
+        <w:rPr>
+          <w:rFonts w:ascii="Times New Roman" w:hAnsi="Times New Roman" w:cs="Times New Roman" w:eastAsia="Times New Roman"/>
+        </w:rPr>
+        <w:t xml:space="preserve">candidate</w:t>
+      </w:r>
+      <w:r>
+        <w:rPr>
+          <w:rFonts w:ascii="Times New Roman" w:hAnsi="Times New Roman" w:cs="Times New Roman" w:eastAsia="Times New Roman"/>
+        </w:rPr>
+        <w:t xml:space="preserve"> </w:t>
+      </w:r>
+      <w:r>
+        <w:rPr>
+          <w:rFonts w:ascii="Times New Roman" w:hAnsi="Times New Roman" w:cs="Times New Roman" w:eastAsia="Times New Roman"/>
+        </w:rPr>
+        <w:t xml:space="preserve">makes</w:t>
+      </w:r>
+      <w:r>
+        <w:rPr>
+          <w:rFonts w:ascii="Times New Roman" w:hAnsi="Times New Roman" w:cs="Times New Roman" w:eastAsia="Times New Roman"/>
+        </w:rPr>
+        <w:t xml:space="preserve"> </w:t>
+      </w:r>
+      <w:r>
+        <w:rPr>
+          <w:rFonts w:ascii="Times New Roman" w:hAnsi="Times New Roman" w:cs="Times New Roman" w:eastAsia="Times New Roman"/>
+        </w:rPr>
+        <w:t xml:space="preserve">rather</w:t>
+      </w:r>
+      <w:r>
+        <w:rPr>
+          <w:rFonts w:ascii="Times New Roman" w:hAnsi="Times New Roman" w:cs="Times New Roman" w:eastAsia="Times New Roman"/>
+        </w:rPr>
+        <w:t xml:space="preserve"> </w:t>
+      </w:r>
+      <w:r>
+        <w:rPr>
+          <w:rFonts w:ascii="Times New Roman" w:hAnsi="Times New Roman" w:cs="Times New Roman" w:eastAsia="Times New Roman"/>
+        </w:rPr>
+        <w:t xml:space="preserve">than</w:t>
+      </w:r>
+      <w:r>
+        <w:rPr>
+          <w:rFonts w:ascii="Times New Roman" w:hAnsi="Times New Roman" w:cs="Times New Roman" w:eastAsia="Times New Roman"/>
+        </w:rPr>
+        <w:t xml:space="preserve"> </w:t>
+      </w:r>
+      <w:r>
+        <w:rPr>
+          <w:rFonts w:ascii="Times New Roman" w:hAnsi="Times New Roman" w:cs="Times New Roman" w:eastAsia="Times New Roman"/>
+        </w:rPr>
+        <w:t xml:space="preserve">score</w:t>
+      </w:r>
+      <w:r>
+        <w:rPr>
+          <w:rFonts w:ascii="Times New Roman" w:hAnsi="Times New Roman" w:cs="Times New Roman" w:eastAsia="Times New Roman"/>
+        </w:rPr>
+        <w:t xml:space="preserve"> </w:t>
+      </w:r>
+      <w:r>
+        <w:rPr>
+          <w:rFonts w:ascii="Times New Roman" w:hAnsi="Times New Roman" w:cs="Times New Roman" w:eastAsia="Times New Roman"/>
+        </w:rPr>
+        <w:t xml:space="preserve">the</w:t>
+      </w:r>
+      <w:r>
+        <w:rPr>
+          <w:rFonts w:ascii="Times New Roman" w:hAnsi="Times New Roman" w:cs="Times New Roman" w:eastAsia="Times New Roman"/>
+        </w:rPr>
+        <w:t xml:space="preserve"> </w:t>
+      </w:r>
+      <w:r>
+        <w:rPr>
+          <w:rFonts w:ascii="Times New Roman" w:hAnsi="Times New Roman" w:cs="Times New Roman" w:eastAsia="Times New Roman"/>
+        </w:rPr>
+        <w:t xml:space="preserve">candidate.</w:t>
+      </w:r>
+      <w:r>
+        <w:rPr>
+          <w:rFonts w:ascii="Times New Roman" w:hAnsi="Times New Roman" w:cs="Times New Roman" w:eastAsia="Times New Roman"/>
+        </w:rPr>
+        <w:t xml:space="preserve"> </w:t>
+      </w:r>
+      <w:r>
+        <w:rPr>
+          <w:rFonts w:ascii="Times New Roman" w:hAnsi="Times New Roman" w:cs="Times New Roman" w:eastAsia="Times New Roman"/>
+        </w:rPr>
+        <w:t xml:space="preserve">A</w:t>
+      </w:r>
+      <w:r>
+        <w:rPr>
+          <w:rFonts w:ascii="Times New Roman" w:hAnsi="Times New Roman" w:cs="Times New Roman" w:eastAsia="Times New Roman"/>
+        </w:rPr>
+        <w:t xml:space="preserve"> </w:t>
+      </w:r>
+      <w:r>
+        <w:rPr>
+          <w:rFonts w:ascii="Times New Roman" w:hAnsi="Times New Roman" w:cs="Times New Roman" w:eastAsia="Times New Roman"/>
+        </w:rPr>
+        <w:t xml:space="preserve">deterministic</w:t>
+      </w:r>
+      <w:r>
+        <w:rPr>
+          <w:rFonts w:ascii="Times New Roman" w:hAnsi="Times New Roman" w:cs="Times New Roman" w:eastAsia="Times New Roman"/>
+        </w:rPr>
+        <w:t xml:space="preserve"> </w:t>
+      </w:r>
+      <w:r>
+        <w:rPr>
+          <w:rFonts w:ascii="Times New Roman" w:hAnsi="Times New Roman" w:cs="Times New Roman" w:eastAsia="Times New Roman"/>
+        </w:rPr>
+        <w:t xml:space="preserve">grounding</w:t>
+      </w:r>
+      <w:r>
+        <w:rPr>
+          <w:rFonts w:ascii="Times New Roman" w:hAnsi="Times New Roman" w:cs="Times New Roman" w:eastAsia="Times New Roman"/>
+        </w:rPr>
+        <w:t xml:space="preserve"> </w:t>
+      </w:r>
+      <w:r>
+        <w:rPr>
+          <w:rFonts w:ascii="Times New Roman" w:hAnsi="Times New Roman" w:cs="Times New Roman" w:eastAsia="Times New Roman"/>
+        </w:rPr>
+        <w:t xml:space="preserve">gate</w:t>
+      </w:r>
+      <w:r>
+        <w:rPr>
+          <w:rFonts w:ascii="Times New Roman" w:hAnsi="Times New Roman" w:cs="Times New Roman" w:eastAsia="Times New Roman"/>
+        </w:rPr>
+        <w:t xml:space="preserve"> </w:t>
+      </w:r>
+      <w:r>
+        <w:rPr>
+          <w:rFonts w:ascii="Times New Roman" w:hAnsi="Times New Roman" w:cs="Times New Roman" w:eastAsia="Times New Roman"/>
+        </w:rPr>
+        <w:t xml:space="preserve">constrains</w:t>
+      </w:r>
+      <w:r>
+        <w:rPr>
+          <w:rFonts w:ascii="Times New Roman" w:hAnsi="Times New Roman" w:cs="Times New Roman" w:eastAsia="Times New Roman"/>
+        </w:rPr>
+        <w:t xml:space="preserve"> </w:t>
+      </w:r>
+      <w:r>
+        <w:rPr>
+          <w:rFonts w:ascii="Times New Roman" w:hAnsi="Times New Roman" w:cs="Times New Roman" w:eastAsia="Times New Roman"/>
+        </w:rPr>
+        <w:t xml:space="preserve">a</w:t>
+      </w:r>
+      <w:r>
+        <w:rPr>
+          <w:rFonts w:ascii="Times New Roman" w:hAnsi="Times New Roman" w:cs="Times New Roman" w:eastAsia="Times New Roman"/>
+        </w:rPr>
+        <w:t xml:space="preserve"> </w:t>
+      </w:r>
+      <w:r>
+        <w:rPr>
+          <w:rFonts w:ascii="Times New Roman" w:hAnsi="Times New Roman" w:cs="Times New Roman" w:eastAsia="Times New Roman"/>
+        </w:rPr>
+        <w:t xml:space="preserve">language</w:t>
+      </w:r>
+      <w:r>
+        <w:rPr>
+          <w:rFonts w:ascii="Times New Roman" w:hAnsi="Times New Roman" w:cs="Times New Roman" w:eastAsia="Times New Roman"/>
+        </w:rPr>
+        <w:t xml:space="preserve"> </w:t>
+      </w:r>
+      <w:r>
+        <w:rPr>
+          <w:rFonts w:ascii="Times New Roman" w:hAnsi="Times New Roman" w:cs="Times New Roman" w:eastAsia="Times New Roman"/>
+        </w:rPr>
+        <w:t xml:space="preserve">model</w:t>
+      </w:r>
+      <w:r>
+        <w:rPr>
+          <w:rFonts w:ascii="Times New Roman" w:hAnsi="Times New Roman" w:cs="Times New Roman" w:eastAsia="Times New Roman"/>
+        </w:rPr>
+        <w:t xml:space="preserve"> </w:t>
+      </w:r>
+      <w:r>
+        <w:rPr>
+          <w:rFonts w:ascii="Times New Roman" w:hAnsi="Times New Roman" w:cs="Times New Roman" w:eastAsia="Times New Roman"/>
+        </w:rPr>
+        <w:t xml:space="preserve">to</w:t>
+      </w:r>
+      <w:r>
+        <w:rPr>
+          <w:rFonts w:ascii="Times New Roman" w:hAnsi="Times New Roman" w:cs="Times New Roman" w:eastAsia="Times New Roman"/>
+        </w:rPr>
+        <w:t xml:space="preserve"> </w:t>
+      </w:r>
+      <w:r>
+        <w:rPr>
+          <w:rFonts w:ascii="Times New Roman" w:hAnsi="Times New Roman" w:cs="Times New Roman" w:eastAsia="Times New Roman"/>
+        </w:rPr>
+        <w:t xml:space="preserve">select</w:t>
+      </w:r>
+      <w:r>
+        <w:rPr>
+          <w:rFonts w:ascii="Times New Roman" w:hAnsi="Times New Roman" w:cs="Times New Roman" w:eastAsia="Times New Roman"/>
+        </w:rPr>
+        <w:t xml:space="preserve"> </w:t>
+      </w:r>
+      <w:r>
+        <w:rPr>
+          <w:rFonts w:ascii="Times New Roman" w:hAnsi="Times New Roman" w:cs="Times New Roman" w:eastAsia="Times New Roman"/>
+        </w:rPr>
+        <w:t xml:space="preserve">claim</w:t>
+      </w:r>
+      <w:r>
+        <w:rPr>
+          <w:rFonts w:ascii="Times New Roman" w:hAnsi="Times New Roman" w:cs="Times New Roman" w:eastAsia="Times New Roman"/>
+        </w:rPr>
+        <w:t xml:space="preserve"> </w:t>
+      </w:r>
+      <w:r>
+        <w:rPr>
+          <w:rFonts w:ascii="Times New Roman" w:hAnsi="Times New Roman" w:cs="Times New Roman" w:eastAsia="Times New Roman"/>
+        </w:rPr>
+        <w:t xml:space="preserve">text</w:t>
+      </w:r>
+      <w:r>
+        <w:rPr>
+          <w:rFonts w:ascii="Times New Roman" w:hAnsi="Times New Roman" w:cs="Times New Roman" w:eastAsia="Times New Roman"/>
+        </w:rPr>
+        <w:t xml:space="preserve"> </w:t>
+      </w:r>
+      <w:r>
+        <w:rPr>
+          <w:rFonts w:ascii="Times New Roman" w:hAnsi="Times New Roman" w:cs="Times New Roman" w:eastAsia="Times New Roman"/>
+        </w:rPr>
+        <w:t xml:space="preserve">from</w:t>
+      </w:r>
+      <w:r>
+        <w:rPr>
+          <w:rFonts w:ascii="Times New Roman" w:hAnsi="Times New Roman" w:cs="Times New Roman" w:eastAsia="Times New Roman"/>
+        </w:rPr>
+        <w:t xml:space="preserve"> </w:t>
+      </w:r>
+      <w:r>
+        <w:rPr>
+          <w:rFonts w:ascii="Times New Roman" w:hAnsi="Times New Roman" w:cs="Times New Roman" w:eastAsia="Times New Roman"/>
+        </w:rPr>
+        <w:t xml:space="preserve">the</w:t>
+      </w:r>
+      <w:r>
+        <w:rPr>
+          <w:rFonts w:ascii="Times New Roman" w:hAnsi="Times New Roman" w:cs="Times New Roman" w:eastAsia="Times New Roman"/>
+        </w:rPr>
+        <w:t xml:space="preserve"> </w:t>
+      </w:r>
+      <w:r>
+        <w:rPr>
+          <w:rFonts w:ascii="Times New Roman" w:hAnsi="Times New Roman" w:cs="Times New Roman" w:eastAsia="Times New Roman"/>
+        </w:rPr>
+        <w:t xml:space="preserve">resume</w:t>
+      </w:r>
+      <w:r>
+        <w:rPr>
+          <w:rFonts w:ascii="Times New Roman" w:hAnsi="Times New Roman" w:cs="Times New Roman" w:eastAsia="Times New Roman"/>
+        </w:rPr>
+        <w:t xml:space="preserve"> </w:t>
+      </w:r>
+      <w:r>
+        <w:rPr>
+          <w:rFonts w:ascii="Times New Roman" w:hAnsi="Times New Roman" w:cs="Times New Roman" w:eastAsia="Times New Roman"/>
+        </w:rPr>
+        <w:t xml:space="preserve">and</w:t>
+      </w:r>
+      <w:r>
+        <w:rPr>
+          <w:rFonts w:ascii="Times New Roman" w:hAnsi="Times New Roman" w:cs="Times New Roman" w:eastAsia="Times New Roman"/>
+        </w:rPr>
+        <w:t xml:space="preserve"> </w:t>
+      </w:r>
+      <w:r>
+        <w:rPr>
+          <w:rFonts w:ascii="Times New Roman" w:hAnsi="Times New Roman" w:cs="Times New Roman" w:eastAsia="Times New Roman"/>
+        </w:rPr>
+        <w:t xml:space="preserve">forbids</w:t>
+      </w:r>
+      <w:r>
+        <w:rPr>
+          <w:rFonts w:ascii="Times New Roman" w:hAnsi="Times New Roman" w:cs="Times New Roman" w:eastAsia="Times New Roman"/>
+        </w:rPr>
+        <w:t xml:space="preserve"> </w:t>
+      </w:r>
+      <w:r>
+        <w:rPr>
+          <w:rFonts w:ascii="Times New Roman" w:hAnsi="Times New Roman" w:cs="Times New Roman" w:eastAsia="Times New Roman"/>
+        </w:rPr>
+        <w:t xml:space="preserve">it</w:t>
+      </w:r>
+      <w:r>
+        <w:rPr>
+          <w:rFonts w:ascii="Times New Roman" w:hAnsi="Times New Roman" w:cs="Times New Roman" w:eastAsia="Times New Roman"/>
+        </w:rPr>
+        <w:t xml:space="preserve"> </w:t>
+      </w:r>
+      <w:r>
+        <w:rPr>
+          <w:rFonts w:ascii="Times New Roman" w:hAnsi="Times New Roman" w:cs="Times New Roman" w:eastAsia="Times New Roman"/>
+        </w:rPr>
+        <w:t xml:space="preserve">to</w:t>
+      </w:r>
+      <w:r>
+        <w:rPr>
+          <w:rFonts w:ascii="Times New Roman" w:hAnsi="Times New Roman" w:cs="Times New Roman" w:eastAsia="Times New Roman"/>
+        </w:rPr>
+        <w:t xml:space="preserve"> </w:t>
+      </w:r>
+      <w:r>
+        <w:rPr>
+          <w:rFonts w:ascii="Times New Roman" w:hAnsi="Times New Roman" w:cs="Times New Roman" w:eastAsia="Times New Roman"/>
+        </w:rPr>
+        <w:t xml:space="preserve">author</w:t>
+      </w:r>
+      <w:r>
+        <w:rPr>
+          <w:rFonts w:ascii="Times New Roman" w:hAnsi="Times New Roman" w:cs="Times New Roman" w:eastAsia="Times New Roman"/>
+        </w:rPr>
+        <w:t xml:space="preserve"> </w:t>
+      </w:r>
+      <w:r>
+        <w:rPr>
+          <w:rFonts w:ascii="Times New Roman" w:hAnsi="Times New Roman" w:cs="Times New Roman" w:eastAsia="Times New Roman"/>
+        </w:rPr>
+        <w:t xml:space="preserve">any.</w:t>
+      </w:r>
+      <w:r>
+        <w:rPr>
+          <w:rFonts w:ascii="Times New Roman" w:hAnsi="Times New Roman" w:cs="Times New Roman" w:eastAsia="Times New Roman"/>
+        </w:rPr>
+        <w:t xml:space="preserve"> </w:t>
+      </w:r>
+      <w:r>
+        <w:rPr>
+          <w:rFonts w:ascii="Times New Roman" w:hAnsi="Times New Roman" w:cs="Times New Roman" w:eastAsia="Times New Roman"/>
+        </w:rPr>
+        <w:t xml:space="preserve">Across</w:t>
+      </w:r>
+      <w:r>
+        <w:rPr>
+          <w:rFonts w:ascii="Times New Roman" w:hAnsi="Times New Roman" w:cs="Times New Roman" w:eastAsia="Times New Roman"/>
+        </w:rPr>
+        <w:t xml:space="preserve"> </w:t>
+      </w:r>
+      <w:r>
+        <w:rPr>
+          <w:rFonts w:ascii="Times New Roman" w:hAnsi="Times New Roman" w:cs="Times New Roman" w:eastAsia="Times New Roman"/>
+        </w:rPr>
+        <w:t xml:space="preserve">roughly</w:t>
+      </w:r>
+      <w:r>
+        <w:rPr>
+          <w:rFonts w:ascii="Times New Roman" w:hAnsi="Times New Roman" w:cs="Times New Roman" w:eastAsia="Times New Roman"/>
+        </w:rPr>
+        <w:t xml:space="preserve"> </w:t>
+      </w:r>
+      <w:r>
+        <w:rPr>
+          <w:rFonts w:ascii="Times New Roman" w:hAnsi="Times New Roman" w:cs="Times New Roman" w:eastAsia="Times New Roman"/>
+        </w:rPr>
+        <w:t xml:space="preserve">100,000</w:t>
+      </w:r>
+      <w:r>
+        <w:rPr>
+          <w:rFonts w:ascii="Times New Roman" w:hAnsi="Times New Roman" w:cs="Times New Roman" w:eastAsia="Times New Roman"/>
+        </w:rPr>
+        <w:t xml:space="preserve"> </w:t>
+      </w:r>
+      <w:r>
+        <w:rPr>
+          <w:rFonts w:ascii="Times New Roman" w:hAnsi="Times New Roman" w:cs="Times New Roman" w:eastAsia="Times New Roman"/>
+        </w:rPr>
+        <w:t xml:space="preserve">synthetic</w:t>
+      </w:r>
+      <w:r>
+        <w:rPr>
+          <w:rFonts w:ascii="Times New Roman" w:hAnsi="Times New Roman" w:cs="Times New Roman" w:eastAsia="Times New Roman"/>
+        </w:rPr>
+        <w:t xml:space="preserve"> </w:t>
+      </w:r>
+      <w:r>
+        <w:rPr>
+          <w:rFonts w:ascii="Times New Roman" w:hAnsi="Times New Roman" w:cs="Times New Roman" w:eastAsia="Times New Roman"/>
+        </w:rPr>
+        <w:t xml:space="preserve">trials</w:t>
+      </w:r>
+      <w:r>
+        <w:rPr>
+          <w:rFonts w:ascii="Times New Roman" w:hAnsi="Times New Roman" w:cs="Times New Roman" w:eastAsia="Times New Roman"/>
+        </w:rPr>
+        <w:t xml:space="preserve"> </w:t>
+      </w:r>
+      <w:r>
+        <w:rPr>
+          <w:rFonts w:ascii="Times New Roman" w:hAnsi="Times New Roman" w:cs="Times New Roman" w:eastAsia="Times New Roman"/>
+        </w:rPr>
+        <w:t xml:space="preserve">the</w:t>
+      </w:r>
+      <w:r>
+        <w:rPr>
+          <w:rFonts w:ascii="Times New Roman" w:hAnsi="Times New Roman" w:cs="Times New Roman" w:eastAsia="Times New Roman"/>
+        </w:rPr>
+        <w:t xml:space="preserve"> </w:t>
+      </w:r>
+      <w:r>
+        <w:rPr>
+          <w:rFonts w:ascii="Times New Roman" w:hAnsi="Times New Roman" w:cs="Times New Roman" w:eastAsia="Times New Roman"/>
+        </w:rPr>
+        <w:t xml:space="preserve">gate</w:t>
+      </w:r>
+      <w:r>
+        <w:rPr>
+          <w:rFonts w:ascii="Times New Roman" w:hAnsi="Times New Roman" w:cs="Times New Roman" w:eastAsia="Times New Roman"/>
+        </w:rPr>
+        <w:t xml:space="preserve"> </w:t>
+      </w:r>
+      <w:r>
+        <w:rPr>
+          <w:rFonts w:ascii="Times New Roman" w:hAnsi="Times New Roman" w:cs="Times New Roman" w:eastAsia="Times New Roman"/>
+        </w:rPr>
+        <w:t xml:space="preserve">rejected</w:t>
+      </w:r>
+      <w:r>
+        <w:rPr>
+          <w:rFonts w:ascii="Times New Roman" w:hAnsi="Times New Roman" w:cs="Times New Roman" w:eastAsia="Times New Roman"/>
+        </w:rPr>
+        <w:t xml:space="preserve"> </w:t>
+      </w:r>
+      <w:r>
+        <w:rPr>
+          <w:rFonts w:ascii="Times New Roman" w:hAnsi="Times New Roman" w:cs="Times New Roman" w:eastAsia="Times New Roman"/>
+        </w:rPr>
+        <w:t xml:space="preserve">every</w:t>
+      </w:r>
+      <w:r>
+        <w:rPr>
+          <w:rFonts w:ascii="Times New Roman" w:hAnsi="Times New Roman" w:cs="Times New Roman" w:eastAsia="Times New Roman"/>
+        </w:rPr>
+        <w:t xml:space="preserve"> </w:t>
+      </w:r>
+      <w:r>
+        <w:rPr>
+          <w:rFonts w:ascii="Times New Roman" w:hAnsi="Times New Roman" w:cs="Times New Roman" w:eastAsia="Times New Roman"/>
+        </w:rPr>
+        <w:t xml:space="preserve">meaning-preserving</w:t>
+      </w:r>
+      <w:r>
+        <w:rPr>
+          <w:rFonts w:ascii="Times New Roman" w:hAnsi="Times New Roman" w:cs="Times New Roman" w:eastAsia="Times New Roman"/>
+        </w:rPr>
+        <w:t xml:space="preserve"> </w:t>
+      </w:r>
+      <w:r>
+        <w:rPr>
+          <w:rFonts w:ascii="Times New Roman" w:hAnsi="Times New Roman" w:cs="Times New Roman" w:eastAsia="Times New Roman"/>
+        </w:rPr>
+        <w:t xml:space="preserve">paraphrase</w:t>
+      </w:r>
+      <w:r>
+        <w:rPr>
+          <w:rFonts w:ascii="Times New Roman" w:hAnsi="Times New Roman" w:cs="Times New Roman" w:eastAsia="Times New Roman"/>
+        </w:rPr>
+        <w:t xml:space="preserve"> </w:t>
+      </w:r>
+      <w:r>
+        <w:rPr>
+          <w:rFonts w:ascii="Times New Roman" w:hAnsi="Times New Roman" w:cs="Times New Roman" w:eastAsia="Times New Roman"/>
+        </w:rPr>
+        <w:t xml:space="preserve">and</w:t>
+      </w:r>
+      <w:r>
+        <w:rPr>
+          <w:rFonts w:ascii="Times New Roman" w:hAnsi="Times New Roman" w:cs="Times New Roman" w:eastAsia="Times New Roman"/>
+        </w:rPr>
+        <w:t xml:space="preserve"> </w:t>
+      </w:r>
+      <w:r>
+        <w:rPr>
+          <w:rFonts w:ascii="Times New Roman" w:hAnsi="Times New Roman" w:cs="Times New Roman" w:eastAsia="Times New Roman"/>
+        </w:rPr>
+        <w:t xml:space="preserve">negation</w:t>
+      </w:r>
+      <w:r>
+        <w:rPr>
+          <w:rFonts w:ascii="Times New Roman" w:hAnsi="Times New Roman" w:cs="Times New Roman" w:eastAsia="Times New Roman"/>
+        </w:rPr>
+        <w:t xml:space="preserve"> </w:t>
+      </w:r>
+      <w:r>
+        <w:rPr>
+          <w:rFonts w:ascii="Times New Roman" w:hAnsi="Times New Roman" w:cs="Times New Roman" w:eastAsia="Times New Roman"/>
+        </w:rPr>
+        <w:t xml:space="preserve">trap</w:t>
+      </w:r>
+      <w:r>
+        <w:rPr>
+          <w:rFonts w:ascii="Times New Roman" w:hAnsi="Times New Roman" w:cs="Times New Roman" w:eastAsia="Times New Roman"/>
+        </w:rPr>
+        <w:t xml:space="preserve"> </w:t>
+      </w:r>
+      <w:r>
+        <w:rPr>
+          <w:rFonts w:ascii="Times New Roman" w:hAnsi="Times New Roman" w:cs="Times New Roman" w:eastAsia="Times New Roman"/>
+        </w:rPr>
+        <w:t xml:space="preserve">while</w:t>
+      </w:r>
+      <w:r>
+        <w:rPr>
+          <w:rFonts w:ascii="Times New Roman" w:hAnsi="Times New Roman" w:cs="Times New Roman" w:eastAsia="Times New Roman"/>
+        </w:rPr>
+        <w:t xml:space="preserve"> </w:t>
+      </w:r>
+      <w:r>
+        <w:rPr>
+          <w:rFonts w:ascii="Times New Roman" w:hAnsi="Times New Roman" w:cs="Times New Roman" w:eastAsia="Times New Roman"/>
+        </w:rPr>
+        <w:t xml:space="preserve">admitting</w:t>
+      </w:r>
+      <w:r>
+        <w:rPr>
+          <w:rFonts w:ascii="Times New Roman" w:hAnsi="Times New Roman" w:cs="Times New Roman" w:eastAsia="Times New Roman"/>
+        </w:rPr>
+        <w:t xml:space="preserve"> </w:t>
+      </w:r>
+      <w:r>
+        <w:rPr>
+          <w:rFonts w:ascii="Times New Roman" w:hAnsi="Times New Roman" w:cs="Times New Roman" w:eastAsia="Times New Roman"/>
+        </w:rPr>
+        <w:t xml:space="preserve">every</w:t>
+      </w:r>
+      <w:r>
+        <w:rPr>
+          <w:rFonts w:ascii="Times New Roman" w:hAnsi="Times New Roman" w:cs="Times New Roman" w:eastAsia="Times New Roman"/>
+        </w:rPr>
+        <w:t xml:space="preserve"> </w:t>
+      </w:r>
+      <w:r>
+        <w:rPr>
+          <w:rFonts w:ascii="Times New Roman" w:hAnsi="Times New Roman" w:cs="Times New Roman" w:eastAsia="Times New Roman"/>
+        </w:rPr>
+        <w:t xml:space="preserve">verbatim</w:t>
+      </w:r>
+      <w:r>
+        <w:rPr>
+          <w:rFonts w:ascii="Times New Roman" w:hAnsi="Times New Roman" w:cs="Times New Roman" w:eastAsia="Times New Roman"/>
+        </w:rPr>
+        <w:t xml:space="preserve"> </w:t>
+      </w:r>
+      <w:r>
+        <w:rPr>
+          <w:rFonts w:ascii="Times New Roman" w:hAnsi="Times New Roman" w:cs="Times New Roman" w:eastAsia="Times New Roman"/>
+        </w:rPr>
+        <w:t xml:space="preserve">claim,</w:t>
+      </w:r>
+      <w:r>
+        <w:rPr>
+          <w:rFonts w:ascii="Times New Roman" w:hAnsi="Times New Roman" w:cs="Times New Roman" w:eastAsia="Times New Roman"/>
+        </w:rPr>
+        <w:t xml:space="preserve"> </w:t>
+      </w:r>
+      <w:r>
+        <w:rPr>
+          <w:rFonts w:ascii="Times New Roman" w:hAnsi="Times New Roman" w:cs="Times New Roman" w:eastAsia="Times New Roman"/>
+        </w:rPr>
+        <w:t xml:space="preserve">and</w:t>
       </w:r>
       <w:r>
         <w:rPr>
@@ -946,55 +1858,811 @@
         <w:rPr>
           <w:rFonts w:ascii="Times New Roman" w:hAnsi="Times New Roman" w:cs="Times New Roman" w:eastAsia="Times New Roman"/>
         </w:rPr>
-        <w:t xml:space="preserve">New</w:t>
-      </w:r>
-      <w:r>
-        <w:rPr>
-          <w:rFonts w:ascii="Times New Roman" w:hAnsi="Times New Roman" w:cs="Times New Roman" w:eastAsia="Times New Roman"/>
-        </w:rPr>
-        <w:t xml:space="preserve"> </w:t>
-      </w:r>
-      <w:r>
-        <w:rPr>
-          <w:rFonts w:ascii="Times New Roman" w:hAnsi="Times New Roman" w:cs="Times New Roman" w:eastAsia="Times New Roman"/>
-        </w:rPr>
-        <w:t xml:space="preserve">York</w:t>
-      </w:r>
-      <w:r>
-        <w:rPr>
-          <w:rFonts w:ascii="Times New Roman" w:hAnsi="Times New Roman" w:cs="Times New Roman" w:eastAsia="Times New Roman"/>
-        </w:rPr>
-        <w:t xml:space="preserve"> </w:t>
-      </w:r>
-      <w:r>
-        <w:rPr>
-          <w:rFonts w:ascii="Times New Roman" w:hAnsi="Times New Roman" w:cs="Times New Roman" w:eastAsia="Times New Roman"/>
-        </w:rPr>
-        <w:t xml:space="preserve">City</w:t>
-      </w:r>
-      <w:r>
-        <w:rPr>
-          <w:rFonts w:ascii="Times New Roman" w:hAnsi="Times New Roman" w:cs="Times New Roman" w:eastAsia="Times New Roman"/>
-        </w:rPr>
-        <w:t xml:space="preserve"> </w:t>
-      </w:r>
-      <w:r>
-        <w:rPr>
-          <w:rFonts w:ascii="Times New Roman" w:hAnsi="Times New Roman" w:cs="Times New Roman" w:eastAsia="Times New Roman"/>
-        </w:rPr>
-        <w:t xml:space="preserve">Local</w:t>
-      </w:r>
-      <w:r>
-        <w:rPr>
-          <w:rFonts w:ascii="Times New Roman" w:hAnsi="Times New Roman" w:cs="Times New Roman" w:eastAsia="Times New Roman"/>
-        </w:rPr>
-        <w:t xml:space="preserve"> </w:t>
-      </w:r>
-      <w:r>
-        <w:rPr>
-          <w:rFonts w:ascii="Times New Roman" w:hAnsi="Times New Roman" w:cs="Times New Roman" w:eastAsia="Times New Roman"/>
-        </w:rPr>
-        <w:t xml:space="preserve">Law 144,</w:t>
+        <w:t xml:space="preserve">a</w:t>
+      </w:r>
+      <w:r>
+        <w:rPr>
+          <w:rFonts w:ascii="Times New Roman" w:hAnsi="Times New Roman" w:cs="Times New Roman" w:eastAsia="Times New Roman"/>
+        </w:rPr>
+        <w:t xml:space="preserve"> </w:t>
+      </w:r>
+      <w:r>
+        <w:rPr>
+          <w:rFonts w:ascii="Times New Roman" w:hAnsi="Times New Roman" w:cs="Times New Roman" w:eastAsia="Times New Roman"/>
+        </w:rPr>
+        <w:t xml:space="preserve">worst-case</w:t>
+      </w:r>
+      <w:r>
+        <w:rPr>
+          <w:rFonts w:ascii="Times New Roman" w:hAnsi="Times New Roman" w:cs="Times New Roman" w:eastAsia="Times New Roman"/>
+        </w:rPr>
+        <w:t xml:space="preserve"> </w:t>
+      </w:r>
+      <w:r>
+        <w:rPr>
+          <w:rFonts w:ascii="Times New Roman" w:hAnsi="Times New Roman" w:cs="Times New Roman" w:eastAsia="Times New Roman"/>
+        </w:rPr>
+        <w:t xml:space="preserve">prompt-injection</w:t>
+      </w:r>
+      <w:r>
+        <w:rPr>
+          <w:rFonts w:ascii="Times New Roman" w:hAnsi="Times New Roman" w:cs="Times New Roman" w:eastAsia="Times New Roman"/>
+        </w:rPr>
+        <w:t xml:space="preserve"> </w:t>
+      </w:r>
+      <w:r>
+        <w:rPr>
+          <w:rFonts w:ascii="Times New Roman" w:hAnsi="Times New Roman" w:cs="Times New Roman" w:eastAsia="Times New Roman"/>
+        </w:rPr>
+        <w:t xml:space="preserve">model</w:t>
+      </w:r>
+      <w:r>
+        <w:rPr>
+          <w:rFonts w:ascii="Times New Roman" w:hAnsi="Times New Roman" w:cs="Times New Roman" w:eastAsia="Times New Roman"/>
+        </w:rPr>
+        <w:t xml:space="preserve"> </w:t>
+      </w:r>
+      <w:r>
+        <w:rPr>
+          <w:rFonts w:ascii="Times New Roman" w:hAnsi="Times New Roman" w:cs="Times New Roman" w:eastAsia="Times New Roman"/>
+        </w:rPr>
+        <w:t xml:space="preserve">it</w:t>
+      </w:r>
+      <w:r>
+        <w:rPr>
+          <w:rFonts w:ascii="Times New Roman" w:hAnsi="Times New Roman" w:cs="Times New Roman" w:eastAsia="Times New Roman"/>
+        </w:rPr>
+        <w:t xml:space="preserve"> </w:t>
+      </w:r>
+      <w:r>
+        <w:rPr>
+          <w:rFonts w:ascii="Times New Roman" w:hAnsi="Times New Roman" w:cs="Times New Roman" w:eastAsia="Times New Roman"/>
+        </w:rPr>
+        <w:t xml:space="preserve">admitted</w:t>
+      </w:r>
+      <w:r>
+        <w:rPr>
+          <w:rFonts w:ascii="Times New Roman" w:hAnsi="Times New Roman" w:cs="Times New Roman" w:eastAsia="Times New Roman"/>
+        </w:rPr>
+        <w:t xml:space="preserve"> </w:t>
+      </w:r>
+      <w:r>
+        <w:rPr>
+          <w:rFonts w:ascii="Times New Roman" w:hAnsi="Times New Roman" w:cs="Times New Roman" w:eastAsia="Times New Roman"/>
+        </w:rPr>
+        <w:t xml:space="preserve">none</w:t>
+      </w:r>
+      <w:r>
+        <w:rPr>
+          <w:rFonts w:ascii="Times New Roman" w:hAnsi="Times New Roman" w:cs="Times New Roman" w:eastAsia="Times New Roman"/>
+        </w:rPr>
+        <w:t xml:space="preserve"> </w:t>
+      </w:r>
+      <w:r>
+        <w:rPr>
+          <w:rFonts w:ascii="Times New Roman" w:hAnsi="Times New Roman" w:cs="Times New Roman" w:eastAsia="Times New Roman"/>
+        </w:rPr>
+        <w:t xml:space="preserve">of</w:t>
+      </w:r>
+      <w:r>
+        <w:rPr>
+          <w:rFonts w:ascii="Times New Roman" w:hAnsi="Times New Roman" w:cs="Times New Roman" w:eastAsia="Times New Roman"/>
+        </w:rPr>
+        <w:t xml:space="preserve"> </w:t>
+      </w:r>
+      <w:r>
+        <w:rPr>
+          <w:rFonts w:ascii="Times New Roman" w:hAnsi="Times New Roman" w:cs="Times New Roman" w:eastAsia="Times New Roman"/>
+        </w:rPr>
+        <w:t xml:space="preserve">1,800</w:t>
+      </w:r>
+      <w:r>
+        <w:rPr>
+          <w:rFonts w:ascii="Times New Roman" w:hAnsi="Times New Roman" w:cs="Times New Roman" w:eastAsia="Times New Roman"/>
+        </w:rPr>
+        <w:t xml:space="preserve"> </w:t>
+      </w:r>
+      <w:r>
+        <w:rPr>
+          <w:rFonts w:ascii="Times New Roman" w:hAnsi="Times New Roman" w:cs="Times New Roman" w:eastAsia="Times New Roman"/>
+        </w:rPr>
+        <w:t xml:space="preserve">fabricated</w:t>
+      </w:r>
+      <w:r>
+        <w:rPr>
+          <w:rFonts w:ascii="Times New Roman" w:hAnsi="Times New Roman" w:cs="Times New Roman" w:eastAsia="Times New Roman"/>
+        </w:rPr>
+        <w:t xml:space="preserve"> </w:t>
+      </w:r>
+      <w:r>
+        <w:rPr>
+          <w:rFonts w:ascii="Times New Roman" w:hAnsi="Times New Roman" w:cs="Times New Roman" w:eastAsia="Times New Roman"/>
+        </w:rPr>
+        <w:t xml:space="preserve">claims.</w:t>
+      </w:r>
+      <w:r>
+        <w:rPr>
+          <w:rFonts w:ascii="Times New Roman" w:hAnsi="Times New Roman" w:cs="Times New Roman" w:eastAsia="Times New Roman"/>
+        </w:rPr>
+        <w:t xml:space="preserve"> </w:t>
+      </w:r>
+      <w:r>
+        <w:rPr>
+          <w:rFonts w:ascii="Times New Roman" w:hAnsi="Times New Roman" w:cs="Times New Roman" w:eastAsia="Times New Roman"/>
+        </w:rPr>
+        <w:t xml:space="preserve">For</w:t>
+      </w:r>
+      <w:r>
+        <w:rPr>
+          <w:rFonts w:ascii="Times New Roman" w:hAnsi="Times New Roman" w:cs="Times New Roman" w:eastAsia="Times New Roman"/>
+        </w:rPr>
+        <w:t xml:space="preserve"> </w:t>
+      </w:r>
+      <w:r>
+        <w:rPr>
+          <w:rFonts w:ascii="Times New Roman" w:hAnsi="Times New Roman" w:cs="Times New Roman" w:eastAsia="Times New Roman"/>
+        </w:rPr>
+        <w:t xml:space="preserve">machine</w:t>
+      </w:r>
+      <w:r>
+        <w:rPr>
+          <w:rFonts w:ascii="Times New Roman" w:hAnsi="Times New Roman" w:cs="Times New Roman" w:eastAsia="Times New Roman"/>
+        </w:rPr>
+        <w:t xml:space="preserve"> </w:t>
+      </w:r>
+      <w:r>
+        <w:rPr>
+          <w:rFonts w:ascii="Times New Roman" w:hAnsi="Times New Roman" w:cs="Times New Roman" w:eastAsia="Times New Roman"/>
+        </w:rPr>
+        <w:t xml:space="preserve">learning</w:t>
+      </w:r>
+      <w:r>
+        <w:rPr>
+          <w:rFonts w:ascii="Times New Roman" w:hAnsi="Times New Roman" w:cs="Times New Roman" w:eastAsia="Times New Roman"/>
+        </w:rPr>
+        <w:t xml:space="preserve"> </w:t>
+      </w:r>
+      <w:r>
+        <w:rPr>
+          <w:rFonts w:ascii="Times New Roman" w:hAnsi="Times New Roman" w:cs="Times New Roman" w:eastAsia="Times New Roman"/>
+        </w:rPr>
+        <w:t xml:space="preserve">we</w:t>
+      </w:r>
+      <w:r>
+        <w:rPr>
+          <w:rFonts w:ascii="Times New Roman" w:hAnsi="Times New Roman" w:cs="Times New Roman" w:eastAsia="Times New Roman"/>
+        </w:rPr>
+        <w:t xml:space="preserve"> </w:t>
+      </w:r>
+      <w:r>
+        <w:rPr>
+          <w:rFonts w:ascii="Times New Roman" w:hAnsi="Times New Roman" w:cs="Times New Roman" w:eastAsia="Times New Roman"/>
+        </w:rPr>
+        <w:t xml:space="preserve">compare</w:t>
+      </w:r>
+      <w:r>
+        <w:rPr>
+          <w:rFonts w:ascii="Times New Roman" w:hAnsi="Times New Roman" w:cs="Times New Roman" w:eastAsia="Times New Roman"/>
+        </w:rPr>
+        <w:t xml:space="preserve"> </w:t>
+      </w:r>
+      <w:r>
+        <w:rPr>
+          <w:rFonts w:ascii="Times New Roman" w:hAnsi="Times New Roman" w:cs="Times New Roman" w:eastAsia="Times New Roman"/>
+        </w:rPr>
+        <w:t xml:space="preserve">nine</w:t>
+      </w:r>
+      <w:r>
+        <w:rPr>
+          <w:rFonts w:ascii="Times New Roman" w:hAnsi="Times New Roman" w:cs="Times New Roman" w:eastAsia="Times New Roman"/>
+        </w:rPr>
+        <w:t xml:space="preserve"> </w:t>
+      </w:r>
+      <w:r>
+        <w:rPr>
+          <w:rFonts w:ascii="Times New Roman" w:hAnsi="Times New Roman" w:cs="Times New Roman" w:eastAsia="Times New Roman"/>
+        </w:rPr>
+        <w:t xml:space="preserve">classifiers</w:t>
+      </w:r>
+      <w:r>
+        <w:rPr>
+          <w:rFonts w:ascii="Times New Roman" w:hAnsi="Times New Roman" w:cs="Times New Roman" w:eastAsia="Times New Roman"/>
+        </w:rPr>
+        <w:t xml:space="preserve"> </w:t>
+      </w:r>
+      <w:r>
+        <w:rPr>
+          <w:rFonts w:ascii="Times New Roman" w:hAnsi="Times New Roman" w:cs="Times New Roman" w:eastAsia="Times New Roman"/>
+        </w:rPr>
+        <w:t xml:space="preserve">under</w:t>
+      </w:r>
+      <w:r>
+        <w:rPr>
+          <w:rFonts w:ascii="Times New Roman" w:hAnsi="Times New Roman" w:cs="Times New Roman" w:eastAsia="Times New Roman"/>
+        </w:rPr>
+        <w:t xml:space="preserve"> </w:t>
+      </w:r>
+      <w:r>
+        <w:rPr>
+          <w:rFonts w:ascii="Times New Roman" w:hAnsi="Times New Roman" w:cs="Times New Roman" w:eastAsia="Times New Roman"/>
+        </w:rPr>
+        <w:t xml:space="preserve">grouped</w:t>
+      </w:r>
+      <w:r>
+        <w:rPr>
+          <w:rFonts w:ascii="Times New Roman" w:hAnsi="Times New Roman" w:cs="Times New Roman" w:eastAsia="Times New Roman"/>
+        </w:rPr>
+        <w:t xml:space="preserve"> </w:t>
+      </w:r>
+      <w:r>
+        <w:rPr>
+          <w:rFonts w:ascii="Times New Roman" w:hAnsi="Times New Roman" w:cs="Times New Roman" w:eastAsia="Times New Roman"/>
+        </w:rPr>
+        <w:t xml:space="preserve">cross-validation</w:t>
+      </w:r>
+      <w:r>
+        <w:rPr>
+          <w:rFonts w:ascii="Times New Roman" w:hAnsi="Times New Roman" w:cs="Times New Roman" w:eastAsia="Times New Roman"/>
+        </w:rPr>
+        <w:t xml:space="preserve"> </w:t>
+      </w:r>
+      <w:r>
+        <w:rPr>
+          <w:rFonts w:ascii="Times New Roman" w:hAnsi="Times New Roman" w:cs="Times New Roman" w:eastAsia="Times New Roman"/>
+        </w:rPr>
+        <w:t xml:space="preserve">with</w:t>
+      </w:r>
+      <w:r>
+        <w:rPr>
+          <w:rFonts w:ascii="Times New Roman" w:hAnsi="Times New Roman" w:cs="Times New Roman" w:eastAsia="Times New Roman"/>
+        </w:rPr>
+        <w:t xml:space="preserve"> </w:t>
+      </w:r>
+      <w:r>
+        <w:rPr>
+          <w:rFonts w:ascii="Times New Roman" w:hAnsi="Times New Roman" w:cs="Times New Roman" w:eastAsia="Times New Roman"/>
+        </w:rPr>
+        <w:t xml:space="preserve">significance</w:t>
+      </w:r>
+      <w:r>
+        <w:rPr>
+          <w:rFonts w:ascii="Times New Roman" w:hAnsi="Times New Roman" w:cs="Times New Roman" w:eastAsia="Times New Roman"/>
+        </w:rPr>
+        <w:t xml:space="preserve"> </w:t>
+      </w:r>
+      <w:r>
+        <w:rPr>
+          <w:rFonts w:ascii="Times New Roman" w:hAnsi="Times New Roman" w:cs="Times New Roman" w:eastAsia="Times New Roman"/>
+        </w:rPr>
+        <w:t xml:space="preserve">testing</w:t>
+      </w:r>
+      <w:r>
+        <w:rPr>
+          <w:rFonts w:ascii="Times New Roman" w:hAnsi="Times New Roman" w:cs="Times New Roman" w:eastAsia="Times New Roman"/>
+        </w:rPr>
+        <w:t xml:space="preserve"> </w:t>
+      </w:r>
+      <w:r>
+        <w:rPr>
+          <w:rFonts w:ascii="Times New Roman" w:hAnsi="Times New Roman" w:cs="Times New Roman" w:eastAsia="Times New Roman"/>
+        </w:rPr>
+        <w:t xml:space="preserve">and</w:t>
+      </w:r>
+      <w:r>
+        <w:rPr>
+          <w:rFonts w:ascii="Times New Roman" w:hAnsi="Times New Roman" w:cs="Times New Roman" w:eastAsia="Times New Roman"/>
+        </w:rPr>
+        <w:t xml:space="preserve"> </w:t>
+      </w:r>
+      <w:r>
+        <w:rPr>
+          <w:rFonts w:ascii="Times New Roman" w:hAnsi="Times New Roman" w:cs="Times New Roman" w:eastAsia="Times New Roman"/>
+        </w:rPr>
+        <w:t xml:space="preserve">introduce</w:t>
+      </w:r>
+      <w:r>
+        <w:rPr>
+          <w:rFonts w:ascii="Times New Roman" w:hAnsi="Times New Roman" w:cs="Times New Roman" w:eastAsia="Times New Roman"/>
+        </w:rPr>
+        <w:t xml:space="preserve"> </w:t>
+      </w:r>
+      <w:r>
+        <w:rPr>
+          <w:rFonts w:ascii="Times New Roman" w:hAnsi="Times New Roman" w:cs="Times New Roman" w:eastAsia="Times New Roman"/>
+        </w:rPr>
+        <w:t xml:space="preserve">a</w:t>
+      </w:r>
+      <w:r>
+        <w:rPr>
+          <w:rFonts w:ascii="Times New Roman" w:hAnsi="Times New Roman" w:cs="Times New Roman" w:eastAsia="Times New Roman"/>
+        </w:rPr>
+        <w:t xml:space="preserve"> </w:t>
+      </w:r>
+      <w:r>
+        <w:rPr>
+          <w:rFonts w:ascii="Times New Roman" w:hAnsi="Times New Roman" w:cs="Times New Roman" w:eastAsia="Times New Roman"/>
+        </w:rPr>
+        <w:t xml:space="preserve">within-query</w:t>
+      </w:r>
+      <w:r>
+        <w:rPr>
+          <w:rFonts w:ascii="Times New Roman" w:hAnsi="Times New Roman" w:cs="Times New Roman" w:eastAsia="Times New Roman"/>
+        </w:rPr>
+        <w:t xml:space="preserve"> </w:t>
+      </w:r>
+      <w:r>
+        <w:rPr>
+          <w:rFonts w:ascii="Times New Roman" w:hAnsi="Times New Roman" w:cs="Times New Roman" w:eastAsia="Times New Roman"/>
+        </w:rPr>
+        <w:t xml:space="preserve">diagnostic</w:t>
+      </w:r>
+      <w:r>
+        <w:rPr>
+          <w:rFonts w:ascii="Times New Roman" w:hAnsi="Times New Roman" w:cs="Times New Roman" w:eastAsia="Times New Roman"/>
+        </w:rPr>
+        <w:t xml:space="preserve"> </w:t>
+      </w:r>
+      <w:r>
+        <w:rPr>
+          <w:rFonts w:ascii="Times New Roman" w:hAnsi="Times New Roman" w:cs="Times New Roman" w:eastAsia="Times New Roman"/>
+        </w:rPr>
+        <w:t xml:space="preserve">that</w:t>
+      </w:r>
+      <w:r>
+        <w:rPr>
+          <w:rFonts w:ascii="Times New Roman" w:hAnsi="Times New Roman" w:cs="Times New Roman" w:eastAsia="Times New Roman"/>
+        </w:rPr>
+        <w:t xml:space="preserve"> </w:t>
+      </w:r>
+      <w:r>
+        <w:rPr>
+          <w:rFonts w:ascii="Times New Roman" w:hAnsi="Times New Roman" w:cs="Times New Roman" w:eastAsia="Times New Roman"/>
+        </w:rPr>
+        <w:t xml:space="preserve">separates</w:t>
+      </w:r>
+      <w:r>
+        <w:rPr>
+          <w:rFonts w:ascii="Times New Roman" w:hAnsi="Times New Roman" w:cs="Times New Roman" w:eastAsia="Times New Roman"/>
+        </w:rPr>
+        <w:t xml:space="preserve"> </w:t>
+      </w:r>
+      <w:r>
+        <w:rPr>
+          <w:rFonts w:ascii="Times New Roman" w:hAnsi="Times New Roman" w:cs="Times New Roman" w:eastAsia="Times New Roman"/>
+        </w:rPr>
+        <w:t xml:space="preserve">matching</w:t>
+      </w:r>
+      <w:r>
+        <w:rPr>
+          <w:rFonts w:ascii="Times New Roman" w:hAnsi="Times New Roman" w:cs="Times New Roman" w:eastAsia="Times New Roman"/>
+        </w:rPr>
+        <w:t xml:space="preserve"> </w:t>
+      </w:r>
+      <w:r>
+        <w:rPr>
+          <w:rFonts w:ascii="Times New Roman" w:hAnsi="Times New Roman" w:cs="Times New Roman" w:eastAsia="Times New Roman"/>
+        </w:rPr>
+        <w:t xml:space="preserve">ability</w:t>
+      </w:r>
+      <w:r>
+        <w:rPr>
+          <w:rFonts w:ascii="Times New Roman" w:hAnsi="Times New Roman" w:cs="Times New Roman" w:eastAsia="Times New Roman"/>
+        </w:rPr>
+        <w:t xml:space="preserve"> </w:t>
+      </w:r>
+      <w:r>
+        <w:rPr>
+          <w:rFonts w:ascii="Times New Roman" w:hAnsi="Times New Roman" w:cs="Times New Roman" w:eastAsia="Times New Roman"/>
+        </w:rPr>
+        <w:t xml:space="preserve">from</w:t>
+      </w:r>
+      <w:r>
+        <w:rPr>
+          <w:rFonts w:ascii="Times New Roman" w:hAnsi="Times New Roman" w:cs="Times New Roman" w:eastAsia="Times New Roman"/>
+        </w:rPr>
+        <w:t xml:space="preserve"> </w:t>
+      </w:r>
+      <w:r>
+        <w:rPr>
+          <w:rFonts w:ascii="Times New Roman" w:hAnsi="Times New Roman" w:cs="Times New Roman" w:eastAsia="Times New Roman"/>
+        </w:rPr>
+        <w:t xml:space="preserve">candidate-level</w:t>
+      </w:r>
+      <w:r>
+        <w:rPr>
+          <w:rFonts w:ascii="Times New Roman" w:hAnsi="Times New Roman" w:cs="Times New Roman" w:eastAsia="Times New Roman"/>
+        </w:rPr>
+        <w:t xml:space="preserve"> </w:t>
+      </w:r>
+      <w:r>
+        <w:rPr>
+          <w:rFonts w:ascii="Times New Roman" w:hAnsi="Times New Roman" w:cs="Times New Roman" w:eastAsia="Times New Roman"/>
+        </w:rPr>
+        <w:t xml:space="preserve">quality.</w:t>
+      </w:r>
+      <w:r>
+        <w:rPr>
+          <w:rFonts w:ascii="Times New Roman" w:hAnsi="Times New Roman" w:cs="Times New Roman" w:eastAsia="Times New Roman"/>
+        </w:rPr>
+        <w:t xml:space="preserve"> </w:t>
+      </w:r>
+      <w:r>
+        <w:rPr>
+          <w:rFonts w:ascii="Times New Roman" w:hAnsi="Times New Roman" w:cs="Times New Roman" w:eastAsia="Times New Roman"/>
+        </w:rPr>
+        <w:t xml:space="preserve">For</w:t>
+      </w:r>
+      <w:r>
+        <w:rPr>
+          <w:rFonts w:ascii="Times New Roman" w:hAnsi="Times New Roman" w:cs="Times New Roman" w:eastAsia="Times New Roman"/>
+        </w:rPr>
+        <w:t xml:space="preserve"> </w:t>
+      </w:r>
+      <w:r>
+        <w:rPr>
+          <w:rFonts w:ascii="Times New Roman" w:hAnsi="Times New Roman" w:cs="Times New Roman" w:eastAsia="Times New Roman"/>
+        </w:rPr>
+        <w:t xml:space="preserve">deep</w:t>
+      </w:r>
+      <w:r>
+        <w:rPr>
+          <w:rFonts w:ascii="Times New Roman" w:hAnsi="Times New Roman" w:cs="Times New Roman" w:eastAsia="Times New Roman"/>
+        </w:rPr>
+        <w:t xml:space="preserve"> </w:t>
+      </w:r>
+      <w:r>
+        <w:rPr>
+          <w:rFonts w:ascii="Times New Roman" w:hAnsi="Times New Roman" w:cs="Times New Roman" w:eastAsia="Times New Roman"/>
+        </w:rPr>
+        <w:t xml:space="preserve">learning</w:t>
+      </w:r>
+      <w:r>
+        <w:rPr>
+          <w:rFonts w:ascii="Times New Roman" w:hAnsi="Times New Roman" w:cs="Times New Roman" w:eastAsia="Times New Roman"/>
+        </w:rPr>
+        <w:t xml:space="preserve"> </w:t>
+      </w:r>
+      <w:r>
+        <w:rPr>
+          <w:rFonts w:ascii="Times New Roman" w:hAnsi="Times New Roman" w:cs="Times New Roman" w:eastAsia="Times New Roman"/>
+        </w:rPr>
+        <w:t xml:space="preserve">we</w:t>
+      </w:r>
+      <w:r>
+        <w:rPr>
+          <w:rFonts w:ascii="Times New Roman" w:hAnsi="Times New Roman" w:cs="Times New Roman" w:eastAsia="Times New Roman"/>
+        </w:rPr>
+        <w:t xml:space="preserve"> </w:t>
+      </w:r>
+      <w:r>
+        <w:rPr>
+          <w:rFonts w:ascii="Times New Roman" w:hAnsi="Times New Roman" w:cs="Times New Roman" w:eastAsia="Times New Roman"/>
+        </w:rPr>
+        <w:t xml:space="preserve">show</w:t>
+      </w:r>
+      <w:r>
+        <w:rPr>
+          <w:rFonts w:ascii="Times New Roman" w:hAnsi="Times New Roman" w:cs="Times New Roman" w:eastAsia="Times New Roman"/>
+        </w:rPr>
+        <w:t xml:space="preserve"> </w:t>
+      </w:r>
+      <w:r>
+        <w:rPr>
+          <w:rFonts w:ascii="Times New Roman" w:hAnsi="Times New Roman" w:cs="Times New Roman" w:eastAsia="Times New Roman"/>
+        </w:rPr>
+        <w:t xml:space="preserve">that</w:t>
+      </w:r>
+      <w:r>
+        <w:rPr>
+          <w:rFonts w:ascii="Times New Roman" w:hAnsi="Times New Roman" w:cs="Times New Roman" w:eastAsia="Times New Roman"/>
+        </w:rPr>
+        <w:t xml:space="preserve"> </w:t>
+      </w:r>
+      <w:r>
+        <w:rPr>
+          <w:rFonts w:ascii="Times New Roman" w:hAnsi="Times New Roman" w:cs="Times New Roman" w:eastAsia="Times New Roman"/>
+        </w:rPr>
+        <w:t xml:space="preserve">a</w:t>
+      </w:r>
+      <w:r>
+        <w:rPr>
+          <w:rFonts w:ascii="Times New Roman" w:hAnsi="Times New Roman" w:cs="Times New Roman" w:eastAsia="Times New Roman"/>
+        </w:rPr>
+        <w:t xml:space="preserve"> </w:t>
+      </w:r>
+      <w:r>
+        <w:rPr>
+          <w:rFonts w:ascii="Times New Roman" w:hAnsi="Times New Roman" w:cs="Times New Roman" w:eastAsia="Times New Roman"/>
+        </w:rPr>
+        <w:t xml:space="preserve">plausible</w:t>
+      </w:r>
+      <w:r>
+        <w:rPr>
+          <w:rFonts w:ascii="Times New Roman" w:hAnsi="Times New Roman" w:cs="Times New Roman" w:eastAsia="Times New Roman"/>
+        </w:rPr>
+        <w:t xml:space="preserve"> </w:t>
+      </w:r>
+      <w:r>
+        <w:rPr>
+          <w:rFonts w:ascii="Times New Roman" w:hAnsi="Times New Roman" w:cs="Times New Roman" w:eastAsia="Times New Roman"/>
+        </w:rPr>
+        <w:t xml:space="preserve">authored</w:t>
+      </w:r>
+      <w:r>
+        <w:rPr>
+          <w:rFonts w:ascii="Times New Roman" w:hAnsi="Times New Roman" w:cs="Times New Roman" w:eastAsia="Times New Roman"/>
+        </w:rPr>
+        <w:t xml:space="preserve"> </w:t>
+      </w:r>
+      <w:r>
+        <w:rPr>
+          <w:rFonts w:ascii="Times New Roman" w:hAnsi="Times New Roman" w:cs="Times New Roman" w:eastAsia="Times New Roman"/>
+        </w:rPr>
+        <w:t xml:space="preserve">face-similarity</w:t>
+      </w:r>
+      <w:r>
+        <w:rPr>
+          <w:rFonts w:ascii="Times New Roman" w:hAnsi="Times New Roman" w:cs="Times New Roman" w:eastAsia="Times New Roman"/>
+        </w:rPr>
+        <w:t xml:space="preserve"> </w:t>
+      </w:r>
+      <w:r>
+        <w:rPr>
+          <w:rFonts w:ascii="Times New Roman" w:hAnsi="Times New Roman" w:cs="Times New Roman" w:eastAsia="Times New Roman"/>
+        </w:rPr>
+        <w:t xml:space="preserve">threshold</w:t>
+      </w:r>
+      <w:r>
+        <w:rPr>
+          <w:rFonts w:ascii="Times New Roman" w:hAnsi="Times New Roman" w:cs="Times New Roman" w:eastAsia="Times New Roman"/>
+        </w:rPr>
+        <w:t xml:space="preserve"> </w:t>
+      </w:r>
+      <w:r>
+        <w:rPr>
+          <w:rFonts w:ascii="Times New Roman" w:hAnsi="Times New Roman" w:cs="Times New Roman" w:eastAsia="Times New Roman"/>
+        </w:rPr>
+        <w:t xml:space="preserve">of</w:t>
+      </w:r>
+      <w:r>
+        <w:rPr>
+          <w:rFonts w:ascii="Times New Roman" w:hAnsi="Times New Roman" w:cs="Times New Roman" w:eastAsia="Times New Roman"/>
+        </w:rPr>
+        <w:t xml:space="preserve"> </w:t>
+      </w:r>
+      <w:r>
+        <w:rPr>
+          <w:rFonts w:ascii="Times New Roman" w:hAnsi="Times New Roman" w:cs="Times New Roman" w:eastAsia="Times New Roman"/>
+        </w:rPr>
+        <w:t xml:space="preserve">0.50</w:t>
+      </w:r>
+      <w:r>
+        <w:rPr>
+          <w:rFonts w:ascii="Times New Roman" w:hAnsi="Times New Roman" w:cs="Times New Roman" w:eastAsia="Times New Roman"/>
+        </w:rPr>
+        <w:t xml:space="preserve"> </w:t>
+      </w:r>
+      <w:r>
+        <w:rPr>
+          <w:rFonts w:ascii="Times New Roman" w:hAnsi="Times New Roman" w:cs="Times New Roman" w:eastAsia="Times New Roman"/>
+        </w:rPr>
+        <w:t xml:space="preserve">would</w:t>
+      </w:r>
+      <w:r>
+        <w:rPr>
+          <w:rFonts w:ascii="Times New Roman" w:hAnsi="Times New Roman" w:cs="Times New Roman" w:eastAsia="Times New Roman"/>
+        </w:rPr>
+        <w:t xml:space="preserve"> </w:t>
+      </w:r>
+      <w:r>
+        <w:rPr>
+          <w:rFonts w:ascii="Times New Roman" w:hAnsi="Times New Roman" w:cs="Times New Roman" w:eastAsia="Times New Roman"/>
+        </w:rPr>
+        <w:t xml:space="preserve">have</w:t>
+      </w:r>
+      <w:r>
+        <w:rPr>
+          <w:rFonts w:ascii="Times New Roman" w:hAnsi="Times New Roman" w:cs="Times New Roman" w:eastAsia="Times New Roman"/>
+        </w:rPr>
+        <w:t xml:space="preserve"> </w:t>
+      </w:r>
+      <w:r>
+        <w:rPr>
+          <w:rFonts w:ascii="Times New Roman" w:hAnsi="Times New Roman" w:cs="Times New Roman" w:eastAsia="Times New Roman"/>
+        </w:rPr>
+        <w:t xml:space="preserve">falsely</w:t>
+      </w:r>
+      <w:r>
+        <w:rPr>
+          <w:rFonts w:ascii="Times New Roman" w:hAnsi="Times New Roman" w:cs="Times New Roman" w:eastAsia="Times New Roman"/>
+        </w:rPr>
+        <w:t xml:space="preserve"> </w:t>
+      </w:r>
+      <w:r>
+        <w:rPr>
+          <w:rFonts w:ascii="Times New Roman" w:hAnsi="Times New Roman" w:cs="Times New Roman" w:eastAsia="Times New Roman"/>
+        </w:rPr>
+        <w:t xml:space="preserve">rejected</w:t>
+      </w:r>
+      <w:r>
+        <w:rPr>
+          <w:rFonts w:ascii="Times New Roman" w:hAnsi="Times New Roman" w:cs="Times New Roman" w:eastAsia="Times New Roman"/>
+        </w:rPr>
+        <w:t xml:space="preserve"> </w:t>
+      </w:r>
+      <w:r>
+        <w:rPr>
+          <w:rFonts w:ascii="Times New Roman" w:hAnsi="Times New Roman" w:cs="Times New Roman" w:eastAsia="Times New Roman"/>
+        </w:rPr>
+        <w:t xml:space="preserve">41.4%</w:t>
+      </w:r>
+      <w:r>
+        <w:rPr>
+          <w:rFonts w:ascii="Times New Roman" w:hAnsi="Times New Roman" w:cs="Times New Roman" w:eastAsia="Times New Roman"/>
+        </w:rPr>
+        <w:t xml:space="preserve"> </w:t>
+      </w:r>
+      <w:r>
+        <w:rPr>
+          <w:rFonts w:ascii="Times New Roman" w:hAnsi="Times New Roman" w:cs="Times New Roman" w:eastAsia="Times New Roman"/>
+        </w:rPr>
+        <w:t xml:space="preserve">of</w:t>
+      </w:r>
+      <w:r>
+        <w:rPr>
+          <w:rFonts w:ascii="Times New Roman" w:hAnsi="Times New Roman" w:cs="Times New Roman" w:eastAsia="Times New Roman"/>
+        </w:rPr>
+        <w:t xml:space="preserve"> </w:t>
+      </w:r>
+      <w:r>
+        <w:rPr>
+          <w:rFonts w:ascii="Times New Roman" w:hAnsi="Times New Roman" w:cs="Times New Roman" w:eastAsia="Times New Roman"/>
+        </w:rPr>
+        <w:t xml:space="preserve">genuine</w:t>
+      </w:r>
+      <w:r>
+        <w:rPr>
+          <w:rFonts w:ascii="Times New Roman" w:hAnsi="Times New Roman" w:cs="Times New Roman" w:eastAsia="Times New Roman"/>
+        </w:rPr>
+        <w:t xml:space="preserve"> </w:t>
+      </w:r>
+      <w:r>
+        <w:rPr>
+          <w:rFonts w:ascii="Times New Roman" w:hAnsi="Times New Roman" w:cs="Times New Roman" w:eastAsia="Times New Roman"/>
+        </w:rPr>
+        <w:t xml:space="preserve">identity</w:t>
+      </w:r>
+      <w:r>
+        <w:rPr>
+          <w:rFonts w:ascii="Times New Roman" w:hAnsi="Times New Roman" w:cs="Times New Roman" w:eastAsia="Times New Roman"/>
+        </w:rPr>
+        <w:t xml:space="preserve"> </w:t>
+      </w:r>
+      <w:r>
+        <w:rPr>
+          <w:rFonts w:ascii="Times New Roman" w:hAnsi="Times New Roman" w:cs="Times New Roman" w:eastAsia="Times New Roman"/>
+        </w:rPr>
+        <w:t xml:space="preserve">matches,</w:t>
+      </w:r>
+      <w:r>
+        <w:rPr>
+          <w:rFonts w:ascii="Times New Roman" w:hAnsi="Times New Roman" w:cs="Times New Roman" w:eastAsia="Times New Roman"/>
+        </w:rPr>
+        <w:t xml:space="preserve"> </w:t>
+      </w:r>
+      <w:r>
+        <w:rPr>
+          <w:rFonts w:ascii="Times New Roman" w:hAnsi="Times New Roman" w:cs="Times New Roman" w:eastAsia="Times New Roman"/>
+        </w:rPr>
+        <w:t xml:space="preserve">against</w:t>
+      </w:r>
+      <w:r>
+        <w:rPr>
+          <w:rFonts w:ascii="Times New Roman" w:hAnsi="Times New Roman" w:cs="Times New Roman" w:eastAsia="Times New Roman"/>
+        </w:rPr>
+        <w:t xml:space="preserve"> </w:t>
+      </w:r>
+      <w:r>
+        <w:rPr>
+          <w:rFonts w:ascii="Times New Roman" w:hAnsi="Times New Roman" w:cs="Times New Roman" w:eastAsia="Times New Roman"/>
+        </w:rPr>
+        <w:t xml:space="preserve">3.4%</w:t>
+      </w:r>
+      <w:r>
+        <w:rPr>
+          <w:rFonts w:ascii="Times New Roman" w:hAnsi="Times New Roman" w:cs="Times New Roman" w:eastAsia="Times New Roman"/>
+        </w:rPr>
+        <w:t xml:space="preserve"> </w:t>
+      </w:r>
+      <w:r>
+        <w:rPr>
+          <w:rFonts w:ascii="Times New Roman" w:hAnsi="Times New Roman" w:cs="Times New Roman" w:eastAsia="Times New Roman"/>
+        </w:rPr>
+        <w:t xml:space="preserve">at</w:t>
+      </w:r>
+      <w:r>
+        <w:rPr>
+          <w:rFonts w:ascii="Times New Roman" w:hAnsi="Times New Roman" w:cs="Times New Roman" w:eastAsia="Times New Roman"/>
+        </w:rPr>
+        <w:t xml:space="preserve"> </w:t>
+      </w:r>
+      <w:r>
+        <w:rPr>
+          <w:rFonts w:ascii="Times New Roman" w:hAnsi="Times New Roman" w:cs="Times New Roman" w:eastAsia="Times New Roman"/>
+        </w:rPr>
+        <w:t xml:space="preserve">a</w:t>
+      </w:r>
+      <w:r>
+        <w:rPr>
+          <w:rFonts w:ascii="Times New Roman" w:hAnsi="Times New Roman" w:cs="Times New Roman" w:eastAsia="Times New Roman"/>
+        </w:rPr>
+        <w:t xml:space="preserve"> </w:t>
+      </w:r>
+      <w:r>
+        <w:rPr>
+          <w:rFonts w:ascii="Times New Roman" w:hAnsi="Times New Roman" w:cs="Times New Roman" w:eastAsia="Times New Roman"/>
+        </w:rPr>
+        <w:t xml:space="preserve">threshold</w:t>
+      </w:r>
+      <w:r>
+        <w:rPr>
+          <w:rFonts w:ascii="Times New Roman" w:hAnsi="Times New Roman" w:cs="Times New Roman" w:eastAsia="Times New Roman"/>
+        </w:rPr>
+        <w:t xml:space="preserve"> </w:t>
+      </w:r>
+      <w:r>
+        <w:rPr>
+          <w:rFonts w:ascii="Times New Roman" w:hAnsi="Times New Roman" w:cs="Times New Roman" w:eastAsia="Times New Roman"/>
+        </w:rPr>
+        <w:t xml:space="preserve">calibrated</w:t>
+      </w:r>
+      <w:r>
+        <w:rPr>
+          <w:rFonts w:ascii="Times New Roman" w:hAnsi="Times New Roman" w:cs="Times New Roman" w:eastAsia="Times New Roman"/>
+        </w:rPr>
+        <w:t xml:space="preserve"> </w:t>
+      </w:r>
+      <w:r>
+        <w:rPr>
+          <w:rFonts w:ascii="Times New Roman" w:hAnsi="Times New Roman" w:cs="Times New Roman" w:eastAsia="Times New Roman"/>
+        </w:rPr>
+        <w:t xml:space="preserve">on</w:t>
+      </w:r>
+      <w:r>
+        <w:rPr>
+          <w:rFonts w:ascii="Times New Roman" w:hAnsi="Times New Roman" w:cs="Times New Roman" w:eastAsia="Times New Roman"/>
+        </w:rPr>
+        <w:t xml:space="preserve"> </w:t>
+      </w:r>
+      <w:r>
+        <w:rPr>
+          <w:rFonts w:ascii="Times New Roman" w:hAnsi="Times New Roman" w:cs="Times New Roman" w:eastAsia="Times New Roman"/>
+        </w:rPr>
+        <w:t xml:space="preserve">Labeled</w:t>
+      </w:r>
+      <w:r>
+        <w:rPr>
+          <w:rFonts w:ascii="Times New Roman" w:hAnsi="Times New Roman" w:cs="Times New Roman" w:eastAsia="Times New Roman"/>
+        </w:rPr>
+        <w:t xml:space="preserve"> </w:t>
+      </w:r>
+      <w:r>
+        <w:rPr>
+          <w:rFonts w:ascii="Times New Roman" w:hAnsi="Times New Roman" w:cs="Times New Roman" w:eastAsia="Times New Roman"/>
+        </w:rPr>
+        <w:t xml:space="preserve">Faces</w:t>
+      </w:r>
+      <w:r>
+        <w:rPr>
+          <w:rFonts w:ascii="Times New Roman" w:hAnsi="Times New Roman" w:cs="Times New Roman" w:eastAsia="Times New Roman"/>
+        </w:rPr>
+        <w:t xml:space="preserve"> </w:t>
+      </w:r>
+      <w:r>
+        <w:rPr>
+          <w:rFonts w:ascii="Times New Roman" w:hAnsi="Times New Roman" w:cs="Times New Roman" w:eastAsia="Times New Roman"/>
+        </w:rPr>
+        <w:t xml:space="preserve">in</w:t>
       </w:r>
       <w:r>
         <w:rPr>
@@ -1018,1951 +2686,7 @@
         <w:rPr>
           <w:rFonts w:ascii="Times New Roman" w:hAnsi="Times New Roman" w:cs="Times New Roman" w:eastAsia="Times New Roman"/>
         </w:rPr>
-        <w:t xml:space="preserve">Illinois</w:t>
-      </w:r>
-      <w:r>
-        <w:rPr>
-          <w:rFonts w:ascii="Times New Roman" w:hAnsi="Times New Roman" w:cs="Times New Roman" w:eastAsia="Times New Roman"/>
-        </w:rPr>
-        <w:t xml:space="preserve"> </w:t>
-      </w:r>
-      <w:r>
-        <w:rPr>
-          <w:rFonts w:ascii="Times New Roman" w:hAnsi="Times New Roman" w:cs="Times New Roman" w:eastAsia="Times New Roman"/>
-        </w:rPr>
-        <w:t xml:space="preserve">Human</w:t>
-      </w:r>
-      <w:r>
-        <w:rPr>
-          <w:rFonts w:ascii="Times New Roman" w:hAnsi="Times New Roman" w:cs="Times New Roman" w:eastAsia="Times New Roman"/>
-        </w:rPr>
-        <w:t xml:space="preserve"> </w:t>
-      </w:r>
-      <w:r>
-        <w:rPr>
-          <w:rFonts w:ascii="Times New Roman" w:hAnsi="Times New Roman" w:cs="Times New Roman" w:eastAsia="Times New Roman"/>
-        </w:rPr>
-        <w:t xml:space="preserve">Rights</w:t>
-      </w:r>
-      <w:r>
-        <w:rPr>
-          <w:rFonts w:ascii="Times New Roman" w:hAnsi="Times New Roman" w:cs="Times New Roman" w:eastAsia="Times New Roman"/>
-        </w:rPr>
-        <w:t xml:space="preserve"> </w:t>
-      </w:r>
-      <w:r>
-        <w:rPr>
-          <w:rFonts w:ascii="Times New Roman" w:hAnsi="Times New Roman" w:cs="Times New Roman" w:eastAsia="Times New Roman"/>
-        </w:rPr>
-        <w:t xml:space="preserve">Act</w:t>
-      </w:r>
-      <w:r>
-        <w:rPr>
-          <w:rFonts w:ascii="Times New Roman" w:hAnsi="Times New Roman" w:cs="Times New Roman" w:eastAsia="Times New Roman"/>
-        </w:rPr>
-        <w:t xml:space="preserve"> </w:t>
-      </w:r>
-      <w:r>
-        <w:rPr>
-          <w:rFonts w:ascii="Times New Roman" w:hAnsi="Times New Roman" w:cs="Times New Roman" w:eastAsia="Times New Roman"/>
-        </w:rPr>
-        <w:t xml:space="preserve">as</w:t>
-      </w:r>
-      <w:r>
-        <w:rPr>
-          <w:rFonts w:ascii="Times New Roman" w:hAnsi="Times New Roman" w:cs="Times New Roman" w:eastAsia="Times New Roman"/>
-        </w:rPr>
-        <w:t xml:space="preserve"> </w:t>
-      </w:r>
-      <w:r>
-        <w:rPr>
-          <w:rFonts w:ascii="Times New Roman" w:hAnsi="Times New Roman" w:cs="Times New Roman" w:eastAsia="Times New Roman"/>
-        </w:rPr>
-        <w:t xml:space="preserve">amended</w:t>
-      </w:r>
-      <w:r>
-        <w:rPr>
-          <w:rFonts w:ascii="Times New Roman" w:hAnsi="Times New Roman" w:cs="Times New Roman" w:eastAsia="Times New Roman"/>
-        </w:rPr>
-        <w:t xml:space="preserve"> </w:t>
-      </w:r>
-      <w:r>
-        <w:rPr>
-          <w:rFonts w:ascii="Times New Roman" w:hAnsi="Times New Roman" w:cs="Times New Roman" w:eastAsia="Times New Roman"/>
-        </w:rPr>
-        <w:t xml:space="preserve">by</w:t>
-      </w:r>
-      <w:r>
-        <w:rPr>
-          <w:rFonts w:ascii="Times New Roman" w:hAnsi="Times New Roman" w:cs="Times New Roman" w:eastAsia="Times New Roman"/>
-        </w:rPr>
-        <w:t xml:space="preserve"> </w:t>
-      </w:r>
-      <w:r>
-        <w:rPr>
-          <w:rFonts w:ascii="Times New Roman" w:hAnsi="Times New Roman" w:cs="Times New Roman" w:eastAsia="Times New Roman"/>
-        </w:rPr>
-        <w:t xml:space="preserve">HB 3773,</w:t>
-      </w:r>
-      <w:r>
-        <w:rPr>
-          <w:rFonts w:ascii="Times New Roman" w:hAnsi="Times New Roman" w:cs="Times New Roman" w:eastAsia="Times New Roman"/>
-        </w:rPr>
-        <w:t xml:space="preserve"> </w:t>
-      </w:r>
-      <w:r>
-        <w:rPr>
-          <w:rFonts w:ascii="Times New Roman" w:hAnsi="Times New Roman" w:cs="Times New Roman" w:eastAsia="Times New Roman"/>
-        </w:rPr>
-        <w:t xml:space="preserve">and</w:t>
-      </w:r>
-      <w:r>
-        <w:rPr>
-          <w:rFonts w:ascii="Times New Roman" w:hAnsi="Times New Roman" w:cs="Times New Roman" w:eastAsia="Times New Roman"/>
-        </w:rPr>
-        <w:t xml:space="preserve"> </w:t>
-      </w:r>
-      <w:r>
-        <w:rPr>
-          <w:rFonts w:ascii="Times New Roman" w:hAnsi="Times New Roman" w:cs="Times New Roman" w:eastAsia="Times New Roman"/>
-        </w:rPr>
-        <w:t xml:space="preserve">the</w:t>
-      </w:r>
-      <w:r>
-        <w:rPr>
-          <w:rFonts w:ascii="Times New Roman" w:hAnsi="Times New Roman" w:cs="Times New Roman" w:eastAsia="Times New Roman"/>
-        </w:rPr>
-        <w:t xml:space="preserve"> </w:t>
-      </w:r>
-      <w:r>
-        <w:rPr>
-          <w:rFonts w:ascii="Times New Roman" w:hAnsi="Times New Roman" w:cs="Times New Roman" w:eastAsia="Times New Roman"/>
-        </w:rPr>
-        <w:t xml:space="preserve">EU</w:t>
-      </w:r>
-      <w:r>
-        <w:rPr>
-          <w:rFonts w:ascii="Times New Roman" w:hAnsi="Times New Roman" w:cs="Times New Roman" w:eastAsia="Times New Roman"/>
-        </w:rPr>
-        <w:t xml:space="preserve"> </w:t>
-      </w:r>
-      <w:r>
-        <w:rPr>
-          <w:rFonts w:ascii="Times New Roman" w:hAnsi="Times New Roman" w:cs="Times New Roman" w:eastAsia="Times New Roman"/>
-        </w:rPr>
-        <w:t xml:space="preserve">Artificial</w:t>
-      </w:r>
-      <w:r>
-        <w:rPr>
-          <w:rFonts w:ascii="Times New Roman" w:hAnsi="Times New Roman" w:cs="Times New Roman" w:eastAsia="Times New Roman"/>
-        </w:rPr>
-        <w:t xml:space="preserve"> </w:t>
-      </w:r>
-      <w:r>
-        <w:rPr>
-          <w:rFonts w:ascii="Times New Roman" w:hAnsi="Times New Roman" w:cs="Times New Roman" w:eastAsia="Times New Roman"/>
-        </w:rPr>
-        <w:t xml:space="preserve">Intelligence</w:t>
-      </w:r>
-      <w:r>
-        <w:rPr>
-          <w:rFonts w:ascii="Times New Roman" w:hAnsi="Times New Roman" w:cs="Times New Roman" w:eastAsia="Times New Roman"/>
-        </w:rPr>
-        <w:t xml:space="preserve"> </w:t>
-      </w:r>
-      <w:r>
-        <w:rPr>
-          <w:rFonts w:ascii="Times New Roman" w:hAnsi="Times New Roman" w:cs="Times New Roman" w:eastAsia="Times New Roman"/>
-        </w:rPr>
-        <w:t xml:space="preserve">Act.</w:t>
-      </w:r>
-      <w:r>
-        <w:rPr>
-          <w:rFonts w:ascii="Times New Roman" w:hAnsi="Times New Roman" w:cs="Times New Roman" w:eastAsia="Times New Roman"/>
-        </w:rPr>
-        <w:t xml:space="preserve"> </w:t>
-      </w:r>
-      <w:r>
-        <w:rPr>
-          <w:rFonts w:ascii="Times New Roman" w:hAnsi="Times New Roman" w:cs="Times New Roman" w:eastAsia="Times New Roman"/>
-        </w:rPr>
-        <w:t xml:space="preserve">We</w:t>
-      </w:r>
-      <w:r>
-        <w:rPr>
-          <w:rFonts w:ascii="Times New Roman" w:hAnsi="Times New Roman" w:cs="Times New Roman" w:eastAsia="Times New Roman"/>
-        </w:rPr>
-        <w:t xml:space="preserve"> </w:t>
-      </w:r>
-      <w:r>
-        <w:rPr>
-          <w:rFonts w:ascii="Times New Roman" w:hAnsi="Times New Roman" w:cs="Times New Roman" w:eastAsia="Times New Roman"/>
-        </w:rPr>
-        <w:t xml:space="preserve">present</w:t>
-      </w:r>
-      <w:r>
-        <w:rPr>
-          <w:rFonts w:ascii="Times New Roman" w:hAnsi="Times New Roman" w:cs="Times New Roman" w:eastAsia="Times New Roman"/>
-        </w:rPr>
-        <w:t xml:space="preserve"> </w:t>
-      </w:r>
-      <w:r>
-        <w:rPr>
-          <w:rFonts w:ascii="Times New Roman" w:hAnsi="Times New Roman" w:cs="Times New Roman" w:eastAsia="Times New Roman"/>
-        </w:rPr>
-        <w:t xml:space="preserve">CogniHire,</w:t>
-      </w:r>
-      <w:r>
-        <w:rPr>
-          <w:rFonts w:ascii="Times New Roman" w:hAnsi="Times New Roman" w:cs="Times New Roman" w:eastAsia="Times New Roman"/>
-        </w:rPr>
-        <w:t xml:space="preserve"> </w:t>
-      </w:r>
-      <w:r>
-        <w:rPr>
-          <w:rFonts w:ascii="Times New Roman" w:hAnsi="Times New Roman" w:cs="Times New Roman" w:eastAsia="Times New Roman"/>
-        </w:rPr>
-        <w:t xml:space="preserve">a</w:t>
-      </w:r>
-      <w:r>
-        <w:rPr>
-          <w:rFonts w:ascii="Times New Roman" w:hAnsi="Times New Roman" w:cs="Times New Roman" w:eastAsia="Times New Roman"/>
-        </w:rPr>
-        <w:t xml:space="preserve"> </w:t>
-      </w:r>
-      <w:r>
-        <w:rPr>
-          <w:rFonts w:ascii="Times New Roman" w:hAnsi="Times New Roman" w:cs="Times New Roman" w:eastAsia="Times New Roman"/>
-        </w:rPr>
-        <w:t xml:space="preserve">technical</w:t>
-      </w:r>
-      <w:r>
-        <w:rPr>
-          <w:rFonts w:ascii="Times New Roman" w:hAnsi="Times New Roman" w:cs="Times New Roman" w:eastAsia="Times New Roman"/>
-        </w:rPr>
-        <w:t xml:space="preserve"> </w:t>
-      </w:r>
-      <w:r>
-        <w:rPr>
-          <w:rFonts w:ascii="Times New Roman" w:hAnsi="Times New Roman" w:cs="Times New Roman" w:eastAsia="Times New Roman"/>
-        </w:rPr>
-        <w:t xml:space="preserve">screening</w:t>
-      </w:r>
-      <w:r>
-        <w:rPr>
-          <w:rFonts w:ascii="Times New Roman" w:hAnsi="Times New Roman" w:cs="Times New Roman" w:eastAsia="Times New Roman"/>
-        </w:rPr>
-        <w:t xml:space="preserve"> </w:t>
-      </w:r>
-      <w:r>
-        <w:rPr>
-          <w:rFonts w:ascii="Times New Roman" w:hAnsi="Times New Roman" w:cs="Times New Roman" w:eastAsia="Times New Roman"/>
-        </w:rPr>
-        <w:t xml:space="preserve">system</w:t>
-      </w:r>
-      <w:r>
-        <w:rPr>
-          <w:rFonts w:ascii="Times New Roman" w:hAnsi="Times New Roman" w:cs="Times New Roman" w:eastAsia="Times New Roman"/>
-        </w:rPr>
-        <w:t xml:space="preserve"> </w:t>
-      </w:r>
-      <w:r>
-        <w:rPr>
-          <w:rFonts w:ascii="Times New Roman" w:hAnsi="Times New Roman" w:cs="Times New Roman" w:eastAsia="Times New Roman"/>
-        </w:rPr>
-        <w:t xml:space="preserve">designed</w:t>
-      </w:r>
-      <w:r>
-        <w:rPr>
-          <w:rFonts w:ascii="Times New Roman" w:hAnsi="Times New Roman" w:cs="Times New Roman" w:eastAsia="Times New Roman"/>
-        </w:rPr>
-        <w:t xml:space="preserve"> </w:t>
-      </w:r>
-      <w:r>
-        <w:rPr>
-          <w:rFonts w:ascii="Times New Roman" w:hAnsi="Times New Roman" w:cs="Times New Roman" w:eastAsia="Times New Roman"/>
-        </w:rPr>
-        <w:t xml:space="preserve">to</w:t>
-      </w:r>
-      <w:r>
-        <w:rPr>
-          <w:rFonts w:ascii="Times New Roman" w:hAnsi="Times New Roman" w:cs="Times New Roman" w:eastAsia="Times New Roman"/>
-        </w:rPr>
-        <w:t xml:space="preserve"> </w:t>
-      </w:r>
-      <w:r>
-        <w:rPr>
-          <w:rFonts w:ascii="Times New Roman" w:hAnsi="Times New Roman" w:cs="Times New Roman" w:eastAsia="Times New Roman"/>
-        </w:rPr>
-        <w:t xml:space="preserve">audit</w:t>
-      </w:r>
-      <w:r>
-        <w:rPr>
-          <w:rFonts w:ascii="Times New Roman" w:hAnsi="Times New Roman" w:cs="Times New Roman" w:eastAsia="Times New Roman"/>
-        </w:rPr>
-        <w:t xml:space="preserve"> </w:t>
-      </w:r>
-      <w:r>
-        <w:rPr>
-          <w:rFonts w:ascii="Times New Roman" w:hAnsi="Times New Roman" w:cs="Times New Roman" w:eastAsia="Times New Roman"/>
-        </w:rPr>
-        <w:t xml:space="preserve">the</w:t>
-      </w:r>
-      <w:r>
-        <w:rPr>
-          <w:rFonts w:ascii="Times New Roman" w:hAnsi="Times New Roman" w:cs="Times New Roman" w:eastAsia="Times New Roman"/>
-        </w:rPr>
-        <w:t xml:space="preserve"> </w:t>
-      </w:r>
-      <w:r>
-        <w:rPr>
-          <w:rFonts w:ascii="Times New Roman" w:hAnsi="Times New Roman" w:cs="Times New Roman" w:eastAsia="Times New Roman"/>
-        </w:rPr>
-        <w:t xml:space="preserve">claims</w:t>
-      </w:r>
-      <w:r>
-        <w:rPr>
-          <w:rFonts w:ascii="Times New Roman" w:hAnsi="Times New Roman" w:cs="Times New Roman" w:eastAsia="Times New Roman"/>
-        </w:rPr>
-        <w:t xml:space="preserve"> </w:t>
-      </w:r>
-      <w:r>
-        <w:rPr>
-          <w:rFonts w:ascii="Times New Roman" w:hAnsi="Times New Roman" w:cs="Times New Roman" w:eastAsia="Times New Roman"/>
-        </w:rPr>
-        <w:t xml:space="preserve">a</w:t>
-      </w:r>
-      <w:r>
-        <w:rPr>
-          <w:rFonts w:ascii="Times New Roman" w:hAnsi="Times New Roman" w:cs="Times New Roman" w:eastAsia="Times New Roman"/>
-        </w:rPr>
-        <w:t xml:space="preserve"> </w:t>
-      </w:r>
-      <w:r>
-        <w:rPr>
-          <w:rFonts w:ascii="Times New Roman" w:hAnsi="Times New Roman" w:cs="Times New Roman" w:eastAsia="Times New Roman"/>
-        </w:rPr>
-        <w:t xml:space="preserve">candidate</w:t>
-      </w:r>
-      <w:r>
-        <w:rPr>
-          <w:rFonts w:ascii="Times New Roman" w:hAnsi="Times New Roman" w:cs="Times New Roman" w:eastAsia="Times New Roman"/>
-        </w:rPr>
-        <w:t xml:space="preserve"> </w:t>
-      </w:r>
-      <w:r>
-        <w:rPr>
-          <w:rFonts w:ascii="Times New Roman" w:hAnsi="Times New Roman" w:cs="Times New Roman" w:eastAsia="Times New Roman"/>
-        </w:rPr>
-        <w:t xml:space="preserve">makes</w:t>
-      </w:r>
-      <w:r>
-        <w:rPr>
-          <w:rFonts w:ascii="Times New Roman" w:hAnsi="Times New Roman" w:cs="Times New Roman" w:eastAsia="Times New Roman"/>
-        </w:rPr>
-        <w:t xml:space="preserve"> </w:t>
-      </w:r>
-      <w:r>
-        <w:rPr>
-          <w:rFonts w:ascii="Times New Roman" w:hAnsi="Times New Roman" w:cs="Times New Roman" w:eastAsia="Times New Roman"/>
-        </w:rPr>
-        <w:t xml:space="preserve">rather</w:t>
-      </w:r>
-      <w:r>
-        <w:rPr>
-          <w:rFonts w:ascii="Times New Roman" w:hAnsi="Times New Roman" w:cs="Times New Roman" w:eastAsia="Times New Roman"/>
-        </w:rPr>
-        <w:t xml:space="preserve"> </w:t>
-      </w:r>
-      <w:r>
-        <w:rPr>
-          <w:rFonts w:ascii="Times New Roman" w:hAnsi="Times New Roman" w:cs="Times New Roman" w:eastAsia="Times New Roman"/>
-        </w:rPr>
-        <w:t xml:space="preserve">than</w:t>
-      </w:r>
-      <w:r>
-        <w:rPr>
-          <w:rFonts w:ascii="Times New Roman" w:hAnsi="Times New Roman" w:cs="Times New Roman" w:eastAsia="Times New Roman"/>
-        </w:rPr>
-        <w:t xml:space="preserve"> </w:t>
-      </w:r>
-      <w:r>
-        <w:rPr>
-          <w:rFonts w:ascii="Times New Roman" w:hAnsi="Times New Roman" w:cs="Times New Roman" w:eastAsia="Times New Roman"/>
-        </w:rPr>
-        <w:t xml:space="preserve">score</w:t>
-      </w:r>
-      <w:r>
-        <w:rPr>
-          <w:rFonts w:ascii="Times New Roman" w:hAnsi="Times New Roman" w:cs="Times New Roman" w:eastAsia="Times New Roman"/>
-        </w:rPr>
-        <w:t xml:space="preserve"> </w:t>
-      </w:r>
-      <w:r>
-        <w:rPr>
-          <w:rFonts w:ascii="Times New Roman" w:hAnsi="Times New Roman" w:cs="Times New Roman" w:eastAsia="Times New Roman"/>
-        </w:rPr>
-        <w:t xml:space="preserve">the</w:t>
-      </w:r>
-      <w:r>
-        <w:rPr>
-          <w:rFonts w:ascii="Times New Roman" w:hAnsi="Times New Roman" w:cs="Times New Roman" w:eastAsia="Times New Roman"/>
-        </w:rPr>
-        <w:t xml:space="preserve"> </w:t>
-      </w:r>
-      <w:r>
-        <w:rPr>
-          <w:rFonts w:ascii="Times New Roman" w:hAnsi="Times New Roman" w:cs="Times New Roman" w:eastAsia="Times New Roman"/>
-        </w:rPr>
-        <w:t xml:space="preserve">candidate.</w:t>
-      </w:r>
-      <w:r>
-        <w:rPr>
-          <w:rFonts w:ascii="Times New Roman" w:hAnsi="Times New Roman" w:cs="Times New Roman" w:eastAsia="Times New Roman"/>
-        </w:rPr>
-        <w:t xml:space="preserve"> </w:t>
-      </w:r>
-      <w:r>
-        <w:rPr>
-          <w:rFonts w:ascii="Times New Roman" w:hAnsi="Times New Roman" w:cs="Times New Roman" w:eastAsia="Times New Roman"/>
-        </w:rPr>
-        <w:t xml:space="preserve">A</w:t>
-      </w:r>
-      <w:r>
-        <w:rPr>
-          <w:rFonts w:ascii="Times New Roman" w:hAnsi="Times New Roman" w:cs="Times New Roman" w:eastAsia="Times New Roman"/>
-        </w:rPr>
-        <w:t xml:space="preserve"> </w:t>
-      </w:r>
-      <w:r>
-        <w:rPr>
-          <w:rFonts w:ascii="Times New Roman" w:hAnsi="Times New Roman" w:cs="Times New Roman" w:eastAsia="Times New Roman"/>
-        </w:rPr>
-        <w:t xml:space="preserve">deterministic</w:t>
-      </w:r>
-      <w:r>
-        <w:rPr>
-          <w:rFonts w:ascii="Times New Roman" w:hAnsi="Times New Roman" w:cs="Times New Roman" w:eastAsia="Times New Roman"/>
-        </w:rPr>
-        <w:t xml:space="preserve"> </w:t>
-      </w:r>
-      <w:r>
-        <w:rPr>
-          <w:rFonts w:ascii="Times New Roman" w:hAnsi="Times New Roman" w:cs="Times New Roman" w:eastAsia="Times New Roman"/>
-        </w:rPr>
-        <w:t xml:space="preserve">grounding</w:t>
-      </w:r>
-      <w:r>
-        <w:rPr>
-          <w:rFonts w:ascii="Times New Roman" w:hAnsi="Times New Roman" w:cs="Times New Roman" w:eastAsia="Times New Roman"/>
-        </w:rPr>
-        <w:t xml:space="preserve"> </w:t>
-      </w:r>
-      <w:r>
-        <w:rPr>
-          <w:rFonts w:ascii="Times New Roman" w:hAnsi="Times New Roman" w:cs="Times New Roman" w:eastAsia="Times New Roman"/>
-        </w:rPr>
-        <w:t xml:space="preserve">gate</w:t>
-      </w:r>
-      <w:r>
-        <w:rPr>
-          <w:rFonts w:ascii="Times New Roman" w:hAnsi="Times New Roman" w:cs="Times New Roman" w:eastAsia="Times New Roman"/>
-        </w:rPr>
-        <w:t xml:space="preserve"> </w:t>
-      </w:r>
-      <w:r>
-        <w:rPr>
-          <w:rFonts w:ascii="Times New Roman" w:hAnsi="Times New Roman" w:cs="Times New Roman" w:eastAsia="Times New Roman"/>
-        </w:rPr>
-        <w:t xml:space="preserve">constrains</w:t>
-      </w:r>
-      <w:r>
-        <w:rPr>
-          <w:rFonts w:ascii="Times New Roman" w:hAnsi="Times New Roman" w:cs="Times New Roman" w:eastAsia="Times New Roman"/>
-        </w:rPr>
-        <w:t xml:space="preserve"> </w:t>
-      </w:r>
-      <w:r>
-        <w:rPr>
-          <w:rFonts w:ascii="Times New Roman" w:hAnsi="Times New Roman" w:cs="Times New Roman" w:eastAsia="Times New Roman"/>
-        </w:rPr>
-        <w:t xml:space="preserve">a</w:t>
-      </w:r>
-      <w:r>
-        <w:rPr>
-          <w:rFonts w:ascii="Times New Roman" w:hAnsi="Times New Roman" w:cs="Times New Roman" w:eastAsia="Times New Roman"/>
-        </w:rPr>
-        <w:t xml:space="preserve"> </w:t>
-      </w:r>
-      <w:r>
-        <w:rPr>
-          <w:rFonts w:ascii="Times New Roman" w:hAnsi="Times New Roman" w:cs="Times New Roman" w:eastAsia="Times New Roman"/>
-        </w:rPr>
-        <w:t xml:space="preserve">language</w:t>
-      </w:r>
-      <w:r>
-        <w:rPr>
-          <w:rFonts w:ascii="Times New Roman" w:hAnsi="Times New Roman" w:cs="Times New Roman" w:eastAsia="Times New Roman"/>
-        </w:rPr>
-        <w:t xml:space="preserve"> </w:t>
-      </w:r>
-      <w:r>
-        <w:rPr>
-          <w:rFonts w:ascii="Times New Roman" w:hAnsi="Times New Roman" w:cs="Times New Roman" w:eastAsia="Times New Roman"/>
-        </w:rPr>
-        <w:t xml:space="preserve">model</w:t>
-      </w:r>
-      <w:r>
-        <w:rPr>
-          <w:rFonts w:ascii="Times New Roman" w:hAnsi="Times New Roman" w:cs="Times New Roman" w:eastAsia="Times New Roman"/>
-        </w:rPr>
-        <w:t xml:space="preserve"> </w:t>
-      </w:r>
-      <w:r>
-        <w:rPr>
-          <w:rFonts w:ascii="Times New Roman" w:hAnsi="Times New Roman" w:cs="Times New Roman" w:eastAsia="Times New Roman"/>
-        </w:rPr>
-        <w:t xml:space="preserve">to</w:t>
-      </w:r>
-      <w:r>
-        <w:rPr>
-          <w:rFonts w:ascii="Times New Roman" w:hAnsi="Times New Roman" w:cs="Times New Roman" w:eastAsia="Times New Roman"/>
-        </w:rPr>
-        <w:t xml:space="preserve"> </w:t>
-      </w:r>
-      <w:r>
-        <w:rPr>
-          <w:rFonts w:ascii="Times New Roman" w:hAnsi="Times New Roman" w:cs="Times New Roman" w:eastAsia="Times New Roman"/>
-        </w:rPr>
-        <w:t xml:space="preserve">select</w:t>
-      </w:r>
-      <w:r>
-        <w:rPr>
-          <w:rFonts w:ascii="Times New Roman" w:hAnsi="Times New Roman" w:cs="Times New Roman" w:eastAsia="Times New Roman"/>
-        </w:rPr>
-        <w:t xml:space="preserve"> </w:t>
-      </w:r>
-      <w:r>
-        <w:rPr>
-          <w:rFonts w:ascii="Times New Roman" w:hAnsi="Times New Roman" w:cs="Times New Roman" w:eastAsia="Times New Roman"/>
-        </w:rPr>
-        <w:t xml:space="preserve">claim</w:t>
-      </w:r>
-      <w:r>
-        <w:rPr>
-          <w:rFonts w:ascii="Times New Roman" w:hAnsi="Times New Roman" w:cs="Times New Roman" w:eastAsia="Times New Roman"/>
-        </w:rPr>
-        <w:t xml:space="preserve"> </w:t>
-      </w:r>
-      <w:r>
-        <w:rPr>
-          <w:rFonts w:ascii="Times New Roman" w:hAnsi="Times New Roman" w:cs="Times New Roman" w:eastAsia="Times New Roman"/>
-        </w:rPr>
-        <w:t xml:space="preserve">text</w:t>
-      </w:r>
-      <w:r>
-        <w:rPr>
-          <w:rFonts w:ascii="Times New Roman" w:hAnsi="Times New Roman" w:cs="Times New Roman" w:eastAsia="Times New Roman"/>
-        </w:rPr>
-        <w:t xml:space="preserve"> </w:t>
-      </w:r>
-      <w:r>
-        <w:rPr>
-          <w:rFonts w:ascii="Times New Roman" w:hAnsi="Times New Roman" w:cs="Times New Roman" w:eastAsia="Times New Roman"/>
-        </w:rPr>
-        <w:t xml:space="preserve">from</w:t>
-      </w:r>
-      <w:r>
-        <w:rPr>
-          <w:rFonts w:ascii="Times New Roman" w:hAnsi="Times New Roman" w:cs="Times New Roman" w:eastAsia="Times New Roman"/>
-        </w:rPr>
-        <w:t xml:space="preserve"> </w:t>
-      </w:r>
-      <w:r>
-        <w:rPr>
-          <w:rFonts w:ascii="Times New Roman" w:hAnsi="Times New Roman" w:cs="Times New Roman" w:eastAsia="Times New Roman"/>
-        </w:rPr>
-        <w:t xml:space="preserve">the</w:t>
-      </w:r>
-      <w:r>
-        <w:rPr>
-          <w:rFonts w:ascii="Times New Roman" w:hAnsi="Times New Roman" w:cs="Times New Roman" w:eastAsia="Times New Roman"/>
-        </w:rPr>
-        <w:t xml:space="preserve"> </w:t>
-      </w:r>
-      <w:r>
-        <w:rPr>
-          <w:rFonts w:ascii="Times New Roman" w:hAnsi="Times New Roman" w:cs="Times New Roman" w:eastAsia="Times New Roman"/>
-        </w:rPr>
-        <w:t xml:space="preserve">resume</w:t>
-      </w:r>
-      <w:r>
-        <w:rPr>
-          <w:rFonts w:ascii="Times New Roman" w:hAnsi="Times New Roman" w:cs="Times New Roman" w:eastAsia="Times New Roman"/>
-        </w:rPr>
-        <w:t xml:space="preserve"> </w:t>
-      </w:r>
-      <w:r>
-        <w:rPr>
-          <w:rFonts w:ascii="Times New Roman" w:hAnsi="Times New Roman" w:cs="Times New Roman" w:eastAsia="Times New Roman"/>
-        </w:rPr>
-        <w:t xml:space="preserve">and</w:t>
-      </w:r>
-      <w:r>
-        <w:rPr>
-          <w:rFonts w:ascii="Times New Roman" w:hAnsi="Times New Roman" w:cs="Times New Roman" w:eastAsia="Times New Roman"/>
-        </w:rPr>
-        <w:t xml:space="preserve"> </w:t>
-      </w:r>
-      <w:r>
-        <w:rPr>
-          <w:rFonts w:ascii="Times New Roman" w:hAnsi="Times New Roman" w:cs="Times New Roman" w:eastAsia="Times New Roman"/>
-        </w:rPr>
-        <w:t xml:space="preserve">forbids</w:t>
-      </w:r>
-      <w:r>
-        <w:rPr>
-          <w:rFonts w:ascii="Times New Roman" w:hAnsi="Times New Roman" w:cs="Times New Roman" w:eastAsia="Times New Roman"/>
-        </w:rPr>
-        <w:t xml:space="preserve"> </w:t>
-      </w:r>
-      <w:r>
-        <w:rPr>
-          <w:rFonts w:ascii="Times New Roman" w:hAnsi="Times New Roman" w:cs="Times New Roman" w:eastAsia="Times New Roman"/>
-        </w:rPr>
-        <w:t xml:space="preserve">it</w:t>
-      </w:r>
-      <w:r>
-        <w:rPr>
-          <w:rFonts w:ascii="Times New Roman" w:hAnsi="Times New Roman" w:cs="Times New Roman" w:eastAsia="Times New Roman"/>
-        </w:rPr>
-        <w:t xml:space="preserve"> </w:t>
-      </w:r>
-      <w:r>
-        <w:rPr>
-          <w:rFonts w:ascii="Times New Roman" w:hAnsi="Times New Roman" w:cs="Times New Roman" w:eastAsia="Times New Roman"/>
-        </w:rPr>
-        <w:t xml:space="preserve">to</w:t>
-      </w:r>
-      <w:r>
-        <w:rPr>
-          <w:rFonts w:ascii="Times New Roman" w:hAnsi="Times New Roman" w:cs="Times New Roman" w:eastAsia="Times New Roman"/>
-        </w:rPr>
-        <w:t xml:space="preserve"> </w:t>
-      </w:r>
-      <w:r>
-        <w:rPr>
-          <w:rFonts w:ascii="Times New Roman" w:hAnsi="Times New Roman" w:cs="Times New Roman" w:eastAsia="Times New Roman"/>
-        </w:rPr>
-        <w:t xml:space="preserve">author</w:t>
-      </w:r>
-      <w:r>
-        <w:rPr>
-          <w:rFonts w:ascii="Times New Roman" w:hAnsi="Times New Roman" w:cs="Times New Roman" w:eastAsia="Times New Roman"/>
-        </w:rPr>
-        <w:t xml:space="preserve"> </w:t>
-      </w:r>
-      <w:r>
-        <w:rPr>
-          <w:rFonts w:ascii="Times New Roman" w:hAnsi="Times New Roman" w:cs="Times New Roman" w:eastAsia="Times New Roman"/>
-        </w:rPr>
-        <w:t xml:space="preserve">any.</w:t>
-      </w:r>
-      <w:r>
-        <w:rPr>
-          <w:rFonts w:ascii="Times New Roman" w:hAnsi="Times New Roman" w:cs="Times New Roman" w:eastAsia="Times New Roman"/>
-        </w:rPr>
-        <w:t xml:space="preserve"> </w:t>
-      </w:r>
-      <w:r>
-        <w:rPr>
-          <w:rFonts w:ascii="Times New Roman" w:hAnsi="Times New Roman" w:cs="Times New Roman" w:eastAsia="Times New Roman"/>
-        </w:rPr>
-        <w:t xml:space="preserve">Across</w:t>
-      </w:r>
-      <w:r>
-        <w:rPr>
-          <w:rFonts w:ascii="Times New Roman" w:hAnsi="Times New Roman" w:cs="Times New Roman" w:eastAsia="Times New Roman"/>
-        </w:rPr>
-        <w:t xml:space="preserve"> </w:t>
-      </w:r>
-      <w:r>
-        <w:rPr>
-          <w:rFonts w:ascii="Times New Roman" w:hAnsi="Times New Roman" w:cs="Times New Roman" w:eastAsia="Times New Roman"/>
-        </w:rPr>
-        <w:t xml:space="preserve">roughly</w:t>
-      </w:r>
-      <w:r>
-        <w:rPr>
-          <w:rFonts w:ascii="Times New Roman" w:hAnsi="Times New Roman" w:cs="Times New Roman" w:eastAsia="Times New Roman"/>
-        </w:rPr>
-        <w:t xml:space="preserve"> </w:t>
-      </w:r>
-      <w:r>
-        <w:rPr>
-          <w:rFonts w:ascii="Times New Roman" w:hAnsi="Times New Roman" w:cs="Times New Roman" w:eastAsia="Times New Roman"/>
-        </w:rPr>
-        <w:t xml:space="preserve">100,000</w:t>
-      </w:r>
-      <w:r>
-        <w:rPr>
-          <w:rFonts w:ascii="Times New Roman" w:hAnsi="Times New Roman" w:cs="Times New Roman" w:eastAsia="Times New Roman"/>
-        </w:rPr>
-        <w:t xml:space="preserve"> </w:t>
-      </w:r>
-      <w:r>
-        <w:rPr>
-          <w:rFonts w:ascii="Times New Roman" w:hAnsi="Times New Roman" w:cs="Times New Roman" w:eastAsia="Times New Roman"/>
-        </w:rPr>
-        <w:t xml:space="preserve">synthetic</w:t>
-      </w:r>
-      <w:r>
-        <w:rPr>
-          <w:rFonts w:ascii="Times New Roman" w:hAnsi="Times New Roman" w:cs="Times New Roman" w:eastAsia="Times New Roman"/>
-        </w:rPr>
-        <w:t xml:space="preserve"> </w:t>
-      </w:r>
-      <w:r>
-        <w:rPr>
-          <w:rFonts w:ascii="Times New Roman" w:hAnsi="Times New Roman" w:cs="Times New Roman" w:eastAsia="Times New Roman"/>
-        </w:rPr>
-        <w:t xml:space="preserve">trials</w:t>
-      </w:r>
-      <w:r>
-        <w:rPr>
-          <w:rFonts w:ascii="Times New Roman" w:hAnsi="Times New Roman" w:cs="Times New Roman" w:eastAsia="Times New Roman"/>
-        </w:rPr>
-        <w:t xml:space="preserve"> </w:t>
-      </w:r>
-      <w:r>
-        <w:rPr>
-          <w:rFonts w:ascii="Times New Roman" w:hAnsi="Times New Roman" w:cs="Times New Roman" w:eastAsia="Times New Roman"/>
-        </w:rPr>
-        <w:t xml:space="preserve">the</w:t>
-      </w:r>
-      <w:r>
-        <w:rPr>
-          <w:rFonts w:ascii="Times New Roman" w:hAnsi="Times New Roman" w:cs="Times New Roman" w:eastAsia="Times New Roman"/>
-        </w:rPr>
-        <w:t xml:space="preserve"> </w:t>
-      </w:r>
-      <w:r>
-        <w:rPr>
-          <w:rFonts w:ascii="Times New Roman" w:hAnsi="Times New Roman" w:cs="Times New Roman" w:eastAsia="Times New Roman"/>
-        </w:rPr>
-        <w:t xml:space="preserve">gate</w:t>
-      </w:r>
-      <w:r>
-        <w:rPr>
-          <w:rFonts w:ascii="Times New Roman" w:hAnsi="Times New Roman" w:cs="Times New Roman" w:eastAsia="Times New Roman"/>
-        </w:rPr>
-        <w:t xml:space="preserve"> </w:t>
-      </w:r>
-      <w:r>
-        <w:rPr>
-          <w:rFonts w:ascii="Times New Roman" w:hAnsi="Times New Roman" w:cs="Times New Roman" w:eastAsia="Times New Roman"/>
-        </w:rPr>
-        <w:t xml:space="preserve">rejected</w:t>
-      </w:r>
-      <w:r>
-        <w:rPr>
-          <w:rFonts w:ascii="Times New Roman" w:hAnsi="Times New Roman" w:cs="Times New Roman" w:eastAsia="Times New Roman"/>
-        </w:rPr>
-        <w:t xml:space="preserve"> </w:t>
-      </w:r>
-      <w:r>
-        <w:rPr>
-          <w:rFonts w:ascii="Times New Roman" w:hAnsi="Times New Roman" w:cs="Times New Roman" w:eastAsia="Times New Roman"/>
-        </w:rPr>
-        <w:t xml:space="preserve">every</w:t>
-      </w:r>
-      <w:r>
-        <w:rPr>
-          <w:rFonts w:ascii="Times New Roman" w:hAnsi="Times New Roman" w:cs="Times New Roman" w:eastAsia="Times New Roman"/>
-        </w:rPr>
-        <w:t xml:space="preserve"> </w:t>
-      </w:r>
-      <w:r>
-        <w:rPr>
-          <w:rFonts w:ascii="Times New Roman" w:hAnsi="Times New Roman" w:cs="Times New Roman" w:eastAsia="Times New Roman"/>
-        </w:rPr>
-        <w:t xml:space="preserve">meaning-preserving</w:t>
-      </w:r>
-      <w:r>
-        <w:rPr>
-          <w:rFonts w:ascii="Times New Roman" w:hAnsi="Times New Roman" w:cs="Times New Roman" w:eastAsia="Times New Roman"/>
-        </w:rPr>
-        <w:t xml:space="preserve"> </w:t>
-      </w:r>
-      <w:r>
-        <w:rPr>
-          <w:rFonts w:ascii="Times New Roman" w:hAnsi="Times New Roman" w:cs="Times New Roman" w:eastAsia="Times New Roman"/>
-        </w:rPr>
-        <w:t xml:space="preserve">paraphrase</w:t>
-      </w:r>
-      <w:r>
-        <w:rPr>
-          <w:rFonts w:ascii="Times New Roman" w:hAnsi="Times New Roman" w:cs="Times New Roman" w:eastAsia="Times New Roman"/>
-        </w:rPr>
-        <w:t xml:space="preserve"> </w:t>
-      </w:r>
-      <w:r>
-        <w:rPr>
-          <w:rFonts w:ascii="Times New Roman" w:hAnsi="Times New Roman" w:cs="Times New Roman" w:eastAsia="Times New Roman"/>
-        </w:rPr>
-        <w:t xml:space="preserve">and</w:t>
-      </w:r>
-      <w:r>
-        <w:rPr>
-          <w:rFonts w:ascii="Times New Roman" w:hAnsi="Times New Roman" w:cs="Times New Roman" w:eastAsia="Times New Roman"/>
-        </w:rPr>
-        <w:t xml:space="preserve"> </w:t>
-      </w:r>
-      <w:r>
-        <w:rPr>
-          <w:rFonts w:ascii="Times New Roman" w:hAnsi="Times New Roman" w:cs="Times New Roman" w:eastAsia="Times New Roman"/>
-        </w:rPr>
-        <w:t xml:space="preserve">negation</w:t>
-      </w:r>
-      <w:r>
-        <w:rPr>
-          <w:rFonts w:ascii="Times New Roman" w:hAnsi="Times New Roman" w:cs="Times New Roman" w:eastAsia="Times New Roman"/>
-        </w:rPr>
-        <w:t xml:space="preserve"> </w:t>
-      </w:r>
-      <w:r>
-        <w:rPr>
-          <w:rFonts w:ascii="Times New Roman" w:hAnsi="Times New Roman" w:cs="Times New Roman" w:eastAsia="Times New Roman"/>
-        </w:rPr>
-        <w:t xml:space="preserve">trap</w:t>
-      </w:r>
-      <w:r>
-        <w:rPr>
-          <w:rFonts w:ascii="Times New Roman" w:hAnsi="Times New Roman" w:cs="Times New Roman" w:eastAsia="Times New Roman"/>
-        </w:rPr>
-        <w:t xml:space="preserve"> </w:t>
-      </w:r>
-      <w:r>
-        <w:rPr>
-          <w:rFonts w:ascii="Times New Roman" w:hAnsi="Times New Roman" w:cs="Times New Roman" w:eastAsia="Times New Roman"/>
-        </w:rPr>
-        <w:t xml:space="preserve">while</w:t>
-      </w:r>
-      <w:r>
-        <w:rPr>
-          <w:rFonts w:ascii="Times New Roman" w:hAnsi="Times New Roman" w:cs="Times New Roman" w:eastAsia="Times New Roman"/>
-        </w:rPr>
-        <w:t xml:space="preserve"> </w:t>
-      </w:r>
-      <w:r>
-        <w:rPr>
-          <w:rFonts w:ascii="Times New Roman" w:hAnsi="Times New Roman" w:cs="Times New Roman" w:eastAsia="Times New Roman"/>
-        </w:rPr>
-        <w:t xml:space="preserve">admitting</w:t>
-      </w:r>
-      <w:r>
-        <w:rPr>
-          <w:rFonts w:ascii="Times New Roman" w:hAnsi="Times New Roman" w:cs="Times New Roman" w:eastAsia="Times New Roman"/>
-        </w:rPr>
-        <w:t xml:space="preserve"> </w:t>
-      </w:r>
-      <w:r>
-        <w:rPr>
-          <w:rFonts w:ascii="Times New Roman" w:hAnsi="Times New Roman" w:cs="Times New Roman" w:eastAsia="Times New Roman"/>
-        </w:rPr>
-        <w:t xml:space="preserve">every</w:t>
-      </w:r>
-      <w:r>
-        <w:rPr>
-          <w:rFonts w:ascii="Times New Roman" w:hAnsi="Times New Roman" w:cs="Times New Roman" w:eastAsia="Times New Roman"/>
-        </w:rPr>
-        <w:t xml:space="preserve"> </w:t>
-      </w:r>
-      <w:r>
-        <w:rPr>
-          <w:rFonts w:ascii="Times New Roman" w:hAnsi="Times New Roman" w:cs="Times New Roman" w:eastAsia="Times New Roman"/>
-        </w:rPr>
-        <w:t xml:space="preserve">verbatim</w:t>
-      </w:r>
-      <w:r>
-        <w:rPr>
-          <w:rFonts w:ascii="Times New Roman" w:hAnsi="Times New Roman" w:cs="Times New Roman" w:eastAsia="Times New Roman"/>
-        </w:rPr>
-        <w:t xml:space="preserve"> </w:t>
-      </w:r>
-      <w:r>
-        <w:rPr>
-          <w:rFonts w:ascii="Times New Roman" w:hAnsi="Times New Roman" w:cs="Times New Roman" w:eastAsia="Times New Roman"/>
-        </w:rPr>
-        <w:t xml:space="preserve">claim,</w:t>
-      </w:r>
-      <w:r>
-        <w:rPr>
-          <w:rFonts w:ascii="Times New Roman" w:hAnsi="Times New Roman" w:cs="Times New Roman" w:eastAsia="Times New Roman"/>
-        </w:rPr>
-        <w:t xml:space="preserve"> </w:t>
-      </w:r>
-      <w:r>
-        <w:rPr>
-          <w:rFonts w:ascii="Times New Roman" w:hAnsi="Times New Roman" w:cs="Times New Roman" w:eastAsia="Times New Roman"/>
-        </w:rPr>
-        <w:t xml:space="preserve">and</w:t>
-      </w:r>
-      <w:r>
-        <w:rPr>
-          <w:rFonts w:ascii="Times New Roman" w:hAnsi="Times New Roman" w:cs="Times New Roman" w:eastAsia="Times New Roman"/>
-        </w:rPr>
-        <w:t xml:space="preserve"> </w:t>
-      </w:r>
-      <w:r>
-        <w:rPr>
-          <w:rFonts w:ascii="Times New Roman" w:hAnsi="Times New Roman" w:cs="Times New Roman" w:eastAsia="Times New Roman"/>
-        </w:rPr>
-        <w:t xml:space="preserve">under</w:t>
-      </w:r>
-      <w:r>
-        <w:rPr>
-          <w:rFonts w:ascii="Times New Roman" w:hAnsi="Times New Roman" w:cs="Times New Roman" w:eastAsia="Times New Roman"/>
-        </w:rPr>
-        <w:t xml:space="preserve"> </w:t>
-      </w:r>
-      <w:r>
-        <w:rPr>
-          <w:rFonts w:ascii="Times New Roman" w:hAnsi="Times New Roman" w:cs="Times New Roman" w:eastAsia="Times New Roman"/>
-        </w:rPr>
-        <w:t xml:space="preserve">a</w:t>
-      </w:r>
-      <w:r>
-        <w:rPr>
-          <w:rFonts w:ascii="Times New Roman" w:hAnsi="Times New Roman" w:cs="Times New Roman" w:eastAsia="Times New Roman"/>
-        </w:rPr>
-        <w:t xml:space="preserve"> </w:t>
-      </w:r>
-      <w:r>
-        <w:rPr>
-          <w:rFonts w:ascii="Times New Roman" w:hAnsi="Times New Roman" w:cs="Times New Roman" w:eastAsia="Times New Roman"/>
-        </w:rPr>
-        <w:t xml:space="preserve">worst-case</w:t>
-      </w:r>
-      <w:r>
-        <w:rPr>
-          <w:rFonts w:ascii="Times New Roman" w:hAnsi="Times New Roman" w:cs="Times New Roman" w:eastAsia="Times New Roman"/>
-        </w:rPr>
-        <w:t xml:space="preserve"> </w:t>
-      </w:r>
-      <w:r>
-        <w:rPr>
-          <w:rFonts w:ascii="Times New Roman" w:hAnsi="Times New Roman" w:cs="Times New Roman" w:eastAsia="Times New Roman"/>
-        </w:rPr>
-        <w:t xml:space="preserve">prompt-injection</w:t>
-      </w:r>
-      <w:r>
-        <w:rPr>
-          <w:rFonts w:ascii="Times New Roman" w:hAnsi="Times New Roman" w:cs="Times New Roman" w:eastAsia="Times New Roman"/>
-        </w:rPr>
-        <w:t xml:space="preserve"> </w:t>
-      </w:r>
-      <w:r>
-        <w:rPr>
-          <w:rFonts w:ascii="Times New Roman" w:hAnsi="Times New Roman" w:cs="Times New Roman" w:eastAsia="Times New Roman"/>
-        </w:rPr>
-        <w:t xml:space="preserve">model</w:t>
-      </w:r>
-      <w:r>
-        <w:rPr>
-          <w:rFonts w:ascii="Times New Roman" w:hAnsi="Times New Roman" w:cs="Times New Roman" w:eastAsia="Times New Roman"/>
-        </w:rPr>
-        <w:t xml:space="preserve"> </w:t>
-      </w:r>
-      <w:r>
-        <w:rPr>
-          <w:rFonts w:ascii="Times New Roman" w:hAnsi="Times New Roman" w:cs="Times New Roman" w:eastAsia="Times New Roman"/>
-        </w:rPr>
-        <w:t xml:space="preserve">it</w:t>
-      </w:r>
-      <w:r>
-        <w:rPr>
-          <w:rFonts w:ascii="Times New Roman" w:hAnsi="Times New Roman" w:cs="Times New Roman" w:eastAsia="Times New Roman"/>
-        </w:rPr>
-        <w:t xml:space="preserve"> </w:t>
-      </w:r>
-      <w:r>
-        <w:rPr>
-          <w:rFonts w:ascii="Times New Roman" w:hAnsi="Times New Roman" w:cs="Times New Roman" w:eastAsia="Times New Roman"/>
-        </w:rPr>
-        <w:t xml:space="preserve">admitted</w:t>
-      </w:r>
-      <w:r>
-        <w:rPr>
-          <w:rFonts w:ascii="Times New Roman" w:hAnsi="Times New Roman" w:cs="Times New Roman" w:eastAsia="Times New Roman"/>
-        </w:rPr>
-        <w:t xml:space="preserve"> </w:t>
-      </w:r>
-      <w:r>
-        <w:rPr>
-          <w:rFonts w:ascii="Times New Roman" w:hAnsi="Times New Roman" w:cs="Times New Roman" w:eastAsia="Times New Roman"/>
-        </w:rPr>
-        <w:t xml:space="preserve">none</w:t>
-      </w:r>
-      <w:r>
-        <w:rPr>
-          <w:rFonts w:ascii="Times New Roman" w:hAnsi="Times New Roman" w:cs="Times New Roman" w:eastAsia="Times New Roman"/>
-        </w:rPr>
-        <w:t xml:space="preserve"> </w:t>
-      </w:r>
-      <w:r>
-        <w:rPr>
-          <w:rFonts w:ascii="Times New Roman" w:hAnsi="Times New Roman" w:cs="Times New Roman" w:eastAsia="Times New Roman"/>
-        </w:rPr>
-        <w:t xml:space="preserve">of</w:t>
-      </w:r>
-      <w:r>
-        <w:rPr>
-          <w:rFonts w:ascii="Times New Roman" w:hAnsi="Times New Roman" w:cs="Times New Roman" w:eastAsia="Times New Roman"/>
-        </w:rPr>
-        <w:t xml:space="preserve"> </w:t>
-      </w:r>
-      <w:r>
-        <w:rPr>
-          <w:rFonts w:ascii="Times New Roman" w:hAnsi="Times New Roman" w:cs="Times New Roman" w:eastAsia="Times New Roman"/>
-        </w:rPr>
-        <w:t xml:space="preserve">1,800</w:t>
-      </w:r>
-      <w:r>
-        <w:rPr>
-          <w:rFonts w:ascii="Times New Roman" w:hAnsi="Times New Roman" w:cs="Times New Roman" w:eastAsia="Times New Roman"/>
-        </w:rPr>
-        <w:t xml:space="preserve"> </w:t>
-      </w:r>
-      <w:r>
-        <w:rPr>
-          <w:rFonts w:ascii="Times New Roman" w:hAnsi="Times New Roman" w:cs="Times New Roman" w:eastAsia="Times New Roman"/>
-        </w:rPr>
-        <w:t xml:space="preserve">fabricated</w:t>
-      </w:r>
-      <w:r>
-        <w:rPr>
-          <w:rFonts w:ascii="Times New Roman" w:hAnsi="Times New Roman" w:cs="Times New Roman" w:eastAsia="Times New Roman"/>
-        </w:rPr>
-        <w:t xml:space="preserve"> </w:t>
-      </w:r>
-      <w:r>
-        <w:rPr>
-          <w:rFonts w:ascii="Times New Roman" w:hAnsi="Times New Roman" w:cs="Times New Roman" w:eastAsia="Times New Roman"/>
-        </w:rPr>
-        <w:t xml:space="preserve">claims.</w:t>
-      </w:r>
-      <w:r>
-        <w:rPr>
-          <w:rFonts w:ascii="Times New Roman" w:hAnsi="Times New Roman" w:cs="Times New Roman" w:eastAsia="Times New Roman"/>
-        </w:rPr>
-        <w:t xml:space="preserve"> </w:t>
-      </w:r>
-      <w:r>
-        <w:rPr>
-          <w:rFonts w:ascii="Times New Roman" w:hAnsi="Times New Roman" w:cs="Times New Roman" w:eastAsia="Times New Roman"/>
-        </w:rPr>
-        <w:t xml:space="preserve">For</w:t>
-      </w:r>
-      <w:r>
-        <w:rPr>
-          <w:rFonts w:ascii="Times New Roman" w:hAnsi="Times New Roman" w:cs="Times New Roman" w:eastAsia="Times New Roman"/>
-        </w:rPr>
-        <w:t xml:space="preserve"> </w:t>
-      </w:r>
-      <w:r>
-        <w:rPr>
-          <w:rFonts w:ascii="Times New Roman" w:hAnsi="Times New Roman" w:cs="Times New Roman" w:eastAsia="Times New Roman"/>
-        </w:rPr>
-        <w:t xml:space="preserve">machine</w:t>
-      </w:r>
-      <w:r>
-        <w:rPr>
-          <w:rFonts w:ascii="Times New Roman" w:hAnsi="Times New Roman" w:cs="Times New Roman" w:eastAsia="Times New Roman"/>
-        </w:rPr>
-        <w:t xml:space="preserve"> </w:t>
-      </w:r>
-      <w:r>
-        <w:rPr>
-          <w:rFonts w:ascii="Times New Roman" w:hAnsi="Times New Roman" w:cs="Times New Roman" w:eastAsia="Times New Roman"/>
-        </w:rPr>
-        <w:t xml:space="preserve">learning</w:t>
-      </w:r>
-      <w:r>
-        <w:rPr>
-          <w:rFonts w:ascii="Times New Roman" w:hAnsi="Times New Roman" w:cs="Times New Roman" w:eastAsia="Times New Roman"/>
-        </w:rPr>
-        <w:t xml:space="preserve"> </w:t>
-      </w:r>
-      <w:r>
-        <w:rPr>
-          <w:rFonts w:ascii="Times New Roman" w:hAnsi="Times New Roman" w:cs="Times New Roman" w:eastAsia="Times New Roman"/>
-        </w:rPr>
-        <w:t xml:space="preserve">we</w:t>
-      </w:r>
-      <w:r>
-        <w:rPr>
-          <w:rFonts w:ascii="Times New Roman" w:hAnsi="Times New Roman" w:cs="Times New Roman" w:eastAsia="Times New Roman"/>
-        </w:rPr>
-        <w:t xml:space="preserve"> </w:t>
-      </w:r>
-      <w:r>
-        <w:rPr>
-          <w:rFonts w:ascii="Times New Roman" w:hAnsi="Times New Roman" w:cs="Times New Roman" w:eastAsia="Times New Roman"/>
-        </w:rPr>
-        <w:t xml:space="preserve">compare</w:t>
-      </w:r>
-      <w:r>
-        <w:rPr>
-          <w:rFonts w:ascii="Times New Roman" w:hAnsi="Times New Roman" w:cs="Times New Roman" w:eastAsia="Times New Roman"/>
-        </w:rPr>
-        <w:t xml:space="preserve"> </w:t>
-      </w:r>
-      <w:r>
-        <w:rPr>
-          <w:rFonts w:ascii="Times New Roman" w:hAnsi="Times New Roman" w:cs="Times New Roman" w:eastAsia="Times New Roman"/>
-        </w:rPr>
-        <w:t xml:space="preserve">nine</w:t>
-      </w:r>
-      <w:r>
-        <w:rPr>
-          <w:rFonts w:ascii="Times New Roman" w:hAnsi="Times New Roman" w:cs="Times New Roman" w:eastAsia="Times New Roman"/>
-        </w:rPr>
-        <w:t xml:space="preserve"> </w:t>
-      </w:r>
-      <w:r>
-        <w:rPr>
-          <w:rFonts w:ascii="Times New Roman" w:hAnsi="Times New Roman" w:cs="Times New Roman" w:eastAsia="Times New Roman"/>
-        </w:rPr>
-        <w:t xml:space="preserve">classifiers</w:t>
-      </w:r>
-      <w:r>
-        <w:rPr>
-          <w:rFonts w:ascii="Times New Roman" w:hAnsi="Times New Roman" w:cs="Times New Roman" w:eastAsia="Times New Roman"/>
-        </w:rPr>
-        <w:t xml:space="preserve"> </w:t>
-      </w:r>
-      <w:r>
-        <w:rPr>
-          <w:rFonts w:ascii="Times New Roman" w:hAnsi="Times New Roman" w:cs="Times New Roman" w:eastAsia="Times New Roman"/>
-        </w:rPr>
-        <w:t xml:space="preserve">under</w:t>
-      </w:r>
-      <w:r>
-        <w:rPr>
-          <w:rFonts w:ascii="Times New Roman" w:hAnsi="Times New Roman" w:cs="Times New Roman" w:eastAsia="Times New Roman"/>
-        </w:rPr>
-        <w:t xml:space="preserve"> </w:t>
-      </w:r>
-      <w:r>
-        <w:rPr>
-          <w:rFonts w:ascii="Times New Roman" w:hAnsi="Times New Roman" w:cs="Times New Roman" w:eastAsia="Times New Roman"/>
-        </w:rPr>
-        <w:t xml:space="preserve">grouped</w:t>
-      </w:r>
-      <w:r>
-        <w:rPr>
-          <w:rFonts w:ascii="Times New Roman" w:hAnsi="Times New Roman" w:cs="Times New Roman" w:eastAsia="Times New Roman"/>
-        </w:rPr>
-        <w:t xml:space="preserve"> </w:t>
-      </w:r>
-      <w:r>
-        <w:rPr>
-          <w:rFonts w:ascii="Times New Roman" w:hAnsi="Times New Roman" w:cs="Times New Roman" w:eastAsia="Times New Roman"/>
-        </w:rPr>
-        <w:t xml:space="preserve">cross-validation</w:t>
-      </w:r>
-      <w:r>
-        <w:rPr>
-          <w:rFonts w:ascii="Times New Roman" w:hAnsi="Times New Roman" w:cs="Times New Roman" w:eastAsia="Times New Roman"/>
-        </w:rPr>
-        <w:t xml:space="preserve"> </w:t>
-      </w:r>
-      <w:r>
-        <w:rPr>
-          <w:rFonts w:ascii="Times New Roman" w:hAnsi="Times New Roman" w:cs="Times New Roman" w:eastAsia="Times New Roman"/>
-        </w:rPr>
-        <w:t xml:space="preserve">with</w:t>
-      </w:r>
-      <w:r>
-        <w:rPr>
-          <w:rFonts w:ascii="Times New Roman" w:hAnsi="Times New Roman" w:cs="Times New Roman" w:eastAsia="Times New Roman"/>
-        </w:rPr>
-        <w:t xml:space="preserve"> </w:t>
-      </w:r>
-      <w:r>
-        <w:rPr>
-          <w:rFonts w:ascii="Times New Roman" w:hAnsi="Times New Roman" w:cs="Times New Roman" w:eastAsia="Times New Roman"/>
-        </w:rPr>
-        <w:t xml:space="preserve">significance</w:t>
-      </w:r>
-      <w:r>
-        <w:rPr>
-          <w:rFonts w:ascii="Times New Roman" w:hAnsi="Times New Roman" w:cs="Times New Roman" w:eastAsia="Times New Roman"/>
-        </w:rPr>
-        <w:t xml:space="preserve"> </w:t>
-      </w:r>
-      <w:r>
-        <w:rPr>
-          <w:rFonts w:ascii="Times New Roman" w:hAnsi="Times New Roman" w:cs="Times New Roman" w:eastAsia="Times New Roman"/>
-        </w:rPr>
-        <w:t xml:space="preserve">testing</w:t>
-      </w:r>
-      <w:r>
-        <w:rPr>
-          <w:rFonts w:ascii="Times New Roman" w:hAnsi="Times New Roman" w:cs="Times New Roman" w:eastAsia="Times New Roman"/>
-        </w:rPr>
-        <w:t xml:space="preserve"> </w:t>
-      </w:r>
-      <w:r>
-        <w:rPr>
-          <w:rFonts w:ascii="Times New Roman" w:hAnsi="Times New Roman" w:cs="Times New Roman" w:eastAsia="Times New Roman"/>
-        </w:rPr>
-        <w:t xml:space="preserve">and</w:t>
-      </w:r>
-      <w:r>
-        <w:rPr>
-          <w:rFonts w:ascii="Times New Roman" w:hAnsi="Times New Roman" w:cs="Times New Roman" w:eastAsia="Times New Roman"/>
-        </w:rPr>
-        <w:t xml:space="preserve"> </w:t>
-      </w:r>
-      <w:r>
-        <w:rPr>
-          <w:rFonts w:ascii="Times New Roman" w:hAnsi="Times New Roman" w:cs="Times New Roman" w:eastAsia="Times New Roman"/>
-        </w:rPr>
-        <w:t xml:space="preserve">introduce</w:t>
-      </w:r>
-      <w:r>
-        <w:rPr>
-          <w:rFonts w:ascii="Times New Roman" w:hAnsi="Times New Roman" w:cs="Times New Roman" w:eastAsia="Times New Roman"/>
-        </w:rPr>
-        <w:t xml:space="preserve"> </w:t>
-      </w:r>
-      <w:r>
-        <w:rPr>
-          <w:rFonts w:ascii="Times New Roman" w:hAnsi="Times New Roman" w:cs="Times New Roman" w:eastAsia="Times New Roman"/>
-        </w:rPr>
-        <w:t xml:space="preserve">a</w:t>
-      </w:r>
-      <w:r>
-        <w:rPr>
-          <w:rFonts w:ascii="Times New Roman" w:hAnsi="Times New Roman" w:cs="Times New Roman" w:eastAsia="Times New Roman"/>
-        </w:rPr>
-        <w:t xml:space="preserve"> </w:t>
-      </w:r>
-      <w:r>
-        <w:rPr>
-          <w:rFonts w:ascii="Times New Roman" w:hAnsi="Times New Roman" w:cs="Times New Roman" w:eastAsia="Times New Roman"/>
-        </w:rPr>
-        <w:t xml:space="preserve">within-query</w:t>
-      </w:r>
-      <w:r>
-        <w:rPr>
-          <w:rFonts w:ascii="Times New Roman" w:hAnsi="Times New Roman" w:cs="Times New Roman" w:eastAsia="Times New Roman"/>
-        </w:rPr>
-        <w:t xml:space="preserve"> </w:t>
-      </w:r>
-      <w:r>
-        <w:rPr>
-          <w:rFonts w:ascii="Times New Roman" w:hAnsi="Times New Roman" w:cs="Times New Roman" w:eastAsia="Times New Roman"/>
-        </w:rPr>
-        <w:t xml:space="preserve">diagnostic</w:t>
-      </w:r>
-      <w:r>
-        <w:rPr>
-          <w:rFonts w:ascii="Times New Roman" w:hAnsi="Times New Roman" w:cs="Times New Roman" w:eastAsia="Times New Roman"/>
-        </w:rPr>
-        <w:t xml:space="preserve"> </w:t>
-      </w:r>
-      <w:r>
-        <w:rPr>
-          <w:rFonts w:ascii="Times New Roman" w:hAnsi="Times New Roman" w:cs="Times New Roman" w:eastAsia="Times New Roman"/>
-        </w:rPr>
-        <w:t xml:space="preserve">that</w:t>
-      </w:r>
-      <w:r>
-        <w:rPr>
-          <w:rFonts w:ascii="Times New Roman" w:hAnsi="Times New Roman" w:cs="Times New Roman" w:eastAsia="Times New Roman"/>
-        </w:rPr>
-        <w:t xml:space="preserve"> </w:t>
-      </w:r>
-      <w:r>
-        <w:rPr>
-          <w:rFonts w:ascii="Times New Roman" w:hAnsi="Times New Roman" w:cs="Times New Roman" w:eastAsia="Times New Roman"/>
-        </w:rPr>
-        <w:t xml:space="preserve">separates</w:t>
-      </w:r>
-      <w:r>
-        <w:rPr>
-          <w:rFonts w:ascii="Times New Roman" w:hAnsi="Times New Roman" w:cs="Times New Roman" w:eastAsia="Times New Roman"/>
-        </w:rPr>
-        <w:t xml:space="preserve"> </w:t>
-      </w:r>
-      <w:r>
-        <w:rPr>
-          <w:rFonts w:ascii="Times New Roman" w:hAnsi="Times New Roman" w:cs="Times New Roman" w:eastAsia="Times New Roman"/>
-        </w:rPr>
-        <w:t xml:space="preserve">matching</w:t>
-      </w:r>
-      <w:r>
-        <w:rPr>
-          <w:rFonts w:ascii="Times New Roman" w:hAnsi="Times New Roman" w:cs="Times New Roman" w:eastAsia="Times New Roman"/>
-        </w:rPr>
-        <w:t xml:space="preserve"> </w:t>
-      </w:r>
-      <w:r>
-        <w:rPr>
-          <w:rFonts w:ascii="Times New Roman" w:hAnsi="Times New Roman" w:cs="Times New Roman" w:eastAsia="Times New Roman"/>
-        </w:rPr>
-        <w:t xml:space="preserve">ability</w:t>
-      </w:r>
-      <w:r>
-        <w:rPr>
-          <w:rFonts w:ascii="Times New Roman" w:hAnsi="Times New Roman" w:cs="Times New Roman" w:eastAsia="Times New Roman"/>
-        </w:rPr>
-        <w:t xml:space="preserve"> </w:t>
-      </w:r>
-      <w:r>
-        <w:rPr>
-          <w:rFonts w:ascii="Times New Roman" w:hAnsi="Times New Roman" w:cs="Times New Roman" w:eastAsia="Times New Roman"/>
-        </w:rPr>
-        <w:t xml:space="preserve">from</w:t>
-      </w:r>
-      <w:r>
-        <w:rPr>
-          <w:rFonts w:ascii="Times New Roman" w:hAnsi="Times New Roman" w:cs="Times New Roman" w:eastAsia="Times New Roman"/>
-        </w:rPr>
-        <w:t xml:space="preserve"> </w:t>
-      </w:r>
-      <w:r>
-        <w:rPr>
-          <w:rFonts w:ascii="Times New Roman" w:hAnsi="Times New Roman" w:cs="Times New Roman" w:eastAsia="Times New Roman"/>
-        </w:rPr>
-        <w:t xml:space="preserve">candidate-level</w:t>
-      </w:r>
-      <w:r>
-        <w:rPr>
-          <w:rFonts w:ascii="Times New Roman" w:hAnsi="Times New Roman" w:cs="Times New Roman" w:eastAsia="Times New Roman"/>
-        </w:rPr>
-        <w:t xml:space="preserve"> </w:t>
-      </w:r>
-      <w:r>
-        <w:rPr>
-          <w:rFonts w:ascii="Times New Roman" w:hAnsi="Times New Roman" w:cs="Times New Roman" w:eastAsia="Times New Roman"/>
-        </w:rPr>
-        <w:t xml:space="preserve">quality.</w:t>
-      </w:r>
-      <w:r>
-        <w:rPr>
-          <w:rFonts w:ascii="Times New Roman" w:hAnsi="Times New Roman" w:cs="Times New Roman" w:eastAsia="Times New Roman"/>
-        </w:rPr>
-        <w:t xml:space="preserve"> </w:t>
-      </w:r>
-      <w:r>
-        <w:rPr>
-          <w:rFonts w:ascii="Times New Roman" w:hAnsi="Times New Roman" w:cs="Times New Roman" w:eastAsia="Times New Roman"/>
-        </w:rPr>
-        <w:t xml:space="preserve">For</w:t>
-      </w:r>
-      <w:r>
-        <w:rPr>
-          <w:rFonts w:ascii="Times New Roman" w:hAnsi="Times New Roman" w:cs="Times New Roman" w:eastAsia="Times New Roman"/>
-        </w:rPr>
-        <w:t xml:space="preserve"> </w:t>
-      </w:r>
-      <w:r>
-        <w:rPr>
-          <w:rFonts w:ascii="Times New Roman" w:hAnsi="Times New Roman" w:cs="Times New Roman" w:eastAsia="Times New Roman"/>
-        </w:rPr>
-        <w:t xml:space="preserve">deep</w:t>
-      </w:r>
-      <w:r>
-        <w:rPr>
-          <w:rFonts w:ascii="Times New Roman" w:hAnsi="Times New Roman" w:cs="Times New Roman" w:eastAsia="Times New Roman"/>
-        </w:rPr>
-        <w:t xml:space="preserve"> </w:t>
-      </w:r>
-      <w:r>
-        <w:rPr>
-          <w:rFonts w:ascii="Times New Roman" w:hAnsi="Times New Roman" w:cs="Times New Roman" w:eastAsia="Times New Roman"/>
-        </w:rPr>
-        <w:t xml:space="preserve">learning</w:t>
-      </w:r>
-      <w:r>
-        <w:rPr>
-          <w:rFonts w:ascii="Times New Roman" w:hAnsi="Times New Roman" w:cs="Times New Roman" w:eastAsia="Times New Roman"/>
-        </w:rPr>
-        <w:t xml:space="preserve"> </w:t>
-      </w:r>
-      <w:r>
-        <w:rPr>
-          <w:rFonts w:ascii="Times New Roman" w:hAnsi="Times New Roman" w:cs="Times New Roman" w:eastAsia="Times New Roman"/>
-        </w:rPr>
-        <w:t xml:space="preserve">we</w:t>
-      </w:r>
-      <w:r>
-        <w:rPr>
-          <w:rFonts w:ascii="Times New Roman" w:hAnsi="Times New Roman" w:cs="Times New Roman" w:eastAsia="Times New Roman"/>
-        </w:rPr>
-        <w:t xml:space="preserve"> </w:t>
-      </w:r>
-      <w:r>
-        <w:rPr>
-          <w:rFonts w:ascii="Times New Roman" w:hAnsi="Times New Roman" w:cs="Times New Roman" w:eastAsia="Times New Roman"/>
-        </w:rPr>
-        <w:t xml:space="preserve">show</w:t>
-      </w:r>
-      <w:r>
-        <w:rPr>
-          <w:rFonts w:ascii="Times New Roman" w:hAnsi="Times New Roman" w:cs="Times New Roman" w:eastAsia="Times New Roman"/>
-        </w:rPr>
-        <w:t xml:space="preserve"> </w:t>
-      </w:r>
-      <w:r>
-        <w:rPr>
-          <w:rFonts w:ascii="Times New Roman" w:hAnsi="Times New Roman" w:cs="Times New Roman" w:eastAsia="Times New Roman"/>
-        </w:rPr>
-        <w:t xml:space="preserve">that</w:t>
-      </w:r>
-      <w:r>
-        <w:rPr>
-          <w:rFonts w:ascii="Times New Roman" w:hAnsi="Times New Roman" w:cs="Times New Roman" w:eastAsia="Times New Roman"/>
-        </w:rPr>
-        <w:t xml:space="preserve"> </w:t>
-      </w:r>
-      <w:r>
-        <w:rPr>
-          <w:rFonts w:ascii="Times New Roman" w:hAnsi="Times New Roman" w:cs="Times New Roman" w:eastAsia="Times New Roman"/>
-        </w:rPr>
-        <w:t xml:space="preserve">a</w:t>
-      </w:r>
-      <w:r>
-        <w:rPr>
-          <w:rFonts w:ascii="Times New Roman" w:hAnsi="Times New Roman" w:cs="Times New Roman" w:eastAsia="Times New Roman"/>
-        </w:rPr>
-        <w:t xml:space="preserve"> </w:t>
-      </w:r>
-      <w:r>
-        <w:rPr>
-          <w:rFonts w:ascii="Times New Roman" w:hAnsi="Times New Roman" w:cs="Times New Roman" w:eastAsia="Times New Roman"/>
-        </w:rPr>
-        <w:t xml:space="preserve">plausible</w:t>
-      </w:r>
-      <w:r>
-        <w:rPr>
-          <w:rFonts w:ascii="Times New Roman" w:hAnsi="Times New Roman" w:cs="Times New Roman" w:eastAsia="Times New Roman"/>
-        </w:rPr>
-        <w:t xml:space="preserve"> </w:t>
-      </w:r>
-      <w:r>
-        <w:rPr>
-          <w:rFonts w:ascii="Times New Roman" w:hAnsi="Times New Roman" w:cs="Times New Roman" w:eastAsia="Times New Roman"/>
-        </w:rPr>
-        <w:t xml:space="preserve">authored</w:t>
-      </w:r>
-      <w:r>
-        <w:rPr>
-          <w:rFonts w:ascii="Times New Roman" w:hAnsi="Times New Roman" w:cs="Times New Roman" w:eastAsia="Times New Roman"/>
-        </w:rPr>
-        <w:t xml:space="preserve"> </w:t>
-      </w:r>
-      <w:r>
-        <w:rPr>
-          <w:rFonts w:ascii="Times New Roman" w:hAnsi="Times New Roman" w:cs="Times New Roman" w:eastAsia="Times New Roman"/>
-        </w:rPr>
-        <w:t xml:space="preserve">face-similarity</w:t>
-      </w:r>
-      <w:r>
-        <w:rPr>
-          <w:rFonts w:ascii="Times New Roman" w:hAnsi="Times New Roman" w:cs="Times New Roman" w:eastAsia="Times New Roman"/>
-        </w:rPr>
-        <w:t xml:space="preserve"> </w:t>
-      </w:r>
-      <w:r>
-        <w:rPr>
-          <w:rFonts w:ascii="Times New Roman" w:hAnsi="Times New Roman" w:cs="Times New Roman" w:eastAsia="Times New Roman"/>
-        </w:rPr>
-        <w:t xml:space="preserve">threshold</w:t>
-      </w:r>
-      <w:r>
-        <w:rPr>
-          <w:rFonts w:ascii="Times New Roman" w:hAnsi="Times New Roman" w:cs="Times New Roman" w:eastAsia="Times New Roman"/>
-        </w:rPr>
-        <w:t xml:space="preserve"> </w:t>
-      </w:r>
-      <w:r>
-        <w:rPr>
-          <w:rFonts w:ascii="Times New Roman" w:hAnsi="Times New Roman" w:cs="Times New Roman" w:eastAsia="Times New Roman"/>
-        </w:rPr>
-        <w:t xml:space="preserve">of</w:t>
-      </w:r>
-      <w:r>
-        <w:rPr>
-          <w:rFonts w:ascii="Times New Roman" w:hAnsi="Times New Roman" w:cs="Times New Roman" w:eastAsia="Times New Roman"/>
-        </w:rPr>
-        <w:t xml:space="preserve"> </w:t>
-      </w:r>
-      <w:r>
-        <w:rPr>
-          <w:rFonts w:ascii="Times New Roman" w:hAnsi="Times New Roman" w:cs="Times New Roman" w:eastAsia="Times New Roman"/>
-        </w:rPr>
-        <w:t xml:space="preserve">0.50</w:t>
-      </w:r>
-      <w:r>
-        <w:rPr>
-          <w:rFonts w:ascii="Times New Roman" w:hAnsi="Times New Roman" w:cs="Times New Roman" w:eastAsia="Times New Roman"/>
-        </w:rPr>
-        <w:t xml:space="preserve"> </w:t>
-      </w:r>
-      <w:r>
-        <w:rPr>
-          <w:rFonts w:ascii="Times New Roman" w:hAnsi="Times New Roman" w:cs="Times New Roman" w:eastAsia="Times New Roman"/>
-        </w:rPr>
-        <w:t xml:space="preserve">would</w:t>
-      </w:r>
-      <w:r>
-        <w:rPr>
-          <w:rFonts w:ascii="Times New Roman" w:hAnsi="Times New Roman" w:cs="Times New Roman" w:eastAsia="Times New Roman"/>
-        </w:rPr>
-        <w:t xml:space="preserve"> </w:t>
-      </w:r>
-      <w:r>
-        <w:rPr>
-          <w:rFonts w:ascii="Times New Roman" w:hAnsi="Times New Roman" w:cs="Times New Roman" w:eastAsia="Times New Roman"/>
-        </w:rPr>
-        <w:t xml:space="preserve">have</w:t>
-      </w:r>
-      <w:r>
-        <w:rPr>
-          <w:rFonts w:ascii="Times New Roman" w:hAnsi="Times New Roman" w:cs="Times New Roman" w:eastAsia="Times New Roman"/>
-        </w:rPr>
-        <w:t xml:space="preserve"> </w:t>
-      </w:r>
-      <w:r>
-        <w:rPr>
-          <w:rFonts w:ascii="Times New Roman" w:hAnsi="Times New Roman" w:cs="Times New Roman" w:eastAsia="Times New Roman"/>
-        </w:rPr>
-        <w:t xml:space="preserve">falsely</w:t>
-      </w:r>
-      <w:r>
-        <w:rPr>
-          <w:rFonts w:ascii="Times New Roman" w:hAnsi="Times New Roman" w:cs="Times New Roman" w:eastAsia="Times New Roman"/>
-        </w:rPr>
-        <w:t xml:space="preserve"> </w:t>
-      </w:r>
-      <w:r>
-        <w:rPr>
-          <w:rFonts w:ascii="Times New Roman" w:hAnsi="Times New Roman" w:cs="Times New Roman" w:eastAsia="Times New Roman"/>
-        </w:rPr>
-        <w:t xml:space="preserve">rejected</w:t>
-      </w:r>
-      <w:r>
-        <w:rPr>
-          <w:rFonts w:ascii="Times New Roman" w:hAnsi="Times New Roman" w:cs="Times New Roman" w:eastAsia="Times New Roman"/>
-        </w:rPr>
-        <w:t xml:space="preserve"> </w:t>
-      </w:r>
-      <w:r>
-        <w:rPr>
-          <w:rFonts w:ascii="Times New Roman" w:hAnsi="Times New Roman" w:cs="Times New Roman" w:eastAsia="Times New Roman"/>
-        </w:rPr>
-        <w:t xml:space="preserve">41.4%</w:t>
-      </w:r>
-      <w:r>
-        <w:rPr>
-          <w:rFonts w:ascii="Times New Roman" w:hAnsi="Times New Roman" w:cs="Times New Roman" w:eastAsia="Times New Roman"/>
-        </w:rPr>
-        <w:t xml:space="preserve"> </w:t>
-      </w:r>
-      <w:r>
-        <w:rPr>
-          <w:rFonts w:ascii="Times New Roman" w:hAnsi="Times New Roman" w:cs="Times New Roman" w:eastAsia="Times New Roman"/>
-        </w:rPr>
-        <w:t xml:space="preserve">of</w:t>
-      </w:r>
-      <w:r>
-        <w:rPr>
-          <w:rFonts w:ascii="Times New Roman" w:hAnsi="Times New Roman" w:cs="Times New Roman" w:eastAsia="Times New Roman"/>
-        </w:rPr>
-        <w:t xml:space="preserve"> </w:t>
-      </w:r>
-      <w:r>
-        <w:rPr>
-          <w:rFonts w:ascii="Times New Roman" w:hAnsi="Times New Roman" w:cs="Times New Roman" w:eastAsia="Times New Roman"/>
-        </w:rPr>
-        <w:t xml:space="preserve">genuine</w:t>
-      </w:r>
-      <w:r>
-        <w:rPr>
-          <w:rFonts w:ascii="Times New Roman" w:hAnsi="Times New Roman" w:cs="Times New Roman" w:eastAsia="Times New Roman"/>
-        </w:rPr>
-        <w:t xml:space="preserve"> </w:t>
-      </w:r>
-      <w:r>
-        <w:rPr>
-          <w:rFonts w:ascii="Times New Roman" w:hAnsi="Times New Roman" w:cs="Times New Roman" w:eastAsia="Times New Roman"/>
-        </w:rPr>
-        <w:t xml:space="preserve">identity</w:t>
-      </w:r>
-      <w:r>
-        <w:rPr>
-          <w:rFonts w:ascii="Times New Roman" w:hAnsi="Times New Roman" w:cs="Times New Roman" w:eastAsia="Times New Roman"/>
-        </w:rPr>
-        <w:t xml:space="preserve"> </w:t>
-      </w:r>
-      <w:r>
-        <w:rPr>
-          <w:rFonts w:ascii="Times New Roman" w:hAnsi="Times New Roman" w:cs="Times New Roman" w:eastAsia="Times New Roman"/>
-        </w:rPr>
-        <w:t xml:space="preserve">matches,</w:t>
-      </w:r>
-      <w:r>
-        <w:rPr>
-          <w:rFonts w:ascii="Times New Roman" w:hAnsi="Times New Roman" w:cs="Times New Roman" w:eastAsia="Times New Roman"/>
-        </w:rPr>
-        <w:t xml:space="preserve"> </w:t>
-      </w:r>
-      <w:r>
-        <w:rPr>
-          <w:rFonts w:ascii="Times New Roman" w:hAnsi="Times New Roman" w:cs="Times New Roman" w:eastAsia="Times New Roman"/>
-        </w:rPr>
-        <w:t xml:space="preserve">against</w:t>
-      </w:r>
-      <w:r>
-        <w:rPr>
-          <w:rFonts w:ascii="Times New Roman" w:hAnsi="Times New Roman" w:cs="Times New Roman" w:eastAsia="Times New Roman"/>
-        </w:rPr>
-        <w:t xml:space="preserve"> </w:t>
-      </w:r>
-      <w:r>
-        <w:rPr>
-          <w:rFonts w:ascii="Times New Roman" w:hAnsi="Times New Roman" w:cs="Times New Roman" w:eastAsia="Times New Roman"/>
-        </w:rPr>
-        <w:t xml:space="preserve">3.4%</w:t>
-      </w:r>
-      <w:r>
-        <w:rPr>
-          <w:rFonts w:ascii="Times New Roman" w:hAnsi="Times New Roman" w:cs="Times New Roman" w:eastAsia="Times New Roman"/>
-        </w:rPr>
-        <w:t xml:space="preserve"> </w:t>
-      </w:r>
-      <w:r>
-        <w:rPr>
-          <w:rFonts w:ascii="Times New Roman" w:hAnsi="Times New Roman" w:cs="Times New Roman" w:eastAsia="Times New Roman"/>
-        </w:rPr>
-        <w:t xml:space="preserve">at</w:t>
-      </w:r>
-      <w:r>
-        <w:rPr>
-          <w:rFonts w:ascii="Times New Roman" w:hAnsi="Times New Roman" w:cs="Times New Roman" w:eastAsia="Times New Roman"/>
-        </w:rPr>
-        <w:t xml:space="preserve"> </w:t>
-      </w:r>
-      <w:r>
-        <w:rPr>
-          <w:rFonts w:ascii="Times New Roman" w:hAnsi="Times New Roman" w:cs="Times New Roman" w:eastAsia="Times New Roman"/>
-        </w:rPr>
-        <w:t xml:space="preserve">a</w:t>
-      </w:r>
-      <w:r>
-        <w:rPr>
-          <w:rFonts w:ascii="Times New Roman" w:hAnsi="Times New Roman" w:cs="Times New Roman" w:eastAsia="Times New Roman"/>
-        </w:rPr>
-        <w:t xml:space="preserve"> </w:t>
-      </w:r>
-      <w:r>
-        <w:rPr>
-          <w:rFonts w:ascii="Times New Roman" w:hAnsi="Times New Roman" w:cs="Times New Roman" w:eastAsia="Times New Roman"/>
-        </w:rPr>
-        <w:t xml:space="preserve">threshold</w:t>
-      </w:r>
-      <w:r>
-        <w:rPr>
-          <w:rFonts w:ascii="Times New Roman" w:hAnsi="Times New Roman" w:cs="Times New Roman" w:eastAsia="Times New Roman"/>
-        </w:rPr>
-        <w:t xml:space="preserve"> </w:t>
-      </w:r>
-      <w:r>
-        <w:rPr>
-          <w:rFonts w:ascii="Times New Roman" w:hAnsi="Times New Roman" w:cs="Times New Roman" w:eastAsia="Times New Roman"/>
-        </w:rPr>
-        <w:t xml:space="preserve">calibrated</w:t>
-      </w:r>
-      <w:r>
-        <w:rPr>
-          <w:rFonts w:ascii="Times New Roman" w:hAnsi="Times New Roman" w:cs="Times New Roman" w:eastAsia="Times New Roman"/>
-        </w:rPr>
-        <w:t xml:space="preserve"> </w:t>
-      </w:r>
-      <w:r>
-        <w:rPr>
-          <w:rFonts w:ascii="Times New Roman" w:hAnsi="Times New Roman" w:cs="Times New Roman" w:eastAsia="Times New Roman"/>
-        </w:rPr>
-        <w:t xml:space="preserve">on</w:t>
-      </w:r>
-      <w:r>
-        <w:rPr>
-          <w:rFonts w:ascii="Times New Roman" w:hAnsi="Times New Roman" w:cs="Times New Roman" w:eastAsia="Times New Roman"/>
-        </w:rPr>
-        <w:t xml:space="preserve"> </w:t>
-      </w:r>
-      <w:r>
-        <w:rPr>
-          <w:rFonts w:ascii="Times New Roman" w:hAnsi="Times New Roman" w:cs="Times New Roman" w:eastAsia="Times New Roman"/>
-        </w:rPr>
-        <w:t xml:space="preserve">Labeled</w:t>
-      </w:r>
-      <w:r>
-        <w:rPr>
-          <w:rFonts w:ascii="Times New Roman" w:hAnsi="Times New Roman" w:cs="Times New Roman" w:eastAsia="Times New Roman"/>
-        </w:rPr>
-        <w:t xml:space="preserve"> </w:t>
-      </w:r>
-      <w:r>
-        <w:rPr>
-          <w:rFonts w:ascii="Times New Roman" w:hAnsi="Times New Roman" w:cs="Times New Roman" w:eastAsia="Times New Roman"/>
-        </w:rPr>
-        <w:t xml:space="preserve">Faces</w:t>
-      </w:r>
-      <w:r>
-        <w:rPr>
-          <w:rFonts w:ascii="Times New Roman" w:hAnsi="Times New Roman" w:cs="Times New Roman" w:eastAsia="Times New Roman"/>
-        </w:rPr>
-        <w:t xml:space="preserve"> </w:t>
-      </w:r>
-      <w:r>
-        <w:rPr>
-          <w:rFonts w:ascii="Times New Roman" w:hAnsi="Times New Roman" w:cs="Times New Roman" w:eastAsia="Times New Roman"/>
-        </w:rPr>
-        <w:t xml:space="preserve">in</w:t>
-      </w:r>
-      <w:r>
-        <w:rPr>
-          <w:rFonts w:ascii="Times New Roman" w:hAnsi="Times New Roman" w:cs="Times New Roman" w:eastAsia="Times New Roman"/>
-        </w:rPr>
-        <w:t xml:space="preserve"> </w:t>
-      </w:r>
-      <w:r>
-        <w:rPr>
-          <w:rFonts w:ascii="Times New Roman" w:hAnsi="Times New Roman" w:cs="Times New Roman" w:eastAsia="Times New Roman"/>
-        </w:rPr>
-        <w:t xml:space="preserve">the</w:t>
-      </w:r>
-      <w:r>
-        <w:rPr>
-          <w:rFonts w:ascii="Times New Roman" w:hAnsi="Times New Roman" w:cs="Times New Roman" w:eastAsia="Times New Roman"/>
-        </w:rPr>
-        <w:t xml:space="preserve"> </w:t>
-      </w:r>
-      <w:r>
-        <w:rPr>
-          <w:rFonts w:ascii="Times New Roman" w:hAnsi="Times New Roman" w:cs="Times New Roman" w:eastAsia="Times New Roman"/>
-        </w:rPr>
         <w:t xml:space="preserve">Wild.</w:t>
-      </w:r>
-      <w:r>
-        <w:rPr>
-          <w:rFonts w:ascii="Times New Roman" w:hAnsi="Times New Roman" w:cs="Times New Roman" w:eastAsia="Times New Roman"/>
-        </w:rPr>
-        <w:t xml:space="preserve"> </w:t>
-      </w:r>
-      <w:r>
-        <w:rPr>
-          <w:rFonts w:ascii="Times New Roman" w:hAnsi="Times New Roman" w:cs="Times New Roman" w:eastAsia="Times New Roman"/>
-        </w:rPr>
-        <w:t xml:space="preserve">Each</w:t>
-      </w:r>
-      <w:r>
-        <w:rPr>
-          <w:rFonts w:ascii="Times New Roman" w:hAnsi="Times New Roman" w:cs="Times New Roman" w:eastAsia="Times New Roman"/>
-        </w:rPr>
-        <w:t xml:space="preserve"> </w:t>
-      </w:r>
-      <w:r>
-        <w:rPr>
-          <w:rFonts w:ascii="Times New Roman" w:hAnsi="Times New Roman" w:cs="Times New Roman" w:eastAsia="Times New Roman"/>
-        </w:rPr>
-        <w:t xml:space="preserve">design</w:t>
-      </w:r>
-      <w:r>
-        <w:rPr>
-          <w:rFonts w:ascii="Times New Roman" w:hAnsi="Times New Roman" w:cs="Times New Roman" w:eastAsia="Times New Roman"/>
-        </w:rPr>
-        <w:t xml:space="preserve"> </w:t>
-      </w:r>
-      <w:r>
-        <w:rPr>
-          <w:rFonts w:ascii="Times New Roman" w:hAnsi="Times New Roman" w:cs="Times New Roman" w:eastAsia="Times New Roman"/>
-        </w:rPr>
-        <w:t xml:space="preserve">policy</w:t>
-      </w:r>
-      <w:r>
-        <w:rPr>
-          <w:rFonts w:ascii="Times New Roman" w:hAnsi="Times New Roman" w:cs="Times New Roman" w:eastAsia="Times New Roman"/>
-        </w:rPr>
-        <w:t xml:space="preserve"> </w:t>
-      </w:r>
-      <w:r>
-        <w:rPr>
-          <w:rFonts w:ascii="Times New Roman" w:hAnsi="Times New Roman" w:cs="Times New Roman" w:eastAsia="Times New Roman"/>
-        </w:rPr>
-        <w:t xml:space="preserve">is</w:t>
-      </w:r>
-      <w:r>
-        <w:rPr>
-          <w:rFonts w:ascii="Times New Roman" w:hAnsi="Times New Roman" w:cs="Times New Roman" w:eastAsia="Times New Roman"/>
-        </w:rPr>
-        <w:t xml:space="preserve"> </w:t>
-      </w:r>
-      <w:r>
-        <w:rPr>
-          <w:rFonts w:ascii="Times New Roman" w:hAnsi="Times New Roman" w:cs="Times New Roman" w:eastAsia="Times New Roman"/>
-        </w:rPr>
-        <w:t xml:space="preserve">enforced</w:t>
-      </w:r>
-      <w:r>
-        <w:rPr>
-          <w:rFonts w:ascii="Times New Roman" w:hAnsi="Times New Roman" w:cs="Times New Roman" w:eastAsia="Times New Roman"/>
-        </w:rPr>
-        <w:t xml:space="preserve"> </w:t>
-      </w:r>
-      <w:r>
-        <w:rPr>
-          <w:rFonts w:ascii="Times New Roman" w:hAnsi="Times New Roman" w:cs="Times New Roman" w:eastAsia="Times New Roman"/>
-        </w:rPr>
-        <w:t xml:space="preserve">as</w:t>
-      </w:r>
-      <w:r>
-        <w:rPr>
-          <w:rFonts w:ascii="Times New Roman" w:hAnsi="Times New Roman" w:cs="Times New Roman" w:eastAsia="Times New Roman"/>
-        </w:rPr>
-        <w:t xml:space="preserve"> </w:t>
-      </w:r>
-      <w:r>
-        <w:rPr>
-          <w:rFonts w:ascii="Times New Roman" w:hAnsi="Times New Roman" w:cs="Times New Roman" w:eastAsia="Times New Roman"/>
-        </w:rPr>
-        <w:t xml:space="preserve">a</w:t>
-      </w:r>
-      <w:r>
-        <w:rPr>
-          <w:rFonts w:ascii="Times New Roman" w:hAnsi="Times New Roman" w:cs="Times New Roman" w:eastAsia="Times New Roman"/>
-        </w:rPr>
-        <w:t xml:space="preserve"> </w:t>
-      </w:r>
-      <w:r>
-        <w:rPr>
-          <w:rFonts w:ascii="Times New Roman" w:hAnsi="Times New Roman" w:cs="Times New Roman" w:eastAsia="Times New Roman"/>
-        </w:rPr>
-        <w:t xml:space="preserve">structural</w:t>
-      </w:r>
-      <w:r>
-        <w:rPr>
-          <w:rFonts w:ascii="Times New Roman" w:hAnsi="Times New Roman" w:cs="Times New Roman" w:eastAsia="Times New Roman"/>
-        </w:rPr>
-        <w:t xml:space="preserve"> </w:t>
-      </w:r>
-      <w:r>
-        <w:rPr>
-          <w:rFonts w:ascii="Times New Roman" w:hAnsi="Times New Roman" w:cs="Times New Roman" w:eastAsia="Times New Roman"/>
-        </w:rPr>
-        <w:t xml:space="preserve">property</w:t>
-      </w:r>
-      <w:r>
-        <w:rPr>
-          <w:rFonts w:ascii="Times New Roman" w:hAnsi="Times New Roman" w:cs="Times New Roman" w:eastAsia="Times New Roman"/>
-        </w:rPr>
-        <w:t xml:space="preserve"> </w:t>
-      </w:r>
-      <w:r>
-        <w:rPr>
-          <w:rFonts w:ascii="Times New Roman" w:hAnsi="Times New Roman" w:cs="Times New Roman" w:eastAsia="Times New Roman"/>
-        </w:rPr>
-        <w:t xml:space="preserve">of</w:t>
-      </w:r>
-      <w:r>
-        <w:rPr>
-          <w:rFonts w:ascii="Times New Roman" w:hAnsi="Times New Roman" w:cs="Times New Roman" w:eastAsia="Times New Roman"/>
-        </w:rPr>
-        <w:t xml:space="preserve"> </w:t>
-      </w:r>
-      <w:r>
-        <w:rPr>
-          <w:rFonts w:ascii="Times New Roman" w:hAnsi="Times New Roman" w:cs="Times New Roman" w:eastAsia="Times New Roman"/>
-        </w:rPr>
-        <w:t xml:space="preserve">the</w:t>
-      </w:r>
-      <w:r>
-        <w:rPr>
-          <w:rFonts w:ascii="Times New Roman" w:hAnsi="Times New Roman" w:cs="Times New Roman" w:eastAsia="Times New Roman"/>
-        </w:rPr>
-        <w:t xml:space="preserve"> </w:t>
-      </w:r>
-      <w:r>
-        <w:rPr>
-          <w:rFonts w:ascii="Times New Roman" w:hAnsi="Times New Roman" w:cs="Times New Roman" w:eastAsia="Times New Roman"/>
-        </w:rPr>
-        <w:t xml:space="preserve">build</w:t>
-      </w:r>
-      <w:r>
-        <w:rPr>
-          <w:rFonts w:ascii="Times New Roman" w:hAnsi="Times New Roman" w:cs="Times New Roman" w:eastAsia="Times New Roman"/>
-        </w:rPr>
-        <w:t xml:space="preserve"> </w:t>
-      </w:r>
-      <w:r>
-        <w:rPr>
-          <w:rFonts w:ascii="Times New Roman" w:hAnsi="Times New Roman" w:cs="Times New Roman" w:eastAsia="Times New Roman"/>
-        </w:rPr>
-        <w:t xml:space="preserve">rather</w:t>
-      </w:r>
-      <w:r>
-        <w:rPr>
-          <w:rFonts w:ascii="Times New Roman" w:hAnsi="Times New Roman" w:cs="Times New Roman" w:eastAsia="Times New Roman"/>
-        </w:rPr>
-        <w:t xml:space="preserve"> </w:t>
-      </w:r>
-      <w:r>
-        <w:rPr>
-          <w:rFonts w:ascii="Times New Roman" w:hAnsi="Times New Roman" w:cs="Times New Roman" w:eastAsia="Times New Roman"/>
-        </w:rPr>
-        <w:t xml:space="preserve">than</w:t>
-      </w:r>
-      <w:r>
-        <w:rPr>
-          <w:rFonts w:ascii="Times New Roman" w:hAnsi="Times New Roman" w:cs="Times New Roman" w:eastAsia="Times New Roman"/>
-        </w:rPr>
-        <w:t xml:space="preserve"> </w:t>
-      </w:r>
-      <w:r>
-        <w:rPr>
-          <w:rFonts w:ascii="Times New Roman" w:hAnsi="Times New Roman" w:cs="Times New Roman" w:eastAsia="Times New Roman"/>
-        </w:rPr>
-        <w:t xml:space="preserve">by</w:t>
-      </w:r>
-      <w:r>
-        <w:rPr>
-          <w:rFonts w:ascii="Times New Roman" w:hAnsi="Times New Roman" w:cs="Times New Roman" w:eastAsia="Times New Roman"/>
-        </w:rPr>
-        <w:t xml:space="preserve"> </w:t>
-      </w:r>
-      <w:r>
-        <w:rPr>
-          <w:rFonts w:ascii="Times New Roman" w:hAnsi="Times New Roman" w:cs="Times New Roman" w:eastAsia="Times New Roman"/>
-        </w:rPr>
-        <w:t xml:space="preserve">developer</w:t>
-      </w:r>
-      <w:r>
-        <w:rPr>
-          <w:rFonts w:ascii="Times New Roman" w:hAnsi="Times New Roman" w:cs="Times New Roman" w:eastAsia="Times New Roman"/>
-        </w:rPr>
-        <w:t xml:space="preserve"> </w:t>
-      </w:r>
-      <w:r>
-        <w:rPr>
-          <w:rFonts w:ascii="Times New Roman" w:hAnsi="Times New Roman" w:cs="Times New Roman" w:eastAsia="Times New Roman"/>
-        </w:rPr>
-        <w:t xml:space="preserve">discipline.</w:t>
       </w:r>
     </w:p>
     <w:p>

</xml_diff>